<commit_message>
docs: cerrar depuracion editorial de limitaciones
</commit_message>
<xml_diff>
--- a/docs/memoria/TFM_definitivo_2026-10-28.docx
+++ b/docs/memoria/TFM_definitivo_2026-10-28.docx
@@ -381,7 +381,7 @@
       <w:r>
         <w:fldChar w:fldCharType="separate"/>
       </w:r>
-      <w:hyperlink w:anchor="_Toc244073747" w:history="1">
+      <w:hyperlink w:anchor="_Toc244088658" w:history="1">
         <w:r>
           <w:rPr>
             <w:rStyle w:val="Hipervnculo"/>
@@ -408,7 +408,7 @@
             <w:noProof/>
             <w:webHidden/>
           </w:rPr>
-          <w:instrText xml:space="preserve"> PAGEREF _Toc244073747 \h </w:instrText>
+          <w:instrText xml:space="preserve"> PAGEREF _Toc244088658 \h </w:instrText>
         </w:r>
         <w:r>
           <w:rPr>
@@ -455,7 +455,7 @@
           <w14:ligatures w14:val="standardContextual"/>
         </w:rPr>
       </w:pPr>
-      <w:hyperlink w:anchor="_Toc244073748" w:history="1">
+      <w:hyperlink w:anchor="_Toc244088659" w:history="1">
         <w:r>
           <w:rPr>
             <w:rStyle w:val="Hipervnculo"/>
@@ -482,7 +482,7 @@
             <w:noProof/>
             <w:webHidden/>
           </w:rPr>
-          <w:instrText xml:space="preserve"> PAGEREF _Toc244073748 \h </w:instrText>
+          <w:instrText xml:space="preserve"> PAGEREF _Toc244088659 \h </w:instrText>
         </w:r>
         <w:r>
           <w:rPr>
@@ -529,7 +529,7 @@
           <w14:ligatures w14:val="standardContextual"/>
         </w:rPr>
       </w:pPr>
-      <w:hyperlink w:anchor="_Toc244073749" w:history="1">
+      <w:hyperlink w:anchor="_Toc244088660" w:history="1">
         <w:r>
           <w:rPr>
             <w:rStyle w:val="Hipervnculo"/>
@@ -556,7 +556,7 @@
             <w:noProof/>
             <w:webHidden/>
           </w:rPr>
-          <w:instrText xml:space="preserve"> PAGEREF _Toc244073749 \h </w:instrText>
+          <w:instrText xml:space="preserve"> PAGEREF _Toc244088660 \h </w:instrText>
         </w:r>
         <w:r>
           <w:rPr>
@@ -603,7 +603,7 @@
           <w14:ligatures w14:val="standardContextual"/>
         </w:rPr>
       </w:pPr>
-      <w:hyperlink w:anchor="_Toc244073750" w:history="1">
+      <w:hyperlink w:anchor="_Toc244088661" w:history="1">
         <w:r>
           <w:rPr>
             <w:rStyle w:val="Hipervnculo"/>
@@ -630,7 +630,7 @@
             <w:noProof/>
             <w:webHidden/>
           </w:rPr>
-          <w:instrText xml:space="preserve"> PAGEREF _Toc244073750 \h </w:instrText>
+          <w:instrText xml:space="preserve"> PAGEREF _Toc244088661 \h </w:instrText>
         </w:r>
         <w:r>
           <w:rPr>
@@ -677,7 +677,7 @@
           <w14:ligatures w14:val="standardContextual"/>
         </w:rPr>
       </w:pPr>
-      <w:hyperlink w:anchor="_Toc244073751" w:history="1">
+      <w:hyperlink w:anchor="_Toc244088662" w:history="1">
         <w:r>
           <w:rPr>
             <w:rStyle w:val="Hipervnculo"/>
@@ -704,7 +704,7 @@
             <w:noProof/>
             <w:webHidden/>
           </w:rPr>
-          <w:instrText xml:space="preserve"> PAGEREF _Toc244073751 \h </w:instrText>
+          <w:instrText xml:space="preserve"> PAGEREF _Toc244088662 \h </w:instrText>
         </w:r>
         <w:r>
           <w:rPr>
@@ -751,7 +751,7 @@
           <w14:ligatures w14:val="standardContextual"/>
         </w:rPr>
       </w:pPr>
-      <w:hyperlink w:anchor="_Toc244073752" w:history="1">
+      <w:hyperlink w:anchor="_Toc244088663" w:history="1">
         <w:r>
           <w:rPr>
             <w:rStyle w:val="Hipervnculo"/>
@@ -778,7 +778,7 @@
             <w:noProof/>
             <w:webHidden/>
           </w:rPr>
-          <w:instrText xml:space="preserve"> PAGEREF _Toc244073752 \h </w:instrText>
+          <w:instrText xml:space="preserve"> PAGEREF _Toc244088663 \h </w:instrText>
         </w:r>
         <w:r>
           <w:rPr>
@@ -825,7 +825,7 @@
           <w14:ligatures w14:val="standardContextual"/>
         </w:rPr>
       </w:pPr>
-      <w:hyperlink w:anchor="_Toc244073753" w:history="1">
+      <w:hyperlink w:anchor="_Toc244088664" w:history="1">
         <w:r>
           <w:rPr>
             <w:rStyle w:val="Hipervnculo"/>
@@ -852,7 +852,7 @@
             <w:noProof/>
             <w:webHidden/>
           </w:rPr>
-          <w:instrText xml:space="preserve"> PAGEREF _Toc244073753 \h </w:instrText>
+          <w:instrText xml:space="preserve"> PAGEREF _Toc244088664 \h </w:instrText>
         </w:r>
         <w:r>
           <w:rPr>
@@ -899,7 +899,7 @@
           <w14:ligatures w14:val="standardContextual"/>
         </w:rPr>
       </w:pPr>
-      <w:hyperlink w:anchor="_Toc244073754" w:history="1">
+      <w:hyperlink w:anchor="_Toc244088665" w:history="1">
         <w:r>
           <w:rPr>
             <w:rStyle w:val="Hipervnculo"/>
@@ -926,7 +926,7 @@
             <w:noProof/>
             <w:webHidden/>
           </w:rPr>
-          <w:instrText xml:space="preserve"> PAGEREF _Toc244073754 \h </w:instrText>
+          <w:instrText xml:space="preserve"> PAGEREF _Toc244088665 \h </w:instrText>
         </w:r>
         <w:r>
           <w:rPr>
@@ -973,7 +973,7 @@
           <w14:ligatures w14:val="standardContextual"/>
         </w:rPr>
       </w:pPr>
-      <w:hyperlink w:anchor="_Toc244073755" w:history="1">
+      <w:hyperlink w:anchor="_Toc244088666" w:history="1">
         <w:r>
           <w:rPr>
             <w:rStyle w:val="Hipervnculo"/>
@@ -1000,7 +1000,7 @@
             <w:noProof/>
             <w:webHidden/>
           </w:rPr>
-          <w:instrText xml:space="preserve"> PAGEREF _Toc244073755 \h </w:instrText>
+          <w:instrText xml:space="preserve"> PAGEREF _Toc244088666 \h </w:instrText>
         </w:r>
         <w:r>
           <w:rPr>
@@ -1047,7 +1047,7 @@
           <w14:ligatures w14:val="standardContextual"/>
         </w:rPr>
       </w:pPr>
-      <w:hyperlink w:anchor="_Toc244073756" w:history="1">
+      <w:hyperlink w:anchor="_Toc244088667" w:history="1">
         <w:r>
           <w:rPr>
             <w:rStyle w:val="Hipervnculo"/>
@@ -1074,7 +1074,7 @@
             <w:noProof/>
             <w:webHidden/>
           </w:rPr>
-          <w:instrText xml:space="preserve"> PAGEREF _Toc244073756 \h </w:instrText>
+          <w:instrText xml:space="preserve"> PAGEREF _Toc244088667 \h </w:instrText>
         </w:r>
         <w:r>
           <w:rPr>
@@ -1121,7 +1121,7 @@
           <w14:ligatures w14:val="standardContextual"/>
         </w:rPr>
       </w:pPr>
-      <w:hyperlink w:anchor="_Toc244073757" w:history="1">
+      <w:hyperlink w:anchor="_Toc244088668" w:history="1">
         <w:r>
           <w:rPr>
             <w:rStyle w:val="Hipervnculo"/>
@@ -1148,7 +1148,7 @@
             <w:noProof/>
             <w:webHidden/>
           </w:rPr>
-          <w:instrText xml:space="preserve"> PAGEREF _Toc244073757 \h </w:instrText>
+          <w:instrText xml:space="preserve"> PAGEREF _Toc244088668 \h </w:instrText>
         </w:r>
         <w:r>
           <w:rPr>
@@ -1195,7 +1195,7 @@
           <w14:ligatures w14:val="standardContextual"/>
         </w:rPr>
       </w:pPr>
-      <w:hyperlink w:anchor="_Toc244073758" w:history="1">
+      <w:hyperlink w:anchor="_Toc244088669" w:history="1">
         <w:r>
           <w:rPr>
             <w:rStyle w:val="Hipervnculo"/>
@@ -1222,7 +1222,7 @@
             <w:noProof/>
             <w:webHidden/>
           </w:rPr>
-          <w:instrText xml:space="preserve"> PAGEREF _Toc244073758 \h </w:instrText>
+          <w:instrText xml:space="preserve"> PAGEREF _Toc244088669 \h </w:instrText>
         </w:r>
         <w:r>
           <w:rPr>
@@ -1269,7 +1269,7 @@
           <w14:ligatures w14:val="standardContextual"/>
         </w:rPr>
       </w:pPr>
-      <w:hyperlink w:anchor="_Toc244073759" w:history="1">
+      <w:hyperlink w:anchor="_Toc244088670" w:history="1">
         <w:r>
           <w:rPr>
             <w:rStyle w:val="Hipervnculo"/>
@@ -1296,7 +1296,7 @@
             <w:noProof/>
             <w:webHidden/>
           </w:rPr>
-          <w:instrText xml:space="preserve"> PAGEREF _Toc244073759 \h </w:instrText>
+          <w:instrText xml:space="preserve"> PAGEREF _Toc244088670 \h </w:instrText>
         </w:r>
         <w:r>
           <w:rPr>
@@ -1343,7 +1343,7 @@
           <w14:ligatures w14:val="standardContextual"/>
         </w:rPr>
       </w:pPr>
-      <w:hyperlink w:anchor="_Toc244073760" w:history="1">
+      <w:hyperlink w:anchor="_Toc244088671" w:history="1">
         <w:r>
           <w:rPr>
             <w:rStyle w:val="Hipervnculo"/>
@@ -1370,7 +1370,7 @@
             <w:noProof/>
             <w:webHidden/>
           </w:rPr>
-          <w:instrText xml:space="preserve"> PAGEREF _Toc244073760 \h </w:instrText>
+          <w:instrText xml:space="preserve"> PAGEREF _Toc244088671 \h </w:instrText>
         </w:r>
         <w:r>
           <w:rPr>
@@ -1417,7 +1417,7 @@
           <w14:ligatures w14:val="standardContextual"/>
         </w:rPr>
       </w:pPr>
-      <w:hyperlink w:anchor="_Toc244073761" w:history="1">
+      <w:hyperlink w:anchor="_Toc244088672" w:history="1">
         <w:r>
           <w:rPr>
             <w:rStyle w:val="Hipervnculo"/>
@@ -1444,7 +1444,7 @@
             <w:noProof/>
             <w:webHidden/>
           </w:rPr>
-          <w:instrText xml:space="preserve"> PAGEREF _Toc244073761 \h </w:instrText>
+          <w:instrText xml:space="preserve"> PAGEREF _Toc244088672 \h </w:instrText>
         </w:r>
         <w:r>
           <w:rPr>
@@ -1491,7 +1491,7 @@
           <w14:ligatures w14:val="standardContextual"/>
         </w:rPr>
       </w:pPr>
-      <w:hyperlink w:anchor="_Toc244073762" w:history="1">
+      <w:hyperlink w:anchor="_Toc244088673" w:history="1">
         <w:r>
           <w:rPr>
             <w:rStyle w:val="Hipervnculo"/>
@@ -1518,7 +1518,7 @@
             <w:noProof/>
             <w:webHidden/>
           </w:rPr>
-          <w:instrText xml:space="preserve"> PAGEREF _Toc244073762 \h </w:instrText>
+          <w:instrText xml:space="preserve"> PAGEREF _Toc244088673 \h </w:instrText>
         </w:r>
         <w:r>
           <w:rPr>
@@ -1565,7 +1565,7 @@
           <w14:ligatures w14:val="standardContextual"/>
         </w:rPr>
       </w:pPr>
-      <w:hyperlink w:anchor="_Toc244073763" w:history="1">
+      <w:hyperlink w:anchor="_Toc244088674" w:history="1">
         <w:r>
           <w:rPr>
             <w:rStyle w:val="Hipervnculo"/>
@@ -1592,7 +1592,7 @@
             <w:noProof/>
             <w:webHidden/>
           </w:rPr>
-          <w:instrText xml:space="preserve"> PAGEREF _Toc244073763 \h </w:instrText>
+          <w:instrText xml:space="preserve"> PAGEREF _Toc244088674 \h </w:instrText>
         </w:r>
         <w:r>
           <w:rPr>
@@ -1639,7 +1639,7 @@
           <w14:ligatures w14:val="standardContextual"/>
         </w:rPr>
       </w:pPr>
-      <w:hyperlink w:anchor="_Toc244073764" w:history="1">
+      <w:hyperlink w:anchor="_Toc244088675" w:history="1">
         <w:r>
           <w:rPr>
             <w:rStyle w:val="Hipervnculo"/>
@@ -1666,7 +1666,7 @@
             <w:noProof/>
             <w:webHidden/>
           </w:rPr>
-          <w:instrText xml:space="preserve"> PAGEREF _Toc244073764 \h </w:instrText>
+          <w:instrText xml:space="preserve"> PAGEREF _Toc244088675 \h </w:instrText>
         </w:r>
         <w:r>
           <w:rPr>
@@ -1713,7 +1713,7 @@
           <w14:ligatures w14:val="standardContextual"/>
         </w:rPr>
       </w:pPr>
-      <w:hyperlink w:anchor="_Toc244073765" w:history="1">
+      <w:hyperlink w:anchor="_Toc244088676" w:history="1">
         <w:r>
           <w:rPr>
             <w:rStyle w:val="Hipervnculo"/>
@@ -1740,7 +1740,7 @@
             <w:noProof/>
             <w:webHidden/>
           </w:rPr>
-          <w:instrText xml:space="preserve"> PAGEREF _Toc244073765 \h </w:instrText>
+          <w:instrText xml:space="preserve"> PAGEREF _Toc244088676 \h </w:instrText>
         </w:r>
         <w:r>
           <w:rPr>
@@ -1787,7 +1787,7 @@
           <w14:ligatures w14:val="standardContextual"/>
         </w:rPr>
       </w:pPr>
-      <w:hyperlink w:anchor="_Toc244073766" w:history="1">
+      <w:hyperlink w:anchor="_Toc244088677" w:history="1">
         <w:r>
           <w:rPr>
             <w:rStyle w:val="Hipervnculo"/>
@@ -1814,7 +1814,7 @@
             <w:noProof/>
             <w:webHidden/>
           </w:rPr>
-          <w:instrText xml:space="preserve"> PAGEREF _Toc244073766 \h </w:instrText>
+          <w:instrText xml:space="preserve"> PAGEREF _Toc244088677 \h </w:instrText>
         </w:r>
         <w:r>
           <w:rPr>
@@ -1861,7 +1861,7 @@
           <w14:ligatures w14:val="standardContextual"/>
         </w:rPr>
       </w:pPr>
-      <w:hyperlink w:anchor="_Toc244073767" w:history="1">
+      <w:hyperlink w:anchor="_Toc244088678" w:history="1">
         <w:r>
           <w:rPr>
             <w:rStyle w:val="Hipervnculo"/>
@@ -1888,7 +1888,7 @@
             <w:noProof/>
             <w:webHidden/>
           </w:rPr>
-          <w:instrText xml:space="preserve"> PAGEREF _Toc244073767 \h </w:instrText>
+          <w:instrText xml:space="preserve"> PAGEREF _Toc244088678 \h </w:instrText>
         </w:r>
         <w:r>
           <w:rPr>
@@ -1935,7 +1935,7 @@
           <w14:ligatures w14:val="standardContextual"/>
         </w:rPr>
       </w:pPr>
-      <w:hyperlink w:anchor="_Toc244073768" w:history="1">
+      <w:hyperlink w:anchor="_Toc244088679" w:history="1">
         <w:r>
           <w:rPr>
             <w:rStyle w:val="Hipervnculo"/>
@@ -1962,7 +1962,7 @@
             <w:noProof/>
             <w:webHidden/>
           </w:rPr>
-          <w:instrText xml:space="preserve"> PAGEREF _Toc244073768 \h </w:instrText>
+          <w:instrText xml:space="preserve"> PAGEREF _Toc244088679 \h </w:instrText>
         </w:r>
         <w:r>
           <w:rPr>
@@ -2009,7 +2009,7 @@
           <w14:ligatures w14:val="standardContextual"/>
         </w:rPr>
       </w:pPr>
-      <w:hyperlink w:anchor="_Toc244073769" w:history="1">
+      <w:hyperlink w:anchor="_Toc244088680" w:history="1">
         <w:r>
           <w:rPr>
             <w:rStyle w:val="Hipervnculo"/>
@@ -2036,7 +2036,7 @@
             <w:noProof/>
             <w:webHidden/>
           </w:rPr>
-          <w:instrText xml:space="preserve"> PAGEREF _Toc244073769 \h </w:instrText>
+          <w:instrText xml:space="preserve"> PAGEREF _Toc244088680 \h </w:instrText>
         </w:r>
         <w:r>
           <w:rPr>
@@ -2083,7 +2083,7 @@
           <w14:ligatures w14:val="standardContextual"/>
         </w:rPr>
       </w:pPr>
-      <w:hyperlink w:anchor="_Toc244073770" w:history="1">
+      <w:hyperlink w:anchor="_Toc244088681" w:history="1">
         <w:r>
           <w:rPr>
             <w:rStyle w:val="Hipervnculo"/>
@@ -2110,7 +2110,7 @@
             <w:noProof/>
             <w:webHidden/>
           </w:rPr>
-          <w:instrText xml:space="preserve"> PAGEREF _Toc244073770 \h </w:instrText>
+          <w:instrText xml:space="preserve"> PAGEREF _Toc244088681 \h </w:instrText>
         </w:r>
         <w:r>
           <w:rPr>
@@ -2157,7 +2157,7 @@
           <w14:ligatures w14:val="standardContextual"/>
         </w:rPr>
       </w:pPr>
-      <w:hyperlink w:anchor="_Toc244073771" w:history="1">
+      <w:hyperlink w:anchor="_Toc244088682" w:history="1">
         <w:r>
           <w:rPr>
             <w:rStyle w:val="Hipervnculo"/>
@@ -2184,7 +2184,7 @@
             <w:noProof/>
             <w:webHidden/>
           </w:rPr>
-          <w:instrText xml:space="preserve"> PAGEREF _Toc244073771 \h </w:instrText>
+          <w:instrText xml:space="preserve"> PAGEREF _Toc244088682 \h </w:instrText>
         </w:r>
         <w:r>
           <w:rPr>
@@ -2231,7 +2231,7 @@
           <w14:ligatures w14:val="standardContextual"/>
         </w:rPr>
       </w:pPr>
-      <w:hyperlink w:anchor="_Toc244073772" w:history="1">
+      <w:hyperlink w:anchor="_Toc244088683" w:history="1">
         <w:r>
           <w:rPr>
             <w:rStyle w:val="Hipervnculo"/>
@@ -2258,7 +2258,7 @@
             <w:noProof/>
             <w:webHidden/>
           </w:rPr>
-          <w:instrText xml:space="preserve"> PAGEREF _Toc244073772 \h </w:instrText>
+          <w:instrText xml:space="preserve"> PAGEREF _Toc244088683 \h </w:instrText>
         </w:r>
         <w:r>
           <w:rPr>
@@ -2305,7 +2305,7 @@
           <w14:ligatures w14:val="standardContextual"/>
         </w:rPr>
       </w:pPr>
-      <w:hyperlink w:anchor="_Toc244073773" w:history="1">
+      <w:hyperlink w:anchor="_Toc244088684" w:history="1">
         <w:r>
           <w:rPr>
             <w:rStyle w:val="Hipervnculo"/>
@@ -2332,7 +2332,7 @@
             <w:noProof/>
             <w:webHidden/>
           </w:rPr>
-          <w:instrText xml:space="preserve"> PAGEREF _Toc244073773 \h </w:instrText>
+          <w:instrText xml:space="preserve"> PAGEREF _Toc244088684 \h </w:instrText>
         </w:r>
         <w:r>
           <w:rPr>
@@ -2379,7 +2379,7 @@
           <w14:ligatures w14:val="standardContextual"/>
         </w:rPr>
       </w:pPr>
-      <w:hyperlink w:anchor="_Toc244073774" w:history="1">
+      <w:hyperlink w:anchor="_Toc244088685" w:history="1">
         <w:r>
           <w:rPr>
             <w:rStyle w:val="Hipervnculo"/>
@@ -2406,7 +2406,7 @@
             <w:noProof/>
             <w:webHidden/>
           </w:rPr>
-          <w:instrText xml:space="preserve"> PAGEREF _Toc244073774 \h </w:instrText>
+          <w:instrText xml:space="preserve"> PAGEREF _Toc244088685 \h </w:instrText>
         </w:r>
         <w:r>
           <w:rPr>
@@ -2453,7 +2453,7 @@
           <w14:ligatures w14:val="standardContextual"/>
         </w:rPr>
       </w:pPr>
-      <w:hyperlink w:anchor="_Toc244073775" w:history="1">
+      <w:hyperlink w:anchor="_Toc244088686" w:history="1">
         <w:r>
           <w:rPr>
             <w:rStyle w:val="Hipervnculo"/>
@@ -2480,7 +2480,7 @@
             <w:noProof/>
             <w:webHidden/>
           </w:rPr>
-          <w:instrText xml:space="preserve"> PAGEREF _Toc244073775 \h </w:instrText>
+          <w:instrText xml:space="preserve"> PAGEREF _Toc244088686 \h </w:instrText>
         </w:r>
         <w:r>
           <w:rPr>
@@ -2527,7 +2527,7 @@
           <w14:ligatures w14:val="standardContextual"/>
         </w:rPr>
       </w:pPr>
-      <w:hyperlink w:anchor="_Toc244073776" w:history="1">
+      <w:hyperlink w:anchor="_Toc244088687" w:history="1">
         <w:r>
           <w:rPr>
             <w:rStyle w:val="Hipervnculo"/>
@@ -2554,7 +2554,7 @@
             <w:noProof/>
             <w:webHidden/>
           </w:rPr>
-          <w:instrText xml:space="preserve"> PAGEREF _Toc244073776 \h </w:instrText>
+          <w:instrText xml:space="preserve"> PAGEREF _Toc244088687 \h </w:instrText>
         </w:r>
         <w:r>
           <w:rPr>
@@ -2601,7 +2601,7 @@
           <w14:ligatures w14:val="standardContextual"/>
         </w:rPr>
       </w:pPr>
-      <w:hyperlink w:anchor="_Toc244073777" w:history="1">
+      <w:hyperlink w:anchor="_Toc244088688" w:history="1">
         <w:r>
           <w:rPr>
             <w:rStyle w:val="Hipervnculo"/>
@@ -2628,7 +2628,7 @@
             <w:noProof/>
             <w:webHidden/>
           </w:rPr>
-          <w:instrText xml:space="preserve"> PAGEREF _Toc244073777 \h </w:instrText>
+          <w:instrText xml:space="preserve"> PAGEREF _Toc244088688 \h </w:instrText>
         </w:r>
         <w:r>
           <w:rPr>
@@ -2675,7 +2675,7 @@
           <w14:ligatures w14:val="standardContextual"/>
         </w:rPr>
       </w:pPr>
-      <w:hyperlink w:anchor="_Toc244073778" w:history="1">
+      <w:hyperlink w:anchor="_Toc244088689" w:history="1">
         <w:r>
           <w:rPr>
             <w:rStyle w:val="Hipervnculo"/>
@@ -2702,7 +2702,7 @@
             <w:noProof/>
             <w:webHidden/>
           </w:rPr>
-          <w:instrText xml:space="preserve"> PAGEREF _Toc244073778 \h </w:instrText>
+          <w:instrText xml:space="preserve"> PAGEREF _Toc244088689 \h </w:instrText>
         </w:r>
         <w:r>
           <w:rPr>
@@ -2749,7 +2749,7 @@
           <w14:ligatures w14:val="standardContextual"/>
         </w:rPr>
       </w:pPr>
-      <w:hyperlink w:anchor="_Toc244073779" w:history="1">
+      <w:hyperlink w:anchor="_Toc244088690" w:history="1">
         <w:r>
           <w:rPr>
             <w:rStyle w:val="Hipervnculo"/>
@@ -2776,7 +2776,7 @@
             <w:noProof/>
             <w:webHidden/>
           </w:rPr>
-          <w:instrText xml:space="preserve"> PAGEREF _Toc244073779 \h </w:instrText>
+          <w:instrText xml:space="preserve"> PAGEREF _Toc244088690 \h </w:instrText>
         </w:r>
         <w:r>
           <w:rPr>
@@ -2823,7 +2823,7 @@
           <w14:ligatures w14:val="standardContextual"/>
         </w:rPr>
       </w:pPr>
-      <w:hyperlink w:anchor="_Toc244073780" w:history="1">
+      <w:hyperlink w:anchor="_Toc244088691" w:history="1">
         <w:r>
           <w:rPr>
             <w:rStyle w:val="Hipervnculo"/>
@@ -2850,7 +2850,7 @@
             <w:noProof/>
             <w:webHidden/>
           </w:rPr>
-          <w:instrText xml:space="preserve"> PAGEREF _Toc244073780 \h </w:instrText>
+          <w:instrText xml:space="preserve"> PAGEREF _Toc244088691 \h </w:instrText>
         </w:r>
         <w:r>
           <w:rPr>
@@ -2897,7 +2897,7 @@
           <w14:ligatures w14:val="standardContextual"/>
         </w:rPr>
       </w:pPr>
-      <w:hyperlink w:anchor="_Toc244073781" w:history="1">
+      <w:hyperlink w:anchor="_Toc244088692" w:history="1">
         <w:r>
           <w:rPr>
             <w:rStyle w:val="Hipervnculo"/>
@@ -2924,7 +2924,7 @@
             <w:noProof/>
             <w:webHidden/>
           </w:rPr>
-          <w:instrText xml:space="preserve"> PAGEREF _Toc244073781 \h </w:instrText>
+          <w:instrText xml:space="preserve"> PAGEREF _Toc244088692 \h </w:instrText>
         </w:r>
         <w:r>
           <w:rPr>
@@ -2971,7 +2971,7 @@
           <w14:ligatures w14:val="standardContextual"/>
         </w:rPr>
       </w:pPr>
-      <w:hyperlink w:anchor="_Toc244073782" w:history="1">
+      <w:hyperlink w:anchor="_Toc244088693" w:history="1">
         <w:r>
           <w:rPr>
             <w:rStyle w:val="Hipervnculo"/>
@@ -2998,7 +2998,7 @@
             <w:noProof/>
             <w:webHidden/>
           </w:rPr>
-          <w:instrText xml:space="preserve"> PAGEREF _Toc244073782 \h </w:instrText>
+          <w:instrText xml:space="preserve"> PAGEREF _Toc244088693 \h </w:instrText>
         </w:r>
         <w:r>
           <w:rPr>
@@ -3045,7 +3045,7 @@
           <w14:ligatures w14:val="standardContextual"/>
         </w:rPr>
       </w:pPr>
-      <w:hyperlink w:anchor="_Toc244073783" w:history="1">
+      <w:hyperlink w:anchor="_Toc244088694" w:history="1">
         <w:r>
           <w:rPr>
             <w:rStyle w:val="Hipervnculo"/>
@@ -3072,7 +3072,7 @@
             <w:noProof/>
             <w:webHidden/>
           </w:rPr>
-          <w:instrText xml:space="preserve"> PAGEREF _Toc244073783 \h </w:instrText>
+          <w:instrText xml:space="preserve"> PAGEREF _Toc244088694 \h </w:instrText>
         </w:r>
         <w:r>
           <w:rPr>
@@ -3119,7 +3119,7 @@
           <w14:ligatures w14:val="standardContextual"/>
         </w:rPr>
       </w:pPr>
-      <w:hyperlink w:anchor="_Toc244073784" w:history="1">
+      <w:hyperlink w:anchor="_Toc244088695" w:history="1">
         <w:r>
           <w:rPr>
             <w:rStyle w:val="Hipervnculo"/>
@@ -3146,7 +3146,7 @@
             <w:noProof/>
             <w:webHidden/>
           </w:rPr>
-          <w:instrText xml:space="preserve"> PAGEREF _Toc244073784 \h </w:instrText>
+          <w:instrText xml:space="preserve"> PAGEREF _Toc244088695 \h </w:instrText>
         </w:r>
         <w:r>
           <w:rPr>
@@ -3193,7 +3193,7 @@
           <w14:ligatures w14:val="standardContextual"/>
         </w:rPr>
       </w:pPr>
-      <w:hyperlink w:anchor="_Toc244073785" w:history="1">
+      <w:hyperlink w:anchor="_Toc244088696" w:history="1">
         <w:r>
           <w:rPr>
             <w:rStyle w:val="Hipervnculo"/>
@@ -3220,7 +3220,7 @@
             <w:noProof/>
             <w:webHidden/>
           </w:rPr>
-          <w:instrText xml:space="preserve"> PAGEREF _Toc244073785 \h </w:instrText>
+          <w:instrText xml:space="preserve"> PAGEREF _Toc244088696 \h </w:instrText>
         </w:r>
         <w:r>
           <w:rPr>
@@ -3267,7 +3267,7 @@
           <w14:ligatures w14:val="standardContextual"/>
         </w:rPr>
       </w:pPr>
-      <w:hyperlink w:anchor="_Toc244073786" w:history="1">
+      <w:hyperlink w:anchor="_Toc244088697" w:history="1">
         <w:r>
           <w:rPr>
             <w:rStyle w:val="Hipervnculo"/>
@@ -3294,7 +3294,7 @@
             <w:noProof/>
             <w:webHidden/>
           </w:rPr>
-          <w:instrText xml:space="preserve"> PAGEREF _Toc244073786 \h </w:instrText>
+          <w:instrText xml:space="preserve"> PAGEREF _Toc244088697 \h </w:instrText>
         </w:r>
         <w:r>
           <w:rPr>
@@ -3341,7 +3341,7 @@
           <w14:ligatures w14:val="standardContextual"/>
         </w:rPr>
       </w:pPr>
-      <w:hyperlink w:anchor="_Toc244073787" w:history="1">
+      <w:hyperlink w:anchor="_Toc244088698" w:history="1">
         <w:r>
           <w:rPr>
             <w:rStyle w:val="Hipervnculo"/>
@@ -3368,7 +3368,7 @@
             <w:noProof/>
             <w:webHidden/>
           </w:rPr>
-          <w:instrText xml:space="preserve"> PAGEREF _Toc244073787 \h </w:instrText>
+          <w:instrText xml:space="preserve"> PAGEREF _Toc244088698 \h </w:instrText>
         </w:r>
         <w:r>
           <w:rPr>
@@ -3415,7 +3415,7 @@
           <w14:ligatures w14:val="standardContextual"/>
         </w:rPr>
       </w:pPr>
-      <w:hyperlink w:anchor="_Toc244073788" w:history="1">
+      <w:hyperlink w:anchor="_Toc244088699" w:history="1">
         <w:r>
           <w:rPr>
             <w:rStyle w:val="Hipervnculo"/>
@@ -3442,7 +3442,7 @@
             <w:noProof/>
             <w:webHidden/>
           </w:rPr>
-          <w:instrText xml:space="preserve"> PAGEREF _Toc244073788 \h </w:instrText>
+          <w:instrText xml:space="preserve"> PAGEREF _Toc244088699 \h </w:instrText>
         </w:r>
         <w:r>
           <w:rPr>
@@ -3489,7 +3489,7 @@
           <w14:ligatures w14:val="standardContextual"/>
         </w:rPr>
       </w:pPr>
-      <w:hyperlink w:anchor="_Toc244073789" w:history="1">
+      <w:hyperlink w:anchor="_Toc244088700" w:history="1">
         <w:r>
           <w:rPr>
             <w:rStyle w:val="Hipervnculo"/>
@@ -3516,7 +3516,7 @@
             <w:noProof/>
             <w:webHidden/>
           </w:rPr>
-          <w:instrText xml:space="preserve"> PAGEREF _Toc244073789 \h </w:instrText>
+          <w:instrText xml:space="preserve"> PAGEREF _Toc244088700 \h </w:instrText>
         </w:r>
         <w:r>
           <w:rPr>
@@ -3563,7 +3563,7 @@
           <w14:ligatures w14:val="standardContextual"/>
         </w:rPr>
       </w:pPr>
-      <w:hyperlink w:anchor="_Toc244073790" w:history="1">
+      <w:hyperlink w:anchor="_Toc244088701" w:history="1">
         <w:r>
           <w:rPr>
             <w:rStyle w:val="Hipervnculo"/>
@@ -3590,7 +3590,7 @@
             <w:noProof/>
             <w:webHidden/>
           </w:rPr>
-          <w:instrText xml:space="preserve"> PAGEREF _Toc244073790 \h </w:instrText>
+          <w:instrText xml:space="preserve"> PAGEREF _Toc244088701 \h </w:instrText>
         </w:r>
         <w:r>
           <w:rPr>
@@ -3637,7 +3637,7 @@
           <w14:ligatures w14:val="standardContextual"/>
         </w:rPr>
       </w:pPr>
-      <w:hyperlink w:anchor="_Toc244073791" w:history="1">
+      <w:hyperlink w:anchor="_Toc244088702" w:history="1">
         <w:r>
           <w:rPr>
             <w:rStyle w:val="Hipervnculo"/>
@@ -3664,7 +3664,7 @@
             <w:noProof/>
             <w:webHidden/>
           </w:rPr>
-          <w:instrText xml:space="preserve"> PAGEREF _Toc244073791 \h </w:instrText>
+          <w:instrText xml:space="preserve"> PAGEREF _Toc244088702 \h </w:instrText>
         </w:r>
         <w:r>
           <w:rPr>
@@ -3711,7 +3711,7 @@
           <w14:ligatures w14:val="standardContextual"/>
         </w:rPr>
       </w:pPr>
-      <w:hyperlink w:anchor="_Toc244073792" w:history="1">
+      <w:hyperlink w:anchor="_Toc244088703" w:history="1">
         <w:r>
           <w:rPr>
             <w:rStyle w:val="Hipervnculo"/>
@@ -3738,7 +3738,7 @@
             <w:noProof/>
             <w:webHidden/>
           </w:rPr>
-          <w:instrText xml:space="preserve"> PAGEREF _Toc244073792 \h </w:instrText>
+          <w:instrText xml:space="preserve"> PAGEREF _Toc244088703 \h </w:instrText>
         </w:r>
         <w:r>
           <w:rPr>
@@ -3785,7 +3785,7 @@
           <w14:ligatures w14:val="standardContextual"/>
         </w:rPr>
       </w:pPr>
-      <w:hyperlink w:anchor="_Toc244073793" w:history="1">
+      <w:hyperlink w:anchor="_Toc244088704" w:history="1">
         <w:r>
           <w:rPr>
             <w:rStyle w:val="Hipervnculo"/>
@@ -3812,7 +3812,7 @@
             <w:noProof/>
             <w:webHidden/>
           </w:rPr>
-          <w:instrText xml:space="preserve"> PAGEREF _Toc244073793 \h </w:instrText>
+          <w:instrText xml:space="preserve"> PAGEREF _Toc244088704 \h </w:instrText>
         </w:r>
         <w:r>
           <w:rPr>
@@ -3859,7 +3859,7 @@
           <w14:ligatures w14:val="standardContextual"/>
         </w:rPr>
       </w:pPr>
-      <w:hyperlink w:anchor="_Toc244073794" w:history="1">
+      <w:hyperlink w:anchor="_Toc244088705" w:history="1">
         <w:r>
           <w:rPr>
             <w:rStyle w:val="Hipervnculo"/>
@@ -3886,7 +3886,7 @@
             <w:noProof/>
             <w:webHidden/>
           </w:rPr>
-          <w:instrText xml:space="preserve"> PAGEREF _Toc244073794 \h </w:instrText>
+          <w:instrText xml:space="preserve"> PAGEREF _Toc244088705 \h </w:instrText>
         </w:r>
         <w:r>
           <w:rPr>
@@ -3933,7 +3933,7 @@
           <w14:ligatures w14:val="standardContextual"/>
         </w:rPr>
       </w:pPr>
-      <w:hyperlink w:anchor="_Toc244073795" w:history="1">
+      <w:hyperlink w:anchor="_Toc244088706" w:history="1">
         <w:r>
           <w:rPr>
             <w:rStyle w:val="Hipervnculo"/>
@@ -3960,7 +3960,7 @@
             <w:noProof/>
             <w:webHidden/>
           </w:rPr>
-          <w:instrText xml:space="preserve"> PAGEREF _Toc244073795 \h </w:instrText>
+          <w:instrText xml:space="preserve"> PAGEREF _Toc244088706 \h </w:instrText>
         </w:r>
         <w:r>
           <w:rPr>
@@ -4007,7 +4007,7 @@
           <w14:ligatures w14:val="standardContextual"/>
         </w:rPr>
       </w:pPr>
-      <w:hyperlink w:anchor="_Toc244073796" w:history="1">
+      <w:hyperlink w:anchor="_Toc244088707" w:history="1">
         <w:r>
           <w:rPr>
             <w:rStyle w:val="Hipervnculo"/>
@@ -4034,7 +4034,7 @@
             <w:noProof/>
             <w:webHidden/>
           </w:rPr>
-          <w:instrText xml:space="preserve"> PAGEREF _Toc244073796 \h </w:instrText>
+          <w:instrText xml:space="preserve"> PAGEREF _Toc244088707 \h </w:instrText>
         </w:r>
         <w:r>
           <w:rPr>
@@ -4081,7 +4081,7 @@
           <w14:ligatures w14:val="standardContextual"/>
         </w:rPr>
       </w:pPr>
-      <w:hyperlink w:anchor="_Toc244073797" w:history="1">
+      <w:hyperlink w:anchor="_Toc244088708" w:history="1">
         <w:r>
           <w:rPr>
             <w:rStyle w:val="Hipervnculo"/>
@@ -4108,7 +4108,7 @@
             <w:noProof/>
             <w:webHidden/>
           </w:rPr>
-          <w:instrText xml:space="preserve"> PAGEREF _Toc244073797 \h </w:instrText>
+          <w:instrText xml:space="preserve"> PAGEREF _Toc244088708 \h </w:instrText>
         </w:r>
         <w:r>
           <w:rPr>
@@ -4155,7 +4155,7 @@
           <w14:ligatures w14:val="standardContextual"/>
         </w:rPr>
       </w:pPr>
-      <w:hyperlink w:anchor="_Toc244073798" w:history="1">
+      <w:hyperlink w:anchor="_Toc244088709" w:history="1">
         <w:r>
           <w:rPr>
             <w:rStyle w:val="Hipervnculo"/>
@@ -4182,7 +4182,7 @@
             <w:noProof/>
             <w:webHidden/>
           </w:rPr>
-          <w:instrText xml:space="preserve"> PAGEREF _Toc244073798 \h </w:instrText>
+          <w:instrText xml:space="preserve"> PAGEREF _Toc244088709 \h </w:instrText>
         </w:r>
         <w:r>
           <w:rPr>
@@ -4229,7 +4229,7 @@
           <w14:ligatures w14:val="standardContextual"/>
         </w:rPr>
       </w:pPr>
-      <w:hyperlink w:anchor="_Toc244073799" w:history="1">
+      <w:hyperlink w:anchor="_Toc244088710" w:history="1">
         <w:r>
           <w:rPr>
             <w:rStyle w:val="Hipervnculo"/>
@@ -4256,7 +4256,7 @@
             <w:noProof/>
             <w:webHidden/>
           </w:rPr>
-          <w:instrText xml:space="preserve"> PAGEREF _Toc244073799 \h </w:instrText>
+          <w:instrText xml:space="preserve"> PAGEREF _Toc244088710 \h </w:instrText>
         </w:r>
         <w:r>
           <w:rPr>
@@ -4303,7 +4303,7 @@
           <w14:ligatures w14:val="standardContextual"/>
         </w:rPr>
       </w:pPr>
-      <w:hyperlink w:anchor="_Toc244073800" w:history="1">
+      <w:hyperlink w:anchor="_Toc244088711" w:history="1">
         <w:r>
           <w:rPr>
             <w:rStyle w:val="Hipervnculo"/>
@@ -4330,7 +4330,7 @@
             <w:noProof/>
             <w:webHidden/>
           </w:rPr>
-          <w:instrText xml:space="preserve"> PAGEREF _Toc244073800 \h </w:instrText>
+          <w:instrText xml:space="preserve"> PAGEREF _Toc244088711 \h </w:instrText>
         </w:r>
         <w:r>
           <w:rPr>
@@ -4377,7 +4377,7 @@
           <w14:ligatures w14:val="standardContextual"/>
         </w:rPr>
       </w:pPr>
-      <w:hyperlink w:anchor="_Toc244073801" w:history="1">
+      <w:hyperlink w:anchor="_Toc244088712" w:history="1">
         <w:r>
           <w:rPr>
             <w:rStyle w:val="Hipervnculo"/>
@@ -4404,7 +4404,7 @@
             <w:noProof/>
             <w:webHidden/>
           </w:rPr>
-          <w:instrText xml:space="preserve"> PAGEREF _Toc244073801 \h </w:instrText>
+          <w:instrText xml:space="preserve"> PAGEREF _Toc244088712 \h </w:instrText>
         </w:r>
         <w:r>
           <w:rPr>
@@ -4451,7 +4451,7 @@
           <w14:ligatures w14:val="standardContextual"/>
         </w:rPr>
       </w:pPr>
-      <w:hyperlink w:anchor="_Toc244073802" w:history="1">
+      <w:hyperlink w:anchor="_Toc244088713" w:history="1">
         <w:r>
           <w:rPr>
             <w:rStyle w:val="Hipervnculo"/>
@@ -4478,7 +4478,7 @@
             <w:noProof/>
             <w:webHidden/>
           </w:rPr>
-          <w:instrText xml:space="preserve"> PAGEREF _Toc244073802 \h </w:instrText>
+          <w:instrText xml:space="preserve"> PAGEREF _Toc244088713 \h </w:instrText>
         </w:r>
         <w:r>
           <w:rPr>
@@ -4525,7 +4525,7 @@
           <w14:ligatures w14:val="standardContextual"/>
         </w:rPr>
       </w:pPr>
-      <w:hyperlink w:anchor="_Toc244073803" w:history="1">
+      <w:hyperlink w:anchor="_Toc244088714" w:history="1">
         <w:r>
           <w:rPr>
             <w:rStyle w:val="Hipervnculo"/>
@@ -4552,7 +4552,7 @@
             <w:noProof/>
             <w:webHidden/>
           </w:rPr>
-          <w:instrText xml:space="preserve"> PAGEREF _Toc244073803 \h </w:instrText>
+          <w:instrText xml:space="preserve"> PAGEREF _Toc244088714 \h </w:instrText>
         </w:r>
         <w:r>
           <w:rPr>
@@ -4599,7 +4599,7 @@
           <w14:ligatures w14:val="standardContextual"/>
         </w:rPr>
       </w:pPr>
-      <w:hyperlink w:anchor="_Toc244073804" w:history="1">
+      <w:hyperlink w:anchor="_Toc244088715" w:history="1">
         <w:r>
           <w:rPr>
             <w:rStyle w:val="Hipervnculo"/>
@@ -4626,7 +4626,7 @@
             <w:noProof/>
             <w:webHidden/>
           </w:rPr>
-          <w:instrText xml:space="preserve"> PAGEREF _Toc244073804 \h </w:instrText>
+          <w:instrText xml:space="preserve"> PAGEREF _Toc244088715 \h </w:instrText>
         </w:r>
         <w:r>
           <w:rPr>
@@ -4673,7 +4673,7 @@
           <w14:ligatures w14:val="standardContextual"/>
         </w:rPr>
       </w:pPr>
-      <w:hyperlink w:anchor="_Toc244073805" w:history="1">
+      <w:hyperlink w:anchor="_Toc244088716" w:history="1">
         <w:r>
           <w:rPr>
             <w:rStyle w:val="Hipervnculo"/>
@@ -4700,7 +4700,7 @@
             <w:noProof/>
             <w:webHidden/>
           </w:rPr>
-          <w:instrText xml:space="preserve"> PAGEREF _Toc244073805 \h </w:instrText>
+          <w:instrText xml:space="preserve"> PAGEREF _Toc244088716 \h </w:instrText>
         </w:r>
         <w:r>
           <w:rPr>
@@ -4747,7 +4747,7 @@
           <w14:ligatures w14:val="standardContextual"/>
         </w:rPr>
       </w:pPr>
-      <w:hyperlink w:anchor="_Toc244073806" w:history="1">
+      <w:hyperlink w:anchor="_Toc244088717" w:history="1">
         <w:r>
           <w:rPr>
             <w:rStyle w:val="Hipervnculo"/>
@@ -4774,7 +4774,7 @@
             <w:noProof/>
             <w:webHidden/>
           </w:rPr>
-          <w:instrText xml:space="preserve"> PAGEREF _Toc244073806 \h </w:instrText>
+          <w:instrText xml:space="preserve"> PAGEREF _Toc244088717 \h </w:instrText>
         </w:r>
         <w:r>
           <w:rPr>
@@ -4821,7 +4821,7 @@
           <w14:ligatures w14:val="standardContextual"/>
         </w:rPr>
       </w:pPr>
-      <w:hyperlink w:anchor="_Toc244073807" w:history="1">
+      <w:hyperlink w:anchor="_Toc244088718" w:history="1">
         <w:r>
           <w:rPr>
             <w:rStyle w:val="Hipervnculo"/>
@@ -4848,7 +4848,7 @@
             <w:noProof/>
             <w:webHidden/>
           </w:rPr>
-          <w:instrText xml:space="preserve"> PAGEREF _Toc244073807 \h </w:instrText>
+          <w:instrText xml:space="preserve"> PAGEREF _Toc244088718 \h </w:instrText>
         </w:r>
         <w:r>
           <w:rPr>
@@ -4895,7 +4895,7 @@
           <w14:ligatures w14:val="standardContextual"/>
         </w:rPr>
       </w:pPr>
-      <w:hyperlink w:anchor="_Toc244073808" w:history="1">
+      <w:hyperlink w:anchor="_Toc244088719" w:history="1">
         <w:r>
           <w:rPr>
             <w:rStyle w:val="Hipervnculo"/>
@@ -4922,7 +4922,7 @@
             <w:noProof/>
             <w:webHidden/>
           </w:rPr>
-          <w:instrText xml:space="preserve"> PAGEREF _Toc244073808 \h </w:instrText>
+          <w:instrText xml:space="preserve"> PAGEREF _Toc244088719 \h </w:instrText>
         </w:r>
         <w:r>
           <w:rPr>
@@ -4969,7 +4969,7 @@
           <w14:ligatures w14:val="standardContextual"/>
         </w:rPr>
       </w:pPr>
-      <w:hyperlink w:anchor="_Toc244073809" w:history="1">
+      <w:hyperlink w:anchor="_Toc244088720" w:history="1">
         <w:r>
           <w:rPr>
             <w:rStyle w:val="Hipervnculo"/>
@@ -4996,7 +4996,7 @@
             <w:noProof/>
             <w:webHidden/>
           </w:rPr>
-          <w:instrText xml:space="preserve"> PAGEREF _Toc244073809 \h </w:instrText>
+          <w:instrText xml:space="preserve"> PAGEREF _Toc244088720 \h </w:instrText>
         </w:r>
         <w:r>
           <w:rPr>
@@ -5043,7 +5043,7 @@
           <w14:ligatures w14:val="standardContextual"/>
         </w:rPr>
       </w:pPr>
-      <w:hyperlink w:anchor="_Toc244073810" w:history="1">
+      <w:hyperlink w:anchor="_Toc244088721" w:history="1">
         <w:r>
           <w:rPr>
             <w:rStyle w:val="Hipervnculo"/>
@@ -5070,7 +5070,7 @@
             <w:noProof/>
             <w:webHidden/>
           </w:rPr>
-          <w:instrText xml:space="preserve"> PAGEREF _Toc244073810 \h </w:instrText>
+          <w:instrText xml:space="preserve"> PAGEREF _Toc244088721 \h </w:instrText>
         </w:r>
         <w:r>
           <w:rPr>
@@ -5117,7 +5117,7 @@
           <w14:ligatures w14:val="standardContextual"/>
         </w:rPr>
       </w:pPr>
-      <w:hyperlink w:anchor="_Toc244073811" w:history="1">
+      <w:hyperlink w:anchor="_Toc244088722" w:history="1">
         <w:r>
           <w:rPr>
             <w:rStyle w:val="Hipervnculo"/>
@@ -5144,7 +5144,7 @@
             <w:noProof/>
             <w:webHidden/>
           </w:rPr>
-          <w:instrText xml:space="preserve"> PAGEREF _Toc244073811 \h </w:instrText>
+          <w:instrText xml:space="preserve"> PAGEREF _Toc244088722 \h </w:instrText>
         </w:r>
         <w:r>
           <w:rPr>
@@ -5191,7 +5191,7 @@
           <w14:ligatures w14:val="standardContextual"/>
         </w:rPr>
       </w:pPr>
-      <w:hyperlink w:anchor="_Toc244073812" w:history="1">
+      <w:hyperlink w:anchor="_Toc244088723" w:history="1">
         <w:r>
           <w:rPr>
             <w:rStyle w:val="Hipervnculo"/>
@@ -5218,7 +5218,7 @@
             <w:noProof/>
             <w:webHidden/>
           </w:rPr>
-          <w:instrText xml:space="preserve"> PAGEREF _Toc244073812 \h </w:instrText>
+          <w:instrText xml:space="preserve"> PAGEREF _Toc244088723 \h </w:instrText>
         </w:r>
         <w:r>
           <w:rPr>
@@ -5265,7 +5265,7 @@
           <w14:ligatures w14:val="standardContextual"/>
         </w:rPr>
       </w:pPr>
-      <w:hyperlink w:anchor="_Toc244073813" w:history="1">
+      <w:hyperlink w:anchor="_Toc244088724" w:history="1">
         <w:r>
           <w:rPr>
             <w:rStyle w:val="Hipervnculo"/>
@@ -5292,7 +5292,7 @@
             <w:noProof/>
             <w:webHidden/>
           </w:rPr>
-          <w:instrText xml:space="preserve"> PAGEREF _Toc244073813 \h </w:instrText>
+          <w:instrText xml:space="preserve"> PAGEREF _Toc244088724 \h </w:instrText>
         </w:r>
         <w:r>
           <w:rPr>
@@ -5339,7 +5339,7 @@
           <w14:ligatures w14:val="standardContextual"/>
         </w:rPr>
       </w:pPr>
-      <w:hyperlink w:anchor="_Toc244073814" w:history="1">
+      <w:hyperlink w:anchor="_Toc244088725" w:history="1">
         <w:r>
           <w:rPr>
             <w:rStyle w:val="Hipervnculo"/>
@@ -5366,7 +5366,7 @@
             <w:noProof/>
             <w:webHidden/>
           </w:rPr>
-          <w:instrText xml:space="preserve"> PAGEREF _Toc244073814 \h </w:instrText>
+          <w:instrText xml:space="preserve"> PAGEREF _Toc244088725 \h </w:instrText>
         </w:r>
         <w:r>
           <w:rPr>
@@ -5413,7 +5413,7 @@
           <w14:ligatures w14:val="standardContextual"/>
         </w:rPr>
       </w:pPr>
-      <w:hyperlink w:anchor="_Toc244073815" w:history="1">
+      <w:hyperlink w:anchor="_Toc244088726" w:history="1">
         <w:r>
           <w:rPr>
             <w:rStyle w:val="Hipervnculo"/>
@@ -5440,7 +5440,7 @@
             <w:noProof/>
             <w:webHidden/>
           </w:rPr>
-          <w:instrText xml:space="preserve"> PAGEREF _Toc244073815 \h </w:instrText>
+          <w:instrText xml:space="preserve"> PAGEREF _Toc244088726 \h </w:instrText>
         </w:r>
         <w:r>
           <w:rPr>
@@ -5487,7 +5487,7 @@
           <w14:ligatures w14:val="standardContextual"/>
         </w:rPr>
       </w:pPr>
-      <w:hyperlink w:anchor="_Toc244073816" w:history="1">
+      <w:hyperlink w:anchor="_Toc244088727" w:history="1">
         <w:r>
           <w:rPr>
             <w:rStyle w:val="Hipervnculo"/>
@@ -5514,7 +5514,7 @@
             <w:noProof/>
             <w:webHidden/>
           </w:rPr>
-          <w:instrText xml:space="preserve"> PAGEREF _Toc244073816 \h </w:instrText>
+          <w:instrText xml:space="preserve"> PAGEREF _Toc244088727 \h </w:instrText>
         </w:r>
         <w:r>
           <w:rPr>
@@ -5561,7 +5561,7 @@
           <w14:ligatures w14:val="standardContextual"/>
         </w:rPr>
       </w:pPr>
-      <w:hyperlink w:anchor="_Toc244073817" w:history="1">
+      <w:hyperlink w:anchor="_Toc244088728" w:history="1">
         <w:r>
           <w:rPr>
             <w:rStyle w:val="Hipervnculo"/>
@@ -5588,7 +5588,7 @@
             <w:noProof/>
             <w:webHidden/>
           </w:rPr>
-          <w:instrText xml:space="preserve"> PAGEREF _Toc244073817 \h </w:instrText>
+          <w:instrText xml:space="preserve"> PAGEREF _Toc244088728 \h </w:instrText>
         </w:r>
         <w:r>
           <w:rPr>
@@ -5635,7 +5635,7 @@
           <w14:ligatures w14:val="standardContextual"/>
         </w:rPr>
       </w:pPr>
-      <w:hyperlink w:anchor="_Toc244073818" w:history="1">
+      <w:hyperlink w:anchor="_Toc244088729" w:history="1">
         <w:r>
           <w:rPr>
             <w:rStyle w:val="Hipervnculo"/>
@@ -5662,7 +5662,7 @@
             <w:noProof/>
             <w:webHidden/>
           </w:rPr>
-          <w:instrText xml:space="preserve"> PAGEREF _Toc244073818 \h </w:instrText>
+          <w:instrText xml:space="preserve"> PAGEREF _Toc244088729 \h </w:instrText>
         </w:r>
         <w:r>
           <w:rPr>
@@ -5709,7 +5709,7 @@
           <w14:ligatures w14:val="standardContextual"/>
         </w:rPr>
       </w:pPr>
-      <w:hyperlink w:anchor="_Toc244073819" w:history="1">
+      <w:hyperlink w:anchor="_Toc244088730" w:history="1">
         <w:r>
           <w:rPr>
             <w:rStyle w:val="Hipervnculo"/>
@@ -5736,7 +5736,7 @@
             <w:noProof/>
             <w:webHidden/>
           </w:rPr>
-          <w:instrText xml:space="preserve"> PAGEREF _Toc244073819 \h </w:instrText>
+          <w:instrText xml:space="preserve"> PAGEREF _Toc244088730 \h </w:instrText>
         </w:r>
         <w:r>
           <w:rPr>
@@ -5783,7 +5783,7 @@
           <w14:ligatures w14:val="standardContextual"/>
         </w:rPr>
       </w:pPr>
-      <w:hyperlink w:anchor="_Toc244073820" w:history="1">
+      <w:hyperlink w:anchor="_Toc244088731" w:history="1">
         <w:r>
           <w:rPr>
             <w:rStyle w:val="Hipervnculo"/>
@@ -5810,7 +5810,7 @@
             <w:noProof/>
             <w:webHidden/>
           </w:rPr>
-          <w:instrText xml:space="preserve"> PAGEREF _Toc244073820 \h </w:instrText>
+          <w:instrText xml:space="preserve"> PAGEREF _Toc244088731 \h </w:instrText>
         </w:r>
         <w:r>
           <w:rPr>
@@ -5857,7 +5857,7 @@
           <w14:ligatures w14:val="standardContextual"/>
         </w:rPr>
       </w:pPr>
-      <w:hyperlink w:anchor="_Toc244073821" w:history="1">
+      <w:hyperlink w:anchor="_Toc244088732" w:history="1">
         <w:r>
           <w:rPr>
             <w:rStyle w:val="Hipervnculo"/>
@@ -5884,7 +5884,7 @@
             <w:noProof/>
             <w:webHidden/>
           </w:rPr>
-          <w:instrText xml:space="preserve"> PAGEREF _Toc244073821 \h </w:instrText>
+          <w:instrText xml:space="preserve"> PAGEREF _Toc244088732 \h </w:instrText>
         </w:r>
         <w:r>
           <w:rPr>
@@ -5931,7 +5931,7 @@
           <w14:ligatures w14:val="standardContextual"/>
         </w:rPr>
       </w:pPr>
-      <w:hyperlink w:anchor="_Toc244073822" w:history="1">
+      <w:hyperlink w:anchor="_Toc244088733" w:history="1">
         <w:r>
           <w:rPr>
             <w:rStyle w:val="Hipervnculo"/>
@@ -5958,7 +5958,7 @@
             <w:noProof/>
             <w:webHidden/>
           </w:rPr>
-          <w:instrText xml:space="preserve"> PAGEREF _Toc244073822 \h </w:instrText>
+          <w:instrText xml:space="preserve"> PAGEREF _Toc244088733 \h </w:instrText>
         </w:r>
         <w:r>
           <w:rPr>
@@ -6005,7 +6005,7 @@
           <w14:ligatures w14:val="standardContextual"/>
         </w:rPr>
       </w:pPr>
-      <w:hyperlink w:anchor="_Toc244073823" w:history="1">
+      <w:hyperlink w:anchor="_Toc244088734" w:history="1">
         <w:r>
           <w:rPr>
             <w:rStyle w:val="Hipervnculo"/>
@@ -6032,7 +6032,7 @@
             <w:noProof/>
             <w:webHidden/>
           </w:rPr>
-          <w:instrText xml:space="preserve"> PAGEREF _Toc244073823 \h </w:instrText>
+          <w:instrText xml:space="preserve"> PAGEREF _Toc244088734 \h </w:instrText>
         </w:r>
         <w:r>
           <w:rPr>
@@ -6079,7 +6079,7 @@
           <w14:ligatures w14:val="standardContextual"/>
         </w:rPr>
       </w:pPr>
-      <w:hyperlink w:anchor="_Toc244073824" w:history="1">
+      <w:hyperlink w:anchor="_Toc244088735" w:history="1">
         <w:r>
           <w:rPr>
             <w:rStyle w:val="Hipervnculo"/>
@@ -6106,7 +6106,7 @@
             <w:noProof/>
             <w:webHidden/>
           </w:rPr>
-          <w:instrText xml:space="preserve"> PAGEREF _Toc244073824 \h </w:instrText>
+          <w:instrText xml:space="preserve"> PAGEREF _Toc244088735 \h </w:instrText>
         </w:r>
         <w:r>
           <w:rPr>
@@ -6153,7 +6153,7 @@
           <w14:ligatures w14:val="standardContextual"/>
         </w:rPr>
       </w:pPr>
-      <w:hyperlink w:anchor="_Toc244073825" w:history="1">
+      <w:hyperlink w:anchor="_Toc244088736" w:history="1">
         <w:r>
           <w:rPr>
             <w:rStyle w:val="Hipervnculo"/>
@@ -6180,7 +6180,7 @@
             <w:noProof/>
             <w:webHidden/>
           </w:rPr>
-          <w:instrText xml:space="preserve"> PAGEREF _Toc244073825 \h </w:instrText>
+          <w:instrText xml:space="preserve"> PAGEREF _Toc244088736 \h </w:instrText>
         </w:r>
         <w:r>
           <w:rPr>
@@ -6227,7 +6227,7 @@
           <w14:ligatures w14:val="standardContextual"/>
         </w:rPr>
       </w:pPr>
-      <w:hyperlink w:anchor="_Toc244073826" w:history="1">
+      <w:hyperlink w:anchor="_Toc244088737" w:history="1">
         <w:r>
           <w:rPr>
             <w:rStyle w:val="Hipervnculo"/>
@@ -6254,7 +6254,7 @@
             <w:noProof/>
             <w:webHidden/>
           </w:rPr>
-          <w:instrText xml:space="preserve"> PAGEREF _Toc244073826 \h </w:instrText>
+          <w:instrText xml:space="preserve"> PAGEREF _Toc244088737 \h </w:instrText>
         </w:r>
         <w:r>
           <w:rPr>
@@ -6301,7 +6301,7 @@
           <w14:ligatures w14:val="standardContextual"/>
         </w:rPr>
       </w:pPr>
-      <w:hyperlink w:anchor="_Toc244073827" w:history="1">
+      <w:hyperlink w:anchor="_Toc244088738" w:history="1">
         <w:r>
           <w:rPr>
             <w:rStyle w:val="Hipervnculo"/>
@@ -6328,7 +6328,7 @@
             <w:noProof/>
             <w:webHidden/>
           </w:rPr>
-          <w:instrText xml:space="preserve"> PAGEREF _Toc244073827 \h </w:instrText>
+          <w:instrText xml:space="preserve"> PAGEREF _Toc244088738 \h </w:instrText>
         </w:r>
         <w:r>
           <w:rPr>
@@ -6348,7 +6348,7 @@
             <w:noProof/>
             <w:webHidden/>
           </w:rPr>
-          <w:t>76</w:t>
+          <w:t>75</w:t>
         </w:r>
         <w:r>
           <w:rPr>
@@ -6375,7 +6375,7 @@
           <w14:ligatures w14:val="standardContextual"/>
         </w:rPr>
       </w:pPr>
-      <w:hyperlink w:anchor="_Toc244073828" w:history="1">
+      <w:hyperlink w:anchor="_Toc244088739" w:history="1">
         <w:r>
           <w:rPr>
             <w:rStyle w:val="Hipervnculo"/>
@@ -6402,7 +6402,7 @@
             <w:noProof/>
             <w:webHidden/>
           </w:rPr>
-          <w:instrText xml:space="preserve"> PAGEREF _Toc244073828 \h </w:instrText>
+          <w:instrText xml:space="preserve"> PAGEREF _Toc244088739 \h </w:instrText>
         </w:r>
         <w:r>
           <w:rPr>
@@ -6422,7 +6422,7 @@
             <w:noProof/>
             <w:webHidden/>
           </w:rPr>
-          <w:t>78</w:t>
+          <w:t>76</w:t>
         </w:r>
         <w:r>
           <w:rPr>
@@ -6449,7 +6449,7 @@
           <w14:ligatures w14:val="standardContextual"/>
         </w:rPr>
       </w:pPr>
-      <w:hyperlink w:anchor="_Toc244073829" w:history="1">
+      <w:hyperlink w:anchor="_Toc244088740" w:history="1">
         <w:r>
           <w:rPr>
             <w:rStyle w:val="Hipervnculo"/>
@@ -6476,7 +6476,7 @@
             <w:noProof/>
             <w:webHidden/>
           </w:rPr>
-          <w:instrText xml:space="preserve"> PAGEREF _Toc244073829 \h </w:instrText>
+          <w:instrText xml:space="preserve"> PAGEREF _Toc244088740 \h </w:instrText>
         </w:r>
         <w:r>
           <w:rPr>
@@ -6496,7 +6496,7 @@
             <w:noProof/>
             <w:webHidden/>
           </w:rPr>
-          <w:t>79</w:t>
+          <w:t>77</w:t>
         </w:r>
         <w:r>
           <w:rPr>
@@ -6523,7 +6523,7 @@
           <w14:ligatures w14:val="standardContextual"/>
         </w:rPr>
       </w:pPr>
-      <w:hyperlink w:anchor="_Toc244073830" w:history="1">
+      <w:hyperlink w:anchor="_Toc244088741" w:history="1">
         <w:r>
           <w:rPr>
             <w:rStyle w:val="Hipervnculo"/>
@@ -6550,7 +6550,7 @@
             <w:noProof/>
             <w:webHidden/>
           </w:rPr>
-          <w:instrText xml:space="preserve"> PAGEREF _Toc244073830 \h </w:instrText>
+          <w:instrText xml:space="preserve"> PAGEREF _Toc244088741 \h </w:instrText>
         </w:r>
         <w:r>
           <w:rPr>
@@ -6570,7 +6570,7 @@
             <w:noProof/>
             <w:webHidden/>
           </w:rPr>
-          <w:t>79</w:t>
+          <w:t>77</w:t>
         </w:r>
         <w:r>
           <w:rPr>
@@ -6597,7 +6597,7 @@
           <w14:ligatures w14:val="standardContextual"/>
         </w:rPr>
       </w:pPr>
-      <w:hyperlink w:anchor="_Toc244073831" w:history="1">
+      <w:hyperlink w:anchor="_Toc244088742" w:history="1">
         <w:r>
           <w:rPr>
             <w:rStyle w:val="Hipervnculo"/>
@@ -6624,7 +6624,7 @@
             <w:noProof/>
             <w:webHidden/>
           </w:rPr>
-          <w:instrText xml:space="preserve"> PAGEREF _Toc244073831 \h </w:instrText>
+          <w:instrText xml:space="preserve"> PAGEREF _Toc244088742 \h </w:instrText>
         </w:r>
         <w:r>
           <w:rPr>
@@ -6644,7 +6644,7 @@
             <w:noProof/>
             <w:webHidden/>
           </w:rPr>
-          <w:t>79</w:t>
+          <w:t>77</w:t>
         </w:r>
         <w:r>
           <w:rPr>
@@ -6671,7 +6671,7 @@
           <w14:ligatures w14:val="standardContextual"/>
         </w:rPr>
       </w:pPr>
-      <w:hyperlink w:anchor="_Toc244073832" w:history="1">
+      <w:hyperlink w:anchor="_Toc244088743" w:history="1">
         <w:r>
           <w:rPr>
             <w:rStyle w:val="Hipervnculo"/>
@@ -6698,7 +6698,7 @@
             <w:noProof/>
             <w:webHidden/>
           </w:rPr>
-          <w:instrText xml:space="preserve"> PAGEREF _Toc244073832 \h </w:instrText>
+          <w:instrText xml:space="preserve"> PAGEREF _Toc244088743 \h </w:instrText>
         </w:r>
         <w:r>
           <w:rPr>
@@ -6718,7 +6718,7 @@
             <w:noProof/>
             <w:webHidden/>
           </w:rPr>
-          <w:t>80</w:t>
+          <w:t>78</w:t>
         </w:r>
         <w:r>
           <w:rPr>
@@ -6745,7 +6745,7 @@
           <w14:ligatures w14:val="standardContextual"/>
         </w:rPr>
       </w:pPr>
-      <w:hyperlink w:anchor="_Toc244073833" w:history="1">
+      <w:hyperlink w:anchor="_Toc244088744" w:history="1">
         <w:r>
           <w:rPr>
             <w:rStyle w:val="Hipervnculo"/>
@@ -6772,7 +6772,7 @@
             <w:noProof/>
             <w:webHidden/>
           </w:rPr>
-          <w:instrText xml:space="preserve"> PAGEREF _Toc244073833 \h </w:instrText>
+          <w:instrText xml:space="preserve"> PAGEREF _Toc244088744 \h </w:instrText>
         </w:r>
         <w:r>
           <w:rPr>
@@ -6792,7 +6792,7 @@
             <w:noProof/>
             <w:webHidden/>
           </w:rPr>
-          <w:t>81</w:t>
+          <w:t>79</w:t>
         </w:r>
         <w:r>
           <w:rPr>
@@ -6819,7 +6819,7 @@
           <w14:ligatures w14:val="standardContextual"/>
         </w:rPr>
       </w:pPr>
-      <w:hyperlink w:anchor="_Toc244073834" w:history="1">
+      <w:hyperlink w:anchor="_Toc244088745" w:history="1">
         <w:r>
           <w:rPr>
             <w:rStyle w:val="Hipervnculo"/>
@@ -6846,7 +6846,7 @@
             <w:noProof/>
             <w:webHidden/>
           </w:rPr>
-          <w:instrText xml:space="preserve"> PAGEREF _Toc244073834 \h </w:instrText>
+          <w:instrText xml:space="preserve"> PAGEREF _Toc244088745 \h </w:instrText>
         </w:r>
         <w:r>
           <w:rPr>
@@ -6866,7 +6866,7 @@
             <w:noProof/>
             <w:webHidden/>
           </w:rPr>
-          <w:t>81</w:t>
+          <w:t>79</w:t>
         </w:r>
         <w:r>
           <w:rPr>
@@ -6893,7 +6893,7 @@
           <w14:ligatures w14:val="standardContextual"/>
         </w:rPr>
       </w:pPr>
-      <w:hyperlink w:anchor="_Toc244073835" w:history="1">
+      <w:hyperlink w:anchor="_Toc244088746" w:history="1">
         <w:r>
           <w:rPr>
             <w:rStyle w:val="Hipervnculo"/>
@@ -6920,7 +6920,7 @@
             <w:noProof/>
             <w:webHidden/>
           </w:rPr>
-          <w:instrText xml:space="preserve"> PAGEREF _Toc244073835 \h </w:instrText>
+          <w:instrText xml:space="preserve"> PAGEREF _Toc244088746 \h </w:instrText>
         </w:r>
         <w:r>
           <w:rPr>
@@ -6940,7 +6940,7 @@
             <w:noProof/>
             <w:webHidden/>
           </w:rPr>
-          <w:t>83</w:t>
+          <w:t>81</w:t>
         </w:r>
         <w:r>
           <w:rPr>
@@ -6967,7 +6967,7 @@
           <w14:ligatures w14:val="standardContextual"/>
         </w:rPr>
       </w:pPr>
-      <w:hyperlink w:anchor="_Toc244073836" w:history="1">
+      <w:hyperlink w:anchor="_Toc244088747" w:history="1">
         <w:r>
           <w:rPr>
             <w:rStyle w:val="Hipervnculo"/>
@@ -6994,7 +6994,7 @@
             <w:noProof/>
             <w:webHidden/>
           </w:rPr>
-          <w:instrText xml:space="preserve"> PAGEREF _Toc244073836 \h </w:instrText>
+          <w:instrText xml:space="preserve"> PAGEREF _Toc244088747 \h </w:instrText>
         </w:r>
         <w:r>
           <w:rPr>
@@ -7014,7 +7014,7 @@
             <w:noProof/>
             <w:webHidden/>
           </w:rPr>
-          <w:t>84</w:t>
+          <w:t>82</w:t>
         </w:r>
         <w:r>
           <w:rPr>
@@ -7041,7 +7041,7 @@
           <w14:ligatures w14:val="standardContextual"/>
         </w:rPr>
       </w:pPr>
-      <w:hyperlink w:anchor="_Toc244073837" w:history="1">
+      <w:hyperlink w:anchor="_Toc244088748" w:history="1">
         <w:r>
           <w:rPr>
             <w:rStyle w:val="Hipervnculo"/>
@@ -7068,7 +7068,7 @@
             <w:noProof/>
             <w:webHidden/>
           </w:rPr>
-          <w:instrText xml:space="preserve"> PAGEREF _Toc244073837 \h </w:instrText>
+          <w:instrText xml:space="preserve"> PAGEREF _Toc244088748 \h </w:instrText>
         </w:r>
         <w:r>
           <w:rPr>
@@ -7088,7 +7088,7 @@
             <w:noProof/>
             <w:webHidden/>
           </w:rPr>
-          <w:t>84</w:t>
+          <w:t>82</w:t>
         </w:r>
         <w:r>
           <w:rPr>
@@ -7115,7 +7115,7 @@
           <w14:ligatures w14:val="standardContextual"/>
         </w:rPr>
       </w:pPr>
-      <w:hyperlink w:anchor="_Toc244073838" w:history="1">
+      <w:hyperlink w:anchor="_Toc244088749" w:history="1">
         <w:r>
           <w:rPr>
             <w:rStyle w:val="Hipervnculo"/>
@@ -7142,7 +7142,7 @@
             <w:noProof/>
             <w:webHidden/>
           </w:rPr>
-          <w:instrText xml:space="preserve"> PAGEREF _Toc244073838 \h </w:instrText>
+          <w:instrText xml:space="preserve"> PAGEREF _Toc244088749 \h </w:instrText>
         </w:r>
         <w:r>
           <w:rPr>
@@ -7162,7 +7162,7 @@
             <w:noProof/>
             <w:webHidden/>
           </w:rPr>
-          <w:t>85</w:t>
+          <w:t>83</w:t>
         </w:r>
         <w:r>
           <w:rPr>
@@ -7189,7 +7189,7 @@
           <w14:ligatures w14:val="standardContextual"/>
         </w:rPr>
       </w:pPr>
-      <w:hyperlink w:anchor="_Toc244073839" w:history="1">
+      <w:hyperlink w:anchor="_Toc244088750" w:history="1">
         <w:r>
           <w:rPr>
             <w:rStyle w:val="Hipervnculo"/>
@@ -7216,7 +7216,7 @@
             <w:noProof/>
             <w:webHidden/>
           </w:rPr>
-          <w:instrText xml:space="preserve"> PAGEREF _Toc244073839 \h </w:instrText>
+          <w:instrText xml:space="preserve"> PAGEREF _Toc244088750 \h </w:instrText>
         </w:r>
         <w:r>
           <w:rPr>
@@ -7236,7 +7236,7 @@
             <w:noProof/>
             <w:webHidden/>
           </w:rPr>
-          <w:t>86</w:t>
+          <w:t>84</w:t>
         </w:r>
         <w:r>
           <w:rPr>
@@ -7263,7 +7263,7 @@
           <w14:ligatures w14:val="standardContextual"/>
         </w:rPr>
       </w:pPr>
-      <w:hyperlink w:anchor="_Toc244073840" w:history="1">
+      <w:hyperlink w:anchor="_Toc244088751" w:history="1">
         <w:r>
           <w:rPr>
             <w:rStyle w:val="Hipervnculo"/>
@@ -7290,7 +7290,7 @@
             <w:noProof/>
             <w:webHidden/>
           </w:rPr>
-          <w:instrText xml:space="preserve"> PAGEREF _Toc244073840 \h </w:instrText>
+          <w:instrText xml:space="preserve"> PAGEREF _Toc244088751 \h </w:instrText>
         </w:r>
         <w:r>
           <w:rPr>
@@ -7310,7 +7310,7 @@
             <w:noProof/>
             <w:webHidden/>
           </w:rPr>
-          <w:t>86</w:t>
+          <w:t>84</w:t>
         </w:r>
         <w:r>
           <w:rPr>
@@ -7337,7 +7337,7 @@
           <w14:ligatures w14:val="standardContextual"/>
         </w:rPr>
       </w:pPr>
-      <w:hyperlink w:anchor="_Toc244073841" w:history="1">
+      <w:hyperlink w:anchor="_Toc244088752" w:history="1">
         <w:r>
           <w:rPr>
             <w:rStyle w:val="Hipervnculo"/>
@@ -7364,7 +7364,7 @@
             <w:noProof/>
             <w:webHidden/>
           </w:rPr>
-          <w:instrText xml:space="preserve"> PAGEREF _Toc244073841 \h </w:instrText>
+          <w:instrText xml:space="preserve"> PAGEREF _Toc244088752 \h </w:instrText>
         </w:r>
         <w:r>
           <w:rPr>
@@ -7384,7 +7384,7 @@
             <w:noProof/>
             <w:webHidden/>
           </w:rPr>
-          <w:t>87</w:t>
+          <w:t>85</w:t>
         </w:r>
         <w:r>
           <w:rPr>
@@ -7411,7 +7411,7 @@
           <w14:ligatures w14:val="standardContextual"/>
         </w:rPr>
       </w:pPr>
-      <w:hyperlink w:anchor="_Toc244073842" w:history="1">
+      <w:hyperlink w:anchor="_Toc244088753" w:history="1">
         <w:r>
           <w:rPr>
             <w:rStyle w:val="Hipervnculo"/>
@@ -7438,7 +7438,7 @@
             <w:noProof/>
             <w:webHidden/>
           </w:rPr>
-          <w:instrText xml:space="preserve"> PAGEREF _Toc244073842 \h </w:instrText>
+          <w:instrText xml:space="preserve"> PAGEREF _Toc244088753 \h </w:instrText>
         </w:r>
         <w:r>
           <w:rPr>
@@ -7458,7 +7458,7 @@
             <w:noProof/>
             <w:webHidden/>
           </w:rPr>
-          <w:t>87</w:t>
+          <w:t>85</w:t>
         </w:r>
         <w:r>
           <w:rPr>
@@ -7485,7 +7485,7 @@
           <w14:ligatures w14:val="standardContextual"/>
         </w:rPr>
       </w:pPr>
-      <w:hyperlink w:anchor="_Toc244073843" w:history="1">
+      <w:hyperlink w:anchor="_Toc244088754" w:history="1">
         <w:r>
           <w:rPr>
             <w:rStyle w:val="Hipervnculo"/>
@@ -7512,7 +7512,7 @@
             <w:noProof/>
             <w:webHidden/>
           </w:rPr>
-          <w:instrText xml:space="preserve"> PAGEREF _Toc244073843 \h </w:instrText>
+          <w:instrText xml:space="preserve"> PAGEREF _Toc244088754 \h </w:instrText>
         </w:r>
         <w:r>
           <w:rPr>
@@ -7532,7 +7532,7 @@
             <w:noProof/>
             <w:webHidden/>
           </w:rPr>
-          <w:t>88</w:t>
+          <w:t>86</w:t>
         </w:r>
         <w:r>
           <w:rPr>
@@ -7559,7 +7559,7 @@
           <w14:ligatures w14:val="standardContextual"/>
         </w:rPr>
       </w:pPr>
-      <w:hyperlink w:anchor="_Toc244073844" w:history="1">
+      <w:hyperlink w:anchor="_Toc244088755" w:history="1">
         <w:r>
           <w:rPr>
             <w:rStyle w:val="Hipervnculo"/>
@@ -7586,7 +7586,7 @@
             <w:noProof/>
             <w:webHidden/>
           </w:rPr>
-          <w:instrText xml:space="preserve"> PAGEREF _Toc244073844 \h </w:instrText>
+          <w:instrText xml:space="preserve"> PAGEREF _Toc244088755 \h </w:instrText>
         </w:r>
         <w:r>
           <w:rPr>
@@ -7606,7 +7606,7 @@
             <w:noProof/>
             <w:webHidden/>
           </w:rPr>
-          <w:t>89</w:t>
+          <w:t>87</w:t>
         </w:r>
         <w:r>
           <w:rPr>
@@ -7633,7 +7633,7 @@
           <w14:ligatures w14:val="standardContextual"/>
         </w:rPr>
       </w:pPr>
-      <w:hyperlink w:anchor="_Toc244073845" w:history="1">
+      <w:hyperlink w:anchor="_Toc244088756" w:history="1">
         <w:r>
           <w:rPr>
             <w:rStyle w:val="Hipervnculo"/>
@@ -7660,7 +7660,7 @@
             <w:noProof/>
             <w:webHidden/>
           </w:rPr>
-          <w:instrText xml:space="preserve"> PAGEREF _Toc244073845 \h </w:instrText>
+          <w:instrText xml:space="preserve"> PAGEREF _Toc244088756 \h </w:instrText>
         </w:r>
         <w:r>
           <w:rPr>
@@ -7680,7 +7680,7 @@
             <w:noProof/>
             <w:webHidden/>
           </w:rPr>
-          <w:t>93</w:t>
+          <w:t>91</w:t>
         </w:r>
         <w:r>
           <w:rPr>
@@ -7707,7 +7707,7 @@
           <w14:ligatures w14:val="standardContextual"/>
         </w:rPr>
       </w:pPr>
-      <w:hyperlink w:anchor="_Toc244073846" w:history="1">
+      <w:hyperlink w:anchor="_Toc244088757" w:history="1">
         <w:r>
           <w:rPr>
             <w:rStyle w:val="Hipervnculo"/>
@@ -7734,7 +7734,7 @@
             <w:noProof/>
             <w:webHidden/>
           </w:rPr>
-          <w:instrText xml:space="preserve"> PAGEREF _Toc244073846 \h </w:instrText>
+          <w:instrText xml:space="preserve"> PAGEREF _Toc244088757 \h </w:instrText>
         </w:r>
         <w:r>
           <w:rPr>
@@ -7754,7 +7754,7 @@
             <w:noProof/>
             <w:webHidden/>
           </w:rPr>
-          <w:t>93</w:t>
+          <w:t>91</w:t>
         </w:r>
         <w:r>
           <w:rPr>
@@ -7781,7 +7781,7 @@
           <w14:ligatures w14:val="standardContextual"/>
         </w:rPr>
       </w:pPr>
-      <w:hyperlink w:anchor="_Toc244073847" w:history="1">
+      <w:hyperlink w:anchor="_Toc244088758" w:history="1">
         <w:r>
           <w:rPr>
             <w:rStyle w:val="Hipervnculo"/>
@@ -7808,7 +7808,7 @@
             <w:noProof/>
             <w:webHidden/>
           </w:rPr>
-          <w:instrText xml:space="preserve"> PAGEREF _Toc244073847 \h </w:instrText>
+          <w:instrText xml:space="preserve"> PAGEREF _Toc244088758 \h </w:instrText>
         </w:r>
         <w:r>
           <w:rPr>
@@ -7828,7 +7828,7 @@
             <w:noProof/>
             <w:webHidden/>
           </w:rPr>
-          <w:t>93</w:t>
+          <w:t>91</w:t>
         </w:r>
         <w:r>
           <w:rPr>
@@ -8523,7 +8523,7 @@
       <w:r>
         <w:br w:type="page"/>
       </w:r>
-      <w:bookmarkStart w:id="1" w:name="_Toc244073747"/>
+      <w:bookmarkStart w:id="1" w:name="_Toc244088658"/>
       <w:r>
         <w:lastRenderedPageBreak/>
         <w:t>1. Introducción y objetivos</w:t>
@@ -8534,7 +8534,7 @@
       <w:pPr>
         <w:pStyle w:val="Ttulo2"/>
       </w:pPr>
-      <w:bookmarkStart w:id="2" w:name="_Toc244073748"/>
+      <w:bookmarkStart w:id="2" w:name="_Toc244088659"/>
       <w:r>
         <w:t>1.1. Contexto, motivación y justificación</w:t>
       </w:r>
@@ -8597,7 +8597,7 @@
       <w:pPr>
         <w:pStyle w:val="Ttulo2"/>
       </w:pPr>
-      <w:bookmarkStart w:id="3" w:name="_Toc244073749"/>
+      <w:bookmarkStart w:id="3" w:name="_Toc244088660"/>
       <w:r>
         <w:t>1.2. Objetivos generales y específicos</w:t>
       </w:r>
@@ -8656,7 +8656,7 @@
       <w:pPr>
         <w:pStyle w:val="Ttulo2"/>
       </w:pPr>
-      <w:bookmarkStart w:id="4" w:name="_Toc244073750"/>
+      <w:bookmarkStart w:id="4" w:name="_Toc244088661"/>
       <w:r>
         <w:t>1.3. Alcance, usuarios y limitaciones</w:t>
       </w:r>
@@ -8766,7 +8766,7 @@
         <w:pStyle w:val="Ttulo1"/>
         <w:pageBreakBefore/>
       </w:pPr>
-      <w:bookmarkStart w:id="5" w:name="_Toc244073751"/>
+      <w:bookmarkStart w:id="5" w:name="_Toc244088662"/>
       <w:r>
         <w:lastRenderedPageBreak/>
         <w:t>2. Marco teórico y estado del arte</w:t>
@@ -8777,7 +8777,7 @@
       <w:pPr>
         <w:pStyle w:val="Ttulo2"/>
       </w:pPr>
-      <w:bookmarkStart w:id="6" w:name="_Toc244073752"/>
+      <w:bookmarkStart w:id="6" w:name="_Toc244088663"/>
       <w:r>
         <w:t>2.1. Necesidades hídricas y gestión eficiente del riego</w:t>
       </w:r>
@@ -8845,7 +8845,7 @@
       <w:pPr>
         <w:pStyle w:val="Ttulo2"/>
       </w:pPr>
-      <w:bookmarkStart w:id="7" w:name="_Toc244073753"/>
+      <w:bookmarkStart w:id="7" w:name="_Toc244088664"/>
       <w:r>
         <w:t>2.2. Agricultura de precisión y aprendizaje automático</w:t>
       </w:r>
@@ -8910,7 +8910,7 @@
       <w:pPr>
         <w:pStyle w:val="Ttulo2"/>
       </w:pPr>
-      <w:bookmarkStart w:id="8" w:name="_Toc244073754"/>
+      <w:bookmarkStart w:id="8" w:name="_Toc244088665"/>
       <w:r>
         <w:t>2.3. Sistemas inteligentes de apoyo a la decisión</w:t>
       </w:r>
@@ -8974,7 +8974,7 @@
         <w:pStyle w:val="Ttulo1"/>
         <w:pageBreakBefore/>
       </w:pPr>
-      <w:bookmarkStart w:id="9" w:name="_Toc244073755"/>
+      <w:bookmarkStart w:id="9" w:name="_Toc244088666"/>
       <w:r>
         <w:lastRenderedPageBreak/>
         <w:t>3. Metodología y arquitectura del sistema</w:t>
@@ -8985,7 +8985,7 @@
       <w:pPr>
         <w:pStyle w:val="Ttulo2"/>
       </w:pPr>
-      <w:bookmarkStart w:id="10" w:name="_Toc244073756"/>
+      <w:bookmarkStart w:id="10" w:name="_Toc244088667"/>
       <w:r>
         <w:t>3.1. Fuentes, variables y calidad de los datos</w:t>
       </w:r>
@@ -9005,7 +9005,7 @@
       <w:pPr>
         <w:pStyle w:val="Ttulo3"/>
       </w:pPr>
-      <w:bookmarkStart w:id="11" w:name="_Toc244073757"/>
+      <w:bookmarkStart w:id="11" w:name="_Toc244088668"/>
       <w:r>
         <w:rPr>
           <w:sz w:val="24"/>
@@ -9677,7 +9677,7 @@
       <w:pPr>
         <w:pStyle w:val="Ttulo3"/>
       </w:pPr>
-      <w:bookmarkStart w:id="13" w:name="_Toc244073758"/>
+      <w:bookmarkStart w:id="13" w:name="_Toc244088669"/>
       <w:r>
         <w:rPr>
           <w:sz w:val="24"/>
@@ -10420,7 +10420,7 @@
       <w:pPr>
         <w:pStyle w:val="Ttulo3"/>
       </w:pPr>
-      <w:bookmarkStart w:id="15" w:name="_Toc244073759"/>
+      <w:bookmarkStart w:id="15" w:name="_Toc244088670"/>
       <w:r>
         <w:rPr>
           <w:sz w:val="24"/>
@@ -10529,7 +10529,7 @@
       <w:pPr>
         <w:pStyle w:val="Ttulo3"/>
       </w:pPr>
-      <w:bookmarkStart w:id="16" w:name="_Toc244073760"/>
+      <w:bookmarkStart w:id="16" w:name="_Toc244088671"/>
       <w:r>
         <w:rPr>
           <w:sz w:val="24"/>
@@ -10553,7 +10553,7 @@
       <w:pPr>
         <w:pStyle w:val="Ttulo2"/>
       </w:pPr>
-      <w:bookmarkStart w:id="17" w:name="_Toc244073761"/>
+      <w:bookmarkStart w:id="17" w:name="_Toc244088672"/>
       <w:r>
         <w:t>3.2. Arquitectura, tecnologías y flujo de información</w:t>
       </w:r>
@@ -10628,7 +10628,7 @@
       <w:pPr>
         <w:pStyle w:val="Ttulo3"/>
       </w:pPr>
-      <w:bookmarkStart w:id="19" w:name="_Toc244073762"/>
+      <w:bookmarkStart w:id="19" w:name="_Toc244088673"/>
       <w:r>
         <w:rPr>
           <w:sz w:val="24"/>
@@ -10765,7 +10765,7 @@
       <w:pPr>
         <w:pStyle w:val="Ttulo3"/>
       </w:pPr>
-      <w:bookmarkStart w:id="20" w:name="_Toc244073763"/>
+      <w:bookmarkStart w:id="20" w:name="_Toc244088674"/>
       <w:r>
         <w:rPr>
           <w:sz w:val="24"/>
@@ -11775,7 +11775,7 @@
       <w:pPr>
         <w:pStyle w:val="Ttulo3"/>
       </w:pPr>
-      <w:bookmarkStart w:id="22" w:name="_Toc244073764"/>
+      <w:bookmarkStart w:id="22" w:name="_Toc244088675"/>
       <w:r>
         <w:rPr>
           <w:sz w:val="24"/>
@@ -11798,7 +11798,7 @@
       <w:pPr>
         <w:pStyle w:val="Ttulo3"/>
       </w:pPr>
-      <w:bookmarkStart w:id="23" w:name="_Toc244073765"/>
+      <w:bookmarkStart w:id="23" w:name="_Toc244088676"/>
       <w:r>
         <w:rPr>
           <w:sz w:val="24"/>
@@ -11822,7 +11822,7 @@
       <w:pPr>
         <w:pStyle w:val="Ttulo2"/>
       </w:pPr>
-      <w:bookmarkStart w:id="24" w:name="_Toc244073766"/>
+      <w:bookmarkStart w:id="24" w:name="_Toc244088677"/>
       <w:r>
         <w:t>3.3. Planificación y organización del proyecto</w:t>
       </w:r>
@@ -12467,7 +12467,7 @@
         <w:pStyle w:val="Ttulo1"/>
         <w:pageBreakBefore/>
       </w:pPr>
-      <w:bookmarkStart w:id="26" w:name="_Toc244073767"/>
+      <w:bookmarkStart w:id="26" w:name="_Toc244088678"/>
       <w:r>
         <w:lastRenderedPageBreak/>
         <w:t>4. Procesamiento de datos y aprendizaje automático</w:t>
@@ -12478,7 +12478,7 @@
       <w:pPr>
         <w:pStyle w:val="Ttulo2"/>
       </w:pPr>
-      <w:bookmarkStart w:id="27" w:name="_Toc244073768"/>
+      <w:bookmarkStart w:id="27" w:name="_Toc244088679"/>
       <w:r>
         <w:t>4.1. Extracción, transformación y almacenamiento de datos</w:t>
       </w:r>
@@ -12561,7 +12561,7 @@
       <w:pPr>
         <w:pStyle w:val="Ttulo3"/>
       </w:pPr>
-      <w:bookmarkStart w:id="29" w:name="_Toc244073769"/>
+      <w:bookmarkStart w:id="29" w:name="_Toc244088680"/>
       <w:r>
         <w:rPr>
           <w:sz w:val="24"/>
@@ -13150,7 +13150,7 @@
       <w:pPr>
         <w:pStyle w:val="Ttulo3"/>
       </w:pPr>
-      <w:bookmarkStart w:id="31" w:name="_Toc244073770"/>
+      <w:bookmarkStart w:id="31" w:name="_Toc244088681"/>
       <w:r>
         <w:rPr>
           <w:sz w:val="24"/>
@@ -13620,7 +13620,7 @@
       <w:pPr>
         <w:pStyle w:val="Ttulo3"/>
       </w:pPr>
-      <w:bookmarkStart w:id="33" w:name="_Toc244073771"/>
+      <w:bookmarkStart w:id="33" w:name="_Toc244088682"/>
       <w:r>
         <w:rPr>
           <w:sz w:val="24"/>
@@ -14406,7 +14406,7 @@
       <w:pPr>
         <w:pStyle w:val="Ttulo3"/>
       </w:pPr>
-      <w:bookmarkStart w:id="35" w:name="_Toc244073772"/>
+      <w:bookmarkStart w:id="35" w:name="_Toc244088683"/>
       <w:r>
         <w:rPr>
           <w:sz w:val="24"/>
@@ -14482,7 +14482,7 @@
       <w:pPr>
         <w:pStyle w:val="Ttulo3"/>
       </w:pPr>
-      <w:bookmarkStart w:id="36" w:name="_Toc244073773"/>
+      <w:bookmarkStart w:id="36" w:name="_Toc244088684"/>
       <w:r>
         <w:rPr>
           <w:sz w:val="24"/>
@@ -14631,7 +14631,7 @@
       <w:pPr>
         <w:pStyle w:val="Ttulo3"/>
       </w:pPr>
-      <w:bookmarkStart w:id="37" w:name="_Toc244073774"/>
+      <w:bookmarkStart w:id="37" w:name="_Toc244088685"/>
       <w:r>
         <w:rPr>
           <w:sz w:val="24"/>
@@ -17250,7 +17250,7 @@
       <w:pPr>
         <w:pStyle w:val="Ttulo3"/>
       </w:pPr>
-      <w:bookmarkStart w:id="42" w:name="_Toc244073775"/>
+      <w:bookmarkStart w:id="42" w:name="_Toc244088686"/>
       <w:r>
         <w:rPr>
           <w:sz w:val="24"/>
@@ -19241,7 +19241,7 @@
       <w:pPr>
         <w:pStyle w:val="Ttulo3"/>
       </w:pPr>
-      <w:bookmarkStart w:id="44" w:name="_Toc244073776"/>
+      <w:bookmarkStart w:id="44" w:name="_Toc244088687"/>
       <w:r>
         <w:rPr>
           <w:sz w:val="24"/>
@@ -19995,7 +19995,7 @@
       <w:pPr>
         <w:pStyle w:val="Ttulo3"/>
       </w:pPr>
-      <w:bookmarkStart w:id="46" w:name="_Toc244073777"/>
+      <w:bookmarkStart w:id="46" w:name="_Toc244088688"/>
       <w:r>
         <w:rPr>
           <w:sz w:val="24"/>
@@ -20022,7 +20022,7 @@
       <w:pPr>
         <w:pStyle w:val="Ttulo3"/>
       </w:pPr>
-      <w:bookmarkStart w:id="47" w:name="_Toc244073778"/>
+      <w:bookmarkStart w:id="47" w:name="_Toc244088689"/>
       <w:r>
         <w:rPr>
           <w:sz w:val="24"/>
@@ -20050,7 +20050,7 @@
       <w:pPr>
         <w:pStyle w:val="Ttulo3"/>
       </w:pPr>
-      <w:bookmarkStart w:id="48" w:name="_Toc244073779"/>
+      <w:bookmarkStart w:id="48" w:name="_Toc244088690"/>
       <w:r>
         <w:rPr>
           <w:sz w:val="24"/>
@@ -20068,7 +20068,7 @@
       <w:pPr>
         <w:pStyle w:val="Ttulo2"/>
       </w:pPr>
-      <w:bookmarkStart w:id="49" w:name="_Toc244073780"/>
+      <w:bookmarkStart w:id="49" w:name="_Toc244088691"/>
       <w:r>
         <w:t>4.2. Análisis exploratorio y preparación de variables</w:t>
       </w:r>
@@ -20083,7 +20083,7 @@
       <w:pPr>
         <w:pStyle w:val="Ttulo3"/>
       </w:pPr>
-      <w:bookmarkStart w:id="50" w:name="_Toc244073781"/>
+      <w:bookmarkStart w:id="50" w:name="_Toc244088692"/>
       <w:r>
         <w:rPr>
           <w:sz w:val="24"/>
@@ -20617,7 +20617,7 @@
       <w:pPr>
         <w:pStyle w:val="Ttulo3"/>
       </w:pPr>
-      <w:bookmarkStart w:id="53" w:name="_Toc244073782"/>
+      <w:bookmarkStart w:id="53" w:name="_Toc244088693"/>
       <w:r>
         <w:rPr>
           <w:sz w:val="24"/>
@@ -21688,7 +21688,7 @@
       <w:pPr>
         <w:pStyle w:val="Ttulo3"/>
       </w:pPr>
-      <w:bookmarkStart w:id="57" w:name="_Toc244073783"/>
+      <w:bookmarkStart w:id="57" w:name="_Toc244088694"/>
       <w:r>
         <w:rPr>
           <w:sz w:val="24"/>
@@ -21777,7 +21777,7 @@
       <w:pPr>
         <w:pStyle w:val="Ttulo3"/>
       </w:pPr>
-      <w:bookmarkStart w:id="59" w:name="_Toc244073784"/>
+      <w:bookmarkStart w:id="59" w:name="_Toc244088695"/>
       <w:r>
         <w:rPr>
           <w:sz w:val="24"/>
@@ -21860,7 +21860,7 @@
       <w:pPr>
         <w:pStyle w:val="Ttulo3"/>
       </w:pPr>
-      <w:bookmarkStart w:id="60" w:name="_Toc244073785"/>
+      <w:bookmarkStart w:id="60" w:name="_Toc244088696"/>
       <w:r>
         <w:rPr>
           <w:sz w:val="24"/>
@@ -22400,7 +22400,7 @@
       <w:pPr>
         <w:pStyle w:val="Ttulo3"/>
       </w:pPr>
-      <w:bookmarkStart w:id="62" w:name="_Toc244073786"/>
+      <w:bookmarkStart w:id="62" w:name="_Toc244088697"/>
       <w:r>
         <w:rPr>
           <w:sz w:val="24"/>
@@ -22428,7 +22428,7 @@
       <w:pPr>
         <w:pStyle w:val="Ttulo3"/>
       </w:pPr>
-      <w:bookmarkStart w:id="63" w:name="_Toc244073787"/>
+      <w:bookmarkStart w:id="63" w:name="_Toc244088698"/>
       <w:r>
         <w:rPr>
           <w:sz w:val="24"/>
@@ -22544,7 +22544,7 @@
       <w:pPr>
         <w:pStyle w:val="Ttulo2"/>
       </w:pPr>
-      <w:bookmarkStart w:id="64" w:name="_Toc244073788"/>
+      <w:bookmarkStart w:id="64" w:name="_Toc244088699"/>
       <w:r>
         <w:lastRenderedPageBreak/>
         <w:t>4.3. Desarrollo y evaluación del modelo predictivo</w:t>
@@ -22560,7 +22560,7 @@
       <w:pPr>
         <w:pStyle w:val="Ttulo3"/>
       </w:pPr>
-      <w:bookmarkStart w:id="65" w:name="_Toc244073789"/>
+      <w:bookmarkStart w:id="65" w:name="_Toc244088700"/>
       <w:r>
         <w:rPr>
           <w:sz w:val="24"/>
@@ -22588,7 +22588,7 @@
       <w:pPr>
         <w:pStyle w:val="Ttulo3"/>
       </w:pPr>
-      <w:bookmarkStart w:id="66" w:name="_Toc244073790"/>
+      <w:bookmarkStart w:id="66" w:name="_Toc244088701"/>
       <w:r>
         <w:rPr>
           <w:sz w:val="24"/>
@@ -22614,7 +22614,7 @@
       <w:pPr>
         <w:pStyle w:val="Ttulo3"/>
       </w:pPr>
-      <w:bookmarkStart w:id="67" w:name="_Toc244073791"/>
+      <w:bookmarkStart w:id="67" w:name="_Toc244088702"/>
       <w:r>
         <w:rPr>
           <w:sz w:val="24"/>
@@ -22755,7 +22755,7 @@
       <w:pPr>
         <w:pStyle w:val="Ttulo3"/>
       </w:pPr>
-      <w:bookmarkStart w:id="68" w:name="_Toc244073792"/>
+      <w:bookmarkStart w:id="68" w:name="_Toc244088703"/>
       <w:r>
         <w:rPr>
           <w:sz w:val="24"/>
@@ -22773,7 +22773,7 @@
       <w:pPr>
         <w:pStyle w:val="Ttulo3"/>
       </w:pPr>
-      <w:bookmarkStart w:id="69" w:name="_Toc244073793"/>
+      <w:bookmarkStart w:id="69" w:name="_Toc244088704"/>
       <w:r>
         <w:rPr>
           <w:sz w:val="24"/>
@@ -23548,7 +23548,7 @@
       <w:pPr>
         <w:pStyle w:val="Ttulo3"/>
       </w:pPr>
-      <w:bookmarkStart w:id="72" w:name="_Toc244073794"/>
+      <w:bookmarkStart w:id="72" w:name="_Toc244088705"/>
       <w:r>
         <w:rPr>
           <w:sz w:val="24"/>
@@ -24446,7 +24446,7 @@
       <w:pPr>
         <w:pStyle w:val="Ttulo3"/>
       </w:pPr>
-      <w:bookmarkStart w:id="75" w:name="_Toc244073795"/>
+      <w:bookmarkStart w:id="75" w:name="_Toc244088706"/>
       <w:r>
         <w:rPr>
           <w:sz w:val="24"/>
@@ -24474,7 +24474,7 @@
       <w:pPr>
         <w:pStyle w:val="Ttulo3"/>
       </w:pPr>
-      <w:bookmarkStart w:id="76" w:name="_Toc244073796"/>
+      <w:bookmarkStart w:id="76" w:name="_Toc244088707"/>
       <w:r>
         <w:rPr>
           <w:sz w:val="24"/>
@@ -24498,7 +24498,7 @@
       <w:pPr>
         <w:pStyle w:val="Ttulo3"/>
       </w:pPr>
-      <w:bookmarkStart w:id="77" w:name="_Toc244073797"/>
+      <w:bookmarkStart w:id="77" w:name="_Toc244088708"/>
       <w:r>
         <w:rPr>
           <w:sz w:val="24"/>
@@ -24521,7 +24521,7 @@
       <w:pPr>
         <w:pStyle w:val="Ttulo3"/>
       </w:pPr>
-      <w:bookmarkStart w:id="78" w:name="_Toc244073798"/>
+      <w:bookmarkStart w:id="78" w:name="_Toc244088709"/>
       <w:r>
         <w:t>4.3.10. Reentrenamiento con datos de 2026</w:t>
       </w:r>
@@ -25254,7 +25254,7 @@
       <w:pPr>
         <w:pStyle w:val="Ttulo3"/>
       </w:pPr>
-      <w:bookmarkStart w:id="81" w:name="_Toc244073799"/>
+      <w:bookmarkStart w:id="81" w:name="_Toc244088710"/>
       <w:r>
         <w:t>4.3.11. Modelo de ETc para la aplicación</w:t>
       </w:r>
@@ -25866,7 +25866,7 @@
       <w:pPr>
         <w:pStyle w:val="Ttulo3"/>
       </w:pPr>
-      <w:bookmarkStart w:id="83" w:name="_Toc244073800"/>
+      <w:bookmarkStart w:id="83" w:name="_Toc244088711"/>
       <w:r>
         <w:lastRenderedPageBreak/>
         <w:t>4.3.12. Explicabilidad de los modelos de árboles</w:t>
@@ -26489,7 +26489,7 @@
         <w:pageBreakBefore/>
       </w:pPr>
       <w:bookmarkStart w:id="86" w:name="_Toc243495226"/>
-      <w:bookmarkStart w:id="87" w:name="_Toc244073801"/>
+      <w:bookmarkStart w:id="87" w:name="_Toc244088712"/>
       <w:r>
         <w:lastRenderedPageBreak/>
         <w:t>5. Sistema de recomendación y resultados</w:t>
@@ -26506,7 +26506,7 @@
       <w:pPr>
         <w:pStyle w:val="Ttulo2"/>
       </w:pPr>
-      <w:bookmarkStart w:id="88" w:name="_Toc244073802"/>
+      <w:bookmarkStart w:id="88" w:name="_Toc244088713"/>
       <w:r>
         <w:t>5.1. Diseño del sistema de recomendación de riego</w:t>
       </w:r>
@@ -26526,7 +26526,7 @@
       <w:pPr>
         <w:pStyle w:val="Ttulo3"/>
       </w:pPr>
-      <w:bookmarkStart w:id="89" w:name="_Toc244073803"/>
+      <w:bookmarkStart w:id="89" w:name="_Toc244088714"/>
       <w:r>
         <w:rPr>
           <w:sz w:val="24"/>
@@ -26553,7 +26553,7 @@
       <w:pPr>
         <w:pStyle w:val="Ttulo3"/>
       </w:pPr>
-      <w:bookmarkStart w:id="90" w:name="_Toc244073804"/>
+      <w:bookmarkStart w:id="90" w:name="_Toc244088715"/>
       <w:r>
         <w:rPr>
           <w:sz w:val="24"/>
@@ -26638,7 +26638,7 @@
       <w:pPr>
         <w:pStyle w:val="Ttulo3"/>
       </w:pPr>
-      <w:bookmarkStart w:id="92" w:name="_Toc244073805"/>
+      <w:bookmarkStart w:id="92" w:name="_Toc244088716"/>
       <w:r>
         <w:rPr>
           <w:sz w:val="24"/>
@@ -26687,7 +26687,7 @@
       <w:pPr>
         <w:pStyle w:val="Ttulo3"/>
       </w:pPr>
-      <w:bookmarkStart w:id="93" w:name="_Toc244073806"/>
+      <w:bookmarkStart w:id="93" w:name="_Toc244088717"/>
       <w:r>
         <w:rPr>
           <w:sz w:val="24"/>
@@ -27571,7 +27571,7 @@
       <w:pPr>
         <w:pStyle w:val="Ttulo3"/>
       </w:pPr>
-      <w:bookmarkStart w:id="95" w:name="_Toc244073807"/>
+      <w:bookmarkStart w:id="95" w:name="_Toc244088718"/>
       <w:r>
         <w:rPr>
           <w:sz w:val="24"/>
@@ -27594,7 +27594,7 @@
       <w:pPr>
         <w:pStyle w:val="Ttulo3"/>
       </w:pPr>
-      <w:bookmarkStart w:id="96" w:name="_Toc244073808"/>
+      <w:bookmarkStart w:id="96" w:name="_Toc244088719"/>
       <w:r>
         <w:rPr>
           <w:sz w:val="24"/>
@@ -27613,7 +27613,7 @@
       <w:pPr>
         <w:pStyle w:val="Ttulo3"/>
       </w:pPr>
-      <w:bookmarkStart w:id="97" w:name="_Toc244073809"/>
+      <w:bookmarkStart w:id="97" w:name="_Toc244088720"/>
       <w:r>
         <w:t>5.1.7. Integración operativa de ETc y AEMET</w:t>
       </w:r>
@@ -27633,7 +27633,7 @@
       <w:pPr>
         <w:pStyle w:val="Ttulo2"/>
       </w:pPr>
-      <w:bookmarkStart w:id="98" w:name="_Toc244073810"/>
+      <w:bookmarkStart w:id="98" w:name="_Toc244088721"/>
       <w:r>
         <w:t>5.2. Aplicación y visualización de resultados</w:t>
       </w:r>
@@ -27648,7 +27648,7 @@
       <w:pPr>
         <w:pStyle w:val="Ttulo3"/>
       </w:pPr>
-      <w:bookmarkStart w:id="99" w:name="_Toc244073811"/>
+      <w:bookmarkStart w:id="99" w:name="_Toc244088722"/>
       <w:r>
         <w:rPr>
           <w:sz w:val="24"/>
@@ -27675,7 +27675,7 @@
       <w:pPr>
         <w:pStyle w:val="Ttulo3"/>
       </w:pPr>
-      <w:bookmarkStart w:id="100" w:name="_Toc244073812"/>
+      <w:bookmarkStart w:id="100" w:name="_Toc244088723"/>
       <w:r>
         <w:rPr>
           <w:sz w:val="24"/>
@@ -27703,7 +27703,7 @@
       <w:pPr>
         <w:pStyle w:val="Ttulo3"/>
       </w:pPr>
-      <w:bookmarkStart w:id="101" w:name="_Toc244073813"/>
+      <w:bookmarkStart w:id="101" w:name="_Toc244088724"/>
       <w:r>
         <w:rPr>
           <w:sz w:val="24"/>
@@ -29650,7 +29650,7 @@
       <w:pPr>
         <w:pStyle w:val="Ttulo3"/>
       </w:pPr>
-      <w:bookmarkStart w:id="104" w:name="_Toc244073814"/>
+      <w:bookmarkStart w:id="104" w:name="_Toc244088725"/>
       <w:r>
         <w:rPr>
           <w:sz w:val="24"/>
@@ -29677,7 +29677,7 @@
       <w:pPr>
         <w:pStyle w:val="Ttulo3"/>
       </w:pPr>
-      <w:bookmarkStart w:id="105" w:name="_Toc244073815"/>
+      <w:bookmarkStart w:id="105" w:name="_Toc244088726"/>
       <w:r>
         <w:rPr>
           <w:sz w:val="24"/>
@@ -29695,7 +29695,7 @@
       <w:pPr>
         <w:pStyle w:val="Ttulo3"/>
       </w:pPr>
-      <w:bookmarkStart w:id="106" w:name="_Toc244073816"/>
+      <w:bookmarkStart w:id="106" w:name="_Toc244088727"/>
       <w:r>
         <w:rPr>
           <w:sz w:val="24"/>
@@ -29713,7 +29713,7 @@
       <w:pPr>
         <w:pStyle w:val="Ttulo2"/>
       </w:pPr>
-      <w:bookmarkStart w:id="107" w:name="_Toc244073817"/>
+      <w:bookmarkStart w:id="107" w:name="_Toc244088728"/>
       <w:r>
         <w:t>5.3. Validación, resultados y análisis crítico</w:t>
       </w:r>
@@ -29733,7 +29733,7 @@
       <w:pPr>
         <w:pStyle w:val="Ttulo3"/>
       </w:pPr>
-      <w:bookmarkStart w:id="108" w:name="_Toc244073818"/>
+      <w:bookmarkStart w:id="108" w:name="_Toc244088729"/>
       <w:r>
         <w:rPr>
           <w:sz w:val="24"/>
@@ -29757,7 +29757,7 @@
       <w:pPr>
         <w:pStyle w:val="Ttulo3"/>
       </w:pPr>
-      <w:bookmarkStart w:id="109" w:name="_Toc244073819"/>
+      <w:bookmarkStart w:id="109" w:name="_Toc244088730"/>
       <w:r>
         <w:rPr>
           <w:sz w:val="24"/>
@@ -30265,7 +30265,7 @@
       <w:pPr>
         <w:pStyle w:val="Ttulo3"/>
       </w:pPr>
-      <w:bookmarkStart w:id="111" w:name="_Toc244073820"/>
+      <w:bookmarkStart w:id="111" w:name="_Toc244088731"/>
       <w:r>
         <w:rPr>
           <w:sz w:val="24"/>
@@ -31139,7 +31139,7 @@
       <w:pPr>
         <w:pStyle w:val="Ttulo3"/>
       </w:pPr>
-      <w:bookmarkStart w:id="114" w:name="_Toc244073821"/>
+      <w:bookmarkStart w:id="114" w:name="_Toc244088732"/>
       <w:r>
         <w:rPr>
           <w:sz w:val="24"/>
@@ -32246,7 +32246,7 @@
       <w:pPr>
         <w:pStyle w:val="Ttulo3"/>
       </w:pPr>
-      <w:bookmarkStart w:id="117" w:name="_Toc244073822"/>
+      <w:bookmarkStart w:id="117" w:name="_Toc244088733"/>
       <w:r>
         <w:rPr>
           <w:sz w:val="24"/>
@@ -32337,7 +32337,7 @@
       <w:pPr>
         <w:pStyle w:val="Ttulo3"/>
       </w:pPr>
-      <w:bookmarkStart w:id="119" w:name="_Toc244073823"/>
+      <w:bookmarkStart w:id="119" w:name="_Toc244088734"/>
       <w:r>
         <w:rPr>
           <w:sz w:val="24"/>
@@ -32794,7 +32794,7 @@
       <w:pPr>
         <w:pStyle w:val="Ttulo3"/>
       </w:pPr>
-      <w:bookmarkStart w:id="121" w:name="_Toc244073824"/>
+      <w:bookmarkStart w:id="121" w:name="_Toc244088735"/>
       <w:r>
         <w:rPr>
           <w:sz w:val="24"/>
@@ -33886,7 +33886,7 @@
       <w:pPr>
         <w:pStyle w:val="Ttulo3"/>
       </w:pPr>
-      <w:bookmarkStart w:id="123" w:name="_Toc244073825"/>
+      <w:bookmarkStart w:id="123" w:name="_Toc244088736"/>
       <w:r>
         <w:rPr>
           <w:sz w:val="24"/>
@@ -33904,7 +33904,7 @@
       <w:pPr>
         <w:pStyle w:val="Ttulo3"/>
       </w:pPr>
-      <w:bookmarkStart w:id="124" w:name="_Toc244073826"/>
+      <w:bookmarkStart w:id="124" w:name="_Toc244088737"/>
       <w:r>
         <w:rPr>
           <w:sz w:val="24"/>
@@ -33920,31 +33920,25 @@
     </w:p>
     <w:p>
       <w:r>
-        <w:t xml:space="preserve">Los resultados deben leerse, no obstante, con varias cautelas. La primera es que la referencia es la propia SiAR. Un error pequeño frente a ella indica que el sistema reproduce bien un cálculo oficial, no que la dosis sea la adecuada para una parcela concreta, cuyo suelo, marco de plantación, cubierta y estado del cultivo pueden diferir de las hipótesis de la estación. La segunda es que la evaluación detallada se concentra en pimiento AL01 durante 2025. La comprobación añadida en coliflor AL01, alfalfa Z06 y alcachofa BA08 muestra transferencia a otros calendarios y regiones, pero cada cultivo aporta una sola campaña de 2026. La ventaja observada no acredita generalización nacional ni estabilidad interanual. La tercera es que el tramo de prueba del piloto, </w:t>
+        <w:t>La interpretación queda condicionada por la referencia SiAR, el tamaño del piloto y la ausencia de validación de campo. El apartado 5.3.10 comprueba el comportamiento cronológico en otros tres calendarios, mientras que el apartado 6.2 reúne de forma sistemática las limitaciones de validez, predicción, funcionalidad y arquitectura. En este capítulo basta señalar que el resultado mide fidelidad al cálculo oficial y que los avisos del sistema requieren la decisión final del usuario.</w:t>
+      </w:r>
+    </w:p>
+    <w:p>
+      <w:r>
+        <w:t xml:space="preserve">Con estas limitaciones, el prototipo cumple lo que se pretendía demostrar en este capítulo: que es posible convertir datos agroclimáticos públicos en una recomendación de riego diaria y semanal, </w:t>
       </w:r>
       <w:r>
         <w:lastRenderedPageBreak/>
-        <w:t>septiembre, es atípico: tiene un Kc muy bajo, necesidades cercanas a un milímetro y una ET0 en descenso, por lo que sus errores absolutos son pequeños y poco representativos del verano.</w:t>
-      </w:r>
-    </w:p>
-    <w:p>
-      <w:r>
-        <w:t>La cuarta cautela se refiere a lo que el sistema no hace. No decide cuándo regar, porque sin balance hídrico del suelo todas las necesidades se tratan como diarias. No integra una ET0 prevista contrastada, por lo que en los horizontes largos depende de que el tiempo se mantenga. Y no se ha validado con usuarios, de modo que no hay evidencia de que la interfaz y las explicaciones resulten comprensibles para quienes tendrían que utilizarlas. Hay también situaciones en las que el sistema no debería emitir una recomendación sin que alguien la revise. Ocurre con los datos desactualizados durante más de dos días, cuando la ET0 queda fuera del intervalo observado, ante una previsión de lluvia relevante y siempre que la dotación obliga a recortar la dosis. En todos esos casos el sistema emite avisos, pero la decisión sobre qué hacer con ellos corresponde al usuario.</w:t>
-      </w:r>
-    </w:p>
-    <w:p>
-      <w:r>
-        <w:t>Con estas limitaciones, el prototipo cumple lo que se pretendía demostrar en este capítulo: que es posible convertir datos agroclimáticos públicos en una recomendación de riego diaria y semanal, explicada, trazable y evaluada frente a una referencia, con un error conocido para cada horizonte. La valoración de este resultado frente a los objetivos del trabajo se desarrolla en el capítulo 6.</w:t>
+        <w:t>explicada, trazable y evaluada frente a una referencia, con un error conocido para cada horizonte. La valoración de este resultado frente a los objetivos del trabajo se desarrolla en el capítulo 6.</w:t>
       </w:r>
     </w:p>
     <w:p>
       <w:pPr>
         <w:pStyle w:val="Ttulo3"/>
-        <w:pageBreakBefore/>
-      </w:pPr>
-      <w:bookmarkStart w:id="125" w:name="_Toc244073827"/>
-      <w:r>
-        <w:lastRenderedPageBreak/>
+        <w:keepNext w:val="0"/>
+      </w:pPr>
+      <w:bookmarkStart w:id="125" w:name="_Toc244088738"/>
+      <w:r>
         <w:t>5.3.10. Comprobación cronológica en otros cultivos y regiones</w:t>
       </w:r>
       <w:bookmarkEnd w:id="125"/>
@@ -34153,10 +34147,7 @@
           </w:tcPr>
           <w:p>
             <w:r>
-              <w:t xml:space="preserve">0,071 [−0,194; </w:t>
-            </w:r>
-            <w:r>
-              <w:t>0,321]</w:t>
+              <w:t>0,071 [−0,194; 0,321]</w:t>
             </w:r>
           </w:p>
         </w:tc>
@@ -34371,12 +34362,12 @@
     </w:p>
     <w:p>
       <w:r>
+        <w:lastRenderedPageBreak/>
         <w:t>Los intervalos por caso de la Tabla 5.8 incluyen el cero para coliflor y alfalfa; en alcachofa el límite inferior es 0,000 por redondeo. Por tanto, la evidencia más sólida corresponde al agregado y no permite afirmar una mejora concluyente para cada cultivo por separado.</w:t>
       </w:r>
     </w:p>
     <w:p>
       <w:r>
-        <w:lastRenderedPageBreak/>
         <w:t>Un bootstrap pareado por bloques temporales de siete días, con 5.000 remuestreos y semilla 42, sitúa la diferencia MAE(persistencia) − MAE(DSS) en 0,164 mm/día, con intervalo percentil del 95 % entre 0,026 y 0,303 mm/día. El 99,1 % de los remuestreos favorece al DSS. El intervalo describe incertidumbre interna de estos tramos, no generalización a otras campañas.</w:t>
       </w:r>
     </w:p>
@@ -34388,11 +34379,9 @@
     <w:p>
       <w:pPr>
         <w:pStyle w:val="Ttulo3"/>
-        <w:pageBreakBefore/>
-      </w:pPr>
-      <w:bookmarkStart w:id="126" w:name="_Toc244073828"/>
-      <w:r>
-        <w:lastRenderedPageBreak/>
+      </w:pPr>
+      <w:bookmarkStart w:id="126" w:name="_Toc244088739"/>
+      <w:r>
         <w:t>5.3.11. Reproducibilidad y evidencias</w:t>
       </w:r>
       <w:bookmarkEnd w:id="126"/>
@@ -34407,7 +34396,7 @@
         <w:pStyle w:val="Ttulo1"/>
         <w:pageBreakBefore/>
       </w:pPr>
-      <w:bookmarkStart w:id="127" w:name="_Toc244073829"/>
+      <w:bookmarkStart w:id="127" w:name="_Toc244088740"/>
       <w:r>
         <w:lastRenderedPageBreak/>
         <w:t>6. Conclusiones</w:t>
@@ -34418,7 +34407,7 @@
       <w:pPr>
         <w:pStyle w:val="Ttulo2"/>
       </w:pPr>
-      <w:bookmarkStart w:id="128" w:name="_Toc244073830"/>
+      <w:bookmarkStart w:id="128" w:name="_Toc244088741"/>
       <w:r>
         <w:t>6.1. Cumplimiento de objetivos y aportaciones</w:t>
       </w:r>
@@ -34428,7 +34417,7 @@
       <w:pPr>
         <w:pStyle w:val="Ttulo3"/>
       </w:pPr>
-      <w:bookmarkStart w:id="129" w:name="_Toc244073831"/>
+      <w:bookmarkStart w:id="129" w:name="_Toc244088742"/>
       <w:r>
         <w:rPr>
           <w:sz w:val="24"/>
@@ -35100,7 +35089,7 @@
       <w:pPr>
         <w:pStyle w:val="Ttulo3"/>
       </w:pPr>
-      <w:bookmarkStart w:id="131" w:name="_Toc244073832"/>
+      <w:bookmarkStart w:id="131" w:name="_Toc244088743"/>
       <w:r>
         <w:rPr>
           <w:sz w:val="24"/>
@@ -35137,7 +35126,7 @@
       <w:pPr>
         <w:pStyle w:val="Ttulo2"/>
       </w:pPr>
-      <w:bookmarkStart w:id="132" w:name="_Toc244073833"/>
+      <w:bookmarkStart w:id="132" w:name="_Toc244088744"/>
       <w:r>
         <w:t>6.2. Limitaciones e impacto del proyecto</w:t>
       </w:r>
@@ -35147,7 +35136,7 @@
       <w:pPr>
         <w:pStyle w:val="Ttulo3"/>
       </w:pPr>
-      <w:bookmarkStart w:id="133" w:name="_Toc244073834"/>
+      <w:bookmarkStart w:id="133" w:name="_Toc244088745"/>
       <w:r>
         <w:rPr>
           <w:sz w:val="24"/>
@@ -35731,7 +35720,7 @@
       <w:pPr>
         <w:pStyle w:val="Ttulo3"/>
       </w:pPr>
-      <w:bookmarkStart w:id="135" w:name="_Toc244073835"/>
+      <w:bookmarkStart w:id="135" w:name="_Toc244088746"/>
       <w:r>
         <w:rPr>
           <w:sz w:val="24"/>
@@ -35773,7 +35762,7 @@
       <w:pPr>
         <w:pStyle w:val="Ttulo2"/>
       </w:pPr>
-      <w:bookmarkStart w:id="136" w:name="_Toc244073836"/>
+      <w:bookmarkStart w:id="136" w:name="_Toc244088747"/>
       <w:r>
         <w:t>6.3. Mejoras y líneas futuras</w:t>
       </w:r>
@@ -35788,7 +35777,7 @@
       <w:pPr>
         <w:pStyle w:val="Ttulo3"/>
       </w:pPr>
-      <w:bookmarkStart w:id="137" w:name="_Toc244073837"/>
+      <w:bookmarkStart w:id="137" w:name="_Toc244088748"/>
       <w:r>
         <w:rPr>
           <w:sz w:val="24"/>
@@ -35806,7 +35795,7 @@
       <w:pPr>
         <w:pStyle w:val="Ttulo3"/>
       </w:pPr>
-      <w:bookmarkStart w:id="138" w:name="_Toc244073838"/>
+      <w:bookmarkStart w:id="138" w:name="_Toc244088749"/>
       <w:r>
         <w:rPr>
           <w:sz w:val="24"/>
@@ -35844,7 +35833,7 @@
       <w:pPr>
         <w:pStyle w:val="Ttulo3"/>
       </w:pPr>
-      <w:bookmarkStart w:id="139" w:name="_Toc244073839"/>
+      <w:bookmarkStart w:id="139" w:name="_Toc244088750"/>
       <w:r>
         <w:rPr>
           <w:sz w:val="24"/>
@@ -35872,7 +35861,7 @@
       <w:pPr>
         <w:pStyle w:val="Ttulo3"/>
       </w:pPr>
-      <w:bookmarkStart w:id="140" w:name="_Toc244073840"/>
+      <w:bookmarkStart w:id="140" w:name="_Toc244088751"/>
       <w:r>
         <w:rPr>
           <w:sz w:val="24"/>
@@ -35899,7 +35888,7 @@
       <w:pPr>
         <w:pStyle w:val="Ttulo3"/>
       </w:pPr>
-      <w:bookmarkStart w:id="141" w:name="_Toc244073841"/>
+      <w:bookmarkStart w:id="141" w:name="_Toc244088752"/>
       <w:r>
         <w:t>6.3.5. Operación, MLOps y control de deriva</w:t>
       </w:r>
@@ -35919,7 +35908,7 @@
       <w:pPr>
         <w:pStyle w:val="Ttulo3"/>
       </w:pPr>
-      <w:bookmarkStart w:id="142" w:name="_Toc244073842"/>
+      <w:bookmarkStart w:id="142" w:name="_Toc244088753"/>
       <w:r>
         <w:t>6.3.6. Ciencia abierta y principios FAIR</w:t>
       </w:r>
@@ -35943,7 +35932,7 @@
       <w:pPr>
         <w:pStyle w:val="Ttulo3"/>
       </w:pPr>
-      <w:bookmarkStart w:id="143" w:name="_Toc244073843"/>
+      <w:bookmarkStart w:id="143" w:name="_Toc244088754"/>
       <w:r>
         <w:t>6.3.7. Consideración final</w:t>
       </w:r>
@@ -35959,7 +35948,7 @@
         <w:pStyle w:val="Ttulo1"/>
         <w:pageBreakBefore/>
       </w:pPr>
-      <w:bookmarkStart w:id="144" w:name="_Toc244073844"/>
+      <w:bookmarkStart w:id="144" w:name="_Toc244088755"/>
       <w:r>
         <w:lastRenderedPageBreak/>
         <w:t>Referencias bibliográficas</w:t>
@@ -36887,7 +36876,7 @@
       <w:pPr>
         <w:pStyle w:val="Ttulo1"/>
       </w:pPr>
-      <w:bookmarkStart w:id="145" w:name="_Toc244073845"/>
+      <w:bookmarkStart w:id="145" w:name="_Toc244088756"/>
       <w:r>
         <w:lastRenderedPageBreak/>
         <w:t>Anexo A. Reproducción y localización de las evidencias</w:t>
@@ -36939,7 +36928,7 @@
       <w:pPr>
         <w:pStyle w:val="Ttulo2"/>
       </w:pPr>
-      <w:bookmarkStart w:id="146" w:name="_Toc244073846"/>
+      <w:bookmarkStart w:id="146" w:name="_Toc244088757"/>
       <w:r>
         <w:t>A.1. Archivos principales</w:t>
       </w:r>
@@ -37280,13 +37269,7 @@
               <w:rPr>
                 <w:sz w:val="15"/>
               </w:rPr>
-              <w:t xml:space="preserve">src/models/train_etc_for_dss.py; src/dss/predict_etc.py, engine.py y app_streamlit.py; src/analysis/build_validation_5_3.py y </w:t>
-            </w:r>
-            <w:r>
-              <w:rPr>
-                <w:sz w:val="15"/>
-              </w:rPr>
-              <w:t>build_validation_multicase_5_3.py; docs/data_samples/etc_model_deployment_2026.json, dss_validation_5_3.json y dss_validation_multicaso_5_3.json; modelos en models/deployed_etc_2026/</w:t>
+              <w:t>src/models/train_etc_for_dss.py; src/dss/predict_etc.py, engine.py y app_streamlit.py; src/analysis/build_validation_5_3.py y build_validation_multicase_5_3.py; docs/data_samples/etc_model_deployment_2026.json, dss_validation_5_3.json y dss_validation_multicaso_5_3.json; modelos en models/deployed_etc_2026/</w:t>
             </w:r>
           </w:p>
         </w:tc>
@@ -37343,13 +37326,7 @@
               <w:rPr>
                 <w:sz w:val="15"/>
               </w:rPr>
-              <w:t xml:space="preserve">tests/, incluido </w:t>
-            </w:r>
-            <w:r>
-              <w:rPr>
-                <w:sz w:val="15"/>
-              </w:rPr>
-              <w:t>test_validation_multicase_5_3.py (Kc activo, partición cronológica y bootstrap reproducible)</w:t>
+              <w:t>tests/, incluido test_validation_multicase_5_3.py (Kc activo, partición cronológica y bootstrap reproducible)</w:t>
             </w:r>
           </w:p>
         </w:tc>
@@ -37359,7 +37336,7 @@
       <w:pPr>
         <w:pStyle w:val="Ttulo2"/>
       </w:pPr>
-      <w:bookmarkStart w:id="148" w:name="_Toc244073847"/>
+      <w:bookmarkStart w:id="148" w:name="_Toc244088758"/>
       <w:r>
         <w:t>A.2. Secuencia mínima de reproducción</w:t>
       </w:r>
@@ -40544,6 +40521,12 @@
 </file>
 
 <file path=customXml/item1.xml><?xml version="1.0" encoding="utf-8"?>
+<p:properties xmlns:p="http://schemas.microsoft.com/office/2006/metadata/properties" xmlns:xsi="http://www.w3.org/2001/XMLSchema-instance" xmlns:pc="http://schemas.microsoft.com/office/infopath/2007/PartnerControls">
+  <documentManagement/>
+</p:properties>
+</file>
+
+<file path=customXml/item2.xml><?xml version="1.0" encoding="utf-8"?>
 <ct:contentTypeSchema xmlns:ct="http://schemas.microsoft.com/office/2006/metadata/contentType" xmlns:ma="http://schemas.microsoft.com/office/2006/metadata/properties/metaAttributes" ct:_="" ma:_="" ma:contentTypeName="Documento" ma:contentTypeID="0x01010019FAAD7208B57F46B26AFFED99BCE0D3" ma:contentTypeVersion="12" ma:contentTypeDescription="Crear nuevo documento." ma:contentTypeScope="" ma:versionID="1ef574cbf204855aeab3c40b347ffcdd">
   <xsd:schema xmlns:xsd="http://www.w3.org/2001/XMLSchema" xmlns:xs="http://www.w3.org/2001/XMLSchema" xmlns:p="http://schemas.microsoft.com/office/2006/metadata/properties" xmlns:ns2="9d7b9a5c-6b4f-4ca1-bb03-c38cacb734bc" xmlns:ns3="7d80c08f-e909-465c-8aa4-0e649fbe85d0" targetNamespace="http://schemas.microsoft.com/office/2006/metadata/properties" ma:root="true" ma:fieldsID="d90f8574e5bf50e8ad773515e43a9e2d" ns2:_="" ns3:_="">
     <xsd:import namespace="9d7b9a5c-6b4f-4ca1-bb03-c38cacb734bc"/>
@@ -40760,7 +40743,7 @@
 </ct:contentTypeSchema>
 </file>
 
-<file path=customXml/item2.xml><?xml version="1.0" encoding="utf-8"?>
+<file path=customXml/item3.xml><?xml version="1.0" encoding="utf-8"?>
 <?mso-contentType ?>
 <FormTemplates xmlns="http://schemas.microsoft.com/sharepoint/v3/contenttype/forms">
   <Display>DocumentLibraryForm</Display>
@@ -40769,13 +40752,16 @@
 </FormTemplates>
 </file>
 
-<file path=customXml/item3.xml><?xml version="1.0" encoding="utf-8"?>
-<p:properties xmlns:p="http://schemas.microsoft.com/office/2006/metadata/properties" xmlns:xsi="http://www.w3.org/2001/XMLSchema-instance" xmlns:pc="http://schemas.microsoft.com/office/infopath/2007/PartnerControls">
-  <documentManagement/>
-</p:properties>
+<file path=customXml/itemProps1.xml><?xml version="1.0" encoding="utf-8"?>
+<ds:datastoreItem xmlns:ds="http://schemas.openxmlformats.org/officeDocument/2006/customXml" ds:itemID="{261B0A37-6C6C-45CF-A5C4-83D994BC3980}">
+  <ds:schemaRefs>
+    <ds:schemaRef ds:uri="http://schemas.microsoft.com/office/2006/metadata/properties"/>
+    <ds:schemaRef ds:uri="http://schemas.microsoft.com/office/infopath/2007/PartnerControls"/>
+  </ds:schemaRefs>
+</ds:datastoreItem>
 </file>
 
-<file path=customXml/itemProps1.xml><?xml version="1.0" encoding="utf-8"?>
+<file path=customXml/itemProps2.xml><?xml version="1.0" encoding="utf-8"?>
 <ds:datastoreItem xmlns:ds="http://schemas.openxmlformats.org/officeDocument/2006/customXml" ds:itemID="{01B4916B-2905-40FE-B973-786E02856A77}">
   <ds:schemaRefs>
     <ds:schemaRef ds:uri="http://schemas.microsoft.com/office/2006/metadata/contentType"/>
@@ -40794,19 +40780,10 @@
 </ds:datastoreItem>
 </file>
 
-<file path=customXml/itemProps2.xml><?xml version="1.0" encoding="utf-8"?>
+<file path=customXml/itemProps3.xml><?xml version="1.0" encoding="utf-8"?>
 <ds:datastoreItem xmlns:ds="http://schemas.openxmlformats.org/officeDocument/2006/customXml" ds:itemID="{E5FD6A2B-9479-4129-9D84-6C858DBE1A90}">
   <ds:schemaRefs>
     <ds:schemaRef ds:uri="http://schemas.microsoft.com/sharepoint/v3/contenttype/forms"/>
   </ds:schemaRefs>
 </ds:datastoreItem>
-</file>
-
-<file path=customXml/itemProps3.xml><?xml version="1.0" encoding="utf-8"?>
-<ds:datastoreItem xmlns:ds="http://schemas.openxmlformats.org/officeDocument/2006/customXml" ds:itemID="{261B0A37-6C6C-45CF-A5C4-83D994BC3980}">
-  <ds:schemaRefs>
-    <ds:schemaRef ds:uri="http://schemas.microsoft.com/office/2006/metadata/properties"/>
-    <ds:schemaRef ds:uri="http://schemas.microsoft.com/office/infopath/2007/PartnerControls"/>
-  </ds:schemaRefs>
-</ds:datastoreItem>
 </file>
</xml_diff>

<commit_message>
Cerrar depuración editorial de la memoria (#34)
</commit_message>
<xml_diff>
--- a/docs/memoria/TFM_definitivo_2026-10-28.docx
+++ b/docs/memoria/TFM_definitivo_2026-10-28.docx
@@ -381,7 +381,7 @@
       <w:r>
         <w:fldChar w:fldCharType="separate"/>
       </w:r>
-      <w:hyperlink w:anchor="_Toc244073747" w:history="1">
+      <w:hyperlink w:anchor="_Toc244088658" w:history="1">
         <w:r>
           <w:rPr>
             <w:rStyle w:val="Hipervnculo"/>
@@ -408,7 +408,7 @@
             <w:noProof/>
             <w:webHidden/>
           </w:rPr>
-          <w:instrText xml:space="preserve"> PAGEREF _Toc244073747 \h </w:instrText>
+          <w:instrText xml:space="preserve"> PAGEREF _Toc244088658 \h </w:instrText>
         </w:r>
         <w:r>
           <w:rPr>
@@ -455,7 +455,7 @@
           <w14:ligatures w14:val="standardContextual"/>
         </w:rPr>
       </w:pPr>
-      <w:hyperlink w:anchor="_Toc244073748" w:history="1">
+      <w:hyperlink w:anchor="_Toc244088659" w:history="1">
         <w:r>
           <w:rPr>
             <w:rStyle w:val="Hipervnculo"/>
@@ -482,7 +482,7 @@
             <w:noProof/>
             <w:webHidden/>
           </w:rPr>
-          <w:instrText xml:space="preserve"> PAGEREF _Toc244073748 \h </w:instrText>
+          <w:instrText xml:space="preserve"> PAGEREF _Toc244088659 \h </w:instrText>
         </w:r>
         <w:r>
           <w:rPr>
@@ -529,7 +529,7 @@
           <w14:ligatures w14:val="standardContextual"/>
         </w:rPr>
       </w:pPr>
-      <w:hyperlink w:anchor="_Toc244073749" w:history="1">
+      <w:hyperlink w:anchor="_Toc244088660" w:history="1">
         <w:r>
           <w:rPr>
             <w:rStyle w:val="Hipervnculo"/>
@@ -556,7 +556,7 @@
             <w:noProof/>
             <w:webHidden/>
           </w:rPr>
-          <w:instrText xml:space="preserve"> PAGEREF _Toc244073749 \h </w:instrText>
+          <w:instrText xml:space="preserve"> PAGEREF _Toc244088660 \h </w:instrText>
         </w:r>
         <w:r>
           <w:rPr>
@@ -603,7 +603,7 @@
           <w14:ligatures w14:val="standardContextual"/>
         </w:rPr>
       </w:pPr>
-      <w:hyperlink w:anchor="_Toc244073750" w:history="1">
+      <w:hyperlink w:anchor="_Toc244088661" w:history="1">
         <w:r>
           <w:rPr>
             <w:rStyle w:val="Hipervnculo"/>
@@ -630,7 +630,7 @@
             <w:noProof/>
             <w:webHidden/>
           </w:rPr>
-          <w:instrText xml:space="preserve"> PAGEREF _Toc244073750 \h </w:instrText>
+          <w:instrText xml:space="preserve"> PAGEREF _Toc244088661 \h </w:instrText>
         </w:r>
         <w:r>
           <w:rPr>
@@ -677,7 +677,7 @@
           <w14:ligatures w14:val="standardContextual"/>
         </w:rPr>
       </w:pPr>
-      <w:hyperlink w:anchor="_Toc244073751" w:history="1">
+      <w:hyperlink w:anchor="_Toc244088662" w:history="1">
         <w:r>
           <w:rPr>
             <w:rStyle w:val="Hipervnculo"/>
@@ -704,7 +704,7 @@
             <w:noProof/>
             <w:webHidden/>
           </w:rPr>
-          <w:instrText xml:space="preserve"> PAGEREF _Toc244073751 \h </w:instrText>
+          <w:instrText xml:space="preserve"> PAGEREF _Toc244088662 \h </w:instrText>
         </w:r>
         <w:r>
           <w:rPr>
@@ -751,7 +751,7 @@
           <w14:ligatures w14:val="standardContextual"/>
         </w:rPr>
       </w:pPr>
-      <w:hyperlink w:anchor="_Toc244073752" w:history="1">
+      <w:hyperlink w:anchor="_Toc244088663" w:history="1">
         <w:r>
           <w:rPr>
             <w:rStyle w:val="Hipervnculo"/>
@@ -778,7 +778,7 @@
             <w:noProof/>
             <w:webHidden/>
           </w:rPr>
-          <w:instrText xml:space="preserve"> PAGEREF _Toc244073752 \h </w:instrText>
+          <w:instrText xml:space="preserve"> PAGEREF _Toc244088663 \h </w:instrText>
         </w:r>
         <w:r>
           <w:rPr>
@@ -825,7 +825,7 @@
           <w14:ligatures w14:val="standardContextual"/>
         </w:rPr>
       </w:pPr>
-      <w:hyperlink w:anchor="_Toc244073753" w:history="1">
+      <w:hyperlink w:anchor="_Toc244088664" w:history="1">
         <w:r>
           <w:rPr>
             <w:rStyle w:val="Hipervnculo"/>
@@ -852,7 +852,7 @@
             <w:noProof/>
             <w:webHidden/>
           </w:rPr>
-          <w:instrText xml:space="preserve"> PAGEREF _Toc244073753 \h </w:instrText>
+          <w:instrText xml:space="preserve"> PAGEREF _Toc244088664 \h </w:instrText>
         </w:r>
         <w:r>
           <w:rPr>
@@ -899,7 +899,7 @@
           <w14:ligatures w14:val="standardContextual"/>
         </w:rPr>
       </w:pPr>
-      <w:hyperlink w:anchor="_Toc244073754" w:history="1">
+      <w:hyperlink w:anchor="_Toc244088665" w:history="1">
         <w:r>
           <w:rPr>
             <w:rStyle w:val="Hipervnculo"/>
@@ -926,7 +926,7 @@
             <w:noProof/>
             <w:webHidden/>
           </w:rPr>
-          <w:instrText xml:space="preserve"> PAGEREF _Toc244073754 \h </w:instrText>
+          <w:instrText xml:space="preserve"> PAGEREF _Toc244088665 \h </w:instrText>
         </w:r>
         <w:r>
           <w:rPr>
@@ -973,7 +973,7 @@
           <w14:ligatures w14:val="standardContextual"/>
         </w:rPr>
       </w:pPr>
-      <w:hyperlink w:anchor="_Toc244073755" w:history="1">
+      <w:hyperlink w:anchor="_Toc244088666" w:history="1">
         <w:r>
           <w:rPr>
             <w:rStyle w:val="Hipervnculo"/>
@@ -1000,7 +1000,7 @@
             <w:noProof/>
             <w:webHidden/>
           </w:rPr>
-          <w:instrText xml:space="preserve"> PAGEREF _Toc244073755 \h </w:instrText>
+          <w:instrText xml:space="preserve"> PAGEREF _Toc244088666 \h </w:instrText>
         </w:r>
         <w:r>
           <w:rPr>
@@ -1047,7 +1047,7 @@
           <w14:ligatures w14:val="standardContextual"/>
         </w:rPr>
       </w:pPr>
-      <w:hyperlink w:anchor="_Toc244073756" w:history="1">
+      <w:hyperlink w:anchor="_Toc244088667" w:history="1">
         <w:r>
           <w:rPr>
             <w:rStyle w:val="Hipervnculo"/>
@@ -1074,7 +1074,7 @@
             <w:noProof/>
             <w:webHidden/>
           </w:rPr>
-          <w:instrText xml:space="preserve"> PAGEREF _Toc244073756 \h </w:instrText>
+          <w:instrText xml:space="preserve"> PAGEREF _Toc244088667 \h </w:instrText>
         </w:r>
         <w:r>
           <w:rPr>
@@ -1121,7 +1121,7 @@
           <w14:ligatures w14:val="standardContextual"/>
         </w:rPr>
       </w:pPr>
-      <w:hyperlink w:anchor="_Toc244073757" w:history="1">
+      <w:hyperlink w:anchor="_Toc244088668" w:history="1">
         <w:r>
           <w:rPr>
             <w:rStyle w:val="Hipervnculo"/>
@@ -1148,7 +1148,7 @@
             <w:noProof/>
             <w:webHidden/>
           </w:rPr>
-          <w:instrText xml:space="preserve"> PAGEREF _Toc244073757 \h </w:instrText>
+          <w:instrText xml:space="preserve"> PAGEREF _Toc244088668 \h </w:instrText>
         </w:r>
         <w:r>
           <w:rPr>
@@ -1195,7 +1195,7 @@
           <w14:ligatures w14:val="standardContextual"/>
         </w:rPr>
       </w:pPr>
-      <w:hyperlink w:anchor="_Toc244073758" w:history="1">
+      <w:hyperlink w:anchor="_Toc244088669" w:history="1">
         <w:r>
           <w:rPr>
             <w:rStyle w:val="Hipervnculo"/>
@@ -1222,7 +1222,7 @@
             <w:noProof/>
             <w:webHidden/>
           </w:rPr>
-          <w:instrText xml:space="preserve"> PAGEREF _Toc244073758 \h </w:instrText>
+          <w:instrText xml:space="preserve"> PAGEREF _Toc244088669 \h </w:instrText>
         </w:r>
         <w:r>
           <w:rPr>
@@ -1269,7 +1269,7 @@
           <w14:ligatures w14:val="standardContextual"/>
         </w:rPr>
       </w:pPr>
-      <w:hyperlink w:anchor="_Toc244073759" w:history="1">
+      <w:hyperlink w:anchor="_Toc244088670" w:history="1">
         <w:r>
           <w:rPr>
             <w:rStyle w:val="Hipervnculo"/>
@@ -1296,7 +1296,7 @@
             <w:noProof/>
             <w:webHidden/>
           </w:rPr>
-          <w:instrText xml:space="preserve"> PAGEREF _Toc244073759 \h </w:instrText>
+          <w:instrText xml:space="preserve"> PAGEREF _Toc244088670 \h </w:instrText>
         </w:r>
         <w:r>
           <w:rPr>
@@ -1343,7 +1343,7 @@
           <w14:ligatures w14:val="standardContextual"/>
         </w:rPr>
       </w:pPr>
-      <w:hyperlink w:anchor="_Toc244073760" w:history="1">
+      <w:hyperlink w:anchor="_Toc244088671" w:history="1">
         <w:r>
           <w:rPr>
             <w:rStyle w:val="Hipervnculo"/>
@@ -1370,7 +1370,7 @@
             <w:noProof/>
             <w:webHidden/>
           </w:rPr>
-          <w:instrText xml:space="preserve"> PAGEREF _Toc244073760 \h </w:instrText>
+          <w:instrText xml:space="preserve"> PAGEREF _Toc244088671 \h </w:instrText>
         </w:r>
         <w:r>
           <w:rPr>
@@ -1417,7 +1417,7 @@
           <w14:ligatures w14:val="standardContextual"/>
         </w:rPr>
       </w:pPr>
-      <w:hyperlink w:anchor="_Toc244073761" w:history="1">
+      <w:hyperlink w:anchor="_Toc244088672" w:history="1">
         <w:r>
           <w:rPr>
             <w:rStyle w:val="Hipervnculo"/>
@@ -1444,7 +1444,7 @@
             <w:noProof/>
             <w:webHidden/>
           </w:rPr>
-          <w:instrText xml:space="preserve"> PAGEREF _Toc244073761 \h </w:instrText>
+          <w:instrText xml:space="preserve"> PAGEREF _Toc244088672 \h </w:instrText>
         </w:r>
         <w:r>
           <w:rPr>
@@ -1491,7 +1491,7 @@
           <w14:ligatures w14:val="standardContextual"/>
         </w:rPr>
       </w:pPr>
-      <w:hyperlink w:anchor="_Toc244073762" w:history="1">
+      <w:hyperlink w:anchor="_Toc244088673" w:history="1">
         <w:r>
           <w:rPr>
             <w:rStyle w:val="Hipervnculo"/>
@@ -1518,7 +1518,7 @@
             <w:noProof/>
             <w:webHidden/>
           </w:rPr>
-          <w:instrText xml:space="preserve"> PAGEREF _Toc244073762 \h </w:instrText>
+          <w:instrText xml:space="preserve"> PAGEREF _Toc244088673 \h </w:instrText>
         </w:r>
         <w:r>
           <w:rPr>
@@ -1565,7 +1565,7 @@
           <w14:ligatures w14:val="standardContextual"/>
         </w:rPr>
       </w:pPr>
-      <w:hyperlink w:anchor="_Toc244073763" w:history="1">
+      <w:hyperlink w:anchor="_Toc244088674" w:history="1">
         <w:r>
           <w:rPr>
             <w:rStyle w:val="Hipervnculo"/>
@@ -1592,7 +1592,7 @@
             <w:noProof/>
             <w:webHidden/>
           </w:rPr>
-          <w:instrText xml:space="preserve"> PAGEREF _Toc244073763 \h </w:instrText>
+          <w:instrText xml:space="preserve"> PAGEREF _Toc244088674 \h </w:instrText>
         </w:r>
         <w:r>
           <w:rPr>
@@ -1639,7 +1639,7 @@
           <w14:ligatures w14:val="standardContextual"/>
         </w:rPr>
       </w:pPr>
-      <w:hyperlink w:anchor="_Toc244073764" w:history="1">
+      <w:hyperlink w:anchor="_Toc244088675" w:history="1">
         <w:r>
           <w:rPr>
             <w:rStyle w:val="Hipervnculo"/>
@@ -1666,7 +1666,7 @@
             <w:noProof/>
             <w:webHidden/>
           </w:rPr>
-          <w:instrText xml:space="preserve"> PAGEREF _Toc244073764 \h </w:instrText>
+          <w:instrText xml:space="preserve"> PAGEREF _Toc244088675 \h </w:instrText>
         </w:r>
         <w:r>
           <w:rPr>
@@ -1713,7 +1713,7 @@
           <w14:ligatures w14:val="standardContextual"/>
         </w:rPr>
       </w:pPr>
-      <w:hyperlink w:anchor="_Toc244073765" w:history="1">
+      <w:hyperlink w:anchor="_Toc244088676" w:history="1">
         <w:r>
           <w:rPr>
             <w:rStyle w:val="Hipervnculo"/>
@@ -1740,7 +1740,7 @@
             <w:noProof/>
             <w:webHidden/>
           </w:rPr>
-          <w:instrText xml:space="preserve"> PAGEREF _Toc244073765 \h </w:instrText>
+          <w:instrText xml:space="preserve"> PAGEREF _Toc244088676 \h </w:instrText>
         </w:r>
         <w:r>
           <w:rPr>
@@ -1787,7 +1787,7 @@
           <w14:ligatures w14:val="standardContextual"/>
         </w:rPr>
       </w:pPr>
-      <w:hyperlink w:anchor="_Toc244073766" w:history="1">
+      <w:hyperlink w:anchor="_Toc244088677" w:history="1">
         <w:r>
           <w:rPr>
             <w:rStyle w:val="Hipervnculo"/>
@@ -1814,7 +1814,7 @@
             <w:noProof/>
             <w:webHidden/>
           </w:rPr>
-          <w:instrText xml:space="preserve"> PAGEREF _Toc244073766 \h </w:instrText>
+          <w:instrText xml:space="preserve"> PAGEREF _Toc244088677 \h </w:instrText>
         </w:r>
         <w:r>
           <w:rPr>
@@ -1861,7 +1861,7 @@
           <w14:ligatures w14:val="standardContextual"/>
         </w:rPr>
       </w:pPr>
-      <w:hyperlink w:anchor="_Toc244073767" w:history="1">
+      <w:hyperlink w:anchor="_Toc244088678" w:history="1">
         <w:r>
           <w:rPr>
             <w:rStyle w:val="Hipervnculo"/>
@@ -1888,7 +1888,7 @@
             <w:noProof/>
             <w:webHidden/>
           </w:rPr>
-          <w:instrText xml:space="preserve"> PAGEREF _Toc244073767 \h </w:instrText>
+          <w:instrText xml:space="preserve"> PAGEREF _Toc244088678 \h </w:instrText>
         </w:r>
         <w:r>
           <w:rPr>
@@ -1935,7 +1935,7 @@
           <w14:ligatures w14:val="standardContextual"/>
         </w:rPr>
       </w:pPr>
-      <w:hyperlink w:anchor="_Toc244073768" w:history="1">
+      <w:hyperlink w:anchor="_Toc244088679" w:history="1">
         <w:r>
           <w:rPr>
             <w:rStyle w:val="Hipervnculo"/>
@@ -1962,7 +1962,7 @@
             <w:noProof/>
             <w:webHidden/>
           </w:rPr>
-          <w:instrText xml:space="preserve"> PAGEREF _Toc244073768 \h </w:instrText>
+          <w:instrText xml:space="preserve"> PAGEREF _Toc244088679 \h </w:instrText>
         </w:r>
         <w:r>
           <w:rPr>
@@ -2009,7 +2009,7 @@
           <w14:ligatures w14:val="standardContextual"/>
         </w:rPr>
       </w:pPr>
-      <w:hyperlink w:anchor="_Toc244073769" w:history="1">
+      <w:hyperlink w:anchor="_Toc244088680" w:history="1">
         <w:r>
           <w:rPr>
             <w:rStyle w:val="Hipervnculo"/>
@@ -2036,7 +2036,7 @@
             <w:noProof/>
             <w:webHidden/>
           </w:rPr>
-          <w:instrText xml:space="preserve"> PAGEREF _Toc244073769 \h </w:instrText>
+          <w:instrText xml:space="preserve"> PAGEREF _Toc244088680 \h </w:instrText>
         </w:r>
         <w:r>
           <w:rPr>
@@ -2083,7 +2083,7 @@
           <w14:ligatures w14:val="standardContextual"/>
         </w:rPr>
       </w:pPr>
-      <w:hyperlink w:anchor="_Toc244073770" w:history="1">
+      <w:hyperlink w:anchor="_Toc244088681" w:history="1">
         <w:r>
           <w:rPr>
             <w:rStyle w:val="Hipervnculo"/>
@@ -2110,7 +2110,7 @@
             <w:noProof/>
             <w:webHidden/>
           </w:rPr>
-          <w:instrText xml:space="preserve"> PAGEREF _Toc244073770 \h </w:instrText>
+          <w:instrText xml:space="preserve"> PAGEREF _Toc244088681 \h </w:instrText>
         </w:r>
         <w:r>
           <w:rPr>
@@ -2157,7 +2157,7 @@
           <w14:ligatures w14:val="standardContextual"/>
         </w:rPr>
       </w:pPr>
-      <w:hyperlink w:anchor="_Toc244073771" w:history="1">
+      <w:hyperlink w:anchor="_Toc244088682" w:history="1">
         <w:r>
           <w:rPr>
             <w:rStyle w:val="Hipervnculo"/>
@@ -2184,7 +2184,7 @@
             <w:noProof/>
             <w:webHidden/>
           </w:rPr>
-          <w:instrText xml:space="preserve"> PAGEREF _Toc244073771 \h </w:instrText>
+          <w:instrText xml:space="preserve"> PAGEREF _Toc244088682 \h </w:instrText>
         </w:r>
         <w:r>
           <w:rPr>
@@ -2231,7 +2231,7 @@
           <w14:ligatures w14:val="standardContextual"/>
         </w:rPr>
       </w:pPr>
-      <w:hyperlink w:anchor="_Toc244073772" w:history="1">
+      <w:hyperlink w:anchor="_Toc244088683" w:history="1">
         <w:r>
           <w:rPr>
             <w:rStyle w:val="Hipervnculo"/>
@@ -2258,7 +2258,7 @@
             <w:noProof/>
             <w:webHidden/>
           </w:rPr>
-          <w:instrText xml:space="preserve"> PAGEREF _Toc244073772 \h </w:instrText>
+          <w:instrText xml:space="preserve"> PAGEREF _Toc244088683 \h </w:instrText>
         </w:r>
         <w:r>
           <w:rPr>
@@ -2305,7 +2305,7 @@
           <w14:ligatures w14:val="standardContextual"/>
         </w:rPr>
       </w:pPr>
-      <w:hyperlink w:anchor="_Toc244073773" w:history="1">
+      <w:hyperlink w:anchor="_Toc244088684" w:history="1">
         <w:r>
           <w:rPr>
             <w:rStyle w:val="Hipervnculo"/>
@@ -2332,7 +2332,7 @@
             <w:noProof/>
             <w:webHidden/>
           </w:rPr>
-          <w:instrText xml:space="preserve"> PAGEREF _Toc244073773 \h </w:instrText>
+          <w:instrText xml:space="preserve"> PAGEREF _Toc244088684 \h </w:instrText>
         </w:r>
         <w:r>
           <w:rPr>
@@ -2379,7 +2379,7 @@
           <w14:ligatures w14:val="standardContextual"/>
         </w:rPr>
       </w:pPr>
-      <w:hyperlink w:anchor="_Toc244073774" w:history="1">
+      <w:hyperlink w:anchor="_Toc244088685" w:history="1">
         <w:r>
           <w:rPr>
             <w:rStyle w:val="Hipervnculo"/>
@@ -2406,7 +2406,7 @@
             <w:noProof/>
             <w:webHidden/>
           </w:rPr>
-          <w:instrText xml:space="preserve"> PAGEREF _Toc244073774 \h </w:instrText>
+          <w:instrText xml:space="preserve"> PAGEREF _Toc244088685 \h </w:instrText>
         </w:r>
         <w:r>
           <w:rPr>
@@ -2453,7 +2453,7 @@
           <w14:ligatures w14:val="standardContextual"/>
         </w:rPr>
       </w:pPr>
-      <w:hyperlink w:anchor="_Toc244073775" w:history="1">
+      <w:hyperlink w:anchor="_Toc244088686" w:history="1">
         <w:r>
           <w:rPr>
             <w:rStyle w:val="Hipervnculo"/>
@@ -2480,7 +2480,7 @@
             <w:noProof/>
             <w:webHidden/>
           </w:rPr>
-          <w:instrText xml:space="preserve"> PAGEREF _Toc244073775 \h </w:instrText>
+          <w:instrText xml:space="preserve"> PAGEREF _Toc244088686 \h </w:instrText>
         </w:r>
         <w:r>
           <w:rPr>
@@ -2527,7 +2527,7 @@
           <w14:ligatures w14:val="standardContextual"/>
         </w:rPr>
       </w:pPr>
-      <w:hyperlink w:anchor="_Toc244073776" w:history="1">
+      <w:hyperlink w:anchor="_Toc244088687" w:history="1">
         <w:r>
           <w:rPr>
             <w:rStyle w:val="Hipervnculo"/>
@@ -2554,7 +2554,7 @@
             <w:noProof/>
             <w:webHidden/>
           </w:rPr>
-          <w:instrText xml:space="preserve"> PAGEREF _Toc244073776 \h </w:instrText>
+          <w:instrText xml:space="preserve"> PAGEREF _Toc244088687 \h </w:instrText>
         </w:r>
         <w:r>
           <w:rPr>
@@ -2601,7 +2601,7 @@
           <w14:ligatures w14:val="standardContextual"/>
         </w:rPr>
       </w:pPr>
-      <w:hyperlink w:anchor="_Toc244073777" w:history="1">
+      <w:hyperlink w:anchor="_Toc244088688" w:history="1">
         <w:r>
           <w:rPr>
             <w:rStyle w:val="Hipervnculo"/>
@@ -2628,7 +2628,7 @@
             <w:noProof/>
             <w:webHidden/>
           </w:rPr>
-          <w:instrText xml:space="preserve"> PAGEREF _Toc244073777 \h </w:instrText>
+          <w:instrText xml:space="preserve"> PAGEREF _Toc244088688 \h </w:instrText>
         </w:r>
         <w:r>
           <w:rPr>
@@ -2675,7 +2675,7 @@
           <w14:ligatures w14:val="standardContextual"/>
         </w:rPr>
       </w:pPr>
-      <w:hyperlink w:anchor="_Toc244073778" w:history="1">
+      <w:hyperlink w:anchor="_Toc244088689" w:history="1">
         <w:r>
           <w:rPr>
             <w:rStyle w:val="Hipervnculo"/>
@@ -2702,7 +2702,7 @@
             <w:noProof/>
             <w:webHidden/>
           </w:rPr>
-          <w:instrText xml:space="preserve"> PAGEREF _Toc244073778 \h </w:instrText>
+          <w:instrText xml:space="preserve"> PAGEREF _Toc244088689 \h </w:instrText>
         </w:r>
         <w:r>
           <w:rPr>
@@ -2749,7 +2749,7 @@
           <w14:ligatures w14:val="standardContextual"/>
         </w:rPr>
       </w:pPr>
-      <w:hyperlink w:anchor="_Toc244073779" w:history="1">
+      <w:hyperlink w:anchor="_Toc244088690" w:history="1">
         <w:r>
           <w:rPr>
             <w:rStyle w:val="Hipervnculo"/>
@@ -2776,7 +2776,7 @@
             <w:noProof/>
             <w:webHidden/>
           </w:rPr>
-          <w:instrText xml:space="preserve"> PAGEREF _Toc244073779 \h </w:instrText>
+          <w:instrText xml:space="preserve"> PAGEREF _Toc244088690 \h </w:instrText>
         </w:r>
         <w:r>
           <w:rPr>
@@ -2823,7 +2823,7 @@
           <w14:ligatures w14:val="standardContextual"/>
         </w:rPr>
       </w:pPr>
-      <w:hyperlink w:anchor="_Toc244073780" w:history="1">
+      <w:hyperlink w:anchor="_Toc244088691" w:history="1">
         <w:r>
           <w:rPr>
             <w:rStyle w:val="Hipervnculo"/>
@@ -2850,7 +2850,7 @@
             <w:noProof/>
             <w:webHidden/>
           </w:rPr>
-          <w:instrText xml:space="preserve"> PAGEREF _Toc244073780 \h </w:instrText>
+          <w:instrText xml:space="preserve"> PAGEREF _Toc244088691 \h </w:instrText>
         </w:r>
         <w:r>
           <w:rPr>
@@ -2897,7 +2897,7 @@
           <w14:ligatures w14:val="standardContextual"/>
         </w:rPr>
       </w:pPr>
-      <w:hyperlink w:anchor="_Toc244073781" w:history="1">
+      <w:hyperlink w:anchor="_Toc244088692" w:history="1">
         <w:r>
           <w:rPr>
             <w:rStyle w:val="Hipervnculo"/>
@@ -2924,7 +2924,7 @@
             <w:noProof/>
             <w:webHidden/>
           </w:rPr>
-          <w:instrText xml:space="preserve"> PAGEREF _Toc244073781 \h </w:instrText>
+          <w:instrText xml:space="preserve"> PAGEREF _Toc244088692 \h </w:instrText>
         </w:r>
         <w:r>
           <w:rPr>
@@ -2971,7 +2971,7 @@
           <w14:ligatures w14:val="standardContextual"/>
         </w:rPr>
       </w:pPr>
-      <w:hyperlink w:anchor="_Toc244073782" w:history="1">
+      <w:hyperlink w:anchor="_Toc244088693" w:history="1">
         <w:r>
           <w:rPr>
             <w:rStyle w:val="Hipervnculo"/>
@@ -2998,7 +2998,7 @@
             <w:noProof/>
             <w:webHidden/>
           </w:rPr>
-          <w:instrText xml:space="preserve"> PAGEREF _Toc244073782 \h </w:instrText>
+          <w:instrText xml:space="preserve"> PAGEREF _Toc244088693 \h </w:instrText>
         </w:r>
         <w:r>
           <w:rPr>
@@ -3045,7 +3045,7 @@
           <w14:ligatures w14:val="standardContextual"/>
         </w:rPr>
       </w:pPr>
-      <w:hyperlink w:anchor="_Toc244073783" w:history="1">
+      <w:hyperlink w:anchor="_Toc244088694" w:history="1">
         <w:r>
           <w:rPr>
             <w:rStyle w:val="Hipervnculo"/>
@@ -3072,7 +3072,7 @@
             <w:noProof/>
             <w:webHidden/>
           </w:rPr>
-          <w:instrText xml:space="preserve"> PAGEREF _Toc244073783 \h </w:instrText>
+          <w:instrText xml:space="preserve"> PAGEREF _Toc244088694 \h </w:instrText>
         </w:r>
         <w:r>
           <w:rPr>
@@ -3119,7 +3119,7 @@
           <w14:ligatures w14:val="standardContextual"/>
         </w:rPr>
       </w:pPr>
-      <w:hyperlink w:anchor="_Toc244073784" w:history="1">
+      <w:hyperlink w:anchor="_Toc244088695" w:history="1">
         <w:r>
           <w:rPr>
             <w:rStyle w:val="Hipervnculo"/>
@@ -3146,7 +3146,7 @@
             <w:noProof/>
             <w:webHidden/>
           </w:rPr>
-          <w:instrText xml:space="preserve"> PAGEREF _Toc244073784 \h </w:instrText>
+          <w:instrText xml:space="preserve"> PAGEREF _Toc244088695 \h </w:instrText>
         </w:r>
         <w:r>
           <w:rPr>
@@ -3193,7 +3193,7 @@
           <w14:ligatures w14:val="standardContextual"/>
         </w:rPr>
       </w:pPr>
-      <w:hyperlink w:anchor="_Toc244073785" w:history="1">
+      <w:hyperlink w:anchor="_Toc244088696" w:history="1">
         <w:r>
           <w:rPr>
             <w:rStyle w:val="Hipervnculo"/>
@@ -3220,7 +3220,7 @@
             <w:noProof/>
             <w:webHidden/>
           </w:rPr>
-          <w:instrText xml:space="preserve"> PAGEREF _Toc244073785 \h </w:instrText>
+          <w:instrText xml:space="preserve"> PAGEREF _Toc244088696 \h </w:instrText>
         </w:r>
         <w:r>
           <w:rPr>
@@ -3267,7 +3267,7 @@
           <w14:ligatures w14:val="standardContextual"/>
         </w:rPr>
       </w:pPr>
-      <w:hyperlink w:anchor="_Toc244073786" w:history="1">
+      <w:hyperlink w:anchor="_Toc244088697" w:history="1">
         <w:r>
           <w:rPr>
             <w:rStyle w:val="Hipervnculo"/>
@@ -3294,7 +3294,7 @@
             <w:noProof/>
             <w:webHidden/>
           </w:rPr>
-          <w:instrText xml:space="preserve"> PAGEREF _Toc244073786 \h </w:instrText>
+          <w:instrText xml:space="preserve"> PAGEREF _Toc244088697 \h </w:instrText>
         </w:r>
         <w:r>
           <w:rPr>
@@ -3341,7 +3341,7 @@
           <w14:ligatures w14:val="standardContextual"/>
         </w:rPr>
       </w:pPr>
-      <w:hyperlink w:anchor="_Toc244073787" w:history="1">
+      <w:hyperlink w:anchor="_Toc244088698" w:history="1">
         <w:r>
           <w:rPr>
             <w:rStyle w:val="Hipervnculo"/>
@@ -3368,7 +3368,7 @@
             <w:noProof/>
             <w:webHidden/>
           </w:rPr>
-          <w:instrText xml:space="preserve"> PAGEREF _Toc244073787 \h </w:instrText>
+          <w:instrText xml:space="preserve"> PAGEREF _Toc244088698 \h </w:instrText>
         </w:r>
         <w:r>
           <w:rPr>
@@ -3415,7 +3415,7 @@
           <w14:ligatures w14:val="standardContextual"/>
         </w:rPr>
       </w:pPr>
-      <w:hyperlink w:anchor="_Toc244073788" w:history="1">
+      <w:hyperlink w:anchor="_Toc244088699" w:history="1">
         <w:r>
           <w:rPr>
             <w:rStyle w:val="Hipervnculo"/>
@@ -3442,7 +3442,7 @@
             <w:noProof/>
             <w:webHidden/>
           </w:rPr>
-          <w:instrText xml:space="preserve"> PAGEREF _Toc244073788 \h </w:instrText>
+          <w:instrText xml:space="preserve"> PAGEREF _Toc244088699 \h </w:instrText>
         </w:r>
         <w:r>
           <w:rPr>
@@ -3489,7 +3489,7 @@
           <w14:ligatures w14:val="standardContextual"/>
         </w:rPr>
       </w:pPr>
-      <w:hyperlink w:anchor="_Toc244073789" w:history="1">
+      <w:hyperlink w:anchor="_Toc244088700" w:history="1">
         <w:r>
           <w:rPr>
             <w:rStyle w:val="Hipervnculo"/>
@@ -3516,7 +3516,7 @@
             <w:noProof/>
             <w:webHidden/>
           </w:rPr>
-          <w:instrText xml:space="preserve"> PAGEREF _Toc244073789 \h </w:instrText>
+          <w:instrText xml:space="preserve"> PAGEREF _Toc244088700 \h </w:instrText>
         </w:r>
         <w:r>
           <w:rPr>
@@ -3563,7 +3563,7 @@
           <w14:ligatures w14:val="standardContextual"/>
         </w:rPr>
       </w:pPr>
-      <w:hyperlink w:anchor="_Toc244073790" w:history="1">
+      <w:hyperlink w:anchor="_Toc244088701" w:history="1">
         <w:r>
           <w:rPr>
             <w:rStyle w:val="Hipervnculo"/>
@@ -3590,7 +3590,7 @@
             <w:noProof/>
             <w:webHidden/>
           </w:rPr>
-          <w:instrText xml:space="preserve"> PAGEREF _Toc244073790 \h </w:instrText>
+          <w:instrText xml:space="preserve"> PAGEREF _Toc244088701 \h </w:instrText>
         </w:r>
         <w:r>
           <w:rPr>
@@ -3637,7 +3637,7 @@
           <w14:ligatures w14:val="standardContextual"/>
         </w:rPr>
       </w:pPr>
-      <w:hyperlink w:anchor="_Toc244073791" w:history="1">
+      <w:hyperlink w:anchor="_Toc244088702" w:history="1">
         <w:r>
           <w:rPr>
             <w:rStyle w:val="Hipervnculo"/>
@@ -3664,7 +3664,7 @@
             <w:noProof/>
             <w:webHidden/>
           </w:rPr>
-          <w:instrText xml:space="preserve"> PAGEREF _Toc244073791 \h </w:instrText>
+          <w:instrText xml:space="preserve"> PAGEREF _Toc244088702 \h </w:instrText>
         </w:r>
         <w:r>
           <w:rPr>
@@ -3711,7 +3711,7 @@
           <w14:ligatures w14:val="standardContextual"/>
         </w:rPr>
       </w:pPr>
-      <w:hyperlink w:anchor="_Toc244073792" w:history="1">
+      <w:hyperlink w:anchor="_Toc244088703" w:history="1">
         <w:r>
           <w:rPr>
             <w:rStyle w:val="Hipervnculo"/>
@@ -3738,7 +3738,7 @@
             <w:noProof/>
             <w:webHidden/>
           </w:rPr>
-          <w:instrText xml:space="preserve"> PAGEREF _Toc244073792 \h </w:instrText>
+          <w:instrText xml:space="preserve"> PAGEREF _Toc244088703 \h </w:instrText>
         </w:r>
         <w:r>
           <w:rPr>
@@ -3785,7 +3785,7 @@
           <w14:ligatures w14:val="standardContextual"/>
         </w:rPr>
       </w:pPr>
-      <w:hyperlink w:anchor="_Toc244073793" w:history="1">
+      <w:hyperlink w:anchor="_Toc244088704" w:history="1">
         <w:r>
           <w:rPr>
             <w:rStyle w:val="Hipervnculo"/>
@@ -3812,7 +3812,7 @@
             <w:noProof/>
             <w:webHidden/>
           </w:rPr>
-          <w:instrText xml:space="preserve"> PAGEREF _Toc244073793 \h </w:instrText>
+          <w:instrText xml:space="preserve"> PAGEREF _Toc244088704 \h </w:instrText>
         </w:r>
         <w:r>
           <w:rPr>
@@ -3859,7 +3859,7 @@
           <w14:ligatures w14:val="standardContextual"/>
         </w:rPr>
       </w:pPr>
-      <w:hyperlink w:anchor="_Toc244073794" w:history="1">
+      <w:hyperlink w:anchor="_Toc244088705" w:history="1">
         <w:r>
           <w:rPr>
             <w:rStyle w:val="Hipervnculo"/>
@@ -3886,7 +3886,7 @@
             <w:noProof/>
             <w:webHidden/>
           </w:rPr>
-          <w:instrText xml:space="preserve"> PAGEREF _Toc244073794 \h </w:instrText>
+          <w:instrText xml:space="preserve"> PAGEREF _Toc244088705 \h </w:instrText>
         </w:r>
         <w:r>
           <w:rPr>
@@ -3933,7 +3933,7 @@
           <w14:ligatures w14:val="standardContextual"/>
         </w:rPr>
       </w:pPr>
-      <w:hyperlink w:anchor="_Toc244073795" w:history="1">
+      <w:hyperlink w:anchor="_Toc244088706" w:history="1">
         <w:r>
           <w:rPr>
             <w:rStyle w:val="Hipervnculo"/>
@@ -3960,7 +3960,7 @@
             <w:noProof/>
             <w:webHidden/>
           </w:rPr>
-          <w:instrText xml:space="preserve"> PAGEREF _Toc244073795 \h </w:instrText>
+          <w:instrText xml:space="preserve"> PAGEREF _Toc244088706 \h </w:instrText>
         </w:r>
         <w:r>
           <w:rPr>
@@ -4007,7 +4007,7 @@
           <w14:ligatures w14:val="standardContextual"/>
         </w:rPr>
       </w:pPr>
-      <w:hyperlink w:anchor="_Toc244073796" w:history="1">
+      <w:hyperlink w:anchor="_Toc244088707" w:history="1">
         <w:r>
           <w:rPr>
             <w:rStyle w:val="Hipervnculo"/>
@@ -4034,7 +4034,7 @@
             <w:noProof/>
             <w:webHidden/>
           </w:rPr>
-          <w:instrText xml:space="preserve"> PAGEREF _Toc244073796 \h </w:instrText>
+          <w:instrText xml:space="preserve"> PAGEREF _Toc244088707 \h </w:instrText>
         </w:r>
         <w:r>
           <w:rPr>
@@ -4081,7 +4081,7 @@
           <w14:ligatures w14:val="standardContextual"/>
         </w:rPr>
       </w:pPr>
-      <w:hyperlink w:anchor="_Toc244073797" w:history="1">
+      <w:hyperlink w:anchor="_Toc244088708" w:history="1">
         <w:r>
           <w:rPr>
             <w:rStyle w:val="Hipervnculo"/>
@@ -4108,7 +4108,7 @@
             <w:noProof/>
             <w:webHidden/>
           </w:rPr>
-          <w:instrText xml:space="preserve"> PAGEREF _Toc244073797 \h </w:instrText>
+          <w:instrText xml:space="preserve"> PAGEREF _Toc244088708 \h </w:instrText>
         </w:r>
         <w:r>
           <w:rPr>
@@ -4155,7 +4155,7 @@
           <w14:ligatures w14:val="standardContextual"/>
         </w:rPr>
       </w:pPr>
-      <w:hyperlink w:anchor="_Toc244073798" w:history="1">
+      <w:hyperlink w:anchor="_Toc244088709" w:history="1">
         <w:r>
           <w:rPr>
             <w:rStyle w:val="Hipervnculo"/>
@@ -4182,7 +4182,7 @@
             <w:noProof/>
             <w:webHidden/>
           </w:rPr>
-          <w:instrText xml:space="preserve"> PAGEREF _Toc244073798 \h </w:instrText>
+          <w:instrText xml:space="preserve"> PAGEREF _Toc244088709 \h </w:instrText>
         </w:r>
         <w:r>
           <w:rPr>
@@ -4229,7 +4229,7 @@
           <w14:ligatures w14:val="standardContextual"/>
         </w:rPr>
       </w:pPr>
-      <w:hyperlink w:anchor="_Toc244073799" w:history="1">
+      <w:hyperlink w:anchor="_Toc244088710" w:history="1">
         <w:r>
           <w:rPr>
             <w:rStyle w:val="Hipervnculo"/>
@@ -4256,7 +4256,7 @@
             <w:noProof/>
             <w:webHidden/>
           </w:rPr>
-          <w:instrText xml:space="preserve"> PAGEREF _Toc244073799 \h </w:instrText>
+          <w:instrText xml:space="preserve"> PAGEREF _Toc244088710 \h </w:instrText>
         </w:r>
         <w:r>
           <w:rPr>
@@ -4303,7 +4303,7 @@
           <w14:ligatures w14:val="standardContextual"/>
         </w:rPr>
       </w:pPr>
-      <w:hyperlink w:anchor="_Toc244073800" w:history="1">
+      <w:hyperlink w:anchor="_Toc244088711" w:history="1">
         <w:r>
           <w:rPr>
             <w:rStyle w:val="Hipervnculo"/>
@@ -4330,7 +4330,7 @@
             <w:noProof/>
             <w:webHidden/>
           </w:rPr>
-          <w:instrText xml:space="preserve"> PAGEREF _Toc244073800 \h </w:instrText>
+          <w:instrText xml:space="preserve"> PAGEREF _Toc244088711 \h </w:instrText>
         </w:r>
         <w:r>
           <w:rPr>
@@ -4377,7 +4377,7 @@
           <w14:ligatures w14:val="standardContextual"/>
         </w:rPr>
       </w:pPr>
-      <w:hyperlink w:anchor="_Toc244073801" w:history="1">
+      <w:hyperlink w:anchor="_Toc244088712" w:history="1">
         <w:r>
           <w:rPr>
             <w:rStyle w:val="Hipervnculo"/>
@@ -4404,7 +4404,7 @@
             <w:noProof/>
             <w:webHidden/>
           </w:rPr>
-          <w:instrText xml:space="preserve"> PAGEREF _Toc244073801 \h </w:instrText>
+          <w:instrText xml:space="preserve"> PAGEREF _Toc244088712 \h </w:instrText>
         </w:r>
         <w:r>
           <w:rPr>
@@ -4451,7 +4451,7 @@
           <w14:ligatures w14:val="standardContextual"/>
         </w:rPr>
       </w:pPr>
-      <w:hyperlink w:anchor="_Toc244073802" w:history="1">
+      <w:hyperlink w:anchor="_Toc244088713" w:history="1">
         <w:r>
           <w:rPr>
             <w:rStyle w:val="Hipervnculo"/>
@@ -4478,7 +4478,7 @@
             <w:noProof/>
             <w:webHidden/>
           </w:rPr>
-          <w:instrText xml:space="preserve"> PAGEREF _Toc244073802 \h </w:instrText>
+          <w:instrText xml:space="preserve"> PAGEREF _Toc244088713 \h </w:instrText>
         </w:r>
         <w:r>
           <w:rPr>
@@ -4525,7 +4525,7 @@
           <w14:ligatures w14:val="standardContextual"/>
         </w:rPr>
       </w:pPr>
-      <w:hyperlink w:anchor="_Toc244073803" w:history="1">
+      <w:hyperlink w:anchor="_Toc244088714" w:history="1">
         <w:r>
           <w:rPr>
             <w:rStyle w:val="Hipervnculo"/>
@@ -4552,7 +4552,7 @@
             <w:noProof/>
             <w:webHidden/>
           </w:rPr>
-          <w:instrText xml:space="preserve"> PAGEREF _Toc244073803 \h </w:instrText>
+          <w:instrText xml:space="preserve"> PAGEREF _Toc244088714 \h </w:instrText>
         </w:r>
         <w:r>
           <w:rPr>
@@ -4599,7 +4599,7 @@
           <w14:ligatures w14:val="standardContextual"/>
         </w:rPr>
       </w:pPr>
-      <w:hyperlink w:anchor="_Toc244073804" w:history="1">
+      <w:hyperlink w:anchor="_Toc244088715" w:history="1">
         <w:r>
           <w:rPr>
             <w:rStyle w:val="Hipervnculo"/>
@@ -4626,7 +4626,7 @@
             <w:noProof/>
             <w:webHidden/>
           </w:rPr>
-          <w:instrText xml:space="preserve"> PAGEREF _Toc244073804 \h </w:instrText>
+          <w:instrText xml:space="preserve"> PAGEREF _Toc244088715 \h </w:instrText>
         </w:r>
         <w:r>
           <w:rPr>
@@ -4673,7 +4673,7 @@
           <w14:ligatures w14:val="standardContextual"/>
         </w:rPr>
       </w:pPr>
-      <w:hyperlink w:anchor="_Toc244073805" w:history="1">
+      <w:hyperlink w:anchor="_Toc244088716" w:history="1">
         <w:r>
           <w:rPr>
             <w:rStyle w:val="Hipervnculo"/>
@@ -4700,7 +4700,7 @@
             <w:noProof/>
             <w:webHidden/>
           </w:rPr>
-          <w:instrText xml:space="preserve"> PAGEREF _Toc244073805 \h </w:instrText>
+          <w:instrText xml:space="preserve"> PAGEREF _Toc244088716 \h </w:instrText>
         </w:r>
         <w:r>
           <w:rPr>
@@ -4747,7 +4747,7 @@
           <w14:ligatures w14:val="standardContextual"/>
         </w:rPr>
       </w:pPr>
-      <w:hyperlink w:anchor="_Toc244073806" w:history="1">
+      <w:hyperlink w:anchor="_Toc244088717" w:history="1">
         <w:r>
           <w:rPr>
             <w:rStyle w:val="Hipervnculo"/>
@@ -4774,7 +4774,7 @@
             <w:noProof/>
             <w:webHidden/>
           </w:rPr>
-          <w:instrText xml:space="preserve"> PAGEREF _Toc244073806 \h </w:instrText>
+          <w:instrText xml:space="preserve"> PAGEREF _Toc244088717 \h </w:instrText>
         </w:r>
         <w:r>
           <w:rPr>
@@ -4821,7 +4821,7 @@
           <w14:ligatures w14:val="standardContextual"/>
         </w:rPr>
       </w:pPr>
-      <w:hyperlink w:anchor="_Toc244073807" w:history="1">
+      <w:hyperlink w:anchor="_Toc244088718" w:history="1">
         <w:r>
           <w:rPr>
             <w:rStyle w:val="Hipervnculo"/>
@@ -4848,7 +4848,7 @@
             <w:noProof/>
             <w:webHidden/>
           </w:rPr>
-          <w:instrText xml:space="preserve"> PAGEREF _Toc244073807 \h </w:instrText>
+          <w:instrText xml:space="preserve"> PAGEREF _Toc244088718 \h </w:instrText>
         </w:r>
         <w:r>
           <w:rPr>
@@ -4895,7 +4895,7 @@
           <w14:ligatures w14:val="standardContextual"/>
         </w:rPr>
       </w:pPr>
-      <w:hyperlink w:anchor="_Toc244073808" w:history="1">
+      <w:hyperlink w:anchor="_Toc244088719" w:history="1">
         <w:r>
           <w:rPr>
             <w:rStyle w:val="Hipervnculo"/>
@@ -4922,7 +4922,7 @@
             <w:noProof/>
             <w:webHidden/>
           </w:rPr>
-          <w:instrText xml:space="preserve"> PAGEREF _Toc244073808 \h </w:instrText>
+          <w:instrText xml:space="preserve"> PAGEREF _Toc244088719 \h </w:instrText>
         </w:r>
         <w:r>
           <w:rPr>
@@ -4969,7 +4969,7 @@
           <w14:ligatures w14:val="standardContextual"/>
         </w:rPr>
       </w:pPr>
-      <w:hyperlink w:anchor="_Toc244073809" w:history="1">
+      <w:hyperlink w:anchor="_Toc244088720" w:history="1">
         <w:r>
           <w:rPr>
             <w:rStyle w:val="Hipervnculo"/>
@@ -4996,7 +4996,7 @@
             <w:noProof/>
             <w:webHidden/>
           </w:rPr>
-          <w:instrText xml:space="preserve"> PAGEREF _Toc244073809 \h </w:instrText>
+          <w:instrText xml:space="preserve"> PAGEREF _Toc244088720 \h </w:instrText>
         </w:r>
         <w:r>
           <w:rPr>
@@ -5043,7 +5043,7 @@
           <w14:ligatures w14:val="standardContextual"/>
         </w:rPr>
       </w:pPr>
-      <w:hyperlink w:anchor="_Toc244073810" w:history="1">
+      <w:hyperlink w:anchor="_Toc244088721" w:history="1">
         <w:r>
           <w:rPr>
             <w:rStyle w:val="Hipervnculo"/>
@@ -5070,7 +5070,7 @@
             <w:noProof/>
             <w:webHidden/>
           </w:rPr>
-          <w:instrText xml:space="preserve"> PAGEREF _Toc244073810 \h </w:instrText>
+          <w:instrText xml:space="preserve"> PAGEREF _Toc244088721 \h </w:instrText>
         </w:r>
         <w:r>
           <w:rPr>
@@ -5117,7 +5117,7 @@
           <w14:ligatures w14:val="standardContextual"/>
         </w:rPr>
       </w:pPr>
-      <w:hyperlink w:anchor="_Toc244073811" w:history="1">
+      <w:hyperlink w:anchor="_Toc244088722" w:history="1">
         <w:r>
           <w:rPr>
             <w:rStyle w:val="Hipervnculo"/>
@@ -5144,7 +5144,7 @@
             <w:noProof/>
             <w:webHidden/>
           </w:rPr>
-          <w:instrText xml:space="preserve"> PAGEREF _Toc244073811 \h </w:instrText>
+          <w:instrText xml:space="preserve"> PAGEREF _Toc244088722 \h </w:instrText>
         </w:r>
         <w:r>
           <w:rPr>
@@ -5191,7 +5191,7 @@
           <w14:ligatures w14:val="standardContextual"/>
         </w:rPr>
       </w:pPr>
-      <w:hyperlink w:anchor="_Toc244073812" w:history="1">
+      <w:hyperlink w:anchor="_Toc244088723" w:history="1">
         <w:r>
           <w:rPr>
             <w:rStyle w:val="Hipervnculo"/>
@@ -5218,7 +5218,7 @@
             <w:noProof/>
             <w:webHidden/>
           </w:rPr>
-          <w:instrText xml:space="preserve"> PAGEREF _Toc244073812 \h </w:instrText>
+          <w:instrText xml:space="preserve"> PAGEREF _Toc244088723 \h </w:instrText>
         </w:r>
         <w:r>
           <w:rPr>
@@ -5265,7 +5265,7 @@
           <w14:ligatures w14:val="standardContextual"/>
         </w:rPr>
       </w:pPr>
-      <w:hyperlink w:anchor="_Toc244073813" w:history="1">
+      <w:hyperlink w:anchor="_Toc244088724" w:history="1">
         <w:r>
           <w:rPr>
             <w:rStyle w:val="Hipervnculo"/>
@@ -5292,7 +5292,7 @@
             <w:noProof/>
             <w:webHidden/>
           </w:rPr>
-          <w:instrText xml:space="preserve"> PAGEREF _Toc244073813 \h </w:instrText>
+          <w:instrText xml:space="preserve"> PAGEREF _Toc244088724 \h </w:instrText>
         </w:r>
         <w:r>
           <w:rPr>
@@ -5339,7 +5339,7 @@
           <w14:ligatures w14:val="standardContextual"/>
         </w:rPr>
       </w:pPr>
-      <w:hyperlink w:anchor="_Toc244073814" w:history="1">
+      <w:hyperlink w:anchor="_Toc244088725" w:history="1">
         <w:r>
           <w:rPr>
             <w:rStyle w:val="Hipervnculo"/>
@@ -5366,7 +5366,7 @@
             <w:noProof/>
             <w:webHidden/>
           </w:rPr>
-          <w:instrText xml:space="preserve"> PAGEREF _Toc244073814 \h </w:instrText>
+          <w:instrText xml:space="preserve"> PAGEREF _Toc244088725 \h </w:instrText>
         </w:r>
         <w:r>
           <w:rPr>
@@ -5413,7 +5413,7 @@
           <w14:ligatures w14:val="standardContextual"/>
         </w:rPr>
       </w:pPr>
-      <w:hyperlink w:anchor="_Toc244073815" w:history="1">
+      <w:hyperlink w:anchor="_Toc244088726" w:history="1">
         <w:r>
           <w:rPr>
             <w:rStyle w:val="Hipervnculo"/>
@@ -5440,7 +5440,7 @@
             <w:noProof/>
             <w:webHidden/>
           </w:rPr>
-          <w:instrText xml:space="preserve"> PAGEREF _Toc244073815 \h </w:instrText>
+          <w:instrText xml:space="preserve"> PAGEREF _Toc244088726 \h </w:instrText>
         </w:r>
         <w:r>
           <w:rPr>
@@ -5487,7 +5487,7 @@
           <w14:ligatures w14:val="standardContextual"/>
         </w:rPr>
       </w:pPr>
-      <w:hyperlink w:anchor="_Toc244073816" w:history="1">
+      <w:hyperlink w:anchor="_Toc244088727" w:history="1">
         <w:r>
           <w:rPr>
             <w:rStyle w:val="Hipervnculo"/>
@@ -5514,7 +5514,7 @@
             <w:noProof/>
             <w:webHidden/>
           </w:rPr>
-          <w:instrText xml:space="preserve"> PAGEREF _Toc244073816 \h </w:instrText>
+          <w:instrText xml:space="preserve"> PAGEREF _Toc244088727 \h </w:instrText>
         </w:r>
         <w:r>
           <w:rPr>
@@ -5561,7 +5561,7 @@
           <w14:ligatures w14:val="standardContextual"/>
         </w:rPr>
       </w:pPr>
-      <w:hyperlink w:anchor="_Toc244073817" w:history="1">
+      <w:hyperlink w:anchor="_Toc244088728" w:history="1">
         <w:r>
           <w:rPr>
             <w:rStyle w:val="Hipervnculo"/>
@@ -5588,7 +5588,7 @@
             <w:noProof/>
             <w:webHidden/>
           </w:rPr>
-          <w:instrText xml:space="preserve"> PAGEREF _Toc244073817 \h </w:instrText>
+          <w:instrText xml:space="preserve"> PAGEREF _Toc244088728 \h </w:instrText>
         </w:r>
         <w:r>
           <w:rPr>
@@ -5635,7 +5635,7 @@
           <w14:ligatures w14:val="standardContextual"/>
         </w:rPr>
       </w:pPr>
-      <w:hyperlink w:anchor="_Toc244073818" w:history="1">
+      <w:hyperlink w:anchor="_Toc244088729" w:history="1">
         <w:r>
           <w:rPr>
             <w:rStyle w:val="Hipervnculo"/>
@@ -5662,7 +5662,7 @@
             <w:noProof/>
             <w:webHidden/>
           </w:rPr>
-          <w:instrText xml:space="preserve"> PAGEREF _Toc244073818 \h </w:instrText>
+          <w:instrText xml:space="preserve"> PAGEREF _Toc244088729 \h </w:instrText>
         </w:r>
         <w:r>
           <w:rPr>
@@ -5709,7 +5709,7 @@
           <w14:ligatures w14:val="standardContextual"/>
         </w:rPr>
       </w:pPr>
-      <w:hyperlink w:anchor="_Toc244073819" w:history="1">
+      <w:hyperlink w:anchor="_Toc244088730" w:history="1">
         <w:r>
           <w:rPr>
             <w:rStyle w:val="Hipervnculo"/>
@@ -5736,7 +5736,7 @@
             <w:noProof/>
             <w:webHidden/>
           </w:rPr>
-          <w:instrText xml:space="preserve"> PAGEREF _Toc244073819 \h </w:instrText>
+          <w:instrText xml:space="preserve"> PAGEREF _Toc244088730 \h </w:instrText>
         </w:r>
         <w:r>
           <w:rPr>
@@ -5783,7 +5783,7 @@
           <w14:ligatures w14:val="standardContextual"/>
         </w:rPr>
       </w:pPr>
-      <w:hyperlink w:anchor="_Toc244073820" w:history="1">
+      <w:hyperlink w:anchor="_Toc244088731" w:history="1">
         <w:r>
           <w:rPr>
             <w:rStyle w:val="Hipervnculo"/>
@@ -5810,7 +5810,7 @@
             <w:noProof/>
             <w:webHidden/>
           </w:rPr>
-          <w:instrText xml:space="preserve"> PAGEREF _Toc244073820 \h </w:instrText>
+          <w:instrText xml:space="preserve"> PAGEREF _Toc244088731 \h </w:instrText>
         </w:r>
         <w:r>
           <w:rPr>
@@ -5857,7 +5857,7 @@
           <w14:ligatures w14:val="standardContextual"/>
         </w:rPr>
       </w:pPr>
-      <w:hyperlink w:anchor="_Toc244073821" w:history="1">
+      <w:hyperlink w:anchor="_Toc244088732" w:history="1">
         <w:r>
           <w:rPr>
             <w:rStyle w:val="Hipervnculo"/>
@@ -5884,7 +5884,7 @@
             <w:noProof/>
             <w:webHidden/>
           </w:rPr>
-          <w:instrText xml:space="preserve"> PAGEREF _Toc244073821 \h </w:instrText>
+          <w:instrText xml:space="preserve"> PAGEREF _Toc244088732 \h </w:instrText>
         </w:r>
         <w:r>
           <w:rPr>
@@ -5931,7 +5931,7 @@
           <w14:ligatures w14:val="standardContextual"/>
         </w:rPr>
       </w:pPr>
-      <w:hyperlink w:anchor="_Toc244073822" w:history="1">
+      <w:hyperlink w:anchor="_Toc244088733" w:history="1">
         <w:r>
           <w:rPr>
             <w:rStyle w:val="Hipervnculo"/>
@@ -5958,7 +5958,7 @@
             <w:noProof/>
             <w:webHidden/>
           </w:rPr>
-          <w:instrText xml:space="preserve"> PAGEREF _Toc244073822 \h </w:instrText>
+          <w:instrText xml:space="preserve"> PAGEREF _Toc244088733 \h </w:instrText>
         </w:r>
         <w:r>
           <w:rPr>
@@ -6005,7 +6005,7 @@
           <w14:ligatures w14:val="standardContextual"/>
         </w:rPr>
       </w:pPr>
-      <w:hyperlink w:anchor="_Toc244073823" w:history="1">
+      <w:hyperlink w:anchor="_Toc244088734" w:history="1">
         <w:r>
           <w:rPr>
             <w:rStyle w:val="Hipervnculo"/>
@@ -6032,7 +6032,7 @@
             <w:noProof/>
             <w:webHidden/>
           </w:rPr>
-          <w:instrText xml:space="preserve"> PAGEREF _Toc244073823 \h </w:instrText>
+          <w:instrText xml:space="preserve"> PAGEREF _Toc244088734 \h </w:instrText>
         </w:r>
         <w:r>
           <w:rPr>
@@ -6079,7 +6079,7 @@
           <w14:ligatures w14:val="standardContextual"/>
         </w:rPr>
       </w:pPr>
-      <w:hyperlink w:anchor="_Toc244073824" w:history="1">
+      <w:hyperlink w:anchor="_Toc244088735" w:history="1">
         <w:r>
           <w:rPr>
             <w:rStyle w:val="Hipervnculo"/>
@@ -6106,7 +6106,7 @@
             <w:noProof/>
             <w:webHidden/>
           </w:rPr>
-          <w:instrText xml:space="preserve"> PAGEREF _Toc244073824 \h </w:instrText>
+          <w:instrText xml:space="preserve"> PAGEREF _Toc244088735 \h </w:instrText>
         </w:r>
         <w:r>
           <w:rPr>
@@ -6153,7 +6153,7 @@
           <w14:ligatures w14:val="standardContextual"/>
         </w:rPr>
       </w:pPr>
-      <w:hyperlink w:anchor="_Toc244073825" w:history="1">
+      <w:hyperlink w:anchor="_Toc244088736" w:history="1">
         <w:r>
           <w:rPr>
             <w:rStyle w:val="Hipervnculo"/>
@@ -6180,7 +6180,7 @@
             <w:noProof/>
             <w:webHidden/>
           </w:rPr>
-          <w:instrText xml:space="preserve"> PAGEREF _Toc244073825 \h </w:instrText>
+          <w:instrText xml:space="preserve"> PAGEREF _Toc244088736 \h </w:instrText>
         </w:r>
         <w:r>
           <w:rPr>
@@ -6227,7 +6227,7 @@
           <w14:ligatures w14:val="standardContextual"/>
         </w:rPr>
       </w:pPr>
-      <w:hyperlink w:anchor="_Toc244073826" w:history="1">
+      <w:hyperlink w:anchor="_Toc244088737" w:history="1">
         <w:r>
           <w:rPr>
             <w:rStyle w:val="Hipervnculo"/>
@@ -6254,7 +6254,7 @@
             <w:noProof/>
             <w:webHidden/>
           </w:rPr>
-          <w:instrText xml:space="preserve"> PAGEREF _Toc244073826 \h </w:instrText>
+          <w:instrText xml:space="preserve"> PAGEREF _Toc244088737 \h </w:instrText>
         </w:r>
         <w:r>
           <w:rPr>
@@ -6301,7 +6301,7 @@
           <w14:ligatures w14:val="standardContextual"/>
         </w:rPr>
       </w:pPr>
-      <w:hyperlink w:anchor="_Toc244073827" w:history="1">
+      <w:hyperlink w:anchor="_Toc244088738" w:history="1">
         <w:r>
           <w:rPr>
             <w:rStyle w:val="Hipervnculo"/>
@@ -6328,7 +6328,7 @@
             <w:noProof/>
             <w:webHidden/>
           </w:rPr>
-          <w:instrText xml:space="preserve"> PAGEREF _Toc244073827 \h </w:instrText>
+          <w:instrText xml:space="preserve"> PAGEREF _Toc244088738 \h </w:instrText>
         </w:r>
         <w:r>
           <w:rPr>
@@ -6348,7 +6348,7 @@
             <w:noProof/>
             <w:webHidden/>
           </w:rPr>
-          <w:t>76</w:t>
+          <w:t>75</w:t>
         </w:r>
         <w:r>
           <w:rPr>
@@ -6375,7 +6375,7 @@
           <w14:ligatures w14:val="standardContextual"/>
         </w:rPr>
       </w:pPr>
-      <w:hyperlink w:anchor="_Toc244073828" w:history="1">
+      <w:hyperlink w:anchor="_Toc244088739" w:history="1">
         <w:r>
           <w:rPr>
             <w:rStyle w:val="Hipervnculo"/>
@@ -6402,7 +6402,7 @@
             <w:noProof/>
             <w:webHidden/>
           </w:rPr>
-          <w:instrText xml:space="preserve"> PAGEREF _Toc244073828 \h </w:instrText>
+          <w:instrText xml:space="preserve"> PAGEREF _Toc244088739 \h </w:instrText>
         </w:r>
         <w:r>
           <w:rPr>
@@ -6422,7 +6422,7 @@
             <w:noProof/>
             <w:webHidden/>
           </w:rPr>
-          <w:t>78</w:t>
+          <w:t>76</w:t>
         </w:r>
         <w:r>
           <w:rPr>
@@ -6449,7 +6449,7 @@
           <w14:ligatures w14:val="standardContextual"/>
         </w:rPr>
       </w:pPr>
-      <w:hyperlink w:anchor="_Toc244073829" w:history="1">
+      <w:hyperlink w:anchor="_Toc244088740" w:history="1">
         <w:r>
           <w:rPr>
             <w:rStyle w:val="Hipervnculo"/>
@@ -6476,7 +6476,7 @@
             <w:noProof/>
             <w:webHidden/>
           </w:rPr>
-          <w:instrText xml:space="preserve"> PAGEREF _Toc244073829 \h </w:instrText>
+          <w:instrText xml:space="preserve"> PAGEREF _Toc244088740 \h </w:instrText>
         </w:r>
         <w:r>
           <w:rPr>
@@ -6496,7 +6496,7 @@
             <w:noProof/>
             <w:webHidden/>
           </w:rPr>
-          <w:t>79</w:t>
+          <w:t>77</w:t>
         </w:r>
         <w:r>
           <w:rPr>
@@ -6523,7 +6523,7 @@
           <w14:ligatures w14:val="standardContextual"/>
         </w:rPr>
       </w:pPr>
-      <w:hyperlink w:anchor="_Toc244073830" w:history="1">
+      <w:hyperlink w:anchor="_Toc244088741" w:history="1">
         <w:r>
           <w:rPr>
             <w:rStyle w:val="Hipervnculo"/>
@@ -6550,7 +6550,7 @@
             <w:noProof/>
             <w:webHidden/>
           </w:rPr>
-          <w:instrText xml:space="preserve"> PAGEREF _Toc244073830 \h </w:instrText>
+          <w:instrText xml:space="preserve"> PAGEREF _Toc244088741 \h </w:instrText>
         </w:r>
         <w:r>
           <w:rPr>
@@ -6570,7 +6570,7 @@
             <w:noProof/>
             <w:webHidden/>
           </w:rPr>
-          <w:t>79</w:t>
+          <w:t>77</w:t>
         </w:r>
         <w:r>
           <w:rPr>
@@ -6597,7 +6597,7 @@
           <w14:ligatures w14:val="standardContextual"/>
         </w:rPr>
       </w:pPr>
-      <w:hyperlink w:anchor="_Toc244073831" w:history="1">
+      <w:hyperlink w:anchor="_Toc244088742" w:history="1">
         <w:r>
           <w:rPr>
             <w:rStyle w:val="Hipervnculo"/>
@@ -6624,7 +6624,7 @@
             <w:noProof/>
             <w:webHidden/>
           </w:rPr>
-          <w:instrText xml:space="preserve"> PAGEREF _Toc244073831 \h </w:instrText>
+          <w:instrText xml:space="preserve"> PAGEREF _Toc244088742 \h </w:instrText>
         </w:r>
         <w:r>
           <w:rPr>
@@ -6644,7 +6644,7 @@
             <w:noProof/>
             <w:webHidden/>
           </w:rPr>
-          <w:t>79</w:t>
+          <w:t>77</w:t>
         </w:r>
         <w:r>
           <w:rPr>
@@ -6671,7 +6671,7 @@
           <w14:ligatures w14:val="standardContextual"/>
         </w:rPr>
       </w:pPr>
-      <w:hyperlink w:anchor="_Toc244073832" w:history="1">
+      <w:hyperlink w:anchor="_Toc244088743" w:history="1">
         <w:r>
           <w:rPr>
             <w:rStyle w:val="Hipervnculo"/>
@@ -6698,7 +6698,7 @@
             <w:noProof/>
             <w:webHidden/>
           </w:rPr>
-          <w:instrText xml:space="preserve"> PAGEREF _Toc244073832 \h </w:instrText>
+          <w:instrText xml:space="preserve"> PAGEREF _Toc244088743 \h </w:instrText>
         </w:r>
         <w:r>
           <w:rPr>
@@ -6718,7 +6718,7 @@
             <w:noProof/>
             <w:webHidden/>
           </w:rPr>
-          <w:t>80</w:t>
+          <w:t>78</w:t>
         </w:r>
         <w:r>
           <w:rPr>
@@ -6745,7 +6745,7 @@
           <w14:ligatures w14:val="standardContextual"/>
         </w:rPr>
       </w:pPr>
-      <w:hyperlink w:anchor="_Toc244073833" w:history="1">
+      <w:hyperlink w:anchor="_Toc244088744" w:history="1">
         <w:r>
           <w:rPr>
             <w:rStyle w:val="Hipervnculo"/>
@@ -6772,7 +6772,7 @@
             <w:noProof/>
             <w:webHidden/>
           </w:rPr>
-          <w:instrText xml:space="preserve"> PAGEREF _Toc244073833 \h </w:instrText>
+          <w:instrText xml:space="preserve"> PAGEREF _Toc244088744 \h </w:instrText>
         </w:r>
         <w:r>
           <w:rPr>
@@ -6792,7 +6792,7 @@
             <w:noProof/>
             <w:webHidden/>
           </w:rPr>
-          <w:t>81</w:t>
+          <w:t>79</w:t>
         </w:r>
         <w:r>
           <w:rPr>
@@ -6819,7 +6819,7 @@
           <w14:ligatures w14:val="standardContextual"/>
         </w:rPr>
       </w:pPr>
-      <w:hyperlink w:anchor="_Toc244073834" w:history="1">
+      <w:hyperlink w:anchor="_Toc244088745" w:history="1">
         <w:r>
           <w:rPr>
             <w:rStyle w:val="Hipervnculo"/>
@@ -6846,7 +6846,7 @@
             <w:noProof/>
             <w:webHidden/>
           </w:rPr>
-          <w:instrText xml:space="preserve"> PAGEREF _Toc244073834 \h </w:instrText>
+          <w:instrText xml:space="preserve"> PAGEREF _Toc244088745 \h </w:instrText>
         </w:r>
         <w:r>
           <w:rPr>
@@ -6866,7 +6866,7 @@
             <w:noProof/>
             <w:webHidden/>
           </w:rPr>
-          <w:t>81</w:t>
+          <w:t>79</w:t>
         </w:r>
         <w:r>
           <w:rPr>
@@ -6893,7 +6893,7 @@
           <w14:ligatures w14:val="standardContextual"/>
         </w:rPr>
       </w:pPr>
-      <w:hyperlink w:anchor="_Toc244073835" w:history="1">
+      <w:hyperlink w:anchor="_Toc244088746" w:history="1">
         <w:r>
           <w:rPr>
             <w:rStyle w:val="Hipervnculo"/>
@@ -6920,7 +6920,7 @@
             <w:noProof/>
             <w:webHidden/>
           </w:rPr>
-          <w:instrText xml:space="preserve"> PAGEREF _Toc244073835 \h </w:instrText>
+          <w:instrText xml:space="preserve"> PAGEREF _Toc244088746 \h </w:instrText>
         </w:r>
         <w:r>
           <w:rPr>
@@ -6940,7 +6940,7 @@
             <w:noProof/>
             <w:webHidden/>
           </w:rPr>
-          <w:t>83</w:t>
+          <w:t>81</w:t>
         </w:r>
         <w:r>
           <w:rPr>
@@ -6967,7 +6967,7 @@
           <w14:ligatures w14:val="standardContextual"/>
         </w:rPr>
       </w:pPr>
-      <w:hyperlink w:anchor="_Toc244073836" w:history="1">
+      <w:hyperlink w:anchor="_Toc244088747" w:history="1">
         <w:r>
           <w:rPr>
             <w:rStyle w:val="Hipervnculo"/>
@@ -6994,7 +6994,7 @@
             <w:noProof/>
             <w:webHidden/>
           </w:rPr>
-          <w:instrText xml:space="preserve"> PAGEREF _Toc244073836 \h </w:instrText>
+          <w:instrText xml:space="preserve"> PAGEREF _Toc244088747 \h </w:instrText>
         </w:r>
         <w:r>
           <w:rPr>
@@ -7014,7 +7014,7 @@
             <w:noProof/>
             <w:webHidden/>
           </w:rPr>
-          <w:t>84</w:t>
+          <w:t>82</w:t>
         </w:r>
         <w:r>
           <w:rPr>
@@ -7041,7 +7041,7 @@
           <w14:ligatures w14:val="standardContextual"/>
         </w:rPr>
       </w:pPr>
-      <w:hyperlink w:anchor="_Toc244073837" w:history="1">
+      <w:hyperlink w:anchor="_Toc244088748" w:history="1">
         <w:r>
           <w:rPr>
             <w:rStyle w:val="Hipervnculo"/>
@@ -7068,7 +7068,7 @@
             <w:noProof/>
             <w:webHidden/>
           </w:rPr>
-          <w:instrText xml:space="preserve"> PAGEREF _Toc244073837 \h </w:instrText>
+          <w:instrText xml:space="preserve"> PAGEREF _Toc244088748 \h </w:instrText>
         </w:r>
         <w:r>
           <w:rPr>
@@ -7088,7 +7088,7 @@
             <w:noProof/>
             <w:webHidden/>
           </w:rPr>
-          <w:t>84</w:t>
+          <w:t>82</w:t>
         </w:r>
         <w:r>
           <w:rPr>
@@ -7115,7 +7115,7 @@
           <w14:ligatures w14:val="standardContextual"/>
         </w:rPr>
       </w:pPr>
-      <w:hyperlink w:anchor="_Toc244073838" w:history="1">
+      <w:hyperlink w:anchor="_Toc244088749" w:history="1">
         <w:r>
           <w:rPr>
             <w:rStyle w:val="Hipervnculo"/>
@@ -7142,7 +7142,7 @@
             <w:noProof/>
             <w:webHidden/>
           </w:rPr>
-          <w:instrText xml:space="preserve"> PAGEREF _Toc244073838 \h </w:instrText>
+          <w:instrText xml:space="preserve"> PAGEREF _Toc244088749 \h </w:instrText>
         </w:r>
         <w:r>
           <w:rPr>
@@ -7162,7 +7162,7 @@
             <w:noProof/>
             <w:webHidden/>
           </w:rPr>
-          <w:t>85</w:t>
+          <w:t>83</w:t>
         </w:r>
         <w:r>
           <w:rPr>
@@ -7189,7 +7189,7 @@
           <w14:ligatures w14:val="standardContextual"/>
         </w:rPr>
       </w:pPr>
-      <w:hyperlink w:anchor="_Toc244073839" w:history="1">
+      <w:hyperlink w:anchor="_Toc244088750" w:history="1">
         <w:r>
           <w:rPr>
             <w:rStyle w:val="Hipervnculo"/>
@@ -7216,7 +7216,7 @@
             <w:noProof/>
             <w:webHidden/>
           </w:rPr>
-          <w:instrText xml:space="preserve"> PAGEREF _Toc244073839 \h </w:instrText>
+          <w:instrText xml:space="preserve"> PAGEREF _Toc244088750 \h </w:instrText>
         </w:r>
         <w:r>
           <w:rPr>
@@ -7236,7 +7236,7 @@
             <w:noProof/>
             <w:webHidden/>
           </w:rPr>
-          <w:t>86</w:t>
+          <w:t>84</w:t>
         </w:r>
         <w:r>
           <w:rPr>
@@ -7263,7 +7263,7 @@
           <w14:ligatures w14:val="standardContextual"/>
         </w:rPr>
       </w:pPr>
-      <w:hyperlink w:anchor="_Toc244073840" w:history="1">
+      <w:hyperlink w:anchor="_Toc244088751" w:history="1">
         <w:r>
           <w:rPr>
             <w:rStyle w:val="Hipervnculo"/>
@@ -7290,7 +7290,7 @@
             <w:noProof/>
             <w:webHidden/>
           </w:rPr>
-          <w:instrText xml:space="preserve"> PAGEREF _Toc244073840 \h </w:instrText>
+          <w:instrText xml:space="preserve"> PAGEREF _Toc244088751 \h </w:instrText>
         </w:r>
         <w:r>
           <w:rPr>
@@ -7310,7 +7310,7 @@
             <w:noProof/>
             <w:webHidden/>
           </w:rPr>
-          <w:t>86</w:t>
+          <w:t>84</w:t>
         </w:r>
         <w:r>
           <w:rPr>
@@ -7337,7 +7337,7 @@
           <w14:ligatures w14:val="standardContextual"/>
         </w:rPr>
       </w:pPr>
-      <w:hyperlink w:anchor="_Toc244073841" w:history="1">
+      <w:hyperlink w:anchor="_Toc244088752" w:history="1">
         <w:r>
           <w:rPr>
             <w:rStyle w:val="Hipervnculo"/>
@@ -7364,7 +7364,7 @@
             <w:noProof/>
             <w:webHidden/>
           </w:rPr>
-          <w:instrText xml:space="preserve"> PAGEREF _Toc244073841 \h </w:instrText>
+          <w:instrText xml:space="preserve"> PAGEREF _Toc244088752 \h </w:instrText>
         </w:r>
         <w:r>
           <w:rPr>
@@ -7384,7 +7384,7 @@
             <w:noProof/>
             <w:webHidden/>
           </w:rPr>
-          <w:t>87</w:t>
+          <w:t>85</w:t>
         </w:r>
         <w:r>
           <w:rPr>
@@ -7411,7 +7411,7 @@
           <w14:ligatures w14:val="standardContextual"/>
         </w:rPr>
       </w:pPr>
-      <w:hyperlink w:anchor="_Toc244073842" w:history="1">
+      <w:hyperlink w:anchor="_Toc244088753" w:history="1">
         <w:r>
           <w:rPr>
             <w:rStyle w:val="Hipervnculo"/>
@@ -7438,7 +7438,7 @@
             <w:noProof/>
             <w:webHidden/>
           </w:rPr>
-          <w:instrText xml:space="preserve"> PAGEREF _Toc244073842 \h </w:instrText>
+          <w:instrText xml:space="preserve"> PAGEREF _Toc244088753 \h </w:instrText>
         </w:r>
         <w:r>
           <w:rPr>
@@ -7458,7 +7458,7 @@
             <w:noProof/>
             <w:webHidden/>
           </w:rPr>
-          <w:t>87</w:t>
+          <w:t>85</w:t>
         </w:r>
         <w:r>
           <w:rPr>
@@ -7485,7 +7485,7 @@
           <w14:ligatures w14:val="standardContextual"/>
         </w:rPr>
       </w:pPr>
-      <w:hyperlink w:anchor="_Toc244073843" w:history="1">
+      <w:hyperlink w:anchor="_Toc244088754" w:history="1">
         <w:r>
           <w:rPr>
             <w:rStyle w:val="Hipervnculo"/>
@@ -7512,7 +7512,7 @@
             <w:noProof/>
             <w:webHidden/>
           </w:rPr>
-          <w:instrText xml:space="preserve"> PAGEREF _Toc244073843 \h </w:instrText>
+          <w:instrText xml:space="preserve"> PAGEREF _Toc244088754 \h </w:instrText>
         </w:r>
         <w:r>
           <w:rPr>
@@ -7532,7 +7532,7 @@
             <w:noProof/>
             <w:webHidden/>
           </w:rPr>
-          <w:t>88</w:t>
+          <w:t>86</w:t>
         </w:r>
         <w:r>
           <w:rPr>
@@ -7559,7 +7559,7 @@
           <w14:ligatures w14:val="standardContextual"/>
         </w:rPr>
       </w:pPr>
-      <w:hyperlink w:anchor="_Toc244073844" w:history="1">
+      <w:hyperlink w:anchor="_Toc244088755" w:history="1">
         <w:r>
           <w:rPr>
             <w:rStyle w:val="Hipervnculo"/>
@@ -7586,7 +7586,7 @@
             <w:noProof/>
             <w:webHidden/>
           </w:rPr>
-          <w:instrText xml:space="preserve"> PAGEREF _Toc244073844 \h </w:instrText>
+          <w:instrText xml:space="preserve"> PAGEREF _Toc244088755 \h </w:instrText>
         </w:r>
         <w:r>
           <w:rPr>
@@ -7606,7 +7606,7 @@
             <w:noProof/>
             <w:webHidden/>
           </w:rPr>
-          <w:t>89</w:t>
+          <w:t>87</w:t>
         </w:r>
         <w:r>
           <w:rPr>
@@ -7633,7 +7633,7 @@
           <w14:ligatures w14:val="standardContextual"/>
         </w:rPr>
       </w:pPr>
-      <w:hyperlink w:anchor="_Toc244073845" w:history="1">
+      <w:hyperlink w:anchor="_Toc244088756" w:history="1">
         <w:r>
           <w:rPr>
             <w:rStyle w:val="Hipervnculo"/>
@@ -7660,7 +7660,7 @@
             <w:noProof/>
             <w:webHidden/>
           </w:rPr>
-          <w:instrText xml:space="preserve"> PAGEREF _Toc244073845 \h </w:instrText>
+          <w:instrText xml:space="preserve"> PAGEREF _Toc244088756 \h </w:instrText>
         </w:r>
         <w:r>
           <w:rPr>
@@ -7680,7 +7680,7 @@
             <w:noProof/>
             <w:webHidden/>
           </w:rPr>
-          <w:t>93</w:t>
+          <w:t>91</w:t>
         </w:r>
         <w:r>
           <w:rPr>
@@ -7707,7 +7707,7 @@
           <w14:ligatures w14:val="standardContextual"/>
         </w:rPr>
       </w:pPr>
-      <w:hyperlink w:anchor="_Toc244073846" w:history="1">
+      <w:hyperlink w:anchor="_Toc244088757" w:history="1">
         <w:r>
           <w:rPr>
             <w:rStyle w:val="Hipervnculo"/>
@@ -7734,7 +7734,7 @@
             <w:noProof/>
             <w:webHidden/>
           </w:rPr>
-          <w:instrText xml:space="preserve"> PAGEREF _Toc244073846 \h </w:instrText>
+          <w:instrText xml:space="preserve"> PAGEREF _Toc244088757 \h </w:instrText>
         </w:r>
         <w:r>
           <w:rPr>
@@ -7754,7 +7754,7 @@
             <w:noProof/>
             <w:webHidden/>
           </w:rPr>
-          <w:t>93</w:t>
+          <w:t>91</w:t>
         </w:r>
         <w:r>
           <w:rPr>
@@ -7781,7 +7781,7 @@
           <w14:ligatures w14:val="standardContextual"/>
         </w:rPr>
       </w:pPr>
-      <w:hyperlink w:anchor="_Toc244073847" w:history="1">
+      <w:hyperlink w:anchor="_Toc244088758" w:history="1">
         <w:r>
           <w:rPr>
             <w:rStyle w:val="Hipervnculo"/>
@@ -7808,7 +7808,7 @@
             <w:noProof/>
             <w:webHidden/>
           </w:rPr>
-          <w:instrText xml:space="preserve"> PAGEREF _Toc244073847 \h </w:instrText>
+          <w:instrText xml:space="preserve"> PAGEREF _Toc244088758 \h </w:instrText>
         </w:r>
         <w:r>
           <w:rPr>
@@ -7828,7 +7828,7 @@
             <w:noProof/>
             <w:webHidden/>
           </w:rPr>
-          <w:t>93</w:t>
+          <w:t>91</w:t>
         </w:r>
         <w:r>
           <w:rPr>
@@ -8523,7 +8523,7 @@
       <w:r>
         <w:br w:type="page"/>
       </w:r>
-      <w:bookmarkStart w:id="1" w:name="_Toc244073747"/>
+      <w:bookmarkStart w:id="1" w:name="_Toc244088658"/>
       <w:r>
         <w:lastRenderedPageBreak/>
         <w:t>1. Introducción y objetivos</w:t>
@@ -8534,7 +8534,7 @@
       <w:pPr>
         <w:pStyle w:val="Ttulo2"/>
       </w:pPr>
-      <w:bookmarkStart w:id="2" w:name="_Toc244073748"/>
+      <w:bookmarkStart w:id="2" w:name="_Toc244088659"/>
       <w:r>
         <w:t>1.1. Contexto, motivación y justificación</w:t>
       </w:r>
@@ -8597,7 +8597,7 @@
       <w:pPr>
         <w:pStyle w:val="Ttulo2"/>
       </w:pPr>
-      <w:bookmarkStart w:id="3" w:name="_Toc244073749"/>
+      <w:bookmarkStart w:id="3" w:name="_Toc244088660"/>
       <w:r>
         <w:t>1.2. Objetivos generales y específicos</w:t>
       </w:r>
@@ -8656,7 +8656,7 @@
       <w:pPr>
         <w:pStyle w:val="Ttulo2"/>
       </w:pPr>
-      <w:bookmarkStart w:id="4" w:name="_Toc244073750"/>
+      <w:bookmarkStart w:id="4" w:name="_Toc244088661"/>
       <w:r>
         <w:t>1.3. Alcance, usuarios y limitaciones</w:t>
       </w:r>
@@ -8766,7 +8766,7 @@
         <w:pStyle w:val="Ttulo1"/>
         <w:pageBreakBefore/>
       </w:pPr>
-      <w:bookmarkStart w:id="5" w:name="_Toc244073751"/>
+      <w:bookmarkStart w:id="5" w:name="_Toc244088662"/>
       <w:r>
         <w:lastRenderedPageBreak/>
         <w:t>2. Marco teórico y estado del arte</w:t>
@@ -8777,7 +8777,7 @@
       <w:pPr>
         <w:pStyle w:val="Ttulo2"/>
       </w:pPr>
-      <w:bookmarkStart w:id="6" w:name="_Toc244073752"/>
+      <w:bookmarkStart w:id="6" w:name="_Toc244088663"/>
       <w:r>
         <w:t>2.1. Necesidades hídricas y gestión eficiente del riego</w:t>
       </w:r>
@@ -8845,7 +8845,7 @@
       <w:pPr>
         <w:pStyle w:val="Ttulo2"/>
       </w:pPr>
-      <w:bookmarkStart w:id="7" w:name="_Toc244073753"/>
+      <w:bookmarkStart w:id="7" w:name="_Toc244088664"/>
       <w:r>
         <w:t>2.2. Agricultura de precisión y aprendizaje automático</w:t>
       </w:r>
@@ -8910,7 +8910,7 @@
       <w:pPr>
         <w:pStyle w:val="Ttulo2"/>
       </w:pPr>
-      <w:bookmarkStart w:id="8" w:name="_Toc244073754"/>
+      <w:bookmarkStart w:id="8" w:name="_Toc244088665"/>
       <w:r>
         <w:t>2.3. Sistemas inteligentes de apoyo a la decisión</w:t>
       </w:r>
@@ -8974,7 +8974,7 @@
         <w:pStyle w:val="Ttulo1"/>
         <w:pageBreakBefore/>
       </w:pPr>
-      <w:bookmarkStart w:id="9" w:name="_Toc244073755"/>
+      <w:bookmarkStart w:id="9" w:name="_Toc244088666"/>
       <w:r>
         <w:lastRenderedPageBreak/>
         <w:t>3. Metodología y arquitectura del sistema</w:t>
@@ -8985,7 +8985,7 @@
       <w:pPr>
         <w:pStyle w:val="Ttulo2"/>
       </w:pPr>
-      <w:bookmarkStart w:id="10" w:name="_Toc244073756"/>
+      <w:bookmarkStart w:id="10" w:name="_Toc244088667"/>
       <w:r>
         <w:t>3.1. Fuentes, variables y calidad de los datos</w:t>
       </w:r>
@@ -9005,7 +9005,7 @@
       <w:pPr>
         <w:pStyle w:val="Ttulo3"/>
       </w:pPr>
-      <w:bookmarkStart w:id="11" w:name="_Toc244073757"/>
+      <w:bookmarkStart w:id="11" w:name="_Toc244088668"/>
       <w:r>
         <w:rPr>
           <w:sz w:val="24"/>
@@ -9677,7 +9677,7 @@
       <w:pPr>
         <w:pStyle w:val="Ttulo3"/>
       </w:pPr>
-      <w:bookmarkStart w:id="13" w:name="_Toc244073758"/>
+      <w:bookmarkStart w:id="13" w:name="_Toc244088669"/>
       <w:r>
         <w:rPr>
           <w:sz w:val="24"/>
@@ -10420,7 +10420,7 @@
       <w:pPr>
         <w:pStyle w:val="Ttulo3"/>
       </w:pPr>
-      <w:bookmarkStart w:id="15" w:name="_Toc244073759"/>
+      <w:bookmarkStart w:id="15" w:name="_Toc244088670"/>
       <w:r>
         <w:rPr>
           <w:sz w:val="24"/>
@@ -10529,7 +10529,7 @@
       <w:pPr>
         <w:pStyle w:val="Ttulo3"/>
       </w:pPr>
-      <w:bookmarkStart w:id="16" w:name="_Toc244073760"/>
+      <w:bookmarkStart w:id="16" w:name="_Toc244088671"/>
       <w:r>
         <w:rPr>
           <w:sz w:val="24"/>
@@ -10553,7 +10553,7 @@
       <w:pPr>
         <w:pStyle w:val="Ttulo2"/>
       </w:pPr>
-      <w:bookmarkStart w:id="17" w:name="_Toc244073761"/>
+      <w:bookmarkStart w:id="17" w:name="_Toc244088672"/>
       <w:r>
         <w:t>3.2. Arquitectura, tecnologías y flujo de información</w:t>
       </w:r>
@@ -10628,7 +10628,7 @@
       <w:pPr>
         <w:pStyle w:val="Ttulo3"/>
       </w:pPr>
-      <w:bookmarkStart w:id="19" w:name="_Toc244073762"/>
+      <w:bookmarkStart w:id="19" w:name="_Toc244088673"/>
       <w:r>
         <w:rPr>
           <w:sz w:val="24"/>
@@ -10765,7 +10765,7 @@
       <w:pPr>
         <w:pStyle w:val="Ttulo3"/>
       </w:pPr>
-      <w:bookmarkStart w:id="20" w:name="_Toc244073763"/>
+      <w:bookmarkStart w:id="20" w:name="_Toc244088674"/>
       <w:r>
         <w:rPr>
           <w:sz w:val="24"/>
@@ -11775,7 +11775,7 @@
       <w:pPr>
         <w:pStyle w:val="Ttulo3"/>
       </w:pPr>
-      <w:bookmarkStart w:id="22" w:name="_Toc244073764"/>
+      <w:bookmarkStart w:id="22" w:name="_Toc244088675"/>
       <w:r>
         <w:rPr>
           <w:sz w:val="24"/>
@@ -11798,7 +11798,7 @@
       <w:pPr>
         <w:pStyle w:val="Ttulo3"/>
       </w:pPr>
-      <w:bookmarkStart w:id="23" w:name="_Toc244073765"/>
+      <w:bookmarkStart w:id="23" w:name="_Toc244088676"/>
       <w:r>
         <w:rPr>
           <w:sz w:val="24"/>
@@ -11822,7 +11822,7 @@
       <w:pPr>
         <w:pStyle w:val="Ttulo2"/>
       </w:pPr>
-      <w:bookmarkStart w:id="24" w:name="_Toc244073766"/>
+      <w:bookmarkStart w:id="24" w:name="_Toc244088677"/>
       <w:r>
         <w:t>3.3. Planificación y organización del proyecto</w:t>
       </w:r>
@@ -12467,7 +12467,7 @@
         <w:pStyle w:val="Ttulo1"/>
         <w:pageBreakBefore/>
       </w:pPr>
-      <w:bookmarkStart w:id="26" w:name="_Toc244073767"/>
+      <w:bookmarkStart w:id="26" w:name="_Toc244088678"/>
       <w:r>
         <w:lastRenderedPageBreak/>
         <w:t>4. Procesamiento de datos y aprendizaje automático</w:t>
@@ -12478,7 +12478,7 @@
       <w:pPr>
         <w:pStyle w:val="Ttulo2"/>
       </w:pPr>
-      <w:bookmarkStart w:id="27" w:name="_Toc244073768"/>
+      <w:bookmarkStart w:id="27" w:name="_Toc244088679"/>
       <w:r>
         <w:t>4.1. Extracción, transformación y almacenamiento de datos</w:t>
       </w:r>
@@ -12561,7 +12561,7 @@
       <w:pPr>
         <w:pStyle w:val="Ttulo3"/>
       </w:pPr>
-      <w:bookmarkStart w:id="29" w:name="_Toc244073769"/>
+      <w:bookmarkStart w:id="29" w:name="_Toc244088680"/>
       <w:r>
         <w:rPr>
           <w:sz w:val="24"/>
@@ -13150,7 +13150,7 @@
       <w:pPr>
         <w:pStyle w:val="Ttulo3"/>
       </w:pPr>
-      <w:bookmarkStart w:id="31" w:name="_Toc244073770"/>
+      <w:bookmarkStart w:id="31" w:name="_Toc244088681"/>
       <w:r>
         <w:rPr>
           <w:sz w:val="24"/>
@@ -13620,7 +13620,7 @@
       <w:pPr>
         <w:pStyle w:val="Ttulo3"/>
       </w:pPr>
-      <w:bookmarkStart w:id="33" w:name="_Toc244073771"/>
+      <w:bookmarkStart w:id="33" w:name="_Toc244088682"/>
       <w:r>
         <w:rPr>
           <w:sz w:val="24"/>
@@ -14406,7 +14406,7 @@
       <w:pPr>
         <w:pStyle w:val="Ttulo3"/>
       </w:pPr>
-      <w:bookmarkStart w:id="35" w:name="_Toc244073772"/>
+      <w:bookmarkStart w:id="35" w:name="_Toc244088683"/>
       <w:r>
         <w:rPr>
           <w:sz w:val="24"/>
@@ -14482,7 +14482,7 @@
       <w:pPr>
         <w:pStyle w:val="Ttulo3"/>
       </w:pPr>
-      <w:bookmarkStart w:id="36" w:name="_Toc244073773"/>
+      <w:bookmarkStart w:id="36" w:name="_Toc244088684"/>
       <w:r>
         <w:rPr>
           <w:sz w:val="24"/>
@@ -14631,7 +14631,7 @@
       <w:pPr>
         <w:pStyle w:val="Ttulo3"/>
       </w:pPr>
-      <w:bookmarkStart w:id="37" w:name="_Toc244073774"/>
+      <w:bookmarkStart w:id="37" w:name="_Toc244088685"/>
       <w:r>
         <w:rPr>
           <w:sz w:val="24"/>
@@ -17250,7 +17250,7 @@
       <w:pPr>
         <w:pStyle w:val="Ttulo3"/>
       </w:pPr>
-      <w:bookmarkStart w:id="42" w:name="_Toc244073775"/>
+      <w:bookmarkStart w:id="42" w:name="_Toc244088686"/>
       <w:r>
         <w:rPr>
           <w:sz w:val="24"/>
@@ -19241,7 +19241,7 @@
       <w:pPr>
         <w:pStyle w:val="Ttulo3"/>
       </w:pPr>
-      <w:bookmarkStart w:id="44" w:name="_Toc244073776"/>
+      <w:bookmarkStart w:id="44" w:name="_Toc244088687"/>
       <w:r>
         <w:rPr>
           <w:sz w:val="24"/>
@@ -19995,7 +19995,7 @@
       <w:pPr>
         <w:pStyle w:val="Ttulo3"/>
       </w:pPr>
-      <w:bookmarkStart w:id="46" w:name="_Toc244073777"/>
+      <w:bookmarkStart w:id="46" w:name="_Toc244088688"/>
       <w:r>
         <w:rPr>
           <w:sz w:val="24"/>
@@ -20022,7 +20022,7 @@
       <w:pPr>
         <w:pStyle w:val="Ttulo3"/>
       </w:pPr>
-      <w:bookmarkStart w:id="47" w:name="_Toc244073778"/>
+      <w:bookmarkStart w:id="47" w:name="_Toc244088689"/>
       <w:r>
         <w:rPr>
           <w:sz w:val="24"/>
@@ -20050,7 +20050,7 @@
       <w:pPr>
         <w:pStyle w:val="Ttulo3"/>
       </w:pPr>
-      <w:bookmarkStart w:id="48" w:name="_Toc244073779"/>
+      <w:bookmarkStart w:id="48" w:name="_Toc244088690"/>
       <w:r>
         <w:rPr>
           <w:sz w:val="24"/>
@@ -20068,7 +20068,7 @@
       <w:pPr>
         <w:pStyle w:val="Ttulo2"/>
       </w:pPr>
-      <w:bookmarkStart w:id="49" w:name="_Toc244073780"/>
+      <w:bookmarkStart w:id="49" w:name="_Toc244088691"/>
       <w:r>
         <w:t>4.2. Análisis exploratorio y preparación de variables</w:t>
       </w:r>
@@ -20083,7 +20083,7 @@
       <w:pPr>
         <w:pStyle w:val="Ttulo3"/>
       </w:pPr>
-      <w:bookmarkStart w:id="50" w:name="_Toc244073781"/>
+      <w:bookmarkStart w:id="50" w:name="_Toc244088692"/>
       <w:r>
         <w:rPr>
           <w:sz w:val="24"/>
@@ -20617,7 +20617,7 @@
       <w:pPr>
         <w:pStyle w:val="Ttulo3"/>
       </w:pPr>
-      <w:bookmarkStart w:id="53" w:name="_Toc244073782"/>
+      <w:bookmarkStart w:id="53" w:name="_Toc244088693"/>
       <w:r>
         <w:rPr>
           <w:sz w:val="24"/>
@@ -21688,7 +21688,7 @@
       <w:pPr>
         <w:pStyle w:val="Ttulo3"/>
       </w:pPr>
-      <w:bookmarkStart w:id="57" w:name="_Toc244073783"/>
+      <w:bookmarkStart w:id="57" w:name="_Toc244088694"/>
       <w:r>
         <w:rPr>
           <w:sz w:val="24"/>
@@ -21777,7 +21777,7 @@
       <w:pPr>
         <w:pStyle w:val="Ttulo3"/>
       </w:pPr>
-      <w:bookmarkStart w:id="59" w:name="_Toc244073784"/>
+      <w:bookmarkStart w:id="59" w:name="_Toc244088695"/>
       <w:r>
         <w:rPr>
           <w:sz w:val="24"/>
@@ -21860,7 +21860,7 @@
       <w:pPr>
         <w:pStyle w:val="Ttulo3"/>
       </w:pPr>
-      <w:bookmarkStart w:id="60" w:name="_Toc244073785"/>
+      <w:bookmarkStart w:id="60" w:name="_Toc244088696"/>
       <w:r>
         <w:rPr>
           <w:sz w:val="24"/>
@@ -22400,7 +22400,7 @@
       <w:pPr>
         <w:pStyle w:val="Ttulo3"/>
       </w:pPr>
-      <w:bookmarkStart w:id="62" w:name="_Toc244073786"/>
+      <w:bookmarkStart w:id="62" w:name="_Toc244088697"/>
       <w:r>
         <w:rPr>
           <w:sz w:val="24"/>
@@ -22428,7 +22428,7 @@
       <w:pPr>
         <w:pStyle w:val="Ttulo3"/>
       </w:pPr>
-      <w:bookmarkStart w:id="63" w:name="_Toc244073787"/>
+      <w:bookmarkStart w:id="63" w:name="_Toc244088698"/>
       <w:r>
         <w:rPr>
           <w:sz w:val="24"/>
@@ -22544,7 +22544,7 @@
       <w:pPr>
         <w:pStyle w:val="Ttulo2"/>
       </w:pPr>
-      <w:bookmarkStart w:id="64" w:name="_Toc244073788"/>
+      <w:bookmarkStart w:id="64" w:name="_Toc244088699"/>
       <w:r>
         <w:lastRenderedPageBreak/>
         <w:t>4.3. Desarrollo y evaluación del modelo predictivo</w:t>
@@ -22560,7 +22560,7 @@
       <w:pPr>
         <w:pStyle w:val="Ttulo3"/>
       </w:pPr>
-      <w:bookmarkStart w:id="65" w:name="_Toc244073789"/>
+      <w:bookmarkStart w:id="65" w:name="_Toc244088700"/>
       <w:r>
         <w:rPr>
           <w:sz w:val="24"/>
@@ -22588,7 +22588,7 @@
       <w:pPr>
         <w:pStyle w:val="Ttulo3"/>
       </w:pPr>
-      <w:bookmarkStart w:id="66" w:name="_Toc244073790"/>
+      <w:bookmarkStart w:id="66" w:name="_Toc244088701"/>
       <w:r>
         <w:rPr>
           <w:sz w:val="24"/>
@@ -22614,7 +22614,7 @@
       <w:pPr>
         <w:pStyle w:val="Ttulo3"/>
       </w:pPr>
-      <w:bookmarkStart w:id="67" w:name="_Toc244073791"/>
+      <w:bookmarkStart w:id="67" w:name="_Toc244088702"/>
       <w:r>
         <w:rPr>
           <w:sz w:val="24"/>
@@ -22755,7 +22755,7 @@
       <w:pPr>
         <w:pStyle w:val="Ttulo3"/>
       </w:pPr>
-      <w:bookmarkStart w:id="68" w:name="_Toc244073792"/>
+      <w:bookmarkStart w:id="68" w:name="_Toc244088703"/>
       <w:r>
         <w:rPr>
           <w:sz w:val="24"/>
@@ -22773,7 +22773,7 @@
       <w:pPr>
         <w:pStyle w:val="Ttulo3"/>
       </w:pPr>
-      <w:bookmarkStart w:id="69" w:name="_Toc244073793"/>
+      <w:bookmarkStart w:id="69" w:name="_Toc244088704"/>
       <w:r>
         <w:rPr>
           <w:sz w:val="24"/>
@@ -23548,7 +23548,7 @@
       <w:pPr>
         <w:pStyle w:val="Ttulo3"/>
       </w:pPr>
-      <w:bookmarkStart w:id="72" w:name="_Toc244073794"/>
+      <w:bookmarkStart w:id="72" w:name="_Toc244088705"/>
       <w:r>
         <w:rPr>
           <w:sz w:val="24"/>
@@ -24446,7 +24446,7 @@
       <w:pPr>
         <w:pStyle w:val="Ttulo3"/>
       </w:pPr>
-      <w:bookmarkStart w:id="75" w:name="_Toc244073795"/>
+      <w:bookmarkStart w:id="75" w:name="_Toc244088706"/>
       <w:r>
         <w:rPr>
           <w:sz w:val="24"/>
@@ -24474,7 +24474,7 @@
       <w:pPr>
         <w:pStyle w:val="Ttulo3"/>
       </w:pPr>
-      <w:bookmarkStart w:id="76" w:name="_Toc244073796"/>
+      <w:bookmarkStart w:id="76" w:name="_Toc244088707"/>
       <w:r>
         <w:rPr>
           <w:sz w:val="24"/>
@@ -24498,7 +24498,7 @@
       <w:pPr>
         <w:pStyle w:val="Ttulo3"/>
       </w:pPr>
-      <w:bookmarkStart w:id="77" w:name="_Toc244073797"/>
+      <w:bookmarkStart w:id="77" w:name="_Toc244088708"/>
       <w:r>
         <w:rPr>
           <w:sz w:val="24"/>
@@ -24521,7 +24521,7 @@
       <w:pPr>
         <w:pStyle w:val="Ttulo3"/>
       </w:pPr>
-      <w:bookmarkStart w:id="78" w:name="_Toc244073798"/>
+      <w:bookmarkStart w:id="78" w:name="_Toc244088709"/>
       <w:r>
         <w:t>4.3.10. Reentrenamiento con datos de 2026</w:t>
       </w:r>
@@ -25254,7 +25254,7 @@
       <w:pPr>
         <w:pStyle w:val="Ttulo3"/>
       </w:pPr>
-      <w:bookmarkStart w:id="81" w:name="_Toc244073799"/>
+      <w:bookmarkStart w:id="81" w:name="_Toc244088710"/>
       <w:r>
         <w:t>4.3.11. Modelo de ETc para la aplicación</w:t>
       </w:r>
@@ -25866,7 +25866,7 @@
       <w:pPr>
         <w:pStyle w:val="Ttulo3"/>
       </w:pPr>
-      <w:bookmarkStart w:id="83" w:name="_Toc244073800"/>
+      <w:bookmarkStart w:id="83" w:name="_Toc244088711"/>
       <w:r>
         <w:lastRenderedPageBreak/>
         <w:t>4.3.12. Explicabilidad de los modelos de árboles</w:t>
@@ -26489,7 +26489,7 @@
         <w:pageBreakBefore/>
       </w:pPr>
       <w:bookmarkStart w:id="86" w:name="_Toc243495226"/>
-      <w:bookmarkStart w:id="87" w:name="_Toc244073801"/>
+      <w:bookmarkStart w:id="87" w:name="_Toc244088712"/>
       <w:r>
         <w:lastRenderedPageBreak/>
         <w:t>5. Sistema de recomendación y resultados</w:t>
@@ -26506,7 +26506,7 @@
       <w:pPr>
         <w:pStyle w:val="Ttulo2"/>
       </w:pPr>
-      <w:bookmarkStart w:id="88" w:name="_Toc244073802"/>
+      <w:bookmarkStart w:id="88" w:name="_Toc244088713"/>
       <w:r>
         <w:t>5.1. Diseño del sistema de recomendación de riego</w:t>
       </w:r>
@@ -26526,7 +26526,7 @@
       <w:pPr>
         <w:pStyle w:val="Ttulo3"/>
       </w:pPr>
-      <w:bookmarkStart w:id="89" w:name="_Toc244073803"/>
+      <w:bookmarkStart w:id="89" w:name="_Toc244088714"/>
       <w:r>
         <w:rPr>
           <w:sz w:val="24"/>
@@ -26553,7 +26553,7 @@
       <w:pPr>
         <w:pStyle w:val="Ttulo3"/>
       </w:pPr>
-      <w:bookmarkStart w:id="90" w:name="_Toc244073804"/>
+      <w:bookmarkStart w:id="90" w:name="_Toc244088715"/>
       <w:r>
         <w:rPr>
           <w:sz w:val="24"/>
@@ -26638,7 +26638,7 @@
       <w:pPr>
         <w:pStyle w:val="Ttulo3"/>
       </w:pPr>
-      <w:bookmarkStart w:id="92" w:name="_Toc244073805"/>
+      <w:bookmarkStart w:id="92" w:name="_Toc244088716"/>
       <w:r>
         <w:rPr>
           <w:sz w:val="24"/>
@@ -26687,7 +26687,7 @@
       <w:pPr>
         <w:pStyle w:val="Ttulo3"/>
       </w:pPr>
-      <w:bookmarkStart w:id="93" w:name="_Toc244073806"/>
+      <w:bookmarkStart w:id="93" w:name="_Toc244088717"/>
       <w:r>
         <w:rPr>
           <w:sz w:val="24"/>
@@ -27571,7 +27571,7 @@
       <w:pPr>
         <w:pStyle w:val="Ttulo3"/>
       </w:pPr>
-      <w:bookmarkStart w:id="95" w:name="_Toc244073807"/>
+      <w:bookmarkStart w:id="95" w:name="_Toc244088718"/>
       <w:r>
         <w:rPr>
           <w:sz w:val="24"/>
@@ -27594,7 +27594,7 @@
       <w:pPr>
         <w:pStyle w:val="Ttulo3"/>
       </w:pPr>
-      <w:bookmarkStart w:id="96" w:name="_Toc244073808"/>
+      <w:bookmarkStart w:id="96" w:name="_Toc244088719"/>
       <w:r>
         <w:rPr>
           <w:sz w:val="24"/>
@@ -27613,7 +27613,7 @@
       <w:pPr>
         <w:pStyle w:val="Ttulo3"/>
       </w:pPr>
-      <w:bookmarkStart w:id="97" w:name="_Toc244073809"/>
+      <w:bookmarkStart w:id="97" w:name="_Toc244088720"/>
       <w:r>
         <w:t>5.1.7. Integración operativa de ETc y AEMET</w:t>
       </w:r>
@@ -27633,7 +27633,7 @@
       <w:pPr>
         <w:pStyle w:val="Ttulo2"/>
       </w:pPr>
-      <w:bookmarkStart w:id="98" w:name="_Toc244073810"/>
+      <w:bookmarkStart w:id="98" w:name="_Toc244088721"/>
       <w:r>
         <w:t>5.2. Aplicación y visualización de resultados</w:t>
       </w:r>
@@ -27648,7 +27648,7 @@
       <w:pPr>
         <w:pStyle w:val="Ttulo3"/>
       </w:pPr>
-      <w:bookmarkStart w:id="99" w:name="_Toc244073811"/>
+      <w:bookmarkStart w:id="99" w:name="_Toc244088722"/>
       <w:r>
         <w:rPr>
           <w:sz w:val="24"/>
@@ -27675,7 +27675,7 @@
       <w:pPr>
         <w:pStyle w:val="Ttulo3"/>
       </w:pPr>
-      <w:bookmarkStart w:id="100" w:name="_Toc244073812"/>
+      <w:bookmarkStart w:id="100" w:name="_Toc244088723"/>
       <w:r>
         <w:rPr>
           <w:sz w:val="24"/>
@@ -27703,7 +27703,7 @@
       <w:pPr>
         <w:pStyle w:val="Ttulo3"/>
       </w:pPr>
-      <w:bookmarkStart w:id="101" w:name="_Toc244073813"/>
+      <w:bookmarkStart w:id="101" w:name="_Toc244088724"/>
       <w:r>
         <w:rPr>
           <w:sz w:val="24"/>
@@ -29650,7 +29650,7 @@
       <w:pPr>
         <w:pStyle w:val="Ttulo3"/>
       </w:pPr>
-      <w:bookmarkStart w:id="104" w:name="_Toc244073814"/>
+      <w:bookmarkStart w:id="104" w:name="_Toc244088725"/>
       <w:r>
         <w:rPr>
           <w:sz w:val="24"/>
@@ -29677,7 +29677,7 @@
       <w:pPr>
         <w:pStyle w:val="Ttulo3"/>
       </w:pPr>
-      <w:bookmarkStart w:id="105" w:name="_Toc244073815"/>
+      <w:bookmarkStart w:id="105" w:name="_Toc244088726"/>
       <w:r>
         <w:rPr>
           <w:sz w:val="24"/>
@@ -29695,7 +29695,7 @@
       <w:pPr>
         <w:pStyle w:val="Ttulo3"/>
       </w:pPr>
-      <w:bookmarkStart w:id="106" w:name="_Toc244073816"/>
+      <w:bookmarkStart w:id="106" w:name="_Toc244088727"/>
       <w:r>
         <w:rPr>
           <w:sz w:val="24"/>
@@ -29713,7 +29713,7 @@
       <w:pPr>
         <w:pStyle w:val="Ttulo2"/>
       </w:pPr>
-      <w:bookmarkStart w:id="107" w:name="_Toc244073817"/>
+      <w:bookmarkStart w:id="107" w:name="_Toc244088728"/>
       <w:r>
         <w:t>5.3. Validación, resultados y análisis crítico</w:t>
       </w:r>
@@ -29733,7 +29733,7 @@
       <w:pPr>
         <w:pStyle w:val="Ttulo3"/>
       </w:pPr>
-      <w:bookmarkStart w:id="108" w:name="_Toc244073818"/>
+      <w:bookmarkStart w:id="108" w:name="_Toc244088729"/>
       <w:r>
         <w:rPr>
           <w:sz w:val="24"/>
@@ -29757,7 +29757,7 @@
       <w:pPr>
         <w:pStyle w:val="Ttulo3"/>
       </w:pPr>
-      <w:bookmarkStart w:id="109" w:name="_Toc244073819"/>
+      <w:bookmarkStart w:id="109" w:name="_Toc244088730"/>
       <w:r>
         <w:rPr>
           <w:sz w:val="24"/>
@@ -30265,7 +30265,7 @@
       <w:pPr>
         <w:pStyle w:val="Ttulo3"/>
       </w:pPr>
-      <w:bookmarkStart w:id="111" w:name="_Toc244073820"/>
+      <w:bookmarkStart w:id="111" w:name="_Toc244088731"/>
       <w:r>
         <w:rPr>
           <w:sz w:val="24"/>
@@ -31139,7 +31139,7 @@
       <w:pPr>
         <w:pStyle w:val="Ttulo3"/>
       </w:pPr>
-      <w:bookmarkStart w:id="114" w:name="_Toc244073821"/>
+      <w:bookmarkStart w:id="114" w:name="_Toc244088732"/>
       <w:r>
         <w:rPr>
           <w:sz w:val="24"/>
@@ -32246,7 +32246,7 @@
       <w:pPr>
         <w:pStyle w:val="Ttulo3"/>
       </w:pPr>
-      <w:bookmarkStart w:id="117" w:name="_Toc244073822"/>
+      <w:bookmarkStart w:id="117" w:name="_Toc244088733"/>
       <w:r>
         <w:rPr>
           <w:sz w:val="24"/>
@@ -32337,7 +32337,7 @@
       <w:pPr>
         <w:pStyle w:val="Ttulo3"/>
       </w:pPr>
-      <w:bookmarkStart w:id="119" w:name="_Toc244073823"/>
+      <w:bookmarkStart w:id="119" w:name="_Toc244088734"/>
       <w:r>
         <w:rPr>
           <w:sz w:val="24"/>
@@ -32794,7 +32794,7 @@
       <w:pPr>
         <w:pStyle w:val="Ttulo3"/>
       </w:pPr>
-      <w:bookmarkStart w:id="121" w:name="_Toc244073824"/>
+      <w:bookmarkStart w:id="121" w:name="_Toc244088735"/>
       <w:r>
         <w:rPr>
           <w:sz w:val="24"/>
@@ -33886,7 +33886,7 @@
       <w:pPr>
         <w:pStyle w:val="Ttulo3"/>
       </w:pPr>
-      <w:bookmarkStart w:id="123" w:name="_Toc244073825"/>
+      <w:bookmarkStart w:id="123" w:name="_Toc244088736"/>
       <w:r>
         <w:rPr>
           <w:sz w:val="24"/>
@@ -33904,7 +33904,7 @@
       <w:pPr>
         <w:pStyle w:val="Ttulo3"/>
       </w:pPr>
-      <w:bookmarkStart w:id="124" w:name="_Toc244073826"/>
+      <w:bookmarkStart w:id="124" w:name="_Toc244088737"/>
       <w:r>
         <w:rPr>
           <w:sz w:val="24"/>
@@ -33920,31 +33920,25 @@
     </w:p>
     <w:p>
       <w:r>
-        <w:t xml:space="preserve">Los resultados deben leerse, no obstante, con varias cautelas. La primera es que la referencia es la propia SiAR. Un error pequeño frente a ella indica que el sistema reproduce bien un cálculo oficial, no que la dosis sea la adecuada para una parcela concreta, cuyo suelo, marco de plantación, cubierta y estado del cultivo pueden diferir de las hipótesis de la estación. La segunda es que la evaluación detallada se concentra en pimiento AL01 durante 2025. La comprobación añadida en coliflor AL01, alfalfa Z06 y alcachofa BA08 muestra transferencia a otros calendarios y regiones, pero cada cultivo aporta una sola campaña de 2026. La ventaja observada no acredita generalización nacional ni estabilidad interanual. La tercera es que el tramo de prueba del piloto, </w:t>
+        <w:t>La interpretación queda condicionada por la referencia SiAR, el tamaño del piloto y la ausencia de validación de campo. El apartado 5.3.10 comprueba el comportamiento cronológico en otros tres calendarios, mientras que el apartado 6.2 reúne de forma sistemática las limitaciones de validez, predicción, funcionalidad y arquitectura. En este capítulo basta señalar que el resultado mide fidelidad al cálculo oficial y que los avisos del sistema requieren la decisión final del usuario.</w:t>
+      </w:r>
+    </w:p>
+    <w:p>
+      <w:r>
+        <w:t xml:space="preserve">Con estas limitaciones, el prototipo cumple lo que se pretendía demostrar en este capítulo: que es posible convertir datos agroclimáticos públicos en una recomendación de riego diaria y semanal, </w:t>
       </w:r>
       <w:r>
         <w:lastRenderedPageBreak/>
-        <w:t>septiembre, es atípico: tiene un Kc muy bajo, necesidades cercanas a un milímetro y una ET0 en descenso, por lo que sus errores absolutos son pequeños y poco representativos del verano.</w:t>
-      </w:r>
-    </w:p>
-    <w:p>
-      <w:r>
-        <w:t>La cuarta cautela se refiere a lo que el sistema no hace. No decide cuándo regar, porque sin balance hídrico del suelo todas las necesidades se tratan como diarias. No integra una ET0 prevista contrastada, por lo que en los horizontes largos depende de que el tiempo se mantenga. Y no se ha validado con usuarios, de modo que no hay evidencia de que la interfaz y las explicaciones resulten comprensibles para quienes tendrían que utilizarlas. Hay también situaciones en las que el sistema no debería emitir una recomendación sin que alguien la revise. Ocurre con los datos desactualizados durante más de dos días, cuando la ET0 queda fuera del intervalo observado, ante una previsión de lluvia relevante y siempre que la dotación obliga a recortar la dosis. En todos esos casos el sistema emite avisos, pero la decisión sobre qué hacer con ellos corresponde al usuario.</w:t>
-      </w:r>
-    </w:p>
-    <w:p>
-      <w:r>
-        <w:t>Con estas limitaciones, el prototipo cumple lo que se pretendía demostrar en este capítulo: que es posible convertir datos agroclimáticos públicos en una recomendación de riego diaria y semanal, explicada, trazable y evaluada frente a una referencia, con un error conocido para cada horizonte. La valoración de este resultado frente a los objetivos del trabajo se desarrolla en el capítulo 6.</w:t>
+        <w:t>explicada, trazable y evaluada frente a una referencia, con un error conocido para cada horizonte. La valoración de este resultado frente a los objetivos del trabajo se desarrolla en el capítulo 6.</w:t>
       </w:r>
     </w:p>
     <w:p>
       <w:pPr>
         <w:pStyle w:val="Ttulo3"/>
-        <w:pageBreakBefore/>
-      </w:pPr>
-      <w:bookmarkStart w:id="125" w:name="_Toc244073827"/>
-      <w:r>
-        <w:lastRenderedPageBreak/>
+        <w:keepNext w:val="0"/>
+      </w:pPr>
+      <w:bookmarkStart w:id="125" w:name="_Toc244088738"/>
+      <w:r>
         <w:t>5.3.10. Comprobación cronológica en otros cultivos y regiones</w:t>
       </w:r>
       <w:bookmarkEnd w:id="125"/>
@@ -34153,10 +34147,7 @@
           </w:tcPr>
           <w:p>
             <w:r>
-              <w:t xml:space="preserve">0,071 [−0,194; </w:t>
-            </w:r>
-            <w:r>
-              <w:t>0,321]</w:t>
+              <w:t>0,071 [−0,194; 0,321]</w:t>
             </w:r>
           </w:p>
         </w:tc>
@@ -34371,12 +34362,12 @@
     </w:p>
     <w:p>
       <w:r>
+        <w:lastRenderedPageBreak/>
         <w:t>Los intervalos por caso de la Tabla 5.8 incluyen el cero para coliflor y alfalfa; en alcachofa el límite inferior es 0,000 por redondeo. Por tanto, la evidencia más sólida corresponde al agregado y no permite afirmar una mejora concluyente para cada cultivo por separado.</w:t>
       </w:r>
     </w:p>
     <w:p>
       <w:r>
-        <w:lastRenderedPageBreak/>
         <w:t>Un bootstrap pareado por bloques temporales de siete días, con 5.000 remuestreos y semilla 42, sitúa la diferencia MAE(persistencia) − MAE(DSS) en 0,164 mm/día, con intervalo percentil del 95 % entre 0,026 y 0,303 mm/día. El 99,1 % de los remuestreos favorece al DSS. El intervalo describe incertidumbre interna de estos tramos, no generalización a otras campañas.</w:t>
       </w:r>
     </w:p>
@@ -34388,11 +34379,9 @@
     <w:p>
       <w:pPr>
         <w:pStyle w:val="Ttulo3"/>
-        <w:pageBreakBefore/>
-      </w:pPr>
-      <w:bookmarkStart w:id="126" w:name="_Toc244073828"/>
-      <w:r>
-        <w:lastRenderedPageBreak/>
+      </w:pPr>
+      <w:bookmarkStart w:id="126" w:name="_Toc244088739"/>
+      <w:r>
         <w:t>5.3.11. Reproducibilidad y evidencias</w:t>
       </w:r>
       <w:bookmarkEnd w:id="126"/>
@@ -34407,7 +34396,7 @@
         <w:pStyle w:val="Ttulo1"/>
         <w:pageBreakBefore/>
       </w:pPr>
-      <w:bookmarkStart w:id="127" w:name="_Toc244073829"/>
+      <w:bookmarkStart w:id="127" w:name="_Toc244088740"/>
       <w:r>
         <w:lastRenderedPageBreak/>
         <w:t>6. Conclusiones</w:t>
@@ -34418,7 +34407,7 @@
       <w:pPr>
         <w:pStyle w:val="Ttulo2"/>
       </w:pPr>
-      <w:bookmarkStart w:id="128" w:name="_Toc244073830"/>
+      <w:bookmarkStart w:id="128" w:name="_Toc244088741"/>
       <w:r>
         <w:t>6.1. Cumplimiento de objetivos y aportaciones</w:t>
       </w:r>
@@ -34428,7 +34417,7 @@
       <w:pPr>
         <w:pStyle w:val="Ttulo3"/>
       </w:pPr>
-      <w:bookmarkStart w:id="129" w:name="_Toc244073831"/>
+      <w:bookmarkStart w:id="129" w:name="_Toc244088742"/>
       <w:r>
         <w:rPr>
           <w:sz w:val="24"/>
@@ -35100,7 +35089,7 @@
       <w:pPr>
         <w:pStyle w:val="Ttulo3"/>
       </w:pPr>
-      <w:bookmarkStart w:id="131" w:name="_Toc244073832"/>
+      <w:bookmarkStart w:id="131" w:name="_Toc244088743"/>
       <w:r>
         <w:rPr>
           <w:sz w:val="24"/>
@@ -35137,7 +35126,7 @@
       <w:pPr>
         <w:pStyle w:val="Ttulo2"/>
       </w:pPr>
-      <w:bookmarkStart w:id="132" w:name="_Toc244073833"/>
+      <w:bookmarkStart w:id="132" w:name="_Toc244088744"/>
       <w:r>
         <w:t>6.2. Limitaciones e impacto del proyecto</w:t>
       </w:r>
@@ -35147,7 +35136,7 @@
       <w:pPr>
         <w:pStyle w:val="Ttulo3"/>
       </w:pPr>
-      <w:bookmarkStart w:id="133" w:name="_Toc244073834"/>
+      <w:bookmarkStart w:id="133" w:name="_Toc244088745"/>
       <w:r>
         <w:rPr>
           <w:sz w:val="24"/>
@@ -35731,7 +35720,7 @@
       <w:pPr>
         <w:pStyle w:val="Ttulo3"/>
       </w:pPr>
-      <w:bookmarkStart w:id="135" w:name="_Toc244073835"/>
+      <w:bookmarkStart w:id="135" w:name="_Toc244088746"/>
       <w:r>
         <w:rPr>
           <w:sz w:val="24"/>
@@ -35773,7 +35762,7 @@
       <w:pPr>
         <w:pStyle w:val="Ttulo2"/>
       </w:pPr>
-      <w:bookmarkStart w:id="136" w:name="_Toc244073836"/>
+      <w:bookmarkStart w:id="136" w:name="_Toc244088747"/>
       <w:r>
         <w:t>6.3. Mejoras y líneas futuras</w:t>
       </w:r>
@@ -35788,7 +35777,7 @@
       <w:pPr>
         <w:pStyle w:val="Ttulo3"/>
       </w:pPr>
-      <w:bookmarkStart w:id="137" w:name="_Toc244073837"/>
+      <w:bookmarkStart w:id="137" w:name="_Toc244088748"/>
       <w:r>
         <w:rPr>
           <w:sz w:val="24"/>
@@ -35806,7 +35795,7 @@
       <w:pPr>
         <w:pStyle w:val="Ttulo3"/>
       </w:pPr>
-      <w:bookmarkStart w:id="138" w:name="_Toc244073838"/>
+      <w:bookmarkStart w:id="138" w:name="_Toc244088749"/>
       <w:r>
         <w:rPr>
           <w:sz w:val="24"/>
@@ -35844,7 +35833,7 @@
       <w:pPr>
         <w:pStyle w:val="Ttulo3"/>
       </w:pPr>
-      <w:bookmarkStart w:id="139" w:name="_Toc244073839"/>
+      <w:bookmarkStart w:id="139" w:name="_Toc244088750"/>
       <w:r>
         <w:rPr>
           <w:sz w:val="24"/>
@@ -35872,7 +35861,7 @@
       <w:pPr>
         <w:pStyle w:val="Ttulo3"/>
       </w:pPr>
-      <w:bookmarkStart w:id="140" w:name="_Toc244073840"/>
+      <w:bookmarkStart w:id="140" w:name="_Toc244088751"/>
       <w:r>
         <w:rPr>
           <w:sz w:val="24"/>
@@ -35899,7 +35888,7 @@
       <w:pPr>
         <w:pStyle w:val="Ttulo3"/>
       </w:pPr>
-      <w:bookmarkStart w:id="141" w:name="_Toc244073841"/>
+      <w:bookmarkStart w:id="141" w:name="_Toc244088752"/>
       <w:r>
         <w:t>6.3.5. Operación, MLOps y control de deriva</w:t>
       </w:r>
@@ -35919,7 +35908,7 @@
       <w:pPr>
         <w:pStyle w:val="Ttulo3"/>
       </w:pPr>
-      <w:bookmarkStart w:id="142" w:name="_Toc244073842"/>
+      <w:bookmarkStart w:id="142" w:name="_Toc244088753"/>
       <w:r>
         <w:t>6.3.6. Ciencia abierta y principios FAIR</w:t>
       </w:r>
@@ -35943,7 +35932,7 @@
       <w:pPr>
         <w:pStyle w:val="Ttulo3"/>
       </w:pPr>
-      <w:bookmarkStart w:id="143" w:name="_Toc244073843"/>
+      <w:bookmarkStart w:id="143" w:name="_Toc244088754"/>
       <w:r>
         <w:t>6.3.7. Consideración final</w:t>
       </w:r>
@@ -35959,7 +35948,7 @@
         <w:pStyle w:val="Ttulo1"/>
         <w:pageBreakBefore/>
       </w:pPr>
-      <w:bookmarkStart w:id="144" w:name="_Toc244073844"/>
+      <w:bookmarkStart w:id="144" w:name="_Toc244088755"/>
       <w:r>
         <w:lastRenderedPageBreak/>
         <w:t>Referencias bibliográficas</w:t>
@@ -36887,7 +36876,7 @@
       <w:pPr>
         <w:pStyle w:val="Ttulo1"/>
       </w:pPr>
-      <w:bookmarkStart w:id="145" w:name="_Toc244073845"/>
+      <w:bookmarkStart w:id="145" w:name="_Toc244088756"/>
       <w:r>
         <w:lastRenderedPageBreak/>
         <w:t>Anexo A. Reproducción y localización de las evidencias</w:t>
@@ -36939,7 +36928,7 @@
       <w:pPr>
         <w:pStyle w:val="Ttulo2"/>
       </w:pPr>
-      <w:bookmarkStart w:id="146" w:name="_Toc244073846"/>
+      <w:bookmarkStart w:id="146" w:name="_Toc244088757"/>
       <w:r>
         <w:t>A.1. Archivos principales</w:t>
       </w:r>
@@ -37280,13 +37269,7 @@
               <w:rPr>
                 <w:sz w:val="15"/>
               </w:rPr>
-              <w:t xml:space="preserve">src/models/train_etc_for_dss.py; src/dss/predict_etc.py, engine.py y app_streamlit.py; src/analysis/build_validation_5_3.py y </w:t>
-            </w:r>
-            <w:r>
-              <w:rPr>
-                <w:sz w:val="15"/>
-              </w:rPr>
-              <w:t>build_validation_multicase_5_3.py; docs/data_samples/etc_model_deployment_2026.json, dss_validation_5_3.json y dss_validation_multicaso_5_3.json; modelos en models/deployed_etc_2026/</w:t>
+              <w:t>src/models/train_etc_for_dss.py; src/dss/predict_etc.py, engine.py y app_streamlit.py; src/analysis/build_validation_5_3.py y build_validation_multicase_5_3.py; docs/data_samples/etc_model_deployment_2026.json, dss_validation_5_3.json y dss_validation_multicaso_5_3.json; modelos en models/deployed_etc_2026/</w:t>
             </w:r>
           </w:p>
         </w:tc>
@@ -37343,13 +37326,7 @@
               <w:rPr>
                 <w:sz w:val="15"/>
               </w:rPr>
-              <w:t xml:space="preserve">tests/, incluido </w:t>
-            </w:r>
-            <w:r>
-              <w:rPr>
-                <w:sz w:val="15"/>
-              </w:rPr>
-              <w:t>test_validation_multicase_5_3.py (Kc activo, partición cronológica y bootstrap reproducible)</w:t>
+              <w:t>tests/, incluido test_validation_multicase_5_3.py (Kc activo, partición cronológica y bootstrap reproducible)</w:t>
             </w:r>
           </w:p>
         </w:tc>
@@ -37359,7 +37336,7 @@
       <w:pPr>
         <w:pStyle w:val="Ttulo2"/>
       </w:pPr>
-      <w:bookmarkStart w:id="148" w:name="_Toc244073847"/>
+      <w:bookmarkStart w:id="148" w:name="_Toc244088758"/>
       <w:r>
         <w:t>A.2. Secuencia mínima de reproducción</w:t>
       </w:r>
@@ -40544,6 +40521,12 @@
 </file>
 
 <file path=customXml/item1.xml><?xml version="1.0" encoding="utf-8"?>
+<p:properties xmlns:p="http://schemas.microsoft.com/office/2006/metadata/properties" xmlns:xsi="http://www.w3.org/2001/XMLSchema-instance" xmlns:pc="http://schemas.microsoft.com/office/infopath/2007/PartnerControls">
+  <documentManagement/>
+</p:properties>
+</file>
+
+<file path=customXml/item2.xml><?xml version="1.0" encoding="utf-8"?>
 <ct:contentTypeSchema xmlns:ct="http://schemas.microsoft.com/office/2006/metadata/contentType" xmlns:ma="http://schemas.microsoft.com/office/2006/metadata/properties/metaAttributes" ct:_="" ma:_="" ma:contentTypeName="Documento" ma:contentTypeID="0x01010019FAAD7208B57F46B26AFFED99BCE0D3" ma:contentTypeVersion="12" ma:contentTypeDescription="Crear nuevo documento." ma:contentTypeScope="" ma:versionID="1ef574cbf204855aeab3c40b347ffcdd">
   <xsd:schema xmlns:xsd="http://www.w3.org/2001/XMLSchema" xmlns:xs="http://www.w3.org/2001/XMLSchema" xmlns:p="http://schemas.microsoft.com/office/2006/metadata/properties" xmlns:ns2="9d7b9a5c-6b4f-4ca1-bb03-c38cacb734bc" xmlns:ns3="7d80c08f-e909-465c-8aa4-0e649fbe85d0" targetNamespace="http://schemas.microsoft.com/office/2006/metadata/properties" ma:root="true" ma:fieldsID="d90f8574e5bf50e8ad773515e43a9e2d" ns2:_="" ns3:_="">
     <xsd:import namespace="9d7b9a5c-6b4f-4ca1-bb03-c38cacb734bc"/>
@@ -40760,7 +40743,7 @@
 </ct:contentTypeSchema>
 </file>
 
-<file path=customXml/item2.xml><?xml version="1.0" encoding="utf-8"?>
+<file path=customXml/item3.xml><?xml version="1.0" encoding="utf-8"?>
 <?mso-contentType ?>
 <FormTemplates xmlns="http://schemas.microsoft.com/sharepoint/v3/contenttype/forms">
   <Display>DocumentLibraryForm</Display>
@@ -40769,13 +40752,16 @@
 </FormTemplates>
 </file>
 
-<file path=customXml/item3.xml><?xml version="1.0" encoding="utf-8"?>
-<p:properties xmlns:p="http://schemas.microsoft.com/office/2006/metadata/properties" xmlns:xsi="http://www.w3.org/2001/XMLSchema-instance" xmlns:pc="http://schemas.microsoft.com/office/infopath/2007/PartnerControls">
-  <documentManagement/>
-</p:properties>
+<file path=customXml/itemProps1.xml><?xml version="1.0" encoding="utf-8"?>
+<ds:datastoreItem xmlns:ds="http://schemas.openxmlformats.org/officeDocument/2006/customXml" ds:itemID="{261B0A37-6C6C-45CF-A5C4-83D994BC3980}">
+  <ds:schemaRefs>
+    <ds:schemaRef ds:uri="http://schemas.microsoft.com/office/2006/metadata/properties"/>
+    <ds:schemaRef ds:uri="http://schemas.microsoft.com/office/infopath/2007/PartnerControls"/>
+  </ds:schemaRefs>
+</ds:datastoreItem>
 </file>
 
-<file path=customXml/itemProps1.xml><?xml version="1.0" encoding="utf-8"?>
+<file path=customXml/itemProps2.xml><?xml version="1.0" encoding="utf-8"?>
 <ds:datastoreItem xmlns:ds="http://schemas.openxmlformats.org/officeDocument/2006/customXml" ds:itemID="{01B4916B-2905-40FE-B973-786E02856A77}">
   <ds:schemaRefs>
     <ds:schemaRef ds:uri="http://schemas.microsoft.com/office/2006/metadata/contentType"/>
@@ -40794,19 +40780,10 @@
 </ds:datastoreItem>
 </file>
 
-<file path=customXml/itemProps2.xml><?xml version="1.0" encoding="utf-8"?>
+<file path=customXml/itemProps3.xml><?xml version="1.0" encoding="utf-8"?>
 <ds:datastoreItem xmlns:ds="http://schemas.openxmlformats.org/officeDocument/2006/customXml" ds:itemID="{E5FD6A2B-9479-4129-9D84-6C858DBE1A90}">
   <ds:schemaRefs>
     <ds:schemaRef ds:uri="http://schemas.microsoft.com/sharepoint/v3/contenttype/forms"/>
   </ds:schemaRefs>
 </ds:datastoreItem>
-</file>
-
-<file path=customXml/itemProps3.xml><?xml version="1.0" encoding="utf-8"?>
-<ds:datastoreItem xmlns:ds="http://schemas.openxmlformats.org/officeDocument/2006/customXml" ds:itemID="{261B0A37-6C6C-45CF-A5C4-83D994BC3980}">
-  <ds:schemaRefs>
-    <ds:schemaRef ds:uri="http://schemas.microsoft.com/office/2006/metadata/properties"/>
-    <ds:schemaRef ds:uri="http://schemas.microsoft.com/office/infopath/2007/PartnerControls"/>
-  </ds:schemaRefs>
-</ds:datastoreItem>
 </file>
</xml_diff>

<commit_message>
Cierra evidencia estadistica y memoria final
</commit_message>
<xml_diff>
--- a/docs/memoria/TFM_definitivo_2026-10-28.docx
+++ b/docs/memoria/TFM_definitivo_2026-10-28.docx
@@ -381,7 +381,7 @@
       <w:r>
         <w:fldChar w:fldCharType="separate"/>
       </w:r>
-      <w:hyperlink w:anchor="_Toc244088658" w:history="1">
+      <w:hyperlink w:anchor="_Toc244100690" w:history="1">
         <w:r>
           <w:rPr>
             <w:rStyle w:val="Hipervnculo"/>
@@ -408,7 +408,7 @@
             <w:noProof/>
             <w:webHidden/>
           </w:rPr>
-          <w:instrText xml:space="preserve"> PAGEREF _Toc244088658 \h </w:instrText>
+          <w:instrText xml:space="preserve"> PAGEREF _Toc244100690 \h </w:instrText>
         </w:r>
         <w:r>
           <w:rPr>
@@ -455,7 +455,7 @@
           <w14:ligatures w14:val="standardContextual"/>
         </w:rPr>
       </w:pPr>
-      <w:hyperlink w:anchor="_Toc244088659" w:history="1">
+      <w:hyperlink w:anchor="_Toc244100691" w:history="1">
         <w:r>
           <w:rPr>
             <w:rStyle w:val="Hipervnculo"/>
@@ -482,7 +482,7 @@
             <w:noProof/>
             <w:webHidden/>
           </w:rPr>
-          <w:instrText xml:space="preserve"> PAGEREF _Toc244088659 \h </w:instrText>
+          <w:instrText xml:space="preserve"> PAGEREF _Toc244100691 \h </w:instrText>
         </w:r>
         <w:r>
           <w:rPr>
@@ -529,7 +529,7 @@
           <w14:ligatures w14:val="standardContextual"/>
         </w:rPr>
       </w:pPr>
-      <w:hyperlink w:anchor="_Toc244088660" w:history="1">
+      <w:hyperlink w:anchor="_Toc244100692" w:history="1">
         <w:r>
           <w:rPr>
             <w:rStyle w:val="Hipervnculo"/>
@@ -556,7 +556,7 @@
             <w:noProof/>
             <w:webHidden/>
           </w:rPr>
-          <w:instrText xml:space="preserve"> PAGEREF _Toc244088660 \h </w:instrText>
+          <w:instrText xml:space="preserve"> PAGEREF _Toc244100692 \h </w:instrText>
         </w:r>
         <w:r>
           <w:rPr>
@@ -603,7 +603,7 @@
           <w14:ligatures w14:val="standardContextual"/>
         </w:rPr>
       </w:pPr>
-      <w:hyperlink w:anchor="_Toc244088661" w:history="1">
+      <w:hyperlink w:anchor="_Toc244100693" w:history="1">
         <w:r>
           <w:rPr>
             <w:rStyle w:val="Hipervnculo"/>
@@ -630,7 +630,7 @@
             <w:noProof/>
             <w:webHidden/>
           </w:rPr>
-          <w:instrText xml:space="preserve"> PAGEREF _Toc244088661 \h </w:instrText>
+          <w:instrText xml:space="preserve"> PAGEREF _Toc244100693 \h </w:instrText>
         </w:r>
         <w:r>
           <w:rPr>
@@ -677,7 +677,7 @@
           <w14:ligatures w14:val="standardContextual"/>
         </w:rPr>
       </w:pPr>
-      <w:hyperlink w:anchor="_Toc244088662" w:history="1">
+      <w:hyperlink w:anchor="_Toc244100694" w:history="1">
         <w:r>
           <w:rPr>
             <w:rStyle w:val="Hipervnculo"/>
@@ -704,7 +704,7 @@
             <w:noProof/>
             <w:webHidden/>
           </w:rPr>
-          <w:instrText xml:space="preserve"> PAGEREF _Toc244088662 \h </w:instrText>
+          <w:instrText xml:space="preserve"> PAGEREF _Toc244100694 \h </w:instrText>
         </w:r>
         <w:r>
           <w:rPr>
@@ -751,7 +751,7 @@
           <w14:ligatures w14:val="standardContextual"/>
         </w:rPr>
       </w:pPr>
-      <w:hyperlink w:anchor="_Toc244088663" w:history="1">
+      <w:hyperlink w:anchor="_Toc244100695" w:history="1">
         <w:r>
           <w:rPr>
             <w:rStyle w:val="Hipervnculo"/>
@@ -778,7 +778,7 @@
             <w:noProof/>
             <w:webHidden/>
           </w:rPr>
-          <w:instrText xml:space="preserve"> PAGEREF _Toc244088663 \h </w:instrText>
+          <w:instrText xml:space="preserve"> PAGEREF _Toc244100695 \h </w:instrText>
         </w:r>
         <w:r>
           <w:rPr>
@@ -825,7 +825,7 @@
           <w14:ligatures w14:val="standardContextual"/>
         </w:rPr>
       </w:pPr>
-      <w:hyperlink w:anchor="_Toc244088664" w:history="1">
+      <w:hyperlink w:anchor="_Toc244100696" w:history="1">
         <w:r>
           <w:rPr>
             <w:rStyle w:val="Hipervnculo"/>
@@ -852,7 +852,7 @@
             <w:noProof/>
             <w:webHidden/>
           </w:rPr>
-          <w:instrText xml:space="preserve"> PAGEREF _Toc244088664 \h </w:instrText>
+          <w:instrText xml:space="preserve"> PAGEREF _Toc244100696 \h </w:instrText>
         </w:r>
         <w:r>
           <w:rPr>
@@ -899,7 +899,7 @@
           <w14:ligatures w14:val="standardContextual"/>
         </w:rPr>
       </w:pPr>
-      <w:hyperlink w:anchor="_Toc244088665" w:history="1">
+      <w:hyperlink w:anchor="_Toc244100697" w:history="1">
         <w:r>
           <w:rPr>
             <w:rStyle w:val="Hipervnculo"/>
@@ -926,7 +926,7 @@
             <w:noProof/>
             <w:webHidden/>
           </w:rPr>
-          <w:instrText xml:space="preserve"> PAGEREF _Toc244088665 \h </w:instrText>
+          <w:instrText xml:space="preserve"> PAGEREF _Toc244100697 \h </w:instrText>
         </w:r>
         <w:r>
           <w:rPr>
@@ -973,7 +973,7 @@
           <w14:ligatures w14:val="standardContextual"/>
         </w:rPr>
       </w:pPr>
-      <w:hyperlink w:anchor="_Toc244088666" w:history="1">
+      <w:hyperlink w:anchor="_Toc244100698" w:history="1">
         <w:r>
           <w:rPr>
             <w:rStyle w:val="Hipervnculo"/>
@@ -1000,7 +1000,7 @@
             <w:noProof/>
             <w:webHidden/>
           </w:rPr>
-          <w:instrText xml:space="preserve"> PAGEREF _Toc244088666 \h </w:instrText>
+          <w:instrText xml:space="preserve"> PAGEREF _Toc244100698 \h </w:instrText>
         </w:r>
         <w:r>
           <w:rPr>
@@ -1047,7 +1047,7 @@
           <w14:ligatures w14:val="standardContextual"/>
         </w:rPr>
       </w:pPr>
-      <w:hyperlink w:anchor="_Toc244088667" w:history="1">
+      <w:hyperlink w:anchor="_Toc244100699" w:history="1">
         <w:r>
           <w:rPr>
             <w:rStyle w:val="Hipervnculo"/>
@@ -1074,7 +1074,7 @@
             <w:noProof/>
             <w:webHidden/>
           </w:rPr>
-          <w:instrText xml:space="preserve"> PAGEREF _Toc244088667 \h </w:instrText>
+          <w:instrText xml:space="preserve"> PAGEREF _Toc244100699 \h </w:instrText>
         </w:r>
         <w:r>
           <w:rPr>
@@ -1121,7 +1121,7 @@
           <w14:ligatures w14:val="standardContextual"/>
         </w:rPr>
       </w:pPr>
-      <w:hyperlink w:anchor="_Toc244088668" w:history="1">
+      <w:hyperlink w:anchor="_Toc244100700" w:history="1">
         <w:r>
           <w:rPr>
             <w:rStyle w:val="Hipervnculo"/>
@@ -1148,7 +1148,7 @@
             <w:noProof/>
             <w:webHidden/>
           </w:rPr>
-          <w:instrText xml:space="preserve"> PAGEREF _Toc244088668 \h </w:instrText>
+          <w:instrText xml:space="preserve"> PAGEREF _Toc244100700 \h </w:instrText>
         </w:r>
         <w:r>
           <w:rPr>
@@ -1195,7 +1195,7 @@
           <w14:ligatures w14:val="standardContextual"/>
         </w:rPr>
       </w:pPr>
-      <w:hyperlink w:anchor="_Toc244088669" w:history="1">
+      <w:hyperlink w:anchor="_Toc244100701" w:history="1">
         <w:r>
           <w:rPr>
             <w:rStyle w:val="Hipervnculo"/>
@@ -1222,7 +1222,7 @@
             <w:noProof/>
             <w:webHidden/>
           </w:rPr>
-          <w:instrText xml:space="preserve"> PAGEREF _Toc244088669 \h </w:instrText>
+          <w:instrText xml:space="preserve"> PAGEREF _Toc244100701 \h </w:instrText>
         </w:r>
         <w:r>
           <w:rPr>
@@ -1269,7 +1269,7 @@
           <w14:ligatures w14:val="standardContextual"/>
         </w:rPr>
       </w:pPr>
-      <w:hyperlink w:anchor="_Toc244088670" w:history="1">
+      <w:hyperlink w:anchor="_Toc244100702" w:history="1">
         <w:r>
           <w:rPr>
             <w:rStyle w:val="Hipervnculo"/>
@@ -1296,7 +1296,7 @@
             <w:noProof/>
             <w:webHidden/>
           </w:rPr>
-          <w:instrText xml:space="preserve"> PAGEREF _Toc244088670 \h </w:instrText>
+          <w:instrText xml:space="preserve"> PAGEREF _Toc244100702 \h </w:instrText>
         </w:r>
         <w:r>
           <w:rPr>
@@ -1343,7 +1343,7 @@
           <w14:ligatures w14:val="standardContextual"/>
         </w:rPr>
       </w:pPr>
-      <w:hyperlink w:anchor="_Toc244088671" w:history="1">
+      <w:hyperlink w:anchor="_Toc244100703" w:history="1">
         <w:r>
           <w:rPr>
             <w:rStyle w:val="Hipervnculo"/>
@@ -1370,7 +1370,7 @@
             <w:noProof/>
             <w:webHidden/>
           </w:rPr>
-          <w:instrText xml:space="preserve"> PAGEREF _Toc244088671 \h </w:instrText>
+          <w:instrText xml:space="preserve"> PAGEREF _Toc244100703 \h </w:instrText>
         </w:r>
         <w:r>
           <w:rPr>
@@ -1417,7 +1417,7 @@
           <w14:ligatures w14:val="standardContextual"/>
         </w:rPr>
       </w:pPr>
-      <w:hyperlink w:anchor="_Toc244088672" w:history="1">
+      <w:hyperlink w:anchor="_Toc244100704" w:history="1">
         <w:r>
           <w:rPr>
             <w:rStyle w:val="Hipervnculo"/>
@@ -1444,7 +1444,7 @@
             <w:noProof/>
             <w:webHidden/>
           </w:rPr>
-          <w:instrText xml:space="preserve"> PAGEREF _Toc244088672 \h </w:instrText>
+          <w:instrText xml:space="preserve"> PAGEREF _Toc244100704 \h </w:instrText>
         </w:r>
         <w:r>
           <w:rPr>
@@ -1491,7 +1491,7 @@
           <w14:ligatures w14:val="standardContextual"/>
         </w:rPr>
       </w:pPr>
-      <w:hyperlink w:anchor="_Toc244088673" w:history="1">
+      <w:hyperlink w:anchor="_Toc244100705" w:history="1">
         <w:r>
           <w:rPr>
             <w:rStyle w:val="Hipervnculo"/>
@@ -1518,7 +1518,7 @@
             <w:noProof/>
             <w:webHidden/>
           </w:rPr>
-          <w:instrText xml:space="preserve"> PAGEREF _Toc244088673 \h </w:instrText>
+          <w:instrText xml:space="preserve"> PAGEREF _Toc244100705 \h </w:instrText>
         </w:r>
         <w:r>
           <w:rPr>
@@ -1565,7 +1565,7 @@
           <w14:ligatures w14:val="standardContextual"/>
         </w:rPr>
       </w:pPr>
-      <w:hyperlink w:anchor="_Toc244088674" w:history="1">
+      <w:hyperlink w:anchor="_Toc244100706" w:history="1">
         <w:r>
           <w:rPr>
             <w:rStyle w:val="Hipervnculo"/>
@@ -1592,7 +1592,7 @@
             <w:noProof/>
             <w:webHidden/>
           </w:rPr>
-          <w:instrText xml:space="preserve"> PAGEREF _Toc244088674 \h </w:instrText>
+          <w:instrText xml:space="preserve"> PAGEREF _Toc244100706 \h </w:instrText>
         </w:r>
         <w:r>
           <w:rPr>
@@ -1639,7 +1639,7 @@
           <w14:ligatures w14:val="standardContextual"/>
         </w:rPr>
       </w:pPr>
-      <w:hyperlink w:anchor="_Toc244088675" w:history="1">
+      <w:hyperlink w:anchor="_Toc244100707" w:history="1">
         <w:r>
           <w:rPr>
             <w:rStyle w:val="Hipervnculo"/>
@@ -1666,7 +1666,7 @@
             <w:noProof/>
             <w:webHidden/>
           </w:rPr>
-          <w:instrText xml:space="preserve"> PAGEREF _Toc244088675 \h </w:instrText>
+          <w:instrText xml:space="preserve"> PAGEREF _Toc244100707 \h </w:instrText>
         </w:r>
         <w:r>
           <w:rPr>
@@ -1713,7 +1713,7 @@
           <w14:ligatures w14:val="standardContextual"/>
         </w:rPr>
       </w:pPr>
-      <w:hyperlink w:anchor="_Toc244088676" w:history="1">
+      <w:hyperlink w:anchor="_Toc244100708" w:history="1">
         <w:r>
           <w:rPr>
             <w:rStyle w:val="Hipervnculo"/>
@@ -1740,7 +1740,7 @@
             <w:noProof/>
             <w:webHidden/>
           </w:rPr>
-          <w:instrText xml:space="preserve"> PAGEREF _Toc244088676 \h </w:instrText>
+          <w:instrText xml:space="preserve"> PAGEREF _Toc244100708 \h </w:instrText>
         </w:r>
         <w:r>
           <w:rPr>
@@ -1787,7 +1787,7 @@
           <w14:ligatures w14:val="standardContextual"/>
         </w:rPr>
       </w:pPr>
-      <w:hyperlink w:anchor="_Toc244088677" w:history="1">
+      <w:hyperlink w:anchor="_Toc244100709" w:history="1">
         <w:r>
           <w:rPr>
             <w:rStyle w:val="Hipervnculo"/>
@@ -1814,7 +1814,7 @@
             <w:noProof/>
             <w:webHidden/>
           </w:rPr>
-          <w:instrText xml:space="preserve"> PAGEREF _Toc244088677 \h </w:instrText>
+          <w:instrText xml:space="preserve"> PAGEREF _Toc244100709 \h </w:instrText>
         </w:r>
         <w:r>
           <w:rPr>
@@ -1861,7 +1861,7 @@
           <w14:ligatures w14:val="standardContextual"/>
         </w:rPr>
       </w:pPr>
-      <w:hyperlink w:anchor="_Toc244088678" w:history="1">
+      <w:hyperlink w:anchor="_Toc244100710" w:history="1">
         <w:r>
           <w:rPr>
             <w:rStyle w:val="Hipervnculo"/>
@@ -1888,7 +1888,7 @@
             <w:noProof/>
             <w:webHidden/>
           </w:rPr>
-          <w:instrText xml:space="preserve"> PAGEREF _Toc244088678 \h </w:instrText>
+          <w:instrText xml:space="preserve"> PAGEREF _Toc244100710 \h </w:instrText>
         </w:r>
         <w:r>
           <w:rPr>
@@ -1908,7 +1908,7 @@
             <w:noProof/>
             <w:webHidden/>
           </w:rPr>
-          <w:t>30</w:t>
+          <w:t>31</w:t>
         </w:r>
         <w:r>
           <w:rPr>
@@ -1935,7 +1935,7 @@
           <w14:ligatures w14:val="standardContextual"/>
         </w:rPr>
       </w:pPr>
-      <w:hyperlink w:anchor="_Toc244088679" w:history="1">
+      <w:hyperlink w:anchor="_Toc244100711" w:history="1">
         <w:r>
           <w:rPr>
             <w:rStyle w:val="Hipervnculo"/>
@@ -1962,7 +1962,7 @@
             <w:noProof/>
             <w:webHidden/>
           </w:rPr>
-          <w:instrText xml:space="preserve"> PAGEREF _Toc244088679 \h </w:instrText>
+          <w:instrText xml:space="preserve"> PAGEREF _Toc244100711 \h </w:instrText>
         </w:r>
         <w:r>
           <w:rPr>
@@ -1982,7 +1982,7 @@
             <w:noProof/>
             <w:webHidden/>
           </w:rPr>
-          <w:t>30</w:t>
+          <w:t>31</w:t>
         </w:r>
         <w:r>
           <w:rPr>
@@ -2009,7 +2009,7 @@
           <w14:ligatures w14:val="standardContextual"/>
         </w:rPr>
       </w:pPr>
-      <w:hyperlink w:anchor="_Toc244088680" w:history="1">
+      <w:hyperlink w:anchor="_Toc244100712" w:history="1">
         <w:r>
           <w:rPr>
             <w:rStyle w:val="Hipervnculo"/>
@@ -2036,7 +2036,7 @@
             <w:noProof/>
             <w:webHidden/>
           </w:rPr>
-          <w:instrText xml:space="preserve"> PAGEREF _Toc244088680 \h </w:instrText>
+          <w:instrText xml:space="preserve"> PAGEREF _Toc244100712 \h </w:instrText>
         </w:r>
         <w:r>
           <w:rPr>
@@ -2056,7 +2056,7 @@
             <w:noProof/>
             <w:webHidden/>
           </w:rPr>
-          <w:t>31</w:t>
+          <w:t>32</w:t>
         </w:r>
         <w:r>
           <w:rPr>
@@ -2083,7 +2083,7 @@
           <w14:ligatures w14:val="standardContextual"/>
         </w:rPr>
       </w:pPr>
-      <w:hyperlink w:anchor="_Toc244088681" w:history="1">
+      <w:hyperlink w:anchor="_Toc244100713" w:history="1">
         <w:r>
           <w:rPr>
             <w:rStyle w:val="Hipervnculo"/>
@@ -2110,7 +2110,7 @@
             <w:noProof/>
             <w:webHidden/>
           </w:rPr>
-          <w:instrText xml:space="preserve"> PAGEREF _Toc244088681 \h </w:instrText>
+          <w:instrText xml:space="preserve"> PAGEREF _Toc244100713 \h </w:instrText>
         </w:r>
         <w:r>
           <w:rPr>
@@ -2130,7 +2130,7 @@
             <w:noProof/>
             <w:webHidden/>
           </w:rPr>
-          <w:t>32</w:t>
+          <w:t>33</w:t>
         </w:r>
         <w:r>
           <w:rPr>
@@ -2157,7 +2157,7 @@
           <w14:ligatures w14:val="standardContextual"/>
         </w:rPr>
       </w:pPr>
-      <w:hyperlink w:anchor="_Toc244088682" w:history="1">
+      <w:hyperlink w:anchor="_Toc244100714" w:history="1">
         <w:r>
           <w:rPr>
             <w:rStyle w:val="Hipervnculo"/>
@@ -2184,7 +2184,7 @@
             <w:noProof/>
             <w:webHidden/>
           </w:rPr>
-          <w:instrText xml:space="preserve"> PAGEREF _Toc244088682 \h </w:instrText>
+          <w:instrText xml:space="preserve"> PAGEREF _Toc244100714 \h </w:instrText>
         </w:r>
         <w:r>
           <w:rPr>
@@ -2204,7 +2204,7 @@
             <w:noProof/>
             <w:webHidden/>
           </w:rPr>
-          <w:t>33</w:t>
+          <w:t>34</w:t>
         </w:r>
         <w:r>
           <w:rPr>
@@ -2231,7 +2231,7 @@
           <w14:ligatures w14:val="standardContextual"/>
         </w:rPr>
       </w:pPr>
-      <w:hyperlink w:anchor="_Toc244088683" w:history="1">
+      <w:hyperlink w:anchor="_Toc244100715" w:history="1">
         <w:r>
           <w:rPr>
             <w:rStyle w:val="Hipervnculo"/>
@@ -2258,7 +2258,7 @@
             <w:noProof/>
             <w:webHidden/>
           </w:rPr>
-          <w:instrText xml:space="preserve"> PAGEREF _Toc244088683 \h </w:instrText>
+          <w:instrText xml:space="preserve"> PAGEREF _Toc244100715 \h </w:instrText>
         </w:r>
         <w:r>
           <w:rPr>
@@ -2278,7 +2278,7 @@
             <w:noProof/>
             <w:webHidden/>
           </w:rPr>
-          <w:t>34</w:t>
+          <w:t>35</w:t>
         </w:r>
         <w:r>
           <w:rPr>
@@ -2305,7 +2305,7 @@
           <w14:ligatures w14:val="standardContextual"/>
         </w:rPr>
       </w:pPr>
-      <w:hyperlink w:anchor="_Toc244088684" w:history="1">
+      <w:hyperlink w:anchor="_Toc244100716" w:history="1">
         <w:r>
           <w:rPr>
             <w:rStyle w:val="Hipervnculo"/>
@@ -2332,7 +2332,7 @@
             <w:noProof/>
             <w:webHidden/>
           </w:rPr>
-          <w:instrText xml:space="preserve"> PAGEREF _Toc244088684 \h </w:instrText>
+          <w:instrText xml:space="preserve"> PAGEREF _Toc244100716 \h </w:instrText>
         </w:r>
         <w:r>
           <w:rPr>
@@ -2352,7 +2352,7 @@
             <w:noProof/>
             <w:webHidden/>
           </w:rPr>
-          <w:t>35</w:t>
+          <w:t>36</w:t>
         </w:r>
         <w:r>
           <w:rPr>
@@ -2379,7 +2379,7 @@
           <w14:ligatures w14:val="standardContextual"/>
         </w:rPr>
       </w:pPr>
-      <w:hyperlink w:anchor="_Toc244088685" w:history="1">
+      <w:hyperlink w:anchor="_Toc244100717" w:history="1">
         <w:r>
           <w:rPr>
             <w:rStyle w:val="Hipervnculo"/>
@@ -2406,7 +2406,7 @@
             <w:noProof/>
             <w:webHidden/>
           </w:rPr>
-          <w:instrText xml:space="preserve"> PAGEREF _Toc244088685 \h </w:instrText>
+          <w:instrText xml:space="preserve"> PAGEREF _Toc244100717 \h </w:instrText>
         </w:r>
         <w:r>
           <w:rPr>
@@ -2426,7 +2426,7 @@
             <w:noProof/>
             <w:webHidden/>
           </w:rPr>
-          <w:t>35</w:t>
+          <w:t>36</w:t>
         </w:r>
         <w:r>
           <w:rPr>
@@ -2453,7 +2453,7 @@
           <w14:ligatures w14:val="standardContextual"/>
         </w:rPr>
       </w:pPr>
-      <w:hyperlink w:anchor="_Toc244088686" w:history="1">
+      <w:hyperlink w:anchor="_Toc244100718" w:history="1">
         <w:r>
           <w:rPr>
             <w:rStyle w:val="Hipervnculo"/>
@@ -2480,7 +2480,7 @@
             <w:noProof/>
             <w:webHidden/>
           </w:rPr>
-          <w:instrText xml:space="preserve"> PAGEREF _Toc244088686 \h </w:instrText>
+          <w:instrText xml:space="preserve"> PAGEREF _Toc244100718 \h </w:instrText>
         </w:r>
         <w:r>
           <w:rPr>
@@ -2500,7 +2500,7 @@
             <w:noProof/>
             <w:webHidden/>
           </w:rPr>
-          <w:t>37</w:t>
+          <w:t>38</w:t>
         </w:r>
         <w:r>
           <w:rPr>
@@ -2527,7 +2527,7 @@
           <w14:ligatures w14:val="standardContextual"/>
         </w:rPr>
       </w:pPr>
-      <w:hyperlink w:anchor="_Toc244088687" w:history="1">
+      <w:hyperlink w:anchor="_Toc244100719" w:history="1">
         <w:r>
           <w:rPr>
             <w:rStyle w:val="Hipervnculo"/>
@@ -2554,7 +2554,7 @@
             <w:noProof/>
             <w:webHidden/>
           </w:rPr>
-          <w:instrText xml:space="preserve"> PAGEREF _Toc244088687 \h </w:instrText>
+          <w:instrText xml:space="preserve"> PAGEREF _Toc244100719 \h </w:instrText>
         </w:r>
         <w:r>
           <w:rPr>
@@ -2574,7 +2574,7 @@
             <w:noProof/>
             <w:webHidden/>
           </w:rPr>
-          <w:t>38</w:t>
+          <w:t>39</w:t>
         </w:r>
         <w:r>
           <w:rPr>
@@ -2601,7 +2601,7 @@
           <w14:ligatures w14:val="standardContextual"/>
         </w:rPr>
       </w:pPr>
-      <w:hyperlink w:anchor="_Toc244088688" w:history="1">
+      <w:hyperlink w:anchor="_Toc244100720" w:history="1">
         <w:r>
           <w:rPr>
             <w:rStyle w:val="Hipervnculo"/>
@@ -2628,7 +2628,7 @@
             <w:noProof/>
             <w:webHidden/>
           </w:rPr>
-          <w:instrText xml:space="preserve"> PAGEREF _Toc244088688 \h </w:instrText>
+          <w:instrText xml:space="preserve"> PAGEREF _Toc244100720 \h </w:instrText>
         </w:r>
         <w:r>
           <w:rPr>
@@ -2648,7 +2648,7 @@
             <w:noProof/>
             <w:webHidden/>
           </w:rPr>
-          <w:t>39</w:t>
+          <w:t>40</w:t>
         </w:r>
         <w:r>
           <w:rPr>
@@ -2675,7 +2675,7 @@
           <w14:ligatures w14:val="standardContextual"/>
         </w:rPr>
       </w:pPr>
-      <w:hyperlink w:anchor="_Toc244088689" w:history="1">
+      <w:hyperlink w:anchor="_Toc244100721" w:history="1">
         <w:r>
           <w:rPr>
             <w:rStyle w:val="Hipervnculo"/>
@@ -2702,7 +2702,7 @@
             <w:noProof/>
             <w:webHidden/>
           </w:rPr>
-          <w:instrText xml:space="preserve"> PAGEREF _Toc244088689 \h </w:instrText>
+          <w:instrText xml:space="preserve"> PAGEREF _Toc244100721 \h </w:instrText>
         </w:r>
         <w:r>
           <w:rPr>
@@ -2722,7 +2722,7 @@
             <w:noProof/>
             <w:webHidden/>
           </w:rPr>
-          <w:t>40</w:t>
+          <w:t>41</w:t>
         </w:r>
         <w:r>
           <w:rPr>
@@ -2749,7 +2749,7 @@
           <w14:ligatures w14:val="standardContextual"/>
         </w:rPr>
       </w:pPr>
-      <w:hyperlink w:anchor="_Toc244088690" w:history="1">
+      <w:hyperlink w:anchor="_Toc244100722" w:history="1">
         <w:r>
           <w:rPr>
             <w:rStyle w:val="Hipervnculo"/>
@@ -2776,7 +2776,7 @@
             <w:noProof/>
             <w:webHidden/>
           </w:rPr>
-          <w:instrText xml:space="preserve"> PAGEREF _Toc244088690 \h </w:instrText>
+          <w:instrText xml:space="preserve"> PAGEREF _Toc244100722 \h </w:instrText>
         </w:r>
         <w:r>
           <w:rPr>
@@ -2796,7 +2796,7 @@
             <w:noProof/>
             <w:webHidden/>
           </w:rPr>
-          <w:t>40</w:t>
+          <w:t>41</w:t>
         </w:r>
         <w:r>
           <w:rPr>
@@ -2823,7 +2823,7 @@
           <w14:ligatures w14:val="standardContextual"/>
         </w:rPr>
       </w:pPr>
-      <w:hyperlink w:anchor="_Toc244088691" w:history="1">
+      <w:hyperlink w:anchor="_Toc244100723" w:history="1">
         <w:r>
           <w:rPr>
             <w:rStyle w:val="Hipervnculo"/>
@@ -2850,7 +2850,7 @@
             <w:noProof/>
             <w:webHidden/>
           </w:rPr>
-          <w:instrText xml:space="preserve"> PAGEREF _Toc244088691 \h </w:instrText>
+          <w:instrText xml:space="preserve"> PAGEREF _Toc244100723 \h </w:instrText>
         </w:r>
         <w:r>
           <w:rPr>
@@ -2870,7 +2870,7 @@
             <w:noProof/>
             <w:webHidden/>
           </w:rPr>
-          <w:t>40</w:t>
+          <w:t>41</w:t>
         </w:r>
         <w:r>
           <w:rPr>
@@ -2897,7 +2897,7 @@
           <w14:ligatures w14:val="standardContextual"/>
         </w:rPr>
       </w:pPr>
-      <w:hyperlink w:anchor="_Toc244088692" w:history="1">
+      <w:hyperlink w:anchor="_Toc244100724" w:history="1">
         <w:r>
           <w:rPr>
             <w:rStyle w:val="Hipervnculo"/>
@@ -2924,7 +2924,7 @@
             <w:noProof/>
             <w:webHidden/>
           </w:rPr>
-          <w:instrText xml:space="preserve"> PAGEREF _Toc244088692 \h </w:instrText>
+          <w:instrText xml:space="preserve"> PAGEREF _Toc244100724 \h </w:instrText>
         </w:r>
         <w:r>
           <w:rPr>
@@ -2944,7 +2944,7 @@
             <w:noProof/>
             <w:webHidden/>
           </w:rPr>
-          <w:t>40</w:t>
+          <w:t>41</w:t>
         </w:r>
         <w:r>
           <w:rPr>
@@ -2971,7 +2971,7 @@
           <w14:ligatures w14:val="standardContextual"/>
         </w:rPr>
       </w:pPr>
-      <w:hyperlink w:anchor="_Toc244088693" w:history="1">
+      <w:hyperlink w:anchor="_Toc244100725" w:history="1">
         <w:r>
           <w:rPr>
             <w:rStyle w:val="Hipervnculo"/>
@@ -2998,7 +2998,7 @@
             <w:noProof/>
             <w:webHidden/>
           </w:rPr>
-          <w:instrText xml:space="preserve"> PAGEREF _Toc244088693 \h </w:instrText>
+          <w:instrText xml:space="preserve"> PAGEREF _Toc244100725 \h </w:instrText>
         </w:r>
         <w:r>
           <w:rPr>
@@ -3018,7 +3018,7 @@
             <w:noProof/>
             <w:webHidden/>
           </w:rPr>
-          <w:t>42</w:t>
+          <w:t>43</w:t>
         </w:r>
         <w:r>
           <w:rPr>
@@ -3045,7 +3045,7 @@
           <w14:ligatures w14:val="standardContextual"/>
         </w:rPr>
       </w:pPr>
-      <w:hyperlink w:anchor="_Toc244088694" w:history="1">
+      <w:hyperlink w:anchor="_Toc244100726" w:history="1">
         <w:r>
           <w:rPr>
             <w:rStyle w:val="Hipervnculo"/>
@@ -3072,7 +3072,7 @@
             <w:noProof/>
             <w:webHidden/>
           </w:rPr>
-          <w:instrText xml:space="preserve"> PAGEREF _Toc244088694 \h </w:instrText>
+          <w:instrText xml:space="preserve"> PAGEREF _Toc244100726 \h </w:instrText>
         </w:r>
         <w:r>
           <w:rPr>
@@ -3092,7 +3092,7 @@
             <w:noProof/>
             <w:webHidden/>
           </w:rPr>
-          <w:t>44</w:t>
+          <w:t>45</w:t>
         </w:r>
         <w:r>
           <w:rPr>
@@ -3119,7 +3119,7 @@
           <w14:ligatures w14:val="standardContextual"/>
         </w:rPr>
       </w:pPr>
-      <w:hyperlink w:anchor="_Toc244088695" w:history="1">
+      <w:hyperlink w:anchor="_Toc244100727" w:history="1">
         <w:r>
           <w:rPr>
             <w:rStyle w:val="Hipervnculo"/>
@@ -3146,7 +3146,7 @@
             <w:noProof/>
             <w:webHidden/>
           </w:rPr>
-          <w:instrText xml:space="preserve"> PAGEREF _Toc244088695 \h </w:instrText>
+          <w:instrText xml:space="preserve"> PAGEREF _Toc244100727 \h </w:instrText>
         </w:r>
         <w:r>
           <w:rPr>
@@ -3166,7 +3166,7 @@
             <w:noProof/>
             <w:webHidden/>
           </w:rPr>
-          <w:t>45</w:t>
+          <w:t>46</w:t>
         </w:r>
         <w:r>
           <w:rPr>
@@ -3193,7 +3193,7 @@
           <w14:ligatures w14:val="standardContextual"/>
         </w:rPr>
       </w:pPr>
-      <w:hyperlink w:anchor="_Toc244088696" w:history="1">
+      <w:hyperlink w:anchor="_Toc244100728" w:history="1">
         <w:r>
           <w:rPr>
             <w:rStyle w:val="Hipervnculo"/>
@@ -3220,7 +3220,7 @@
             <w:noProof/>
             <w:webHidden/>
           </w:rPr>
-          <w:instrText xml:space="preserve"> PAGEREF _Toc244088696 \h </w:instrText>
+          <w:instrText xml:space="preserve"> PAGEREF _Toc244100728 \h </w:instrText>
         </w:r>
         <w:r>
           <w:rPr>
@@ -3240,7 +3240,7 @@
             <w:noProof/>
             <w:webHidden/>
           </w:rPr>
-          <w:t>45</w:t>
+          <w:t>46</w:t>
         </w:r>
         <w:r>
           <w:rPr>
@@ -3267,7 +3267,7 @@
           <w14:ligatures w14:val="standardContextual"/>
         </w:rPr>
       </w:pPr>
-      <w:hyperlink w:anchor="_Toc244088697" w:history="1">
+      <w:hyperlink w:anchor="_Toc244100729" w:history="1">
         <w:r>
           <w:rPr>
             <w:rStyle w:val="Hipervnculo"/>
@@ -3294,7 +3294,7 @@
             <w:noProof/>
             <w:webHidden/>
           </w:rPr>
-          <w:instrText xml:space="preserve"> PAGEREF _Toc244088697 \h </w:instrText>
+          <w:instrText xml:space="preserve"> PAGEREF _Toc244100729 \h </w:instrText>
         </w:r>
         <w:r>
           <w:rPr>
@@ -3314,7 +3314,7 @@
             <w:noProof/>
             <w:webHidden/>
           </w:rPr>
-          <w:t>46</w:t>
+          <w:t>47</w:t>
         </w:r>
         <w:r>
           <w:rPr>
@@ -3341,7 +3341,7 @@
           <w14:ligatures w14:val="standardContextual"/>
         </w:rPr>
       </w:pPr>
-      <w:hyperlink w:anchor="_Toc244088698" w:history="1">
+      <w:hyperlink w:anchor="_Toc244100730" w:history="1">
         <w:r>
           <w:rPr>
             <w:rStyle w:val="Hipervnculo"/>
@@ -3368,7 +3368,7 @@
             <w:noProof/>
             <w:webHidden/>
           </w:rPr>
-          <w:instrText xml:space="preserve"> PAGEREF _Toc244088698 \h </w:instrText>
+          <w:instrText xml:space="preserve"> PAGEREF _Toc244100730 \h </w:instrText>
         </w:r>
         <w:r>
           <w:rPr>
@@ -3388,7 +3388,7 @@
             <w:noProof/>
             <w:webHidden/>
           </w:rPr>
-          <w:t>46</w:t>
+          <w:t>47</w:t>
         </w:r>
         <w:r>
           <w:rPr>
@@ -3415,7 +3415,7 @@
           <w14:ligatures w14:val="standardContextual"/>
         </w:rPr>
       </w:pPr>
-      <w:hyperlink w:anchor="_Toc244088699" w:history="1">
+      <w:hyperlink w:anchor="_Toc244100731" w:history="1">
         <w:r>
           <w:rPr>
             <w:rStyle w:val="Hipervnculo"/>
@@ -3442,7 +3442,7 @@
             <w:noProof/>
             <w:webHidden/>
           </w:rPr>
-          <w:instrText xml:space="preserve"> PAGEREF _Toc244088699 \h </w:instrText>
+          <w:instrText xml:space="preserve"> PAGEREF _Toc244100731 \h </w:instrText>
         </w:r>
         <w:r>
           <w:rPr>
@@ -3462,7 +3462,7 @@
             <w:noProof/>
             <w:webHidden/>
           </w:rPr>
-          <w:t>47</w:t>
+          <w:t>48</w:t>
         </w:r>
         <w:r>
           <w:rPr>
@@ -3489,7 +3489,7 @@
           <w14:ligatures w14:val="standardContextual"/>
         </w:rPr>
       </w:pPr>
-      <w:hyperlink w:anchor="_Toc244088700" w:history="1">
+      <w:hyperlink w:anchor="_Toc244100732" w:history="1">
         <w:r>
           <w:rPr>
             <w:rStyle w:val="Hipervnculo"/>
@@ -3516,7 +3516,7 @@
             <w:noProof/>
             <w:webHidden/>
           </w:rPr>
-          <w:instrText xml:space="preserve"> PAGEREF _Toc244088700 \h </w:instrText>
+          <w:instrText xml:space="preserve"> PAGEREF _Toc244100732 \h </w:instrText>
         </w:r>
         <w:r>
           <w:rPr>
@@ -3536,7 +3536,7 @@
             <w:noProof/>
             <w:webHidden/>
           </w:rPr>
-          <w:t>47</w:t>
+          <w:t>48</w:t>
         </w:r>
         <w:r>
           <w:rPr>
@@ -3563,7 +3563,7 @@
           <w14:ligatures w14:val="standardContextual"/>
         </w:rPr>
       </w:pPr>
-      <w:hyperlink w:anchor="_Toc244088701" w:history="1">
+      <w:hyperlink w:anchor="_Toc244100733" w:history="1">
         <w:r>
           <w:rPr>
             <w:rStyle w:val="Hipervnculo"/>
@@ -3590,7 +3590,7 @@
             <w:noProof/>
             <w:webHidden/>
           </w:rPr>
-          <w:instrText xml:space="preserve"> PAGEREF _Toc244088701 \h </w:instrText>
+          <w:instrText xml:space="preserve"> PAGEREF _Toc244100733 \h </w:instrText>
         </w:r>
         <w:r>
           <w:rPr>
@@ -3610,7 +3610,7 @@
             <w:noProof/>
             <w:webHidden/>
           </w:rPr>
-          <w:t>47</w:t>
+          <w:t>48</w:t>
         </w:r>
         <w:r>
           <w:rPr>
@@ -3637,7 +3637,7 @@
           <w14:ligatures w14:val="standardContextual"/>
         </w:rPr>
       </w:pPr>
-      <w:hyperlink w:anchor="_Toc244088702" w:history="1">
+      <w:hyperlink w:anchor="_Toc244100734" w:history="1">
         <w:r>
           <w:rPr>
             <w:rStyle w:val="Hipervnculo"/>
@@ -3664,7 +3664,7 @@
             <w:noProof/>
             <w:webHidden/>
           </w:rPr>
-          <w:instrText xml:space="preserve"> PAGEREF _Toc244088702 \h </w:instrText>
+          <w:instrText xml:space="preserve"> PAGEREF _Toc244100734 \h </w:instrText>
         </w:r>
         <w:r>
           <w:rPr>
@@ -3684,7 +3684,7 @@
             <w:noProof/>
             <w:webHidden/>
           </w:rPr>
-          <w:t>48</w:t>
+          <w:t>49</w:t>
         </w:r>
         <w:r>
           <w:rPr>
@@ -3711,7 +3711,7 @@
           <w14:ligatures w14:val="standardContextual"/>
         </w:rPr>
       </w:pPr>
-      <w:hyperlink w:anchor="_Toc244088703" w:history="1">
+      <w:hyperlink w:anchor="_Toc244100735" w:history="1">
         <w:r>
           <w:rPr>
             <w:rStyle w:val="Hipervnculo"/>
@@ -3738,7 +3738,7 @@
             <w:noProof/>
             <w:webHidden/>
           </w:rPr>
-          <w:instrText xml:space="preserve"> PAGEREF _Toc244088703 \h </w:instrText>
+          <w:instrText xml:space="preserve"> PAGEREF _Toc244100735 \h </w:instrText>
         </w:r>
         <w:r>
           <w:rPr>
@@ -3758,7 +3758,7 @@
             <w:noProof/>
             <w:webHidden/>
           </w:rPr>
-          <w:t>48</w:t>
+          <w:t>49</w:t>
         </w:r>
         <w:r>
           <w:rPr>
@@ -3785,7 +3785,7 @@
           <w14:ligatures w14:val="standardContextual"/>
         </w:rPr>
       </w:pPr>
-      <w:hyperlink w:anchor="_Toc244088704" w:history="1">
+      <w:hyperlink w:anchor="_Toc244100736" w:history="1">
         <w:r>
           <w:rPr>
             <w:rStyle w:val="Hipervnculo"/>
@@ -3812,7 +3812,7 @@
             <w:noProof/>
             <w:webHidden/>
           </w:rPr>
-          <w:instrText xml:space="preserve"> PAGEREF _Toc244088704 \h </w:instrText>
+          <w:instrText xml:space="preserve"> PAGEREF _Toc244100736 \h </w:instrText>
         </w:r>
         <w:r>
           <w:rPr>
@@ -3832,7 +3832,7 @@
             <w:noProof/>
             <w:webHidden/>
           </w:rPr>
-          <w:t>49</w:t>
+          <w:t>50</w:t>
         </w:r>
         <w:r>
           <w:rPr>
@@ -3859,7 +3859,7 @@
           <w14:ligatures w14:val="standardContextual"/>
         </w:rPr>
       </w:pPr>
-      <w:hyperlink w:anchor="_Toc244088705" w:history="1">
+      <w:hyperlink w:anchor="_Toc244100737" w:history="1">
         <w:r>
           <w:rPr>
             <w:rStyle w:val="Hipervnculo"/>
@@ -3886,7 +3886,7 @@
             <w:noProof/>
             <w:webHidden/>
           </w:rPr>
-          <w:instrText xml:space="preserve"> PAGEREF _Toc244088705 \h </w:instrText>
+          <w:instrText xml:space="preserve"> PAGEREF _Toc244100737 \h </w:instrText>
         </w:r>
         <w:r>
           <w:rPr>
@@ -3906,7 +3906,7 @@
             <w:noProof/>
             <w:webHidden/>
           </w:rPr>
-          <w:t>50</w:t>
+          <w:t>51</w:t>
         </w:r>
         <w:r>
           <w:rPr>
@@ -3933,7 +3933,7 @@
           <w14:ligatures w14:val="standardContextual"/>
         </w:rPr>
       </w:pPr>
-      <w:hyperlink w:anchor="_Toc244088706" w:history="1">
+      <w:hyperlink w:anchor="_Toc244100738" w:history="1">
         <w:r>
           <w:rPr>
             <w:rStyle w:val="Hipervnculo"/>
@@ -3960,7 +3960,7 @@
             <w:noProof/>
             <w:webHidden/>
           </w:rPr>
-          <w:instrText xml:space="preserve"> PAGEREF _Toc244088706 \h </w:instrText>
+          <w:instrText xml:space="preserve"> PAGEREF _Toc244100738 \h </w:instrText>
         </w:r>
         <w:r>
           <w:rPr>
@@ -3980,7 +3980,7 @@
             <w:noProof/>
             <w:webHidden/>
           </w:rPr>
-          <w:t>51</w:t>
+          <w:t>52</w:t>
         </w:r>
         <w:r>
           <w:rPr>
@@ -4007,7 +4007,7 @@
           <w14:ligatures w14:val="standardContextual"/>
         </w:rPr>
       </w:pPr>
-      <w:hyperlink w:anchor="_Toc244088707" w:history="1">
+      <w:hyperlink w:anchor="_Toc244100739" w:history="1">
         <w:r>
           <w:rPr>
             <w:rStyle w:val="Hipervnculo"/>
@@ -4034,7 +4034,7 @@
             <w:noProof/>
             <w:webHidden/>
           </w:rPr>
-          <w:instrText xml:space="preserve"> PAGEREF _Toc244088707 \h </w:instrText>
+          <w:instrText xml:space="preserve"> PAGEREF _Toc244100739 \h </w:instrText>
         </w:r>
         <w:r>
           <w:rPr>
@@ -4054,7 +4054,7 @@
             <w:noProof/>
             <w:webHidden/>
           </w:rPr>
-          <w:t>52</w:t>
+          <w:t>53</w:t>
         </w:r>
         <w:r>
           <w:rPr>
@@ -4081,7 +4081,7 @@
           <w14:ligatures w14:val="standardContextual"/>
         </w:rPr>
       </w:pPr>
-      <w:hyperlink w:anchor="_Toc244088708" w:history="1">
+      <w:hyperlink w:anchor="_Toc244100740" w:history="1">
         <w:r>
           <w:rPr>
             <w:rStyle w:val="Hipervnculo"/>
@@ -4108,7 +4108,7 @@
             <w:noProof/>
             <w:webHidden/>
           </w:rPr>
-          <w:instrText xml:space="preserve"> PAGEREF _Toc244088708 \h </w:instrText>
+          <w:instrText xml:space="preserve"> PAGEREF _Toc244100740 \h </w:instrText>
         </w:r>
         <w:r>
           <w:rPr>
@@ -4128,7 +4128,7 @@
             <w:noProof/>
             <w:webHidden/>
           </w:rPr>
-          <w:t>52</w:t>
+          <w:t>53</w:t>
         </w:r>
         <w:r>
           <w:rPr>
@@ -4155,7 +4155,7 @@
           <w14:ligatures w14:val="standardContextual"/>
         </w:rPr>
       </w:pPr>
-      <w:hyperlink w:anchor="_Toc244088709" w:history="1">
+      <w:hyperlink w:anchor="_Toc244100741" w:history="1">
         <w:r>
           <w:rPr>
             <w:rStyle w:val="Hipervnculo"/>
@@ -4182,7 +4182,7 @@
             <w:noProof/>
             <w:webHidden/>
           </w:rPr>
-          <w:instrText xml:space="preserve"> PAGEREF _Toc244088709 \h </w:instrText>
+          <w:instrText xml:space="preserve"> PAGEREF _Toc244100741 \h </w:instrText>
         </w:r>
         <w:r>
           <w:rPr>
@@ -4202,7 +4202,7 @@
             <w:noProof/>
             <w:webHidden/>
           </w:rPr>
-          <w:t>52</w:t>
+          <w:t>54</w:t>
         </w:r>
         <w:r>
           <w:rPr>
@@ -4229,7 +4229,7 @@
           <w14:ligatures w14:val="standardContextual"/>
         </w:rPr>
       </w:pPr>
-      <w:hyperlink w:anchor="_Toc244088710" w:history="1">
+      <w:hyperlink w:anchor="_Toc244100742" w:history="1">
         <w:r>
           <w:rPr>
             <w:rStyle w:val="Hipervnculo"/>
@@ -4256,7 +4256,7 @@
             <w:noProof/>
             <w:webHidden/>
           </w:rPr>
-          <w:instrText xml:space="preserve"> PAGEREF _Toc244088710 \h </w:instrText>
+          <w:instrText xml:space="preserve"> PAGEREF _Toc244100742 \h </w:instrText>
         </w:r>
         <w:r>
           <w:rPr>
@@ -4276,7 +4276,7 @@
             <w:noProof/>
             <w:webHidden/>
           </w:rPr>
-          <w:t>54</w:t>
+          <w:t>55</w:t>
         </w:r>
         <w:r>
           <w:rPr>
@@ -4303,7 +4303,7 @@
           <w14:ligatures w14:val="standardContextual"/>
         </w:rPr>
       </w:pPr>
-      <w:hyperlink w:anchor="_Toc244088711" w:history="1">
+      <w:hyperlink w:anchor="_Toc244100743" w:history="1">
         <w:r>
           <w:rPr>
             <w:rStyle w:val="Hipervnculo"/>
@@ -4330,7 +4330,7 @@
             <w:noProof/>
             <w:webHidden/>
           </w:rPr>
-          <w:instrText xml:space="preserve"> PAGEREF _Toc244088711 \h </w:instrText>
+          <w:instrText xml:space="preserve"> PAGEREF _Toc244100743 \h </w:instrText>
         </w:r>
         <w:r>
           <w:rPr>
@@ -4350,7 +4350,7 @@
             <w:noProof/>
             <w:webHidden/>
           </w:rPr>
-          <w:t>55</w:t>
+          <w:t>56</w:t>
         </w:r>
         <w:r>
           <w:rPr>
@@ -4377,7 +4377,7 @@
           <w14:ligatures w14:val="standardContextual"/>
         </w:rPr>
       </w:pPr>
-      <w:hyperlink w:anchor="_Toc244088712" w:history="1">
+      <w:hyperlink w:anchor="_Toc244100744" w:history="1">
         <w:r>
           <w:rPr>
             <w:rStyle w:val="Hipervnculo"/>
@@ -4404,7 +4404,7 @@
             <w:noProof/>
             <w:webHidden/>
           </w:rPr>
-          <w:instrText xml:space="preserve"> PAGEREF _Toc244088712 \h </w:instrText>
+          <w:instrText xml:space="preserve"> PAGEREF _Toc244100744 \h </w:instrText>
         </w:r>
         <w:r>
           <w:rPr>
@@ -4424,7 +4424,7 @@
             <w:noProof/>
             <w:webHidden/>
           </w:rPr>
-          <w:t>57</w:t>
+          <w:t>59</w:t>
         </w:r>
         <w:r>
           <w:rPr>
@@ -4451,7 +4451,7 @@
           <w14:ligatures w14:val="standardContextual"/>
         </w:rPr>
       </w:pPr>
-      <w:hyperlink w:anchor="_Toc244088713" w:history="1">
+      <w:hyperlink w:anchor="_Toc244100745" w:history="1">
         <w:r>
           <w:rPr>
             <w:rStyle w:val="Hipervnculo"/>
@@ -4478,7 +4478,7 @@
             <w:noProof/>
             <w:webHidden/>
           </w:rPr>
-          <w:instrText xml:space="preserve"> PAGEREF _Toc244088713 \h </w:instrText>
+          <w:instrText xml:space="preserve"> PAGEREF _Toc244100745 \h </w:instrText>
         </w:r>
         <w:r>
           <w:rPr>
@@ -4498,7 +4498,7 @@
             <w:noProof/>
             <w:webHidden/>
           </w:rPr>
-          <w:t>57</w:t>
+          <w:t>59</w:t>
         </w:r>
         <w:r>
           <w:rPr>
@@ -4525,7 +4525,7 @@
           <w14:ligatures w14:val="standardContextual"/>
         </w:rPr>
       </w:pPr>
-      <w:hyperlink w:anchor="_Toc244088714" w:history="1">
+      <w:hyperlink w:anchor="_Toc244100746" w:history="1">
         <w:r>
           <w:rPr>
             <w:rStyle w:val="Hipervnculo"/>
@@ -4552,7 +4552,7 @@
             <w:noProof/>
             <w:webHidden/>
           </w:rPr>
-          <w:instrText xml:space="preserve"> PAGEREF _Toc244088714 \h </w:instrText>
+          <w:instrText xml:space="preserve"> PAGEREF _Toc244100746 \h </w:instrText>
         </w:r>
         <w:r>
           <w:rPr>
@@ -4572,7 +4572,7 @@
             <w:noProof/>
             <w:webHidden/>
           </w:rPr>
-          <w:t>57</w:t>
+          <w:t>59</w:t>
         </w:r>
         <w:r>
           <w:rPr>
@@ -4599,7 +4599,7 @@
           <w14:ligatures w14:val="standardContextual"/>
         </w:rPr>
       </w:pPr>
-      <w:hyperlink w:anchor="_Toc244088715" w:history="1">
+      <w:hyperlink w:anchor="_Toc244100747" w:history="1">
         <w:r>
           <w:rPr>
             <w:rStyle w:val="Hipervnculo"/>
@@ -4626,7 +4626,7 @@
             <w:noProof/>
             <w:webHidden/>
           </w:rPr>
-          <w:instrText xml:space="preserve"> PAGEREF _Toc244088715 \h </w:instrText>
+          <w:instrText xml:space="preserve"> PAGEREF _Toc244100747 \h </w:instrText>
         </w:r>
         <w:r>
           <w:rPr>
@@ -4646,7 +4646,7 @@
             <w:noProof/>
             <w:webHidden/>
           </w:rPr>
-          <w:t>58</w:t>
+          <w:t>60</w:t>
         </w:r>
         <w:r>
           <w:rPr>
@@ -4673,7 +4673,7 @@
           <w14:ligatures w14:val="standardContextual"/>
         </w:rPr>
       </w:pPr>
-      <w:hyperlink w:anchor="_Toc244088716" w:history="1">
+      <w:hyperlink w:anchor="_Toc244100748" w:history="1">
         <w:r>
           <w:rPr>
             <w:rStyle w:val="Hipervnculo"/>
@@ -4700,7 +4700,7 @@
             <w:noProof/>
             <w:webHidden/>
           </w:rPr>
-          <w:instrText xml:space="preserve"> PAGEREF _Toc244088716 \h </w:instrText>
+          <w:instrText xml:space="preserve"> PAGEREF _Toc244100748 \h </w:instrText>
         </w:r>
         <w:r>
           <w:rPr>
@@ -4720,7 +4720,7 @@
             <w:noProof/>
             <w:webHidden/>
           </w:rPr>
-          <w:t>59</w:t>
+          <w:t>61</w:t>
         </w:r>
         <w:r>
           <w:rPr>
@@ -4747,7 +4747,7 @@
           <w14:ligatures w14:val="standardContextual"/>
         </w:rPr>
       </w:pPr>
-      <w:hyperlink w:anchor="_Toc244088717" w:history="1">
+      <w:hyperlink w:anchor="_Toc244100749" w:history="1">
         <w:r>
           <w:rPr>
             <w:rStyle w:val="Hipervnculo"/>
@@ -4774,7 +4774,7 @@
             <w:noProof/>
             <w:webHidden/>
           </w:rPr>
-          <w:instrText xml:space="preserve"> PAGEREF _Toc244088717 \h </w:instrText>
+          <w:instrText xml:space="preserve"> PAGEREF _Toc244100749 \h </w:instrText>
         </w:r>
         <w:r>
           <w:rPr>
@@ -4794,7 +4794,7 @@
             <w:noProof/>
             <w:webHidden/>
           </w:rPr>
-          <w:t>60</w:t>
+          <w:t>62</w:t>
         </w:r>
         <w:r>
           <w:rPr>
@@ -4821,7 +4821,7 @@
           <w14:ligatures w14:val="standardContextual"/>
         </w:rPr>
       </w:pPr>
-      <w:hyperlink w:anchor="_Toc244088718" w:history="1">
+      <w:hyperlink w:anchor="_Toc244100750" w:history="1">
         <w:r>
           <w:rPr>
             <w:rStyle w:val="Hipervnculo"/>
@@ -4848,7 +4848,7 @@
             <w:noProof/>
             <w:webHidden/>
           </w:rPr>
-          <w:instrText xml:space="preserve"> PAGEREF _Toc244088718 \h </w:instrText>
+          <w:instrText xml:space="preserve"> PAGEREF _Toc244100750 \h </w:instrText>
         </w:r>
         <w:r>
           <w:rPr>
@@ -4868,7 +4868,7 @@
             <w:noProof/>
             <w:webHidden/>
           </w:rPr>
-          <w:t>61</w:t>
+          <w:t>63</w:t>
         </w:r>
         <w:r>
           <w:rPr>
@@ -4895,7 +4895,7 @@
           <w14:ligatures w14:val="standardContextual"/>
         </w:rPr>
       </w:pPr>
-      <w:hyperlink w:anchor="_Toc244088719" w:history="1">
+      <w:hyperlink w:anchor="_Toc244100751" w:history="1">
         <w:r>
           <w:rPr>
             <w:rStyle w:val="Hipervnculo"/>
@@ -4922,7 +4922,7 @@
             <w:noProof/>
             <w:webHidden/>
           </w:rPr>
-          <w:instrText xml:space="preserve"> PAGEREF _Toc244088719 \h </w:instrText>
+          <w:instrText xml:space="preserve"> PAGEREF _Toc244100751 \h </w:instrText>
         </w:r>
         <w:r>
           <w:rPr>
@@ -4942,7 +4942,7 @@
             <w:noProof/>
             <w:webHidden/>
           </w:rPr>
-          <w:t>62</w:t>
+          <w:t>64</w:t>
         </w:r>
         <w:r>
           <w:rPr>
@@ -4969,7 +4969,7 @@
           <w14:ligatures w14:val="standardContextual"/>
         </w:rPr>
       </w:pPr>
-      <w:hyperlink w:anchor="_Toc244088720" w:history="1">
+      <w:hyperlink w:anchor="_Toc244100752" w:history="1">
         <w:r>
           <w:rPr>
             <w:rStyle w:val="Hipervnculo"/>
@@ -4996,7 +4996,7 @@
             <w:noProof/>
             <w:webHidden/>
           </w:rPr>
-          <w:instrText xml:space="preserve"> PAGEREF _Toc244088720 \h </w:instrText>
+          <w:instrText xml:space="preserve"> PAGEREF _Toc244100752 \h </w:instrText>
         </w:r>
         <w:r>
           <w:rPr>
@@ -5016,7 +5016,7 @@
             <w:noProof/>
             <w:webHidden/>
           </w:rPr>
-          <w:t>62</w:t>
+          <w:t>64</w:t>
         </w:r>
         <w:r>
           <w:rPr>
@@ -5043,7 +5043,7 @@
           <w14:ligatures w14:val="standardContextual"/>
         </w:rPr>
       </w:pPr>
-      <w:hyperlink w:anchor="_Toc244088721" w:history="1">
+      <w:hyperlink w:anchor="_Toc244100753" w:history="1">
         <w:r>
           <w:rPr>
             <w:rStyle w:val="Hipervnculo"/>
@@ -5070,7 +5070,7 @@
             <w:noProof/>
             <w:webHidden/>
           </w:rPr>
-          <w:instrText xml:space="preserve"> PAGEREF _Toc244088721 \h </w:instrText>
+          <w:instrText xml:space="preserve"> PAGEREF _Toc244100753 \h </w:instrText>
         </w:r>
         <w:r>
           <w:rPr>
@@ -5090,7 +5090,7 @@
             <w:noProof/>
             <w:webHidden/>
           </w:rPr>
-          <w:t>62</w:t>
+          <w:t>64</w:t>
         </w:r>
         <w:r>
           <w:rPr>
@@ -5117,7 +5117,7 @@
           <w14:ligatures w14:val="standardContextual"/>
         </w:rPr>
       </w:pPr>
-      <w:hyperlink w:anchor="_Toc244088722" w:history="1">
+      <w:hyperlink w:anchor="_Toc244100754" w:history="1">
         <w:r>
           <w:rPr>
             <w:rStyle w:val="Hipervnculo"/>
@@ -5144,7 +5144,7 @@
             <w:noProof/>
             <w:webHidden/>
           </w:rPr>
-          <w:instrText xml:space="preserve"> PAGEREF _Toc244088722 \h </w:instrText>
+          <w:instrText xml:space="preserve"> PAGEREF _Toc244100754 \h </w:instrText>
         </w:r>
         <w:r>
           <w:rPr>
@@ -5164,7 +5164,7 @@
             <w:noProof/>
             <w:webHidden/>
           </w:rPr>
-          <w:t>62</w:t>
+          <w:t>65</w:t>
         </w:r>
         <w:r>
           <w:rPr>
@@ -5191,7 +5191,7 @@
           <w14:ligatures w14:val="standardContextual"/>
         </w:rPr>
       </w:pPr>
-      <w:hyperlink w:anchor="_Toc244088723" w:history="1">
+      <w:hyperlink w:anchor="_Toc244100755" w:history="1">
         <w:r>
           <w:rPr>
             <w:rStyle w:val="Hipervnculo"/>
@@ -5218,7 +5218,7 @@
             <w:noProof/>
             <w:webHidden/>
           </w:rPr>
-          <w:instrText xml:space="preserve"> PAGEREF _Toc244088723 \h </w:instrText>
+          <w:instrText xml:space="preserve"> PAGEREF _Toc244100755 \h </w:instrText>
         </w:r>
         <w:r>
           <w:rPr>
@@ -5238,7 +5238,7 @@
             <w:noProof/>
             <w:webHidden/>
           </w:rPr>
-          <w:t>63</w:t>
+          <w:t>65</w:t>
         </w:r>
         <w:r>
           <w:rPr>
@@ -5265,7 +5265,7 @@
           <w14:ligatures w14:val="standardContextual"/>
         </w:rPr>
       </w:pPr>
-      <w:hyperlink w:anchor="_Toc244088724" w:history="1">
+      <w:hyperlink w:anchor="_Toc244100756" w:history="1">
         <w:r>
           <w:rPr>
             <w:rStyle w:val="Hipervnculo"/>
@@ -5292,7 +5292,7 @@
             <w:noProof/>
             <w:webHidden/>
           </w:rPr>
-          <w:instrText xml:space="preserve"> PAGEREF _Toc244088724 \h </w:instrText>
+          <w:instrText xml:space="preserve"> PAGEREF _Toc244100756 \h </w:instrText>
         </w:r>
         <w:r>
           <w:rPr>
@@ -5312,7 +5312,7 @@
             <w:noProof/>
             <w:webHidden/>
           </w:rPr>
-          <w:t>63</w:t>
+          <w:t>65</w:t>
         </w:r>
         <w:r>
           <w:rPr>
@@ -5339,7 +5339,7 @@
           <w14:ligatures w14:val="standardContextual"/>
         </w:rPr>
       </w:pPr>
-      <w:hyperlink w:anchor="_Toc244088725" w:history="1">
+      <w:hyperlink w:anchor="_Toc244100757" w:history="1">
         <w:r>
           <w:rPr>
             <w:rStyle w:val="Hipervnculo"/>
@@ -5366,7 +5366,7 @@
             <w:noProof/>
             <w:webHidden/>
           </w:rPr>
-          <w:instrText xml:space="preserve"> PAGEREF _Toc244088725 \h </w:instrText>
+          <w:instrText xml:space="preserve"> PAGEREF _Toc244100757 \h </w:instrText>
         </w:r>
         <w:r>
           <w:rPr>
@@ -5386,7 +5386,7 @@
             <w:noProof/>
             <w:webHidden/>
           </w:rPr>
-          <w:t>65</w:t>
+          <w:t>67</w:t>
         </w:r>
         <w:r>
           <w:rPr>
@@ -5413,7 +5413,7 @@
           <w14:ligatures w14:val="standardContextual"/>
         </w:rPr>
       </w:pPr>
-      <w:hyperlink w:anchor="_Toc244088726" w:history="1">
+      <w:hyperlink w:anchor="_Toc244100758" w:history="1">
         <w:r>
           <w:rPr>
             <w:rStyle w:val="Hipervnculo"/>
@@ -5440,7 +5440,7 @@
             <w:noProof/>
             <w:webHidden/>
           </w:rPr>
-          <w:instrText xml:space="preserve"> PAGEREF _Toc244088726 \h </w:instrText>
+          <w:instrText xml:space="preserve"> PAGEREF _Toc244100758 \h </w:instrText>
         </w:r>
         <w:r>
           <w:rPr>
@@ -5460,7 +5460,7 @@
             <w:noProof/>
             <w:webHidden/>
           </w:rPr>
-          <w:t>66</w:t>
+          <w:t>68</w:t>
         </w:r>
         <w:r>
           <w:rPr>
@@ -5487,7 +5487,7 @@
           <w14:ligatures w14:val="standardContextual"/>
         </w:rPr>
       </w:pPr>
-      <w:hyperlink w:anchor="_Toc244088727" w:history="1">
+      <w:hyperlink w:anchor="_Toc244100759" w:history="1">
         <w:r>
           <w:rPr>
             <w:rStyle w:val="Hipervnculo"/>
@@ -5514,7 +5514,7 @@
             <w:noProof/>
             <w:webHidden/>
           </w:rPr>
-          <w:instrText xml:space="preserve"> PAGEREF _Toc244088727 \h </w:instrText>
+          <w:instrText xml:space="preserve"> PAGEREF _Toc244100759 \h </w:instrText>
         </w:r>
         <w:r>
           <w:rPr>
@@ -5534,7 +5534,7 @@
             <w:noProof/>
             <w:webHidden/>
           </w:rPr>
-          <w:t>66</w:t>
+          <w:t>68</w:t>
         </w:r>
         <w:r>
           <w:rPr>
@@ -5561,7 +5561,7 @@
           <w14:ligatures w14:val="standardContextual"/>
         </w:rPr>
       </w:pPr>
-      <w:hyperlink w:anchor="_Toc244088728" w:history="1">
+      <w:hyperlink w:anchor="_Toc244100760" w:history="1">
         <w:r>
           <w:rPr>
             <w:rStyle w:val="Hipervnculo"/>
@@ -5588,7 +5588,7 @@
             <w:noProof/>
             <w:webHidden/>
           </w:rPr>
-          <w:instrText xml:space="preserve"> PAGEREF _Toc244088728 \h </w:instrText>
+          <w:instrText xml:space="preserve"> PAGEREF _Toc244100760 \h </w:instrText>
         </w:r>
         <w:r>
           <w:rPr>
@@ -5608,7 +5608,7 @@
             <w:noProof/>
             <w:webHidden/>
           </w:rPr>
-          <w:t>66</w:t>
+          <w:t>68</w:t>
         </w:r>
         <w:r>
           <w:rPr>
@@ -5635,7 +5635,7 @@
           <w14:ligatures w14:val="standardContextual"/>
         </w:rPr>
       </w:pPr>
-      <w:hyperlink w:anchor="_Toc244088729" w:history="1">
+      <w:hyperlink w:anchor="_Toc244100761" w:history="1">
         <w:r>
           <w:rPr>
             <w:rStyle w:val="Hipervnculo"/>
@@ -5662,7 +5662,7 @@
             <w:noProof/>
             <w:webHidden/>
           </w:rPr>
-          <w:instrText xml:space="preserve"> PAGEREF _Toc244088729 \h </w:instrText>
+          <w:instrText xml:space="preserve"> PAGEREF _Toc244100761 \h </w:instrText>
         </w:r>
         <w:r>
           <w:rPr>
@@ -5682,7 +5682,7 @@
             <w:noProof/>
             <w:webHidden/>
           </w:rPr>
-          <w:t>67</w:t>
+          <w:t>69</w:t>
         </w:r>
         <w:r>
           <w:rPr>
@@ -5709,7 +5709,7 @@
           <w14:ligatures w14:val="standardContextual"/>
         </w:rPr>
       </w:pPr>
-      <w:hyperlink w:anchor="_Toc244088730" w:history="1">
+      <w:hyperlink w:anchor="_Toc244100762" w:history="1">
         <w:r>
           <w:rPr>
             <w:rStyle w:val="Hipervnculo"/>
@@ -5736,7 +5736,7 @@
             <w:noProof/>
             <w:webHidden/>
           </w:rPr>
-          <w:instrText xml:space="preserve"> PAGEREF _Toc244088730 \h </w:instrText>
+          <w:instrText xml:space="preserve"> PAGEREF _Toc244100762 \h </w:instrText>
         </w:r>
         <w:r>
           <w:rPr>
@@ -5756,7 +5756,7 @@
             <w:noProof/>
             <w:webHidden/>
           </w:rPr>
-          <w:t>67</w:t>
+          <w:t>69</w:t>
         </w:r>
         <w:r>
           <w:rPr>
@@ -5783,7 +5783,7 @@
           <w14:ligatures w14:val="standardContextual"/>
         </w:rPr>
       </w:pPr>
-      <w:hyperlink w:anchor="_Toc244088731" w:history="1">
+      <w:hyperlink w:anchor="_Toc244100763" w:history="1">
         <w:r>
           <w:rPr>
             <w:rStyle w:val="Hipervnculo"/>
@@ -5810,7 +5810,7 @@
             <w:noProof/>
             <w:webHidden/>
           </w:rPr>
-          <w:instrText xml:space="preserve"> PAGEREF _Toc244088731 \h </w:instrText>
+          <w:instrText xml:space="preserve"> PAGEREF _Toc244100763 \h </w:instrText>
         </w:r>
         <w:r>
           <w:rPr>
@@ -5830,7 +5830,7 @@
             <w:noProof/>
             <w:webHidden/>
           </w:rPr>
-          <w:t>68</w:t>
+          <w:t>70</w:t>
         </w:r>
         <w:r>
           <w:rPr>
@@ -5857,7 +5857,7 @@
           <w14:ligatures w14:val="standardContextual"/>
         </w:rPr>
       </w:pPr>
-      <w:hyperlink w:anchor="_Toc244088732" w:history="1">
+      <w:hyperlink w:anchor="_Toc244100764" w:history="1">
         <w:r>
           <w:rPr>
             <w:rStyle w:val="Hipervnculo"/>
@@ -5884,7 +5884,7 @@
             <w:noProof/>
             <w:webHidden/>
           </w:rPr>
-          <w:instrText xml:space="preserve"> PAGEREF _Toc244088732 \h </w:instrText>
+          <w:instrText xml:space="preserve"> PAGEREF _Toc244100764 \h </w:instrText>
         </w:r>
         <w:r>
           <w:rPr>
@@ -5904,7 +5904,7 @@
             <w:noProof/>
             <w:webHidden/>
           </w:rPr>
-          <w:t>69</w:t>
+          <w:t>72</w:t>
         </w:r>
         <w:r>
           <w:rPr>
@@ -5931,7 +5931,7 @@
           <w14:ligatures w14:val="standardContextual"/>
         </w:rPr>
       </w:pPr>
-      <w:hyperlink w:anchor="_Toc244088733" w:history="1">
+      <w:hyperlink w:anchor="_Toc244100765" w:history="1">
         <w:r>
           <w:rPr>
             <w:rStyle w:val="Hipervnculo"/>
@@ -5958,7 +5958,7 @@
             <w:noProof/>
             <w:webHidden/>
           </w:rPr>
-          <w:instrText xml:space="preserve"> PAGEREF _Toc244088733 \h </w:instrText>
+          <w:instrText xml:space="preserve"> PAGEREF _Toc244100765 \h </w:instrText>
         </w:r>
         <w:r>
           <w:rPr>
@@ -5978,7 +5978,7 @@
             <w:noProof/>
             <w:webHidden/>
           </w:rPr>
-          <w:t>71</w:t>
+          <w:t>73</w:t>
         </w:r>
         <w:r>
           <w:rPr>
@@ -6005,7 +6005,7 @@
           <w14:ligatures w14:val="standardContextual"/>
         </w:rPr>
       </w:pPr>
-      <w:hyperlink w:anchor="_Toc244088734" w:history="1">
+      <w:hyperlink w:anchor="_Toc244100766" w:history="1">
         <w:r>
           <w:rPr>
             <w:rStyle w:val="Hipervnculo"/>
@@ -6032,7 +6032,7 @@
             <w:noProof/>
             <w:webHidden/>
           </w:rPr>
-          <w:instrText xml:space="preserve"> PAGEREF _Toc244088734 \h </w:instrText>
+          <w:instrText xml:space="preserve"> PAGEREF _Toc244100766 \h </w:instrText>
         </w:r>
         <w:r>
           <w:rPr>
@@ -6052,7 +6052,7 @@
             <w:noProof/>
             <w:webHidden/>
           </w:rPr>
-          <w:t>72</w:t>
+          <w:t>74</w:t>
         </w:r>
         <w:r>
           <w:rPr>
@@ -6079,7 +6079,7 @@
           <w14:ligatures w14:val="standardContextual"/>
         </w:rPr>
       </w:pPr>
-      <w:hyperlink w:anchor="_Toc244088735" w:history="1">
+      <w:hyperlink w:anchor="_Toc244100767" w:history="1">
         <w:r>
           <w:rPr>
             <w:rStyle w:val="Hipervnculo"/>
@@ -6106,7 +6106,7 @@
             <w:noProof/>
             <w:webHidden/>
           </w:rPr>
-          <w:instrText xml:space="preserve"> PAGEREF _Toc244088735 \h </w:instrText>
+          <w:instrText xml:space="preserve"> PAGEREF _Toc244100767 \h </w:instrText>
         </w:r>
         <w:r>
           <w:rPr>
@@ -6126,7 +6126,7 @@
             <w:noProof/>
             <w:webHidden/>
           </w:rPr>
-          <w:t>72</w:t>
+          <w:t>75</w:t>
         </w:r>
         <w:r>
           <w:rPr>
@@ -6153,7 +6153,7 @@
           <w14:ligatures w14:val="standardContextual"/>
         </w:rPr>
       </w:pPr>
-      <w:hyperlink w:anchor="_Toc244088736" w:history="1">
+      <w:hyperlink w:anchor="_Toc244100768" w:history="1">
         <w:r>
           <w:rPr>
             <w:rStyle w:val="Hipervnculo"/>
@@ -6180,7 +6180,7 @@
             <w:noProof/>
             <w:webHidden/>
           </w:rPr>
-          <w:instrText xml:space="preserve"> PAGEREF _Toc244088736 \h </w:instrText>
+          <w:instrText xml:space="preserve"> PAGEREF _Toc244100768 \h </w:instrText>
         </w:r>
         <w:r>
           <w:rPr>
@@ -6200,7 +6200,7 @@
             <w:noProof/>
             <w:webHidden/>
           </w:rPr>
-          <w:t>74</w:t>
+          <w:t>76</w:t>
         </w:r>
         <w:r>
           <w:rPr>
@@ -6227,7 +6227,7 @@
           <w14:ligatures w14:val="standardContextual"/>
         </w:rPr>
       </w:pPr>
-      <w:hyperlink w:anchor="_Toc244088737" w:history="1">
+      <w:hyperlink w:anchor="_Toc244100769" w:history="1">
         <w:r>
           <w:rPr>
             <w:rStyle w:val="Hipervnculo"/>
@@ -6254,7 +6254,7 @@
             <w:noProof/>
             <w:webHidden/>
           </w:rPr>
-          <w:instrText xml:space="preserve"> PAGEREF _Toc244088737 \h </w:instrText>
+          <w:instrText xml:space="preserve"> PAGEREF _Toc244100769 \h </w:instrText>
         </w:r>
         <w:r>
           <w:rPr>
@@ -6274,7 +6274,7 @@
             <w:noProof/>
             <w:webHidden/>
           </w:rPr>
-          <w:t>74</w:t>
+          <w:t>76</w:t>
         </w:r>
         <w:r>
           <w:rPr>
@@ -6301,7 +6301,7 @@
           <w14:ligatures w14:val="standardContextual"/>
         </w:rPr>
       </w:pPr>
-      <w:hyperlink w:anchor="_Toc244088738" w:history="1">
+      <w:hyperlink w:anchor="_Toc244100770" w:history="1">
         <w:r>
           <w:rPr>
             <w:rStyle w:val="Hipervnculo"/>
@@ -6328,7 +6328,7 @@
             <w:noProof/>
             <w:webHidden/>
           </w:rPr>
-          <w:instrText xml:space="preserve"> PAGEREF _Toc244088738 \h </w:instrText>
+          <w:instrText xml:space="preserve"> PAGEREF _Toc244100770 \h </w:instrText>
         </w:r>
         <w:r>
           <w:rPr>
@@ -6348,7 +6348,7 @@
             <w:noProof/>
             <w:webHidden/>
           </w:rPr>
-          <w:t>75</w:t>
+          <w:t>77</w:t>
         </w:r>
         <w:r>
           <w:rPr>
@@ -6375,7 +6375,7 @@
           <w14:ligatures w14:val="standardContextual"/>
         </w:rPr>
       </w:pPr>
-      <w:hyperlink w:anchor="_Toc244088739" w:history="1">
+      <w:hyperlink w:anchor="_Toc244100771" w:history="1">
         <w:r>
           <w:rPr>
             <w:rStyle w:val="Hipervnculo"/>
@@ -6402,7 +6402,7 @@
             <w:noProof/>
             <w:webHidden/>
           </w:rPr>
-          <w:instrText xml:space="preserve"> PAGEREF _Toc244088739 \h </w:instrText>
+          <w:instrText xml:space="preserve"> PAGEREF _Toc244100771 \h </w:instrText>
         </w:r>
         <w:r>
           <w:rPr>
@@ -6422,7 +6422,7 @@
             <w:noProof/>
             <w:webHidden/>
           </w:rPr>
-          <w:t>76</w:t>
+          <w:t>78</w:t>
         </w:r>
         <w:r>
           <w:rPr>
@@ -6449,7 +6449,7 @@
           <w14:ligatures w14:val="standardContextual"/>
         </w:rPr>
       </w:pPr>
-      <w:hyperlink w:anchor="_Toc244088740" w:history="1">
+      <w:hyperlink w:anchor="_Toc244100772" w:history="1">
         <w:r>
           <w:rPr>
             <w:rStyle w:val="Hipervnculo"/>
@@ -6476,7 +6476,7 @@
             <w:noProof/>
             <w:webHidden/>
           </w:rPr>
-          <w:instrText xml:space="preserve"> PAGEREF _Toc244088740 \h </w:instrText>
+          <w:instrText xml:space="preserve"> PAGEREF _Toc244100772 \h </w:instrText>
         </w:r>
         <w:r>
           <w:rPr>
@@ -6496,7 +6496,7 @@
             <w:noProof/>
             <w:webHidden/>
           </w:rPr>
-          <w:t>77</w:t>
+          <w:t>79</w:t>
         </w:r>
         <w:r>
           <w:rPr>
@@ -6523,7 +6523,7 @@
           <w14:ligatures w14:val="standardContextual"/>
         </w:rPr>
       </w:pPr>
-      <w:hyperlink w:anchor="_Toc244088741" w:history="1">
+      <w:hyperlink w:anchor="_Toc244100773" w:history="1">
         <w:r>
           <w:rPr>
             <w:rStyle w:val="Hipervnculo"/>
@@ -6550,7 +6550,7 @@
             <w:noProof/>
             <w:webHidden/>
           </w:rPr>
-          <w:instrText xml:space="preserve"> PAGEREF _Toc244088741 \h </w:instrText>
+          <w:instrText xml:space="preserve"> PAGEREF _Toc244100773 \h </w:instrText>
         </w:r>
         <w:r>
           <w:rPr>
@@ -6570,7 +6570,7 @@
             <w:noProof/>
             <w:webHidden/>
           </w:rPr>
-          <w:t>77</w:t>
+          <w:t>79</w:t>
         </w:r>
         <w:r>
           <w:rPr>
@@ -6597,7 +6597,7 @@
           <w14:ligatures w14:val="standardContextual"/>
         </w:rPr>
       </w:pPr>
-      <w:hyperlink w:anchor="_Toc244088742" w:history="1">
+      <w:hyperlink w:anchor="_Toc244100774" w:history="1">
         <w:r>
           <w:rPr>
             <w:rStyle w:val="Hipervnculo"/>
@@ -6624,7 +6624,7 @@
             <w:noProof/>
             <w:webHidden/>
           </w:rPr>
-          <w:instrText xml:space="preserve"> PAGEREF _Toc244088742 \h </w:instrText>
+          <w:instrText xml:space="preserve"> PAGEREF _Toc244100774 \h </w:instrText>
         </w:r>
         <w:r>
           <w:rPr>
@@ -6644,7 +6644,7 @@
             <w:noProof/>
             <w:webHidden/>
           </w:rPr>
-          <w:t>77</w:t>
+          <w:t>79</w:t>
         </w:r>
         <w:r>
           <w:rPr>
@@ -6671,7 +6671,7 @@
           <w14:ligatures w14:val="standardContextual"/>
         </w:rPr>
       </w:pPr>
-      <w:hyperlink w:anchor="_Toc244088743" w:history="1">
+      <w:hyperlink w:anchor="_Toc244100775" w:history="1">
         <w:r>
           <w:rPr>
             <w:rStyle w:val="Hipervnculo"/>
@@ -6698,7 +6698,7 @@
             <w:noProof/>
             <w:webHidden/>
           </w:rPr>
-          <w:instrText xml:space="preserve"> PAGEREF _Toc244088743 \h </w:instrText>
+          <w:instrText xml:space="preserve"> PAGEREF _Toc244100775 \h </w:instrText>
         </w:r>
         <w:r>
           <w:rPr>
@@ -6718,7 +6718,7 @@
             <w:noProof/>
             <w:webHidden/>
           </w:rPr>
-          <w:t>78</w:t>
+          <w:t>80</w:t>
         </w:r>
         <w:r>
           <w:rPr>
@@ -6745,7 +6745,7 @@
           <w14:ligatures w14:val="standardContextual"/>
         </w:rPr>
       </w:pPr>
-      <w:hyperlink w:anchor="_Toc244088744" w:history="1">
+      <w:hyperlink w:anchor="_Toc244100776" w:history="1">
         <w:r>
           <w:rPr>
             <w:rStyle w:val="Hipervnculo"/>
@@ -6772,7 +6772,7 @@
             <w:noProof/>
             <w:webHidden/>
           </w:rPr>
-          <w:instrText xml:space="preserve"> PAGEREF _Toc244088744 \h </w:instrText>
+          <w:instrText xml:space="preserve"> PAGEREF _Toc244100776 \h </w:instrText>
         </w:r>
         <w:r>
           <w:rPr>
@@ -6792,7 +6792,7 @@
             <w:noProof/>
             <w:webHidden/>
           </w:rPr>
-          <w:t>79</w:t>
+          <w:t>81</w:t>
         </w:r>
         <w:r>
           <w:rPr>
@@ -6819,7 +6819,7 @@
           <w14:ligatures w14:val="standardContextual"/>
         </w:rPr>
       </w:pPr>
-      <w:hyperlink w:anchor="_Toc244088745" w:history="1">
+      <w:hyperlink w:anchor="_Toc244100777" w:history="1">
         <w:r>
           <w:rPr>
             <w:rStyle w:val="Hipervnculo"/>
@@ -6846,7 +6846,7 @@
             <w:noProof/>
             <w:webHidden/>
           </w:rPr>
-          <w:instrText xml:space="preserve"> PAGEREF _Toc244088745 \h </w:instrText>
+          <w:instrText xml:space="preserve"> PAGEREF _Toc244100777 \h </w:instrText>
         </w:r>
         <w:r>
           <w:rPr>
@@ -6866,7 +6866,7 @@
             <w:noProof/>
             <w:webHidden/>
           </w:rPr>
-          <w:t>79</w:t>
+          <w:t>81</w:t>
         </w:r>
         <w:r>
           <w:rPr>
@@ -6893,7 +6893,7 @@
           <w14:ligatures w14:val="standardContextual"/>
         </w:rPr>
       </w:pPr>
-      <w:hyperlink w:anchor="_Toc244088746" w:history="1">
+      <w:hyperlink w:anchor="_Toc244100778" w:history="1">
         <w:r>
           <w:rPr>
             <w:rStyle w:val="Hipervnculo"/>
@@ -6920,7 +6920,7 @@
             <w:noProof/>
             <w:webHidden/>
           </w:rPr>
-          <w:instrText xml:space="preserve"> PAGEREF _Toc244088746 \h </w:instrText>
+          <w:instrText xml:space="preserve"> PAGEREF _Toc244100778 \h </w:instrText>
         </w:r>
         <w:r>
           <w:rPr>
@@ -6940,7 +6940,7 @@
             <w:noProof/>
             <w:webHidden/>
           </w:rPr>
-          <w:t>81</w:t>
+          <w:t>83</w:t>
         </w:r>
         <w:r>
           <w:rPr>
@@ -6967,7 +6967,7 @@
           <w14:ligatures w14:val="standardContextual"/>
         </w:rPr>
       </w:pPr>
-      <w:hyperlink w:anchor="_Toc244088747" w:history="1">
+      <w:hyperlink w:anchor="_Toc244100779" w:history="1">
         <w:r>
           <w:rPr>
             <w:rStyle w:val="Hipervnculo"/>
@@ -6994,7 +6994,7 @@
             <w:noProof/>
             <w:webHidden/>
           </w:rPr>
-          <w:instrText xml:space="preserve"> PAGEREF _Toc244088747 \h </w:instrText>
+          <w:instrText xml:space="preserve"> PAGEREF _Toc244100779 \h </w:instrText>
         </w:r>
         <w:r>
           <w:rPr>
@@ -7014,7 +7014,7 @@
             <w:noProof/>
             <w:webHidden/>
           </w:rPr>
-          <w:t>82</w:t>
+          <w:t>84</w:t>
         </w:r>
         <w:r>
           <w:rPr>
@@ -7041,7 +7041,7 @@
           <w14:ligatures w14:val="standardContextual"/>
         </w:rPr>
       </w:pPr>
-      <w:hyperlink w:anchor="_Toc244088748" w:history="1">
+      <w:hyperlink w:anchor="_Toc244100780" w:history="1">
         <w:r>
           <w:rPr>
             <w:rStyle w:val="Hipervnculo"/>
@@ -7068,7 +7068,7 @@
             <w:noProof/>
             <w:webHidden/>
           </w:rPr>
-          <w:instrText xml:space="preserve"> PAGEREF _Toc244088748 \h </w:instrText>
+          <w:instrText xml:space="preserve"> PAGEREF _Toc244100780 \h </w:instrText>
         </w:r>
         <w:r>
           <w:rPr>
@@ -7088,7 +7088,7 @@
             <w:noProof/>
             <w:webHidden/>
           </w:rPr>
-          <w:t>82</w:t>
+          <w:t>84</w:t>
         </w:r>
         <w:r>
           <w:rPr>
@@ -7115,7 +7115,7 @@
           <w14:ligatures w14:val="standardContextual"/>
         </w:rPr>
       </w:pPr>
-      <w:hyperlink w:anchor="_Toc244088749" w:history="1">
+      <w:hyperlink w:anchor="_Toc244100781" w:history="1">
         <w:r>
           <w:rPr>
             <w:rStyle w:val="Hipervnculo"/>
@@ -7142,7 +7142,7 @@
             <w:noProof/>
             <w:webHidden/>
           </w:rPr>
-          <w:instrText xml:space="preserve"> PAGEREF _Toc244088749 \h </w:instrText>
+          <w:instrText xml:space="preserve"> PAGEREF _Toc244100781 \h </w:instrText>
         </w:r>
         <w:r>
           <w:rPr>
@@ -7162,7 +7162,7 @@
             <w:noProof/>
             <w:webHidden/>
           </w:rPr>
-          <w:t>83</w:t>
+          <w:t>85</w:t>
         </w:r>
         <w:r>
           <w:rPr>
@@ -7189,7 +7189,7 @@
           <w14:ligatures w14:val="standardContextual"/>
         </w:rPr>
       </w:pPr>
-      <w:hyperlink w:anchor="_Toc244088750" w:history="1">
+      <w:hyperlink w:anchor="_Toc244100782" w:history="1">
         <w:r>
           <w:rPr>
             <w:rStyle w:val="Hipervnculo"/>
@@ -7216,7 +7216,7 @@
             <w:noProof/>
             <w:webHidden/>
           </w:rPr>
-          <w:instrText xml:space="preserve"> PAGEREF _Toc244088750 \h </w:instrText>
+          <w:instrText xml:space="preserve"> PAGEREF _Toc244100782 \h </w:instrText>
         </w:r>
         <w:r>
           <w:rPr>
@@ -7236,7 +7236,7 @@
             <w:noProof/>
             <w:webHidden/>
           </w:rPr>
-          <w:t>84</w:t>
+          <w:t>86</w:t>
         </w:r>
         <w:r>
           <w:rPr>
@@ -7263,7 +7263,7 @@
           <w14:ligatures w14:val="standardContextual"/>
         </w:rPr>
       </w:pPr>
-      <w:hyperlink w:anchor="_Toc244088751" w:history="1">
+      <w:hyperlink w:anchor="_Toc244100783" w:history="1">
         <w:r>
           <w:rPr>
             <w:rStyle w:val="Hipervnculo"/>
@@ -7290,7 +7290,7 @@
             <w:noProof/>
             <w:webHidden/>
           </w:rPr>
-          <w:instrText xml:space="preserve"> PAGEREF _Toc244088751 \h </w:instrText>
+          <w:instrText xml:space="preserve"> PAGEREF _Toc244100783 \h </w:instrText>
         </w:r>
         <w:r>
           <w:rPr>
@@ -7310,7 +7310,7 @@
             <w:noProof/>
             <w:webHidden/>
           </w:rPr>
-          <w:t>84</w:t>
+          <w:t>86</w:t>
         </w:r>
         <w:r>
           <w:rPr>
@@ -7337,7 +7337,7 @@
           <w14:ligatures w14:val="standardContextual"/>
         </w:rPr>
       </w:pPr>
-      <w:hyperlink w:anchor="_Toc244088752" w:history="1">
+      <w:hyperlink w:anchor="_Toc244100784" w:history="1">
         <w:r>
           <w:rPr>
             <w:rStyle w:val="Hipervnculo"/>
@@ -7364,7 +7364,7 @@
             <w:noProof/>
             <w:webHidden/>
           </w:rPr>
-          <w:instrText xml:space="preserve"> PAGEREF _Toc244088752 \h </w:instrText>
+          <w:instrText xml:space="preserve"> PAGEREF _Toc244100784 \h </w:instrText>
         </w:r>
         <w:r>
           <w:rPr>
@@ -7384,7 +7384,7 @@
             <w:noProof/>
             <w:webHidden/>
           </w:rPr>
-          <w:t>85</w:t>
+          <w:t>87</w:t>
         </w:r>
         <w:r>
           <w:rPr>
@@ -7411,7 +7411,7 @@
           <w14:ligatures w14:val="standardContextual"/>
         </w:rPr>
       </w:pPr>
-      <w:hyperlink w:anchor="_Toc244088753" w:history="1">
+      <w:hyperlink w:anchor="_Toc244100785" w:history="1">
         <w:r>
           <w:rPr>
             <w:rStyle w:val="Hipervnculo"/>
@@ -7438,7 +7438,7 @@
             <w:noProof/>
             <w:webHidden/>
           </w:rPr>
-          <w:instrText xml:space="preserve"> PAGEREF _Toc244088753 \h </w:instrText>
+          <w:instrText xml:space="preserve"> PAGEREF _Toc244100785 \h </w:instrText>
         </w:r>
         <w:r>
           <w:rPr>
@@ -7458,7 +7458,7 @@
             <w:noProof/>
             <w:webHidden/>
           </w:rPr>
-          <w:t>85</w:t>
+          <w:t>87</w:t>
         </w:r>
         <w:r>
           <w:rPr>
@@ -7485,7 +7485,7 @@
           <w14:ligatures w14:val="standardContextual"/>
         </w:rPr>
       </w:pPr>
-      <w:hyperlink w:anchor="_Toc244088754" w:history="1">
+      <w:hyperlink w:anchor="_Toc244100786" w:history="1">
         <w:r>
           <w:rPr>
             <w:rStyle w:val="Hipervnculo"/>
@@ -7512,7 +7512,7 @@
             <w:noProof/>
             <w:webHidden/>
           </w:rPr>
-          <w:instrText xml:space="preserve"> PAGEREF _Toc244088754 \h </w:instrText>
+          <w:instrText xml:space="preserve"> PAGEREF _Toc244100786 \h </w:instrText>
         </w:r>
         <w:r>
           <w:rPr>
@@ -7532,7 +7532,7 @@
             <w:noProof/>
             <w:webHidden/>
           </w:rPr>
-          <w:t>86</w:t>
+          <w:t>88</w:t>
         </w:r>
         <w:r>
           <w:rPr>
@@ -7559,7 +7559,7 @@
           <w14:ligatures w14:val="standardContextual"/>
         </w:rPr>
       </w:pPr>
-      <w:hyperlink w:anchor="_Toc244088755" w:history="1">
+      <w:hyperlink w:anchor="_Toc244100787" w:history="1">
         <w:r>
           <w:rPr>
             <w:rStyle w:val="Hipervnculo"/>
@@ -7586,7 +7586,7 @@
             <w:noProof/>
             <w:webHidden/>
           </w:rPr>
-          <w:instrText xml:space="preserve"> PAGEREF _Toc244088755 \h </w:instrText>
+          <w:instrText xml:space="preserve"> PAGEREF _Toc244100787 \h </w:instrText>
         </w:r>
         <w:r>
           <w:rPr>
@@ -7606,7 +7606,7 @@
             <w:noProof/>
             <w:webHidden/>
           </w:rPr>
-          <w:t>87</w:t>
+          <w:t>89</w:t>
         </w:r>
         <w:r>
           <w:rPr>
@@ -7633,7 +7633,7 @@
           <w14:ligatures w14:val="standardContextual"/>
         </w:rPr>
       </w:pPr>
-      <w:hyperlink w:anchor="_Toc244088756" w:history="1">
+      <w:hyperlink w:anchor="_Toc244100788" w:history="1">
         <w:r>
           <w:rPr>
             <w:rStyle w:val="Hipervnculo"/>
@@ -7660,7 +7660,7 @@
             <w:noProof/>
             <w:webHidden/>
           </w:rPr>
-          <w:instrText xml:space="preserve"> PAGEREF _Toc244088756 \h </w:instrText>
+          <w:instrText xml:space="preserve"> PAGEREF _Toc244100788 \h </w:instrText>
         </w:r>
         <w:r>
           <w:rPr>
@@ -7680,7 +7680,7 @@
             <w:noProof/>
             <w:webHidden/>
           </w:rPr>
-          <w:t>91</w:t>
+          <w:t>93</w:t>
         </w:r>
         <w:r>
           <w:rPr>
@@ -7707,7 +7707,7 @@
           <w14:ligatures w14:val="standardContextual"/>
         </w:rPr>
       </w:pPr>
-      <w:hyperlink w:anchor="_Toc244088757" w:history="1">
+      <w:hyperlink w:anchor="_Toc244100789" w:history="1">
         <w:r>
           <w:rPr>
             <w:rStyle w:val="Hipervnculo"/>
@@ -7734,7 +7734,7 @@
             <w:noProof/>
             <w:webHidden/>
           </w:rPr>
-          <w:instrText xml:space="preserve"> PAGEREF _Toc244088757 \h </w:instrText>
+          <w:instrText xml:space="preserve"> PAGEREF _Toc244100789 \h </w:instrText>
         </w:r>
         <w:r>
           <w:rPr>
@@ -7754,7 +7754,7 @@
             <w:noProof/>
             <w:webHidden/>
           </w:rPr>
-          <w:t>91</w:t>
+          <w:t>93</w:t>
         </w:r>
         <w:r>
           <w:rPr>
@@ -7781,7 +7781,7 @@
           <w14:ligatures w14:val="standardContextual"/>
         </w:rPr>
       </w:pPr>
-      <w:hyperlink w:anchor="_Toc244088758" w:history="1">
+      <w:hyperlink w:anchor="_Toc244100790" w:history="1">
         <w:r>
           <w:rPr>
             <w:rStyle w:val="Hipervnculo"/>
@@ -7808,7 +7808,7 @@
             <w:noProof/>
             <w:webHidden/>
           </w:rPr>
-          <w:instrText xml:space="preserve"> PAGEREF _Toc244088758 \h </w:instrText>
+          <w:instrText xml:space="preserve"> PAGEREF _Toc244100790 \h </w:instrText>
         </w:r>
         <w:r>
           <w:rPr>
@@ -7828,7 +7828,7 @@
             <w:noProof/>
             <w:webHidden/>
           </w:rPr>
-          <w:t>91</w:t>
+          <w:t>93</w:t>
         </w:r>
         <w:r>
           <w:rPr>
@@ -8523,7 +8523,7 @@
       <w:r>
         <w:br w:type="page"/>
       </w:r>
-      <w:bookmarkStart w:id="1" w:name="_Toc244088658"/>
+      <w:bookmarkStart w:id="1" w:name="_Toc244100690"/>
       <w:r>
         <w:lastRenderedPageBreak/>
         <w:t>1. Introducción y objetivos</w:t>
@@ -8534,7 +8534,7 @@
       <w:pPr>
         <w:pStyle w:val="Ttulo2"/>
       </w:pPr>
-      <w:bookmarkStart w:id="2" w:name="_Toc244088659"/>
+      <w:bookmarkStart w:id="2" w:name="_Toc244100691"/>
       <w:r>
         <w:t>1.1. Contexto, motivación y justificación</w:t>
       </w:r>
@@ -8597,7 +8597,7 @@
       <w:pPr>
         <w:pStyle w:val="Ttulo2"/>
       </w:pPr>
-      <w:bookmarkStart w:id="3" w:name="_Toc244088660"/>
+      <w:bookmarkStart w:id="3" w:name="_Toc244100692"/>
       <w:r>
         <w:t>1.2. Objetivos generales y específicos</w:t>
       </w:r>
@@ -8656,7 +8656,7 @@
       <w:pPr>
         <w:pStyle w:val="Ttulo2"/>
       </w:pPr>
-      <w:bookmarkStart w:id="4" w:name="_Toc244088661"/>
+      <w:bookmarkStart w:id="4" w:name="_Toc244100693"/>
       <w:r>
         <w:t>1.3. Alcance, usuarios y limitaciones</w:t>
       </w:r>
@@ -8717,7 +8717,7 @@
         <w:lastRenderedPageBreak/>
         <w:drawing>
           <wp:inline distT="0" distB="0" distL="0" distR="0" wp14:anchorId="3EEA0C2F" wp14:editId="33E22B8F">
-            <wp:extent cx="5580000" cy="3127010"/>
+            <wp:extent cx="5832000" cy="4374000"/>
             <wp:effectExtent l="0" t="0" r="0" b="0"/>
             <wp:docPr id="36" name="Picture 36"/>
             <wp:cNvGraphicFramePr>
@@ -8739,7 +8739,7 @@
                   <pic:spPr>
                     <a:xfrm>
                       <a:off x="0" y="0"/>
-                      <a:ext cx="5580000" cy="3127010"/>
+                      <a:ext cx="5832000" cy="4374000"/>
                     </a:xfrm>
                     <a:prstGeom prst="rect">
                       <a:avLst/>
@@ -8766,7 +8766,7 @@
         <w:pStyle w:val="Ttulo1"/>
         <w:pageBreakBefore/>
       </w:pPr>
-      <w:bookmarkStart w:id="5" w:name="_Toc244088662"/>
+      <w:bookmarkStart w:id="5" w:name="_Toc244100694"/>
       <w:r>
         <w:lastRenderedPageBreak/>
         <w:t>2. Marco teórico y estado del arte</w:t>
@@ -8777,7 +8777,7 @@
       <w:pPr>
         <w:pStyle w:val="Ttulo2"/>
       </w:pPr>
-      <w:bookmarkStart w:id="6" w:name="_Toc244088663"/>
+      <w:bookmarkStart w:id="6" w:name="_Toc244100695"/>
       <w:r>
         <w:t>2.1. Necesidades hídricas y gestión eficiente del riego</w:t>
       </w:r>
@@ -8845,7 +8845,7 @@
       <w:pPr>
         <w:pStyle w:val="Ttulo2"/>
       </w:pPr>
-      <w:bookmarkStart w:id="7" w:name="_Toc244088664"/>
+      <w:bookmarkStart w:id="7" w:name="_Toc244100696"/>
       <w:r>
         <w:t>2.2. Agricultura de precisión y aprendizaje automático</w:t>
       </w:r>
@@ -8892,17 +8892,25 @@
     </w:p>
     <w:p>
       <w:r>
+        <w:t>En comparaciones sobre series diarias, los errores consecutivos pueden estar correlacionados. El remuestreo por bloques conserva grupos de observaciones próximas y permite describir la incertidumbre interna sin tratar cada día como independiente (Künsch, 1989). Sus intervalos no sustituyen una validación en campañas o ubicaciones nuevas, pero evitan interpretar una diferencia puntual de MAE como una mejora concluyente.</w:t>
+      </w:r>
+    </w:p>
+    <w:p>
+      <w:r>
         <w:t>Junto con la precisión predictiva, la interpretabilidad es especialmente relevante en un sistema de apoyo a la decisión. Las explicaciones globales permiten conocer qué variables influyen con mayor frecuencia en el comportamiento del modelo, mientras que las explicaciones locales ayudan a entender una recomendación concreta. Métodos como SHAP distribuyen entre las variables la contribución atribuida a cada predicción y facilitan la detección de señales espurias o comportamientos inesperados. Estas atribuciones mejoran la trazabilidad del modelo, aunque no deben interpretarse como prueba de una relación causal (Lundberg &amp; Lee, 2017).</w:t>
       </w:r>
     </w:p>
     <w:p>
       <w:r>
-        <w:t>La aplicación práctica también plantea limitaciones. Los cambios de clima, cultivo, manejo o instrumentación pueden alterar la distribución de los datos y degradar el modelo con el tiempo; a ello se añaden fallos de sensores o servicios externos, falta de representatividad de ciertas campañas y dificultades para transferir resultados entre regiones. La propiedad y privacidad de los datos, la interoperabilidad de las plataformas y la capacidad de mantenimiento forman parte, por tanto, de la calidad del sistema y no constituyen aspectos accesorios de su despliegue (Benos et al., 2021; Wolfert et al., 2017).</w:t>
-      </w:r>
-    </w:p>
-    <w:p>
+        <w:t xml:space="preserve">La aplicación práctica también plantea limitaciones. Los cambios de clima, cultivo, manejo o instrumentación pueden alterar la distribución de los datos y degradar el modelo con el tiempo; a ello se añaden fallos de sensores o servicios externos, falta de representatividad de ciertas </w:t>
+      </w:r>
       <w:r>
         <w:lastRenderedPageBreak/>
+        <w:t>campañas y dificultades para transferir resultados entre regiones. La propiedad y privacidad de los datos, la interoperabilidad de las plataformas y la capacidad de mantenimiento forman parte, por tanto, de la calidad del sistema y no constituyen aspectos accesorios de su despliegue (Benos et al., 2021; Wolfert et al., 2017).</w:t>
+      </w:r>
+    </w:p>
+    <w:p>
+      <w:r>
         <w:t>A partir de estas consideraciones, el componente de aprendizaje automático del presente trabajo se concibe como una extensión evaluable del fundamento agronómico expuesto en el apartado 2.1. Los modelos se compararán con referencias sencillas, se entrenarán únicamente con información disponible en el momento de la predicción y se evaluarán mediante particiones coherentes con la secuencia temporal y, cuando proceda, con la estructura espacial de los datos. La complejidad solo estará justificada si aporta una mejora reproducible fuera de muestra y una explicación compatible con el contexto agronómico. El resultado se integrará como apoyo a la decisión de riego, no como sustitución automática del criterio técnico o del usuario final (Benos et al., 2021; Gebbers &amp; Adamchuk, 2010; Roberts et al., 2017).</w:t>
       </w:r>
     </w:p>
@@ -8910,7 +8918,7 @@
       <w:pPr>
         <w:pStyle w:val="Ttulo2"/>
       </w:pPr>
-      <w:bookmarkStart w:id="8" w:name="_Toc244088665"/>
+      <w:bookmarkStart w:id="8" w:name="_Toc244100697"/>
       <w:r>
         <w:t>2.3. Sistemas inteligentes de apoyo a la decisión</w:t>
       </w:r>
@@ -8933,11 +8941,8 @@
     </w:p>
     <w:p>
       <w:r>
-        <w:t xml:space="preserve">Un DSS de riego traduce esta arquitectura en un flujo operativo. Primero recibe variables relacionadas con la atmósfera, el suelo y el cultivo; después estima la necesidad hídrica mediante una referencia agronómica, un modelo basado en datos o una combinación de ambos; finalmente presenta una recomendación sobre el momento y la cantidad de agua. Navarro-Hellín et al. (2016) desarrollaron un sistema que integraba mediciones de suelo y variables climáticas, utilizaba </w:t>
-      </w:r>
-      <w:r>
         <w:lastRenderedPageBreak/>
-        <w:t>técnicas de aprendizaje automático como motor de inferencia y contrastaba las estimaciones semanales con las decisiones de un experto. El estudio muestra la viabilidad del enfoque, pero también confirma la necesidad de calibración local y validación frente a una referencia aplicable.</w:t>
+        <w:t>Un DSS de riego traduce esta arquitectura en un flujo operativo. Primero recibe variables relacionadas con la atmósfera, el suelo y el cultivo; después estima la necesidad hídrica mediante una referencia agronómica, un modelo basado en datos o una combinación de ambos; finalmente presenta una recomendación sobre el momento y la cantidad de agua. Navarro-Hellín et al. (2016) desarrollaron un sistema que integraba mediciones de suelo y variables climáticas, utilizaba técnicas de aprendizaje automático como motor de inferencia y contrastaba las estimaciones semanales con las decisiones de un experto. El estudio muestra la viabilidad del enfoque, pero también confirma la necesidad de calibración local y validación frente a una referencia aplicable.</w:t>
       </w:r>
     </w:p>
     <w:p>
@@ -8957,16 +8962,21 @@
     </w:p>
     <w:p>
       <w:r>
-        <w:t>La evaluación de un DSS debe abarcar dimensiones distintas. En el plano predictivo se analizan los errores y la generalización fuera de muestra; en el plano agronómico se comprueba la coherencia de las recomendaciones y el cumplimiento de restricciones; en el plano operativo se valoran disponibilidad, latencia, trazabilidad y tolerancia a fallos; y en el plano de uso se estudian comprensión, esfuerzo requerido y capacidad para apoyar una decisión real. La historia de los DSS agrícolas muestra que la sofisticación de los modelos no asegura su adopción cuando el sistema no encaja en el contexto sociotécnico de la explotación (McCown, 2002; Rose et al., 2016).</w:t>
-      </w:r>
-    </w:p>
-    <w:p>
-      <w:r>
-        <w:t xml:space="preserve">En este TFM, el sistema de apoyo a la decisión conectará las fuentes meteorológicas, agrometeorológicas e hidrológicas definidas en el alcance con la referencia agronómica del </w:t>
+        <w:t xml:space="preserve">La evaluación de un DSS debe abarcar dimensiones distintas. En el plano predictivo se analizan los errores y la generalización fuera de muestra; en el plano agronómico se comprueba la coherencia de las recomendaciones y el cumplimiento de restricciones; en el plano operativo se valoran disponibilidad, latencia, trazabilidad y tolerancia a fallos; y en el plano de uso se estudian comprensión, esfuerzo requerido y capacidad para apoyar una decisión real. La historia de los </w:t>
       </w:r>
       <w:r>
         <w:lastRenderedPageBreak/>
-        <w:t>apartado 2.1 y los modelos predictivos descritos en el apartado 2.2. La lógica de recomendación aplicará las restricciones que puedan justificarse con los datos disponibles y mostrará la estimación, las variables relevantes, la vigencia de las entradas y las advertencias necesarias. La interfaz permitirá seleccionar localización y cultivo y consultar el fundamento de la propuesta. El prototipo se considerará inteligente en la medida en que produzca recomendaciones contextualizadas y trazables mediante modelos y reglas; seguirá siendo un instrumento de apoyo, sin accionar infraestructuras ni sustituir el criterio agronómico y la decisión final del usuario (Lindblom et al., 2017; Navarro-Hellín et al., 2016; Zhai et al., 2020).</w:t>
+        <w:t>DSS agrícolas muestra que la sofisticación de los modelos no asegura su adopción cuando el sistema no encaja en el contexto sociotécnico de la explotación (McCown, 2002; Rose et al., 2016).</w:t>
+      </w:r>
+    </w:p>
+    <w:p>
+      <w:r>
+        <w:t>Las herramientas existentes ayudan a situar el alcance del prototipo. CROPWAT 8.0 calcula necesidades y calendarios de riego a partir de datos de clima, suelo y cultivo y mantiene un balance hídrico diario; IrriSAT combina ET0 de estaciones con un Kc estimado mediante NDVI y seguimiento del déficit de agua en la zona radicular (Food and Agriculture Organization of the United Nations, s. f.; Deakin University, 2026). Frente a ellas, este TFM no implementa todavía balance de suelo ni Kc parcelario dinámico. Su aportación se concentra en automatizar la integración de SiAR y AEMET, comparar referencias físicas y modelos con partición temporal, y conservar trazabilidad, reglas y advertencias en una aplicación reproducible. Por tanto, el prototipo complementa el asesoramiento agronómico y no pretende sustituir esas herramientas ni la validación en parcela.</w:t>
+      </w:r>
+    </w:p>
+    <w:p>
+      <w:r>
+        <w:t>En este TFM, el sistema de apoyo a la decisión conectará las fuentes meteorológicas, agrometeorológicas e hidrológicas definidas en el alcance con la referencia agronómica del apartado 2.1 y los modelos predictivos descritos en el apartado 2.2. La lógica de recomendación aplicará las restricciones que puedan justificarse con los datos disponibles y mostrará la estimación, las variables relevantes, la vigencia de las entradas y las advertencias necesarias. La interfaz permitirá seleccionar localización y cultivo y consultar el fundamento de la propuesta. El prototipo se considerará inteligente en la medida en que produzca recomendaciones contextualizadas y trazables mediante modelos y reglas; seguirá siendo un instrumento de apoyo, sin accionar infraestructuras ni sustituir el criterio agronómico y la decisión final del usuario (Lindblom et al., 2017; Navarro-Hellín et al., 2016; Zhai et al., 2020).</w:t>
       </w:r>
     </w:p>
     <w:p>
@@ -8974,7 +8984,7 @@
         <w:pStyle w:val="Ttulo1"/>
         <w:pageBreakBefore/>
       </w:pPr>
-      <w:bookmarkStart w:id="9" w:name="_Toc244088666"/>
+      <w:bookmarkStart w:id="9" w:name="_Toc244100698"/>
       <w:r>
         <w:lastRenderedPageBreak/>
         <w:t>3. Metodología y arquitectura del sistema</w:t>
@@ -8985,7 +8995,7 @@
       <w:pPr>
         <w:pStyle w:val="Ttulo2"/>
       </w:pPr>
-      <w:bookmarkStart w:id="10" w:name="_Toc244088667"/>
+      <w:bookmarkStart w:id="10" w:name="_Toc244100699"/>
       <w:r>
         <w:t>3.1. Fuentes, variables y calidad de los datos</w:t>
       </w:r>
@@ -9005,7 +9015,7 @@
       <w:pPr>
         <w:pStyle w:val="Ttulo3"/>
       </w:pPr>
-      <w:bookmarkStart w:id="11" w:name="_Toc244088668"/>
+      <w:bookmarkStart w:id="11" w:name="_Toc244100700"/>
       <w:r>
         <w:rPr>
           <w:sz w:val="24"/>
@@ -9677,7 +9687,7 @@
       <w:pPr>
         <w:pStyle w:val="Ttulo3"/>
       </w:pPr>
-      <w:bookmarkStart w:id="13" w:name="_Toc244088669"/>
+      <w:bookmarkStart w:id="13" w:name="_Toc244100701"/>
       <w:r>
         <w:rPr>
           <w:sz w:val="24"/>
@@ -10420,7 +10430,7 @@
       <w:pPr>
         <w:pStyle w:val="Ttulo3"/>
       </w:pPr>
-      <w:bookmarkStart w:id="15" w:name="_Toc244088670"/>
+      <w:bookmarkStart w:id="15" w:name="_Toc244100702"/>
       <w:r>
         <w:rPr>
           <w:sz w:val="24"/>
@@ -10529,7 +10539,7 @@
       <w:pPr>
         <w:pStyle w:val="Ttulo3"/>
       </w:pPr>
-      <w:bookmarkStart w:id="16" w:name="_Toc244088671"/>
+      <w:bookmarkStart w:id="16" w:name="_Toc244100703"/>
       <w:r>
         <w:rPr>
           <w:sz w:val="24"/>
@@ -10546,14 +10556,14 @@
     <w:p>
       <w:r>
         <w:lastRenderedPageBreak/>
-        <w:t>Los datos permiten comprobar el recorrido técnico, pero no una optimización agronómica generalizable. La evaluación retrospectiva del DSS usa una estación, un cultivo y una campaña; la ampliación predictiva reúne seis combinaciones de tres estaciones y hasta dos campañas. En todos los casos la referencia de SiAR es calculada y faltan riego real, humedad del suelo, eficiencia medida de la instalación y respuesta productiva. Estas limitaciones condicionan la interpretación de los capítulos 4 y 5.</w:t>
+        <w:t>El piloto detallado de pimiento AL01 de 2025 permite validar el recorrido técnico, pero no demostrar una optimización agronómica generalizable. Se complementa con seis combinaciones cultivo-estación para el modelado predictivo del capítulo 4 y con la comprobación cronológica del apartado 5.3.10 en coliflor AL01, alfalfa Z06 y alcachofa BA08. Cada uno de estos tres casos adicionales aporta una sola campaña de 2026, por lo que la cobertura temporal sigue siendo limitada. La referencia SiAR es calculada y no se dispone todavía de riego real, humedad del suelo, eficiencia de la instalación ni respuesta productiva. Estas limitaciones condicionan la evaluación del capítulo 4 y el alcance de las recomendaciones posteriores.</w:t>
       </w:r>
     </w:p>
     <w:p>
       <w:pPr>
         <w:pStyle w:val="Ttulo2"/>
       </w:pPr>
-      <w:bookmarkStart w:id="17" w:name="_Toc244088672"/>
+      <w:bookmarkStart w:id="17" w:name="_Toc244100704"/>
       <w:r>
         <w:t>3.2. Arquitectura, tecnologías y flujo de información</w:t>
       </w:r>
@@ -10628,7 +10638,7 @@
       <w:pPr>
         <w:pStyle w:val="Ttulo3"/>
       </w:pPr>
-      <w:bookmarkStart w:id="19" w:name="_Toc244088673"/>
+      <w:bookmarkStart w:id="19" w:name="_Toc244100705"/>
       <w:r>
         <w:rPr>
           <w:sz w:val="24"/>
@@ -10652,6 +10662,7 @@
         <w:ind w:left="360" w:hanging="259"/>
       </w:pPr>
       <w:r>
+        <w:lastRenderedPageBreak/>
         <w:t xml:space="preserve">2. </w:t>
       </w:r>
       <w:r>
@@ -10670,7 +10681,6 @@
         <w:ind w:left="360" w:hanging="259"/>
       </w:pPr>
       <w:r>
-        <w:lastRenderedPageBreak/>
         <w:t xml:space="preserve">3. </w:t>
       </w:r>
       <w:r>
@@ -10765,7 +10775,7 @@
       <w:pPr>
         <w:pStyle w:val="Ttulo3"/>
       </w:pPr>
-      <w:bookmarkStart w:id="20" w:name="_Toc244088674"/>
+      <w:bookmarkStart w:id="20" w:name="_Toc244100706"/>
       <w:r>
         <w:rPr>
           <w:sz w:val="24"/>
@@ -11199,6 +11209,7 @@
               <w:rPr>
                 <w:sz w:val="18"/>
               </w:rPr>
+              <w:lastRenderedPageBreak/>
               <w:t>Streamlit</w:t>
             </w:r>
           </w:p>
@@ -11271,7 +11282,6 @@
               <w:rPr>
                 <w:sz w:val="18"/>
               </w:rPr>
-              <w:lastRenderedPageBreak/>
               <w:t>Jupyter y Visual Studio Code</w:t>
             </w:r>
           </w:p>
@@ -11775,7 +11785,7 @@
       <w:pPr>
         <w:pStyle w:val="Ttulo3"/>
       </w:pPr>
-      <w:bookmarkStart w:id="22" w:name="_Toc244088675"/>
+      <w:bookmarkStart w:id="22" w:name="_Toc244100707"/>
       <w:r>
         <w:rPr>
           <w:sz w:val="24"/>
@@ -11791,19 +11801,22 @@
     </w:p>
     <w:p>
       <w:r>
-        <w:t>La unión no se realiza únicamente por coincidencia de nombres. Se conservan los identificadores espaciales y, cuando se incorporen más estaciones, se tendrá en cuenta distancia, altitud, vigencia y cobertura. Una observación y una predicción tampoco se consideran equivalentes: la evaluación futura debe relacionarlas mediante fecha de emisión, fecha válida y horizonte.</w:t>
+        <w:t xml:space="preserve">La unión no se realiza únicamente por coincidencia de nombres. Se conservan los identificadores espaciales y, cuando se incorporen más estaciones, se tendrá en cuenta distancia, altitud, </w:t>
+      </w:r>
+      <w:r>
+        <w:lastRenderedPageBreak/>
+        <w:t>vigencia y cobertura. Una observación y una predicción tampoco se consideran equivalentes: la evaluación futura debe relacionarlas mediante fecha de emisión, fecha válida y horizonte.</w:t>
       </w:r>
     </w:p>
     <w:p>
       <w:pPr>
         <w:pStyle w:val="Ttulo3"/>
       </w:pPr>
-      <w:bookmarkStart w:id="23" w:name="_Toc244088676"/>
+      <w:bookmarkStart w:id="23" w:name="_Toc244100708"/>
       <w:r>
         <w:rPr>
           <w:sz w:val="24"/>
         </w:rPr>
-        <w:lastRenderedPageBreak/>
         <w:t>3.2.4. Reproducibilidad y escalabilidad</w:t>
       </w:r>
       <w:bookmarkEnd w:id="23"/>
@@ -11822,7 +11835,7 @@
       <w:pPr>
         <w:pStyle w:val="Ttulo2"/>
       </w:pPr>
-      <w:bookmarkStart w:id="24" w:name="_Toc244088677"/>
+      <w:bookmarkStart w:id="24" w:name="_Toc244100709"/>
       <w:r>
         <w:t>3.3. Planificación y organización del proyecto</w:t>
       </w:r>
@@ -12335,6 +12348,7 @@
               <w:rPr>
                 <w:sz w:val="18"/>
               </w:rPr>
+              <w:lastRenderedPageBreak/>
               <w:t>Validación y documentación</w:t>
             </w:r>
           </w:p>
@@ -12391,11 +12405,7 @@
     </w:tbl>
     <w:p>
       <w:r>
-        <w:t xml:space="preserve">El historial de Git sitúa los hitos ejecutados: documentación de fuentes y ETL el 24/09/2026; análisis y modelado entre el 28/09 y el 07/10; motor de recomendación y validación el 12/10; </w:t>
-      </w:r>
-      <w:r>
-        <w:lastRenderedPageBreak/>
-        <w:t>conclusiones entre el 15 y el 17/10; revisión de coherencia y reproducción independiente el 22/10. Son fechas de integración comprobables, no una asignación individual de tareas. La publicación del prototipo mediante un enlace y una validación agronómica externa siguen pendientes.</w:t>
+        <w:t>El historial de Git sitúa los hitos ejecutados: documentación de fuentes y ETL el 24/09/2026; análisis y modelado entre el 28/09 y el 07/10; motor de recomendación y validación el 12/10; conclusiones entre el 15 y el 17/10; revisión de coherencia y reproducción independiente el 22/10. Son fechas de integración comprobables, no una asignación individual de tareas. La publicación del prototipo mediante un enlace y una validación agronómica externa siguen pendientes.</w:t>
       </w:r>
     </w:p>
     <w:p>
@@ -12454,7 +12464,11 @@
     </w:p>
     <w:p>
       <w:r>
-        <w:t>Antes de integrar una tarea se comprueba que el código se ejecuta desde un entorno limpio, que las pruebas relacionadas finalizan correctamente, que las cifras de la documentación proceden de archivos reproducibles y que no se han incluido credenciales. Los cambios que afecten a la memoria deben mantener la correspondencia entre texto, tablas, figuras y evidencias del repositorio.</w:t>
+        <w:t xml:space="preserve">Antes de integrar una tarea se comprueba que el código se ejecuta desde un entorno limpio, que las pruebas relacionadas finalizan correctamente, que las cifras de la documentación proceden de archivos reproducibles y que no se han incluido credenciales. Los cambios que afecten a la </w:t>
+      </w:r>
+      <w:r>
+        <w:lastRenderedPageBreak/>
+        <w:t>memoria deben mantener la correspondencia entre texto, tablas, figuras y evidencias del repositorio.</w:t>
       </w:r>
     </w:p>
     <w:p>
@@ -12467,7 +12481,7 @@
         <w:pStyle w:val="Ttulo1"/>
         <w:pageBreakBefore/>
       </w:pPr>
-      <w:bookmarkStart w:id="26" w:name="_Toc244088678"/>
+      <w:bookmarkStart w:id="26" w:name="_Toc244100710"/>
       <w:r>
         <w:lastRenderedPageBreak/>
         <w:t>4. Procesamiento de datos y aprendizaje automático</w:t>
@@ -12478,7 +12492,7 @@
       <w:pPr>
         <w:pStyle w:val="Ttulo2"/>
       </w:pPr>
-      <w:bookmarkStart w:id="27" w:name="_Toc244088679"/>
+      <w:bookmarkStart w:id="27" w:name="_Toc244100711"/>
       <w:r>
         <w:t>4.1. Extracción, transformación y almacenamiento de datos</w:t>
       </w:r>
@@ -12561,7 +12575,7 @@
       <w:pPr>
         <w:pStyle w:val="Ttulo3"/>
       </w:pPr>
-      <w:bookmarkStart w:id="29" w:name="_Toc244088680"/>
+      <w:bookmarkStart w:id="29" w:name="_Toc244100712"/>
       <w:r>
         <w:rPr>
           <w:sz w:val="24"/>
@@ -13150,7 +13164,7 @@
       <w:pPr>
         <w:pStyle w:val="Ttulo3"/>
       </w:pPr>
-      <w:bookmarkStart w:id="31" w:name="_Toc244088681"/>
+      <w:bookmarkStart w:id="31" w:name="_Toc244100713"/>
       <w:r>
         <w:rPr>
           <w:sz w:val="24"/>
@@ -13620,7 +13634,7 @@
       <w:pPr>
         <w:pStyle w:val="Ttulo3"/>
       </w:pPr>
-      <w:bookmarkStart w:id="33" w:name="_Toc244088682"/>
+      <w:bookmarkStart w:id="33" w:name="_Toc244100714"/>
       <w:r>
         <w:rPr>
           <w:sz w:val="24"/>
@@ -14406,7 +14420,7 @@
       <w:pPr>
         <w:pStyle w:val="Ttulo3"/>
       </w:pPr>
-      <w:bookmarkStart w:id="35" w:name="_Toc244088683"/>
+      <w:bookmarkStart w:id="35" w:name="_Toc244100715"/>
       <w:r>
         <w:rPr>
           <w:sz w:val="24"/>
@@ -14482,7 +14496,7 @@
       <w:pPr>
         <w:pStyle w:val="Ttulo3"/>
       </w:pPr>
-      <w:bookmarkStart w:id="36" w:name="_Toc244088684"/>
+      <w:bookmarkStart w:id="36" w:name="_Toc244100716"/>
       <w:r>
         <w:rPr>
           <w:sz w:val="24"/>
@@ -14631,7 +14645,7 @@
       <w:pPr>
         <w:pStyle w:val="Ttulo3"/>
       </w:pPr>
-      <w:bookmarkStart w:id="37" w:name="_Toc244088685"/>
+      <w:bookmarkStart w:id="37" w:name="_Toc244100717"/>
       <w:r>
         <w:rPr>
           <w:sz w:val="24"/>
@@ -17250,7 +17264,7 @@
       <w:pPr>
         <w:pStyle w:val="Ttulo3"/>
       </w:pPr>
-      <w:bookmarkStart w:id="42" w:name="_Toc244088686"/>
+      <w:bookmarkStart w:id="42" w:name="_Toc244100718"/>
       <w:r>
         <w:rPr>
           <w:sz w:val="24"/>
@@ -19241,7 +19255,7 @@
       <w:pPr>
         <w:pStyle w:val="Ttulo3"/>
       </w:pPr>
-      <w:bookmarkStart w:id="44" w:name="_Toc244088687"/>
+      <w:bookmarkStart w:id="44" w:name="_Toc244100719"/>
       <w:r>
         <w:rPr>
           <w:sz w:val="24"/>
@@ -19995,7 +20009,7 @@
       <w:pPr>
         <w:pStyle w:val="Ttulo3"/>
       </w:pPr>
-      <w:bookmarkStart w:id="46" w:name="_Toc244088688"/>
+      <w:bookmarkStart w:id="46" w:name="_Toc244100720"/>
       <w:r>
         <w:rPr>
           <w:sz w:val="24"/>
@@ -20022,7 +20036,7 @@
       <w:pPr>
         <w:pStyle w:val="Ttulo3"/>
       </w:pPr>
-      <w:bookmarkStart w:id="47" w:name="_Toc244088689"/>
+      <w:bookmarkStart w:id="47" w:name="_Toc244100721"/>
       <w:r>
         <w:rPr>
           <w:sz w:val="24"/>
@@ -20050,7 +20064,7 @@
       <w:pPr>
         <w:pStyle w:val="Ttulo3"/>
       </w:pPr>
-      <w:bookmarkStart w:id="48" w:name="_Toc244088690"/>
+      <w:bookmarkStart w:id="48" w:name="_Toc244100722"/>
       <w:r>
         <w:rPr>
           <w:sz w:val="24"/>
@@ -20068,7 +20082,7 @@
       <w:pPr>
         <w:pStyle w:val="Ttulo2"/>
       </w:pPr>
-      <w:bookmarkStart w:id="49" w:name="_Toc244088691"/>
+      <w:bookmarkStart w:id="49" w:name="_Toc244100723"/>
       <w:r>
         <w:t>4.2. Análisis exploratorio y preparación de variables</w:t>
       </w:r>
@@ -20083,7 +20097,7 @@
       <w:pPr>
         <w:pStyle w:val="Ttulo3"/>
       </w:pPr>
-      <w:bookmarkStart w:id="50" w:name="_Toc244088692"/>
+      <w:bookmarkStart w:id="50" w:name="_Toc244100724"/>
       <w:r>
         <w:rPr>
           <w:sz w:val="24"/>
@@ -20617,7 +20631,7 @@
       <w:pPr>
         <w:pStyle w:val="Ttulo3"/>
       </w:pPr>
-      <w:bookmarkStart w:id="53" w:name="_Toc244088693"/>
+      <w:bookmarkStart w:id="53" w:name="_Toc244100725"/>
       <w:r>
         <w:rPr>
           <w:sz w:val="24"/>
@@ -21688,7 +21702,7 @@
       <w:pPr>
         <w:pStyle w:val="Ttulo3"/>
       </w:pPr>
-      <w:bookmarkStart w:id="57" w:name="_Toc244088694"/>
+      <w:bookmarkStart w:id="57" w:name="_Toc244100726"/>
       <w:r>
         <w:rPr>
           <w:sz w:val="24"/>
@@ -21777,7 +21791,7 @@
       <w:pPr>
         <w:pStyle w:val="Ttulo3"/>
       </w:pPr>
-      <w:bookmarkStart w:id="59" w:name="_Toc244088695"/>
+      <w:bookmarkStart w:id="59" w:name="_Toc244100727"/>
       <w:r>
         <w:rPr>
           <w:sz w:val="24"/>
@@ -21860,7 +21874,7 @@
       <w:pPr>
         <w:pStyle w:val="Ttulo3"/>
       </w:pPr>
-      <w:bookmarkStart w:id="60" w:name="_Toc244088696"/>
+      <w:bookmarkStart w:id="60" w:name="_Toc244100728"/>
       <w:r>
         <w:rPr>
           <w:sz w:val="24"/>
@@ -22400,7 +22414,7 @@
       <w:pPr>
         <w:pStyle w:val="Ttulo3"/>
       </w:pPr>
-      <w:bookmarkStart w:id="62" w:name="_Toc244088697"/>
+      <w:bookmarkStart w:id="62" w:name="_Toc244100729"/>
       <w:r>
         <w:rPr>
           <w:sz w:val="24"/>
@@ -22428,7 +22442,7 @@
       <w:pPr>
         <w:pStyle w:val="Ttulo3"/>
       </w:pPr>
-      <w:bookmarkStart w:id="63" w:name="_Toc244088698"/>
+      <w:bookmarkStart w:id="63" w:name="_Toc244100730"/>
       <w:r>
         <w:rPr>
           <w:sz w:val="24"/>
@@ -22544,7 +22558,7 @@
       <w:pPr>
         <w:pStyle w:val="Ttulo2"/>
       </w:pPr>
-      <w:bookmarkStart w:id="64" w:name="_Toc244088699"/>
+      <w:bookmarkStart w:id="64" w:name="_Toc244100731"/>
       <w:r>
         <w:lastRenderedPageBreak/>
         <w:t>4.3. Desarrollo y evaluación del modelo predictivo</w:t>
@@ -22560,7 +22574,7 @@
       <w:pPr>
         <w:pStyle w:val="Ttulo3"/>
       </w:pPr>
-      <w:bookmarkStart w:id="65" w:name="_Toc244088700"/>
+      <w:bookmarkStart w:id="65" w:name="_Toc244100732"/>
       <w:r>
         <w:rPr>
           <w:sz w:val="24"/>
@@ -22588,7 +22602,7 @@
       <w:pPr>
         <w:pStyle w:val="Ttulo3"/>
       </w:pPr>
-      <w:bookmarkStart w:id="66" w:name="_Toc244088701"/>
+      <w:bookmarkStart w:id="66" w:name="_Toc244100733"/>
       <w:r>
         <w:rPr>
           <w:sz w:val="24"/>
@@ -22614,7 +22628,7 @@
       <w:pPr>
         <w:pStyle w:val="Ttulo3"/>
       </w:pPr>
-      <w:bookmarkStart w:id="67" w:name="_Toc244088702"/>
+      <w:bookmarkStart w:id="67" w:name="_Toc244100734"/>
       <w:r>
         <w:rPr>
           <w:sz w:val="24"/>
@@ -22755,7 +22769,7 @@
       <w:pPr>
         <w:pStyle w:val="Ttulo3"/>
       </w:pPr>
-      <w:bookmarkStart w:id="68" w:name="_Toc244088703"/>
+      <w:bookmarkStart w:id="68" w:name="_Toc244100735"/>
       <w:r>
         <w:rPr>
           <w:sz w:val="24"/>
@@ -22773,7 +22787,7 @@
       <w:pPr>
         <w:pStyle w:val="Ttulo3"/>
       </w:pPr>
-      <w:bookmarkStart w:id="69" w:name="_Toc244088704"/>
+      <w:bookmarkStart w:id="69" w:name="_Toc244100736"/>
       <w:r>
         <w:rPr>
           <w:sz w:val="24"/>
@@ -23548,7 +23562,7 @@
       <w:pPr>
         <w:pStyle w:val="Ttulo3"/>
       </w:pPr>
-      <w:bookmarkStart w:id="72" w:name="_Toc244088705"/>
+      <w:bookmarkStart w:id="72" w:name="_Toc244100737"/>
       <w:r>
         <w:rPr>
           <w:sz w:val="24"/>
@@ -24427,6 +24441,11 @@
       </w:r>
     </w:p>
     <w:p>
+      <w:r>
+        <w:t>El bootstrap pareado por bloques temporales de siete días (Künsch, 1989), con 5.000 remuestreos y semilla 42, confirma que ninguno de los modelos de aprendizaje mejora a la persistencia en el tramo de prueba. La diferencia MAE(persistencia) − MAE(modelo) y su IC percentil del 95 % fueron: Ridge −0,081 [−0,135; −0,038], Random Forest −0,440 [−0,516; −0,349], KNN −0,523 [−0,603; −0,431], SVR −1,771 [−2,011; −1,530] y XGBoost −0,680 [−0,753; −0,585] mm/día. Todos los intervalos favorecen a la persistencia. La inferencia es interna al tramo temporal disponible y no acredita generalización a otras campañas.</w:t>
+      </w:r>
+    </w:p>
+    <w:p>
       <w:pPr>
         <w:pStyle w:val="ndicefiguraTFM"/>
         <w:keepLines/>
@@ -24446,7 +24465,7 @@
       <w:pPr>
         <w:pStyle w:val="Ttulo3"/>
       </w:pPr>
-      <w:bookmarkStart w:id="75" w:name="_Toc244088706"/>
+      <w:bookmarkStart w:id="75" w:name="_Toc244100738"/>
       <w:r>
         <w:rPr>
           <w:sz w:val="24"/>
@@ -24462,6 +24481,12 @@
     </w:p>
     <w:p>
       <w:r>
+        <w:t>El tramo de septiembre se reservó antes del ajuste inicial, pero posteriormente se reutilizó para interpretar los modelos mediante SHAP, comprobar el motor físico y orientar decisiones operativas de la aplicación. Por ello, sus resultados son una evaluación retrospectiva reutilizada y no una prueba final independiente del sistema completo. Esta limitación no altera las métricas, pero restringe el alcance de las conclusiones.</w:t>
+      </w:r>
+    </w:p>
+    <w:p>
+      <w:r>
+        <w:lastRenderedPageBreak/>
         <w:t>El buen resultado de la persistencia es coherente con el problema evaluado. El objetivo cambia gradualmente entre días consecutivos porque el Kc y gran parte de las condiciones meteorológicas presentan continuidad. Su uso operativo es de un día vista y supone que, al emitir la recomendación, la necesidad del día anterior ya está disponible. Para predecir una semana completa sin nuevas observaciones sería necesario evaluar una estrategia recursiva diferente, en la que cada predicción alimente el día siguiente.</w:t>
       </w:r>
     </w:p>
@@ -24474,12 +24499,11 @@
       <w:pPr>
         <w:pStyle w:val="Ttulo3"/>
       </w:pPr>
-      <w:bookmarkStart w:id="76" w:name="_Toc244088707"/>
+      <w:bookmarkStart w:id="76" w:name="_Toc244100739"/>
       <w:r>
         <w:rPr>
           <w:sz w:val="24"/>
         </w:rPr>
-        <w:lastRenderedPageBreak/>
         <w:t>4.3.8. Limitaciones y evolución prevista</w:t>
       </w:r>
       <w:bookmarkEnd w:id="76"/>
@@ -24498,7 +24522,7 @@
       <w:pPr>
         <w:pStyle w:val="Ttulo3"/>
       </w:pPr>
-      <w:bookmarkStart w:id="77" w:name="_Toc244088708"/>
+      <w:bookmarkStart w:id="77" w:name="_Toc244100740"/>
       <w:r>
         <w:rPr>
           <w:sz w:val="24"/>
@@ -24521,8 +24545,9 @@
       <w:pPr>
         <w:pStyle w:val="Ttulo3"/>
       </w:pPr>
-      <w:bookmarkStart w:id="78" w:name="_Toc244088709"/>
-      <w:r>
+      <w:bookmarkStart w:id="78" w:name="_Toc244100741"/>
+      <w:r>
+        <w:lastRenderedPageBreak/>
         <w:t>4.3.10. Reentrenamiento con datos de 2026</w:t>
       </w:r>
       <w:bookmarkEnd w:id="78"/>
@@ -24543,7 +24568,6 @@
       </w:pPr>
       <w:bookmarkStart w:id="79" w:name="idx_tbl_4_15"/>
       <w:r>
-        <w:lastRenderedPageBreak/>
         <w:t>Tabla 4.15. Reentrenamiento por cultivo y estación con datos hasta el 22 de octubre de 2026. Errores en mm/día.</w:t>
       </w:r>
       <w:bookmarkEnd w:id="79"/>
@@ -25194,6 +25218,7 @@
         <w:rPr>
           <w:noProof/>
         </w:rPr>
+        <w:lastRenderedPageBreak/>
         <w:drawing>
           <wp:inline distT="0" distB="0" distL="0" distR="0" wp14:anchorId="5DB75AF7" wp14:editId="5E29939D">
             <wp:extent cx="4709160" cy="2563347"/>
@@ -25243,18 +25268,14 @@
     </w:p>
     <w:p>
       <w:r>
-        <w:t xml:space="preserve">El reentrenamiento amplía la evidencia y corrige la comparación al incorporar ET0 pasada, pero la etiqueta sigue siendo una necesidad calculada por SiAR, no riego aplicado. Sin previsiones </w:t>
-      </w:r>
-      <w:r>
-        <w:lastRenderedPageBreak/>
-        <w:t>AEMET archivadas antes de cada fecha no se puede medir su aportación histórica. Los modelos se conservan como experimento y la aplicación utiliza el motor híbrido descrito a continuación.</w:t>
+        <w:t>El reentrenamiento amplía la evidencia y corrige la comparación al incorporar ET0 pasada, pero la etiqueta sigue siendo una necesidad calculada por SiAR, no riego aplicado. Sin previsiones AEMET archivadas antes de cada fecha no se puede medir su aportación histórica. Los modelos se conservan como experimento y la aplicación utiliza el motor híbrido descrito a continuación.</w:t>
       </w:r>
     </w:p>
     <w:p>
       <w:pPr>
         <w:pStyle w:val="Ttulo3"/>
       </w:pPr>
-      <w:bookmarkStart w:id="81" w:name="_Toc244088710"/>
+      <w:bookmarkStart w:id="81" w:name="_Toc244100742"/>
       <w:r>
         <w:t>4.3.11. Modelo de ETc para la aplicación</w:t>
       </w:r>
@@ -25854,7 +25875,8 @@
     </w:tbl>
     <w:p>
       <w:r>
-        <w:t>El modelo seleccionado por validación fue persistencia en cinco casos y Ridge en coliflor. El cálculo físico que ya utilizaba el DSS —media de ET0 reciente por Kc— obtuvo menor MAE en cinco de los seis tramos de prueba. Por ello, Streamlit carga y muestra la estimación de cada modelo, pero solo permite que el modelo determine la dosis si su error de prueba fue menor que el físico: algodón BA08, fuera de ciclo en octubre. Los tres cultivos activos conservan el cálculo físico. Esta elección utiliza el tramo de prueba como control operativo; las cifras de la tabla ya no son una evaluación independiente del sistema completo seleccionado.</w:t>
+        <w:lastRenderedPageBreak/>
+        <w:t>El modelo seleccionado por validación fue persistencia en cinco casos y Ridge en coliflor. El cálculo físico que ya utilizaba el DSS —media de ET0 reciente por Kc— obtuvo menor MAE en cinco de los seis tramos de prueba. Por ello, Streamlit carga y muestra la estimación de cada modelo, pero solo permite que el modelo determine la dosis si su error de prueba fue menor que el físico: algodón BA08, fuera de ciclo en octubre. Los tres cultivos activos conservan el cálculo físico. Esta elección utiliza el tramo de prueba como control operativo; las cifras de la tabla ya no son una evaluación independiente del sistema completo seleccionado. En consecuencia, para los cultivos activos mostrados en el prototipo la dosis principal procede de ET0 reciente por Kc y de las reglas agronómicas, no del modelo de aprendizaje.</w:t>
       </w:r>
     </w:p>
     <w:p>
@@ -25866,9 +25888,8 @@
       <w:pPr>
         <w:pStyle w:val="Ttulo3"/>
       </w:pPr>
-      <w:bookmarkStart w:id="83" w:name="_Toc244088711"/>
-      <w:r>
-        <w:lastRenderedPageBreak/>
+      <w:bookmarkStart w:id="83" w:name="_Toc244100743"/>
+      <w:r>
         <w:t>4.3.12. Explicabilidad de los modelos de árboles</w:t>
       </w:r>
       <w:bookmarkEnd w:id="83"/>
@@ -26409,6 +26430,91 @@
           </w:p>
         </w:tc>
       </w:tr>
+      <w:tr>
+        <w:tc>
+          <w:tcPr>
+            <w:tcW w:w="1814" w:type="dxa"/>
+          </w:tcPr>
+          <w:p>
+            <w:r>
+              <w:lastRenderedPageBreak/>
+              <w:t>Random Forest</w:t>
+            </w:r>
+          </w:p>
+        </w:tc>
+        <w:tc>
+          <w:tcPr>
+            <w:tcW w:w="2948" w:type="dxa"/>
+          </w:tcPr>
+          <w:p>
+            <w:r>
+              <w:t>ET0 retardada y medias de ET0 (agregado)</w:t>
+            </w:r>
+          </w:p>
+        </w:tc>
+        <w:tc>
+          <w:tcPr>
+            <w:tcW w:w="2098" w:type="dxa"/>
+          </w:tcPr>
+          <w:p>
+            <w:r>
+              <w:t>0,115 mm/día</w:t>
+            </w:r>
+          </w:p>
+        </w:tc>
+        <w:tc>
+          <w:tcPr>
+            <w:tcW w:w="1814" w:type="dxa"/>
+          </w:tcPr>
+          <w:p>
+            <w:r>
+              <w:t>4,5 %</w:t>
+            </w:r>
+          </w:p>
+        </w:tc>
+      </w:tr>
+      <w:tr>
+        <w:tc>
+          <w:tcPr>
+            <w:tcW w:w="1814" w:type="dxa"/>
+          </w:tcPr>
+          <w:p>
+            <w:r>
+              <w:t>XGBoost</w:t>
+            </w:r>
+          </w:p>
+        </w:tc>
+        <w:tc>
+          <w:tcPr>
+            <w:tcW w:w="2948" w:type="dxa"/>
+          </w:tcPr>
+          <w:p>
+            <w:r>
+              <w:t>ET0 retardada y medias de ET0 (agregado)</w:t>
+            </w:r>
+          </w:p>
+        </w:tc>
+        <w:tc>
+          <w:tcPr>
+            <w:tcW w:w="2098" w:type="dxa"/>
+          </w:tcPr>
+          <w:p>
+            <w:r>
+              <w:t>0,440 mm/día</w:t>
+            </w:r>
+          </w:p>
+        </w:tc>
+        <w:tc>
+          <w:tcPr>
+            <w:tcW w:w="1814" w:type="dxa"/>
+          </w:tcPr>
+          <w:p>
+            <w:r>
+              <w:t>15,4 %</w:t>
+            </w:r>
+          </w:p>
+        </w:tc>
+      </w:tr>
     </w:tbl>
     <w:p>
       <w:pPr>
@@ -26420,7 +26526,6 @@
         <w:rPr>
           <w:noProof/>
         </w:rPr>
-        <w:lastRenderedPageBreak/>
         <w:drawing>
           <wp:inline distT="0" distB="0" distL="0" distR="0" wp14:anchorId="397D5CBD" wp14:editId="195B83AC">
             <wp:extent cx="5832000" cy="4587977"/>
@@ -26470,11 +26575,12 @@
     </w:p>
     <w:p>
       <w:r>
-        <w:t>El periodo de desarrollo contiene Kc entre 0,3 y 1,0 y una necesidad media de 4,041 mm/día, mientras que la prueba corresponde a Kc igual a 0,3 y una media de 1,130 mm/día. Kc y la necesidad del día anterior concentran la mayor parte de la contribución en ambos árboles. Las variables de ET0 pasada aportan información adicional, pero no corrigen por completo el cambio de nivel del tramo final.</w:t>
-      </w:r>
-    </w:p>
-    <w:p>
-      <w:r>
+        <w:t>El resultado debe interpretarse junto con la distribución temporal. El periodo de desarrollo contiene valores de Kc entre 0,3 y 1,0 y una necesidad media de 4,041 mm/día, mientras que toda la prueba corresponde a Kc igual a 0,3 y su media desciende a 1,130 mm/día. En ambos modelos, Kc y la necesidad del día anterior concentran la mayor parte de la contribución. Las seis variables de ET0 retardada y medias de ET0 suman un 4,5 % de la importancia en Random Forest y un 15,4 % en XGBoost. Por tanto, su aportación es secundaria en el primer modelo y apreciable en el segundo, pero no evita que ambos árboles se ajusten de forma incompleta al tramo final y mantengan un sesgo positivo.</w:t>
+      </w:r>
+    </w:p>
+    <w:p>
+      <w:r>
+        <w:lastRenderedPageBreak/>
         <w:t>La explicación local del 29 de septiembre muestra el mismo patrón: frente a 0,89 mm/día de SiAR, Random Forest estima 1,70 y XGBoost 1,95 mm/día. La persistencia se adapta mejor al nivel local porque utiliza directamente la observación más reciente. La evidencia XAI respalda la decisión de no desplegar los árboles con los datos actuales.</w:t>
       </w:r>
     </w:p>
@@ -26489,7 +26595,7 @@
         <w:pageBreakBefore/>
       </w:pPr>
       <w:bookmarkStart w:id="86" w:name="_Toc243495226"/>
-      <w:bookmarkStart w:id="87" w:name="_Toc244088712"/>
+      <w:bookmarkStart w:id="87" w:name="_Toc244100744"/>
       <w:r>
         <w:lastRenderedPageBreak/>
         <w:t>5. Sistema de recomendación y resultados</w:t>
@@ -26506,7 +26612,7 @@
       <w:pPr>
         <w:pStyle w:val="Ttulo2"/>
       </w:pPr>
-      <w:bookmarkStart w:id="88" w:name="_Toc244088713"/>
+      <w:bookmarkStart w:id="88" w:name="_Toc244100745"/>
       <w:r>
         <w:t>5.1. Diseño del sistema de recomendación de riego</w:t>
       </w:r>
@@ -26526,7 +26632,7 @@
       <w:pPr>
         <w:pStyle w:val="Ttulo3"/>
       </w:pPr>
-      <w:bookmarkStart w:id="89" w:name="_Toc244088714"/>
+      <w:bookmarkStart w:id="89" w:name="_Toc244100746"/>
       <w:r>
         <w:rPr>
           <w:sz w:val="24"/>
@@ -26553,7 +26659,7 @@
       <w:pPr>
         <w:pStyle w:val="Ttulo3"/>
       </w:pPr>
-      <w:bookmarkStart w:id="90" w:name="_Toc244088715"/>
+      <w:bookmarkStart w:id="90" w:name="_Toc244100747"/>
       <w:r>
         <w:rPr>
           <w:sz w:val="24"/>
@@ -26638,7 +26744,7 @@
       <w:pPr>
         <w:pStyle w:val="Ttulo3"/>
       </w:pPr>
-      <w:bookmarkStart w:id="92" w:name="_Toc244088716"/>
+      <w:bookmarkStart w:id="92" w:name="_Toc244100748"/>
       <w:r>
         <w:rPr>
           <w:sz w:val="24"/>
@@ -26687,7 +26793,7 @@
       <w:pPr>
         <w:pStyle w:val="Ttulo3"/>
       </w:pPr>
-      <w:bookmarkStart w:id="93" w:name="_Toc244088717"/>
+      <w:bookmarkStart w:id="93" w:name="_Toc244100749"/>
       <w:r>
         <w:rPr>
           <w:sz w:val="24"/>
@@ -27571,7 +27677,7 @@
       <w:pPr>
         <w:pStyle w:val="Ttulo3"/>
       </w:pPr>
-      <w:bookmarkStart w:id="95" w:name="_Toc244088718"/>
+      <w:bookmarkStart w:id="95" w:name="_Toc244100750"/>
       <w:r>
         <w:rPr>
           <w:sz w:val="24"/>
@@ -27594,7 +27700,7 @@
       <w:pPr>
         <w:pStyle w:val="Ttulo3"/>
       </w:pPr>
-      <w:bookmarkStart w:id="96" w:name="_Toc244088719"/>
+      <w:bookmarkStart w:id="96" w:name="_Toc244100751"/>
       <w:r>
         <w:rPr>
           <w:sz w:val="24"/>
@@ -27613,7 +27719,7 @@
       <w:pPr>
         <w:pStyle w:val="Ttulo3"/>
       </w:pPr>
-      <w:bookmarkStart w:id="97" w:name="_Toc244088720"/>
+      <w:bookmarkStart w:id="97" w:name="_Toc244100752"/>
       <w:r>
         <w:t>5.1.7. Integración operativa de ETc y AEMET</w:t>
       </w:r>
@@ -27626,6 +27732,11 @@
     </w:p>
     <w:p>
       <w:r>
+        <w:t>En la versión evaluada, el cálculo físico supera al modelo de ETc en cinco de los seis casos. El único caso habilitado para determinar la dosis mediante el modelo es algodón BA08, que estaba fuera de ciclo durante la demostración de octubre de 2026. Por ello, en los cultivos activos de la aplicación la dosis principal procede del cálculo ET0 reciente × Kc; el modelo de ETc se conserva como resultado comparativo y trazable, no como motor operativo general.</w:t>
+      </w:r>
+    </w:p>
+    <w:p>
+      <w:r>
         <w:t>El código de entrenamiento está en src/models/train_etc_for_dss.py, la inferencia en src/dss/predict_etc.py y el informe reproducible en docs/data_samples/etc_model_deployment_2026.json. Los seis artefactos pequeños de ETc se versionan para su carga en Streamlit. El cálculo físico permanece disponible si el modelo falta, envejece o no dispone de información reciente. La validación del capítulo 5.3 corresponde al motor anterior; no se presenta como evaluación prospectiva de esta integración reciente.</w:t>
       </w:r>
     </w:p>
@@ -27633,7 +27744,7 @@
       <w:pPr>
         <w:pStyle w:val="Ttulo2"/>
       </w:pPr>
-      <w:bookmarkStart w:id="98" w:name="_Toc244088721"/>
+      <w:bookmarkStart w:id="98" w:name="_Toc244100753"/>
       <w:r>
         <w:t>5.2. Aplicación y visualización de resultados</w:t>
       </w:r>
@@ -27648,22 +27759,19 @@
       <w:pPr>
         <w:pStyle w:val="Ttulo3"/>
       </w:pPr>
-      <w:bookmarkStart w:id="99" w:name="_Toc244088722"/>
+      <w:bookmarkStart w:id="99" w:name="_Toc244100754"/>
       <w:r>
         <w:rPr>
           <w:sz w:val="24"/>
         </w:rPr>
+        <w:lastRenderedPageBreak/>
         <w:t>5.2.1. Elección de la tecnología de presentación</w:t>
       </w:r>
       <w:bookmarkEnd w:id="99"/>
     </w:p>
     <w:p>
       <w:r>
-        <w:t xml:space="preserve">El anteproyecto contemplaba un cuadro de mando en Power BI o Tableau. Se mantuvo esa opción hasta disponer de un motor funcional, y en ese momento se comprobó que la herramienta debía cumplir dos condiciones que un cuadro de mando convencional resuelve con dificultad. La primera es interactiva: cambiar la fecha de emisión, el horizonte o la eficiencia tiene que volver a ejecutar el motor, no solo filtrar una tabla ya calculada. La segunda es de reproducibilidad: </w:t>
-      </w:r>
-      <w:r>
-        <w:lastRenderedPageBreak/>
-        <w:t>cualquier evaluador o miembro del equipo debería poder lanzar la aplicación desde el repositorio con las mismas dependencias que el resto del proyecto.</w:t>
+        <w:t>El anteproyecto contemplaba un cuadro de mando en Power BI o Tableau. Se mantuvo esa opción hasta disponer de un motor funcional, y en ese momento se comprobó que la herramienta debía cumplir dos condiciones que un cuadro de mando convencional resuelve con dificultad. La primera es interactiva: cambiar la fecha de emisión, el horizonte o la eficiencia tiene que volver a ejecutar el motor, no solo filtrar una tabla ya calculada. La segunda es de reproducibilidad: cualquier evaluador o miembro del equipo debería poder lanzar la aplicación desde el repositorio con las mismas dependencias que el resto del proyecto.</w:t>
       </w:r>
     </w:p>
     <w:p>
@@ -27675,7 +27783,7 @@
       <w:pPr>
         <w:pStyle w:val="Ttulo3"/>
       </w:pPr>
-      <w:bookmarkStart w:id="100" w:name="_Toc244088723"/>
+      <w:bookmarkStart w:id="100" w:name="_Toc244100755"/>
       <w:r>
         <w:rPr>
           <w:sz w:val="24"/>
@@ -27703,7 +27811,7 @@
       <w:pPr>
         <w:pStyle w:val="Ttulo3"/>
       </w:pPr>
-      <w:bookmarkStart w:id="101" w:name="_Toc244088724"/>
+      <w:bookmarkStart w:id="101" w:name="_Toc244100756"/>
       <w:r>
         <w:rPr>
           <w:sz w:val="24"/>
@@ -27714,7 +27822,11 @@
     </w:p>
     <w:p>
       <w:r>
-        <w:t>El ejemplo histórico analiza una planificación emitida el 28 de junio de 2025 con siete días de horizonte; cruza el cambio de Kc de 0,70 a 0,90 el 1 de julio. Supone goteo con eficiencia del 90 % y una parcela de 1,5 ha. La Figura 5.2 conserva una captura de la versión anterior de la interfaz con la referencia SiAR superpuesta. La interfaz pública actual se organiza como describe 5.2.2.</w:t>
+        <w:t xml:space="preserve">El ejemplo histórico analiza una planificación emitida el 28 de junio de 2025 con siete días de horizonte; cruza el cambio de Kc de 0,70 a 0,90 el 1 de julio. Supone goteo con eficiencia del 90 % </w:t>
+      </w:r>
+      <w:r>
+        <w:lastRenderedPageBreak/>
+        <w:t>y una parcela de 1,5 ha. La Figura 5.2 conserva una captura de la versión anterior de la interfaz con la referencia SiAR superpuesta. La interfaz pública actual se organiza como describe 5.2.2.</w:t>
       </w:r>
     </w:p>
     <w:p>
@@ -27726,7 +27838,6 @@
         <w:rPr>
           <w:noProof/>
         </w:rPr>
-        <w:lastRenderedPageBreak/>
         <w:drawing>
           <wp:inline distT="0" distB="0" distL="0" distR="0" wp14:anchorId="3E2F1CF6" wp14:editId="3076D4AC">
             <wp:extent cx="5577840" cy="4648200"/>
@@ -29650,7 +29761,7 @@
       <w:pPr>
         <w:pStyle w:val="Ttulo3"/>
       </w:pPr>
-      <w:bookmarkStart w:id="104" w:name="_Toc244088725"/>
+      <w:bookmarkStart w:id="104" w:name="_Toc244100757"/>
       <w:r>
         <w:rPr>
           <w:sz w:val="24"/>
@@ -29677,7 +29788,7 @@
       <w:pPr>
         <w:pStyle w:val="Ttulo3"/>
       </w:pPr>
-      <w:bookmarkStart w:id="105" w:name="_Toc244088726"/>
+      <w:bookmarkStart w:id="105" w:name="_Toc244100758"/>
       <w:r>
         <w:rPr>
           <w:sz w:val="24"/>
@@ -29695,7 +29806,7 @@
       <w:pPr>
         <w:pStyle w:val="Ttulo3"/>
       </w:pPr>
-      <w:bookmarkStart w:id="106" w:name="_Toc244088727"/>
+      <w:bookmarkStart w:id="106" w:name="_Toc244100759"/>
       <w:r>
         <w:rPr>
           <w:sz w:val="24"/>
@@ -29713,7 +29824,7 @@
       <w:pPr>
         <w:pStyle w:val="Ttulo2"/>
       </w:pPr>
-      <w:bookmarkStart w:id="107" w:name="_Toc244088728"/>
+      <w:bookmarkStart w:id="107" w:name="_Toc244100760"/>
       <w:r>
         <w:t>5.3. Validación, resultados y análisis crítico</w:t>
       </w:r>
@@ -29733,7 +29844,7 @@
       <w:pPr>
         <w:pStyle w:val="Ttulo3"/>
       </w:pPr>
-      <w:bookmarkStart w:id="108" w:name="_Toc244088729"/>
+      <w:bookmarkStart w:id="108" w:name="_Toc244100761"/>
       <w:r>
         <w:rPr>
           <w:sz w:val="24"/>
@@ -29757,7 +29868,7 @@
       <w:pPr>
         <w:pStyle w:val="Ttulo3"/>
       </w:pPr>
-      <w:bookmarkStart w:id="109" w:name="_Toc244088730"/>
+      <w:bookmarkStart w:id="109" w:name="_Toc244100762"/>
       <w:r>
         <w:rPr>
           <w:sz w:val="24"/>
@@ -30265,7 +30376,7 @@
       <w:pPr>
         <w:pStyle w:val="Ttulo3"/>
       </w:pPr>
-      <w:bookmarkStart w:id="111" w:name="_Toc244088731"/>
+      <w:bookmarkStart w:id="111" w:name="_Toc244100763"/>
       <w:r>
         <w:rPr>
           <w:sz w:val="24"/>
@@ -31110,6 +31221,11 @@
       </w:r>
     </w:p>
     <w:p>
+      <w:r>
+        <w:t>La diferencia pareada MAE(persistencia) − MAE(DSS) es de 0,032 mm/día en desarrollo, con IC 95 % [−0,055; 0,122], y de 0,029 mm/día en prueba, con IC 95 % [0,002; 0,067]. Los intervalos se obtuvieron mediante 5.000 remuestreos por bloques temporales de siete días y semilla 42. La mejora a un día es compatible con incertidumbre en desarrollo y es positiva en este tramo de prueba, pero no constituye una validación externa.</w:t>
+      </w:r>
+    </w:p>
+    <w:p>
       <w:pPr>
         <w:pStyle w:val="ndicefiguraTFM"/>
         <w:keepLines/>
@@ -31139,22 +31255,19 @@
       <w:pPr>
         <w:pStyle w:val="Ttulo3"/>
       </w:pPr>
-      <w:bookmarkStart w:id="114" w:name="_Toc244088732"/>
+      <w:bookmarkStart w:id="114" w:name="_Toc244100764"/>
       <w:r>
         <w:rPr>
           <w:sz w:val="24"/>
         </w:rPr>
+        <w:lastRenderedPageBreak/>
         <w:t>5.3.4. Error según el horizonte de planificación</w:t>
       </w:r>
       <w:bookmarkEnd w:id="114"/>
     </w:p>
     <w:p>
       <w:r>
-        <w:t xml:space="preserve">Cuando el usuario planifica varios días, el sistema no recibe observaciones nuevas y el error crece con la anticipación. La Figura 5.4 y la Tabla 5.5 comparan la vía del sistema con una persistencia extendida, que repite la última necesidad conocida durante todo el horizonte y es el punto de partida habitual en predicción de series temporales (Hyndman &amp; Athanasopoulos, 2021). La </w:t>
-      </w:r>
-      <w:r>
-        <w:lastRenderedPageBreak/>
-        <w:t>simulación empieza el 16 de mayo para disponer de historia suficiente en todas las ventanas. Por eso su día 1 de desarrollo y la Tabla 5.4 usan muestras diferentes; en prueba coinciden las 23 emisiones.</w:t>
+        <w:t>Cuando el usuario planifica varios días, el sistema no recibe observaciones nuevas y el error crece con la anticipación. La Figura 5.4 y la Tabla 5.5 comparan la vía del sistema con una persistencia extendida, que repite la última necesidad conocida durante todo el horizonte y es el punto de partida habitual en predicción de series temporales (Hyndman &amp; Athanasopoulos, 2021). La simulación empieza el 16 de mayo para disponer de historia suficiente en todas las ventanas. Por eso su día 1 de desarrollo y la Tabla 5.4 usan muestras diferentes; en prueba coinciden las 23 emisiones.</w:t>
       </w:r>
     </w:p>
     <w:p>
@@ -32230,11 +32343,16 @@
     </w:p>
     <w:p>
       <w:r>
-        <w:t xml:space="preserve">En el periodo de desarrollo el error de la persistencia casi se duplica entre el primer y el séptimo día, mientras que el del sistema se mantiene entre 0,44 y 0,48 mm. Al separar los casos se aprecian dos causas. Cuando el horizonte cruza un cambio de fase, lo que ocurre en el 4 % de las emisiones a un día y en el 25 % a siete días, la persistencia comete un error medio de unos 1,6 mm y el sistema de 0,33 a 0,43 mm. Cuando no lo cruza, la persistencia pasa de 0,42 a 0,63 mm entre el primer y el séptimo día y el sistema de 0,44 a 0,51 mm, porque la media de siete días filtra las oscilaciones de un día concreto y representa mejor el nivel de demanda de los días siguientes. En ese último subconjunto la persistencia es ligeramente mejor a un día, con 0,42 frente a 0,44 </w:t>
+        <w:t xml:space="preserve">En el periodo de desarrollo el error de la persistencia casi se duplica entre el primer y el séptimo día, mientras que el del sistema se mantiene entre 0,44 y 0,48 mm. Al separar los casos se aprecian dos causas. Cuando el horizonte cruza un cambio de fase, lo que ocurre en el 4 % de las </w:t>
       </w:r>
       <w:r>
         <w:lastRenderedPageBreak/>
-        <w:t>mm, de modo que la ventaja del sistema en el primer día procede sobre todo de los cambios de fase. En la prueba el comportamiento es distinto. Septiembre tiene un Kc constante y una ET0 en descenso continuo, de modo que ninguna de las dos vías dispone de información sobre esa tendencia. El sistema mantiene la ventaja hasta el quinto día, la reduce en el sexto y pierde frente a la persistencia en el séptimo, con 0,134 frente a 0,126 mm.</w:t>
+        <w:t>emisiones a un día y en el 25 % a siete días, la persistencia comete un error medio de unos 1,6 mm y el sistema de 0,33 a 0,43 mm. Cuando no lo cruza, la persistencia pasa de 0,42 a 0,63 mm entre el primer y el séptimo día y el sistema de 0,44 a 0,51 mm, porque la media de siete días filtra las oscilaciones de un día concreto y representa mejor el nivel de demanda de los días siguientes. En ese último subconjunto la persistencia es ligeramente mejor a un día, con 0,42 frente a 0,44 mm, de modo que la ventaja del sistema en el primer día procede sobre todo de los cambios de fase. En la prueba el comportamiento es distinto. Septiembre tiene un Kc constante y una ET0 en descenso continuo, de modo que ninguna de las dos vías dispone de información sobre esa tendencia. El sistema mantiene la ventaja hasta el quinto día, la reduce en el sexto y pierde frente a la persistencia en el séptimo, con 0,134 frente a 0,126 mm.</w:t>
+      </w:r>
+    </w:p>
+    <w:p>
+      <w:r>
+        <w:t>Los intervalos pareados de la diferencia de MAE muestran una evidencia menos uniforme que los valores puntuales. En desarrollo, los días 2 a 7 presentan intervalos positivos, mientras que el día 1 incluye el cero. En prueba, solo los días 1 y 3 tienen un límite inferior positivo: 0,029 [0,001; 0,067] y 0,046 [0,010; 0,084] mm/día. Los días 2, 4, 5 y 6 incluyen el cero, y el día 7 arroja −0,007 [−0,026; 0,011] mm/día. Por tanto, no se atribuye una mejora concluyente a todos los horizontes.</w:t>
       </w:r>
     </w:p>
     <w:p>
@@ -32246,7 +32364,7 @@
       <w:pPr>
         <w:pStyle w:val="Ttulo3"/>
       </w:pPr>
-      <w:bookmarkStart w:id="117" w:name="_Toc244088733"/>
+      <w:bookmarkStart w:id="117" w:name="_Toc244100765"/>
       <w:r>
         <w:rPr>
           <w:sz w:val="24"/>
@@ -32269,6 +32387,7 @@
         <w:rPr>
           <w:noProof/>
         </w:rPr>
+        <w:lastRenderedPageBreak/>
         <w:drawing>
           <wp:inline distT="0" distB="0" distL="0" distR="0" wp14:anchorId="0FCE854D" wp14:editId="00DC8A68">
             <wp:extent cx="5577840" cy="1981650"/>
@@ -32329,7 +32448,6 @@
     </w:p>
     <w:p>
       <w:r>
-        <w:lastRenderedPageBreak/>
         <w:t>Además de la exactitud, se verificó la coherencia interna. En todas las consultas comprobadas la suma de las dosis diarias coincide con el total del resumen y el volumen coincide con diez metros cúbicos por milímetro y hectárea. A lo largo de la campaña no se generó ninguna dosis negativa.</w:t>
       </w:r>
     </w:p>
@@ -32337,7 +32455,7 @@
       <w:pPr>
         <w:pStyle w:val="Ttulo3"/>
       </w:pPr>
-      <w:bookmarkStart w:id="119" w:name="_Toc244088734"/>
+      <w:bookmarkStart w:id="119" w:name="_Toc244100766"/>
       <w:r>
         <w:rPr>
           <w:sz w:val="24"/>
@@ -32787,14 +32905,18 @@
     </w:p>
     <w:p>
       <w:r>
-        <w:t>Con la misma necesidad del cultivo, pasar del riego por goteo al de superficie supone aplicar un 50 % más de agua. Una desviación de diez puntos en la eficiencia introducida, por ejemplo usar 0,90 cuando la instalación real trabaja a 0,80, genera un error de alrededor del 12 % en la dosis bruta, bastante mayor que el error de estimación de la necesidad neta medido en los apartados anteriores. Esta comparación sitúa las prioridades de mejora: en una explotación real, medir la eficiencia y la uniformidad de la instalación aportaría más precisión que refinar el modelo de ET0 (Burt et al., 1997). También recuerda que una dosis menor no equivale a un ahorro neto de agua a escala de cuenca, porque parte de las pérdidas en parcela retorna al sistema hidrológico (Perry, 2007).</w:t>
+        <w:t xml:space="preserve">Con la misma necesidad del cultivo, pasar del riego por goteo al de superficie supone aplicar un 50 % más de agua. Una desviación de diez puntos en la eficiencia introducida, por ejemplo usar </w:t>
+      </w:r>
+      <w:r>
+        <w:lastRenderedPageBreak/>
+        <w:t>0,90 cuando la instalación real trabaja a 0,80, genera un error de alrededor del 12 % en la dosis bruta, bastante mayor que el error de estimación de la necesidad neta medido en los apartados anteriores. Esta comparación sitúa las prioridades de mejora: en una explotación real, medir la eficiencia y la uniformidad de la instalación aportaría más precisión que refinar el modelo de ET0 (Burt et al., 1997). También recuerda que una dosis menor no equivale a un ahorro neto de agua a escala de cuenca, porque parte de las pérdidas en parcela retorna al sistema hidrológico (Perry, 2007).</w:t>
       </w:r>
     </w:p>
     <w:p>
       <w:pPr>
         <w:pStyle w:val="Ttulo3"/>
       </w:pPr>
-      <w:bookmarkStart w:id="121" w:name="_Toc244088735"/>
+      <w:bookmarkStart w:id="121" w:name="_Toc244100767"/>
       <w:r>
         <w:rPr>
           <w:sz w:val="24"/>
@@ -32818,7 +32940,6 @@
         <w:rPr>
           <w:b/>
         </w:rPr>
-        <w:lastRenderedPageBreak/>
         <w:t>Tabla 5.7. Escenarios de validación del comportamiento del sistema.</w:t>
       </w:r>
       <w:bookmarkEnd w:id="122"/>
@@ -33524,6 +33645,7 @@
               <w:rPr>
                 <w:sz w:val="18"/>
               </w:rPr>
+              <w:lastRenderedPageBreak/>
               <w:t>Dotación de 20 mm frente a 47,1 mm planificados</w:t>
             </w:r>
           </w:p>
@@ -33873,7 +33995,6 @@
     </w:p>
     <w:p>
       <w:r>
-        <w:lastRenderedPageBreak/>
         <w:t>Los trece escenarios produjeron el comportamiento esperado. Más que el recuento, interesa lo que estos casos revelan sobre el diseño. En ninguno de ellos el sistema sustituye una ausencia por un cero ni oculta que ha cambiado de vía de estimación, y en los casos sin información suficiente prefiere no emitir recomendación. Este comportamiento responde a la idea, expuesta en el apartado 2.3, de que la incertidumbre debe formar parte de la salida.</w:t>
       </w:r>
     </w:p>
@@ -33886,7 +34007,7 @@
       <w:pPr>
         <w:pStyle w:val="Ttulo3"/>
       </w:pPr>
-      <w:bookmarkStart w:id="123" w:name="_Toc244088736"/>
+      <w:bookmarkStart w:id="123" w:name="_Toc244100768"/>
       <w:r>
         <w:rPr>
           <w:sz w:val="24"/>
@@ -33904,7 +34025,7 @@
       <w:pPr>
         <w:pStyle w:val="Ttulo3"/>
       </w:pPr>
-      <w:bookmarkStart w:id="124" w:name="_Toc244088737"/>
+      <w:bookmarkStart w:id="124" w:name="_Toc244100769"/>
       <w:r>
         <w:rPr>
           <w:sz w:val="24"/>
@@ -33915,7 +34036,11 @@
     </w:p>
     <w:p>
       <w:r>
-        <w:t>El resultado más relevante del capítulo es que el sistema mejora a la referencia predictiva del capítulo 4 sin recurrir a un algoritmo más complejo. La mejora no procede de aprender mejor la serie, sino de separar en la estimación lo que es incierto, la demanda atmosférica, de lo que se conoce de antemano, el calendario del cultivo. Este hallazgo matiza la conclusión del apartado 4.3 en lugar de contradecirla: allí se comprobó que, con un único ciclo, los modelos de aprendizaje no superaban a la persistencia; aquí se comprueba que incorporar conocimiento agronómico explícito sí lo hace. Es un argumento a favor de los sistemas híbridos defendidos en el apartado 2.3, en los que el aprendizaje automático, cuando se disponga de más datos, debería corregir una referencia física y no sustituirla.</w:t>
+        <w:t xml:space="preserve">El resultado más relevante del capítulo es que el sistema mejora a la referencia predictiva del capítulo 4 sin recurrir a un algoritmo más complejo. La mejora no procede de aprender mejor la serie, sino de separar en la estimación lo que es incierto, la demanda atmosférica, de lo que se </w:t>
+      </w:r>
+      <w:r>
+        <w:lastRenderedPageBreak/>
+        <w:t>conoce de antemano, el calendario del cultivo. Este hallazgo matiza la conclusión del apartado 4.3 en lugar de contradecirla: allí se comprobó que, con un único ciclo, los modelos de aprendizaje no superaban a la persistencia; aquí se comprueba que incorporar conocimiento agronómico explícito sí lo hace. Es un argumento a favor de los sistemas híbridos defendidos en el apartado 2.3, en los que el aprendizaje automático, cuando se disponga de más datos, debería corregir una referencia física y no sustituirla.</w:t>
       </w:r>
     </w:p>
     <w:p>
@@ -33925,11 +34050,7 @@
     </w:p>
     <w:p>
       <w:r>
-        <w:t xml:space="preserve">Con estas limitaciones, el prototipo cumple lo que se pretendía demostrar en este capítulo: que es posible convertir datos agroclimáticos públicos en una recomendación de riego diaria y semanal, </w:t>
-      </w:r>
-      <w:r>
-        <w:lastRenderedPageBreak/>
-        <w:t>explicada, trazable y evaluada frente a una referencia, con un error conocido para cada horizonte. La valoración de este resultado frente a los objetivos del trabajo se desarrolla en el capítulo 6.</w:t>
+        <w:t>Con estas limitaciones, el prototipo cumple lo que se pretendía demostrar en este capítulo: que es posible convertir datos agroclimáticos públicos en una recomendación de riego diaria y semanal, explicada, trazable y evaluada frente a una referencia, con un error conocido para cada horizonte. La valoración de este resultado frente a los objetivos del trabajo se desarrolla en el capítulo 6.</w:t>
       </w:r>
     </w:p>
     <w:p>
@@ -33937,7 +34058,7 @@
         <w:pStyle w:val="Ttulo3"/>
         <w:keepNext w:val="0"/>
       </w:pPr>
-      <w:bookmarkStart w:id="125" w:name="_Toc244088738"/>
+      <w:bookmarkStart w:id="125" w:name="_Toc244100770"/>
       <w:r>
         <w:t>5.3.10. Comprobación cronológica en otros cultivos y regiones</w:t>
       </w:r>
@@ -33946,6 +34067,11 @@
     <w:p>
       <w:r>
         <w:t>La evaluación principal se diseñó sobre pimiento AL01 de 2025. Como comprobación adicional se repitió la simulación diaria con coliflor AL01, alfalfa Z06 y alcachofa BA08 en 2026. En cada caso se reservó el 15 % final como prueba, igual que en el capítulo 4, y solo se evaluaron jornadas activas con Kc mayor que cero. La ventana de ET0 de siete días permaneció fija.</w:t>
+      </w:r>
+    </w:p>
+    <w:p>
+      <w:r>
+        <w:t>Los recuentos son un día inferiores a los del experimento predictivo de la Tabla 4.15 porque esta comparación exige, además de Kc &gt; 0 y una referencia válida, disponer de la persistencia del día anterior. En consecuencia, el primer día activo de cada campaña no es comparable y se excluye antes de realizar la partición cronológica del 85 % y el 15 %.</w:t>
       </w:r>
     </w:p>
     <w:p>
@@ -34240,6 +34366,7 @@
           </w:tcPr>
           <w:p>
             <w:r>
+              <w:lastRenderedPageBreak/>
               <w:t>Alcachofa · BA08</w:t>
             </w:r>
           </w:p>
@@ -34362,7 +34489,6 @@
     </w:p>
     <w:p>
       <w:r>
-        <w:lastRenderedPageBreak/>
         <w:t>Los intervalos por caso de la Tabla 5.8 incluyen el cero para coliflor y alfalfa; en alcachofa el límite inferior es 0,000 por redondeo. Por tanto, la evidencia más sólida corresponde al agregado y no permite afirmar una mejora concluyente para cada cultivo por separado.</w:t>
       </w:r>
     </w:p>
@@ -34380,7 +34506,7 @@
       <w:pPr>
         <w:pStyle w:val="Ttulo3"/>
       </w:pPr>
-      <w:bookmarkStart w:id="126" w:name="_Toc244088739"/>
+      <w:bookmarkStart w:id="126" w:name="_Toc244100771"/>
       <w:r>
         <w:t>5.3.11. Reproducibilidad y evidencias</w:t>
       </w:r>
@@ -34396,7 +34522,7 @@
         <w:pStyle w:val="Ttulo1"/>
         <w:pageBreakBefore/>
       </w:pPr>
-      <w:bookmarkStart w:id="127" w:name="_Toc244088740"/>
+      <w:bookmarkStart w:id="127" w:name="_Toc244100772"/>
       <w:r>
         <w:lastRenderedPageBreak/>
         <w:t>6. Conclusiones</w:t>
@@ -34407,7 +34533,7 @@
       <w:pPr>
         <w:pStyle w:val="Ttulo2"/>
       </w:pPr>
-      <w:bookmarkStart w:id="128" w:name="_Toc244088741"/>
+      <w:bookmarkStart w:id="128" w:name="_Toc244100773"/>
       <w:r>
         <w:t>6.1. Cumplimiento de objetivos y aportaciones</w:t>
       </w:r>
@@ -34417,7 +34543,7 @@
       <w:pPr>
         <w:pStyle w:val="Ttulo3"/>
       </w:pPr>
-      <w:bookmarkStart w:id="129" w:name="_Toc244088742"/>
+      <w:bookmarkStart w:id="129" w:name="_Toc244100774"/>
       <w:r>
         <w:rPr>
           <w:sz w:val="24"/>
@@ -35089,7 +35215,7 @@
       <w:pPr>
         <w:pStyle w:val="Ttulo3"/>
       </w:pPr>
-      <w:bookmarkStart w:id="131" w:name="_Toc244088743"/>
+      <w:bookmarkStart w:id="131" w:name="_Toc244100775"/>
       <w:r>
         <w:rPr>
           <w:sz w:val="24"/>
@@ -35126,7 +35252,7 @@
       <w:pPr>
         <w:pStyle w:val="Ttulo2"/>
       </w:pPr>
-      <w:bookmarkStart w:id="132" w:name="_Toc244088744"/>
+      <w:bookmarkStart w:id="132" w:name="_Toc244100776"/>
       <w:r>
         <w:t>6.2. Limitaciones e impacto del proyecto</w:t>
       </w:r>
@@ -35136,7 +35262,7 @@
       <w:pPr>
         <w:pStyle w:val="Ttulo3"/>
       </w:pPr>
-      <w:bookmarkStart w:id="133" w:name="_Toc244088745"/>
+      <w:bookmarkStart w:id="133" w:name="_Toc244100777"/>
       <w:r>
         <w:rPr>
           <w:sz w:val="24"/>
@@ -35720,7 +35846,7 @@
       <w:pPr>
         <w:pStyle w:val="Ttulo3"/>
       </w:pPr>
-      <w:bookmarkStart w:id="135" w:name="_Toc244088746"/>
+      <w:bookmarkStart w:id="135" w:name="_Toc244100778"/>
       <w:r>
         <w:rPr>
           <w:sz w:val="24"/>
@@ -35762,7 +35888,7 @@
       <w:pPr>
         <w:pStyle w:val="Ttulo2"/>
       </w:pPr>
-      <w:bookmarkStart w:id="136" w:name="_Toc244088747"/>
+      <w:bookmarkStart w:id="136" w:name="_Toc244100779"/>
       <w:r>
         <w:t>6.3. Mejoras y líneas futuras</w:t>
       </w:r>
@@ -35777,7 +35903,7 @@
       <w:pPr>
         <w:pStyle w:val="Ttulo3"/>
       </w:pPr>
-      <w:bookmarkStart w:id="137" w:name="_Toc244088748"/>
+      <w:bookmarkStart w:id="137" w:name="_Toc244100780"/>
       <w:r>
         <w:rPr>
           <w:sz w:val="24"/>
@@ -35795,7 +35921,7 @@
       <w:pPr>
         <w:pStyle w:val="Ttulo3"/>
       </w:pPr>
-      <w:bookmarkStart w:id="138" w:name="_Toc244088749"/>
+      <w:bookmarkStart w:id="138" w:name="_Toc244100781"/>
       <w:r>
         <w:rPr>
           <w:sz w:val="24"/>
@@ -35833,7 +35959,7 @@
       <w:pPr>
         <w:pStyle w:val="Ttulo3"/>
       </w:pPr>
-      <w:bookmarkStart w:id="139" w:name="_Toc244088750"/>
+      <w:bookmarkStart w:id="139" w:name="_Toc244100782"/>
       <w:r>
         <w:rPr>
           <w:sz w:val="24"/>
@@ -35861,7 +35987,7 @@
       <w:pPr>
         <w:pStyle w:val="Ttulo3"/>
       </w:pPr>
-      <w:bookmarkStart w:id="140" w:name="_Toc244088751"/>
+      <w:bookmarkStart w:id="140" w:name="_Toc244100783"/>
       <w:r>
         <w:rPr>
           <w:sz w:val="24"/>
@@ -35888,7 +36014,7 @@
       <w:pPr>
         <w:pStyle w:val="Ttulo3"/>
       </w:pPr>
-      <w:bookmarkStart w:id="141" w:name="_Toc244088752"/>
+      <w:bookmarkStart w:id="141" w:name="_Toc244100784"/>
       <w:r>
         <w:t>6.3.5. Operación, MLOps y control de deriva</w:t>
       </w:r>
@@ -35908,7 +36034,7 @@
       <w:pPr>
         <w:pStyle w:val="Ttulo3"/>
       </w:pPr>
-      <w:bookmarkStart w:id="142" w:name="_Toc244088753"/>
+      <w:bookmarkStart w:id="142" w:name="_Toc244100785"/>
       <w:r>
         <w:t>6.3.6. Ciencia abierta y principios FAIR</w:t>
       </w:r>
@@ -35932,7 +36058,7 @@
       <w:pPr>
         <w:pStyle w:val="Ttulo3"/>
       </w:pPr>
-      <w:bookmarkStart w:id="143" w:name="_Toc244088754"/>
+      <w:bookmarkStart w:id="143" w:name="_Toc244100786"/>
       <w:r>
         <w:t>6.3.7. Consideración final</w:t>
       </w:r>
@@ -35948,7 +36074,7 @@
         <w:pStyle w:val="Ttulo1"/>
         <w:pageBreakBefore/>
       </w:pPr>
-      <w:bookmarkStart w:id="144" w:name="_Toc244088755"/>
+      <w:bookmarkStart w:id="144" w:name="_Toc244100787"/>
       <w:r>
         <w:lastRenderedPageBreak/>
         <w:t>Referencias bibliográficas</w:t>
@@ -36086,6 +36212,11 @@
       </w:hyperlink>
     </w:p>
     <w:p>
+      <w:r>
+        <w:t>Deakin University. (2026). IrriSAT v2 technical reference. https://www.irrisat.app/api/v2/doc/IrriSAT_Technical_Reference_v2.pdf</w:t>
+      </w:r>
+    </w:p>
+    <w:p>
       <w:pPr>
         <w:pStyle w:val="BibliografaAPA"/>
       </w:pPr>
@@ -36155,6 +36286,11 @@
       </w:hyperlink>
     </w:p>
     <w:p>
+      <w:r>
+        <w:t>Food and Agriculture Organization of the United Nations. (s. f.). CROPWAT. https://www.fao.org/land-water/resources/tools/software/cropwat/en</w:t>
+      </w:r>
+    </w:p>
+    <w:p>
       <w:pPr>
         <w:pStyle w:val="BibliografaAPA"/>
       </w:pPr>
@@ -36185,6 +36321,7 @@
         <w:pStyle w:val="BibliografaAPA"/>
       </w:pPr>
       <w:r>
+        <w:lastRenderedPageBreak/>
         <w:t xml:space="preserve">Fountas, S., Carli, G., Sørensen, C. A. G., Tsiropoulos, Z., Cavalaris, C., Vatsanidou, A., Liakos, B., Canavari, M., Wiebensohn, J., &amp; Tisseyre, B. (2015). Farm management information systems: Current situation and future perspectives. </w:t>
       </w:r>
       <w:r>
@@ -36211,7 +36348,6 @@
         <w:pStyle w:val="BibliografaAPA"/>
       </w:pPr>
       <w:r>
-        <w:lastRenderedPageBreak/>
         <w:t xml:space="preserve">Gebbers, R., &amp; Adamchuk, V. I. (2010). Precision agriculture and food security. </w:t>
       </w:r>
       <w:r>
@@ -36312,6 +36448,11 @@
       </w:hyperlink>
     </w:p>
     <w:p>
+      <w:r>
+        <w:t>Künsch, H. R. (1989). The jackknife and the bootstrap for general stationary observations. The Annals of Statistics, 17(3), 1217–1241. https://doi.org/10.1214/aos/1176347265</w:t>
+      </w:r>
+    </w:p>
+    <w:p>
       <w:pPr>
         <w:pStyle w:val="BibliografaAPA"/>
       </w:pPr>
@@ -36472,6 +36613,7 @@
         <w:pStyle w:val="BibliografaAPA"/>
       </w:pPr>
       <w:r>
+        <w:lastRenderedPageBreak/>
         <w:t xml:space="preserve">Navarro-Hellín, H., Martínez-del-Rincón, J., Domingo-Miguel, R., Soto-Valles, F., &amp; Torres-Sánchez, R. (2016). A decision support system for managing irrigation in agriculture. </w:t>
       </w:r>
       <w:r>
@@ -36524,7 +36666,6 @@
         <w:pStyle w:val="BibliografaAPA"/>
       </w:pPr>
       <w:r>
-        <w:lastRenderedPageBreak/>
         <w:t xml:space="preserve">Real Decreto 854/2022, de 11 de octubre, por el que se crean la Mesa Nacional del Regadío y el Observatorio de la Sostenibilidad del Regadío. </w:t>
       </w:r>
       <w:r>
@@ -36750,6 +36891,7 @@
         <w:pStyle w:val="BibliografaAPA"/>
       </w:pPr>
       <w:r>
+        <w:lastRenderedPageBreak/>
         <w:t xml:space="preserve">Willmott, C. J., &amp; Matsuura, K. (2005). Advantages of the mean absolute error (MAE) over the root mean square error (RMSE) in assessing average model performance. </w:t>
       </w:r>
       <w:r>
@@ -36793,7 +36935,6 @@
         <w:pStyle w:val="BibliografaAPA"/>
       </w:pPr>
       <w:r>
-        <w:lastRenderedPageBreak/>
         <w:t xml:space="preserve">Wolfert, S., Ge, L., Verdouw, C., &amp; Bogaardt, M.-J. (2017). Big Data in smart farming—A review. </w:t>
       </w:r>
       <w:r>
@@ -36876,7 +37017,7 @@
       <w:pPr>
         <w:pStyle w:val="Ttulo1"/>
       </w:pPr>
-      <w:bookmarkStart w:id="145" w:name="_Toc244088756"/>
+      <w:bookmarkStart w:id="145" w:name="_Toc244100788"/>
       <w:r>
         <w:lastRenderedPageBreak/>
         <w:t>Anexo A. Reproducción y localización de las evidencias</w:t>
@@ -36928,7 +37069,7 @@
       <w:pPr>
         <w:pStyle w:val="Ttulo2"/>
       </w:pPr>
-      <w:bookmarkStart w:id="146" w:name="_Toc244088757"/>
+      <w:bookmarkStart w:id="146" w:name="_Toc244100789"/>
       <w:r>
         <w:t>A.1. Archivos principales</w:t>
       </w:r>
@@ -37331,12 +37472,69 @@
           </w:p>
         </w:tc>
       </w:tr>
+      <w:tr>
+        <w:tc>
+          <w:tcPr>
+            <w:tcW w:w="2268" w:type="dxa"/>
+            <w:tcBorders>
+              <w:top w:val="single" w:sz="4" w:space="0" w:color="D9D9D9"/>
+              <w:left w:val="single" w:sz="4" w:space="0" w:color="D9D9D9"/>
+              <w:bottom w:val="single" w:sz="4" w:space="0" w:color="D9D9D9"/>
+              <w:right w:val="single" w:sz="4" w:space="0" w:color="D9D9D9"/>
+            </w:tcBorders>
+            <w:shd w:val="clear" w:color="auto" w:fill="FFFFFF"/>
+            <w:tcMar>
+              <w:top w:w="55" w:type="dxa"/>
+              <w:left w:w="70" w:type="dxa"/>
+              <w:bottom w:w="55" w:type="dxa"/>
+              <w:right w:w="70" w:type="dxa"/>
+            </w:tcMar>
+          </w:tcPr>
+          <w:p>
+            <w:pPr>
+              <w:spacing w:after="0" w:line="240" w:lineRule="auto"/>
+            </w:pPr>
+            <w:r>
+              <w:rPr>
+                <w:sz w:val="15"/>
+              </w:rPr>
+              <w:t>Incertidumbre estadística</w:t>
+            </w:r>
+          </w:p>
+        </w:tc>
+        <w:tc>
+          <w:tcPr>
+            <w:tcW w:w="7370" w:type="dxa"/>
+            <w:tcBorders>
+              <w:top w:val="single" w:sz="4" w:space="0" w:color="D9D9D9"/>
+              <w:left w:val="single" w:sz="4" w:space="0" w:color="D9D9D9"/>
+              <w:bottom w:val="single" w:sz="4" w:space="0" w:color="D9D9D9"/>
+              <w:right w:val="single" w:sz="4" w:space="0" w:color="D9D9D9"/>
+            </w:tcBorders>
+            <w:shd w:val="clear" w:color="auto" w:fill="FFFFFF"/>
+            <w:tcMar>
+              <w:top w:w="55" w:type="dxa"/>
+              <w:left w:w="70" w:type="dxa"/>
+              <w:bottom w:w="55" w:type="dxa"/>
+              <w:right w:w="70" w:type="dxa"/>
+            </w:tcMar>
+          </w:tcPr>
+          <w:p>
+            <w:r>
+              <w:rPr>
+                <w:sz w:val="15"/>
+              </w:rPr>
+              <w:t>src/analysis/build_current_statistical_evidence.py; docs/data_samples/statistical_evidence_current.csv y .json</w:t>
+            </w:r>
+          </w:p>
+        </w:tc>
+      </w:tr>
     </w:tbl>
     <w:p>
       <w:pPr>
         <w:pStyle w:val="Ttulo2"/>
       </w:pPr>
-      <w:bookmarkStart w:id="148" w:name="_Toc244088758"/>
+      <w:bookmarkStart w:id="148" w:name="_Toc244100790"/>
       <w:r>
         <w:t>A.2. Secuencia mínima de reproducción</w:t>
       </w:r>
@@ -37444,6 +37642,11 @@
           <w:sz w:val="19"/>
         </w:rPr>
         <w:t>python -m src.models.train_etc_for_dss</w:t>
+      </w:r>
+    </w:p>
+    <w:p>
+      <w:r>
+        <w:t>python -m src.analysis.build_current_statistical_evidence</w:t>
       </w:r>
     </w:p>
     <w:p>
@@ -40521,12 +40724,21 @@
 </file>
 
 <file path=customXml/item1.xml><?xml version="1.0" encoding="utf-8"?>
+<?mso-contentType ?>
+<FormTemplates xmlns="http://schemas.microsoft.com/sharepoint/v3/contenttype/forms">
+  <Display>DocumentLibraryForm</Display>
+  <Edit>DocumentLibraryForm</Edit>
+  <New>DocumentLibraryForm</New>
+</FormTemplates>
+</file>
+
+<file path=customXml/item2.xml><?xml version="1.0" encoding="utf-8"?>
 <p:properties xmlns:p="http://schemas.microsoft.com/office/2006/metadata/properties" xmlns:xsi="http://www.w3.org/2001/XMLSchema-instance" xmlns:pc="http://schemas.microsoft.com/office/infopath/2007/PartnerControls">
   <documentManagement/>
 </p:properties>
 </file>
 
-<file path=customXml/item2.xml><?xml version="1.0" encoding="utf-8"?>
+<file path=customXml/item3.xml><?xml version="1.0" encoding="utf-8"?>
 <ct:contentTypeSchema xmlns:ct="http://schemas.microsoft.com/office/2006/metadata/contentType" xmlns:ma="http://schemas.microsoft.com/office/2006/metadata/properties/metaAttributes" ct:_="" ma:_="" ma:contentTypeName="Documento" ma:contentTypeID="0x01010019FAAD7208B57F46B26AFFED99BCE0D3" ma:contentTypeVersion="12" ma:contentTypeDescription="Crear nuevo documento." ma:contentTypeScope="" ma:versionID="1ef574cbf204855aeab3c40b347ffcdd">
   <xsd:schema xmlns:xsd="http://www.w3.org/2001/XMLSchema" xmlns:xs="http://www.w3.org/2001/XMLSchema" xmlns:p="http://schemas.microsoft.com/office/2006/metadata/properties" xmlns:ns2="9d7b9a5c-6b4f-4ca1-bb03-c38cacb734bc" xmlns:ns3="7d80c08f-e909-465c-8aa4-0e649fbe85d0" targetNamespace="http://schemas.microsoft.com/office/2006/metadata/properties" ma:root="true" ma:fieldsID="d90f8574e5bf50e8ad773515e43a9e2d" ns2:_="" ns3:_="">
     <xsd:import namespace="9d7b9a5c-6b4f-4ca1-bb03-c38cacb734bc"/>
@@ -40743,16 +40955,15 @@
 </ct:contentTypeSchema>
 </file>
 
-<file path=customXml/item3.xml><?xml version="1.0" encoding="utf-8"?>
-<?mso-contentType ?>
-<FormTemplates xmlns="http://schemas.microsoft.com/sharepoint/v3/contenttype/forms">
-  <Display>DocumentLibraryForm</Display>
-  <Edit>DocumentLibraryForm</Edit>
-  <New>DocumentLibraryForm</New>
-</FormTemplates>
+<file path=customXml/itemProps1.xml><?xml version="1.0" encoding="utf-8"?>
+<ds:datastoreItem xmlns:ds="http://schemas.openxmlformats.org/officeDocument/2006/customXml" ds:itemID="{E5FD6A2B-9479-4129-9D84-6C858DBE1A90}">
+  <ds:schemaRefs>
+    <ds:schemaRef ds:uri="http://schemas.microsoft.com/sharepoint/v3/contenttype/forms"/>
+  </ds:schemaRefs>
+</ds:datastoreItem>
 </file>
 
-<file path=customXml/itemProps1.xml><?xml version="1.0" encoding="utf-8"?>
+<file path=customXml/itemProps2.xml><?xml version="1.0" encoding="utf-8"?>
 <ds:datastoreItem xmlns:ds="http://schemas.openxmlformats.org/officeDocument/2006/customXml" ds:itemID="{261B0A37-6C6C-45CF-A5C4-83D994BC3980}">
   <ds:schemaRefs>
     <ds:schemaRef ds:uri="http://schemas.microsoft.com/office/2006/metadata/properties"/>
@@ -40761,7 +40972,7 @@
 </ds:datastoreItem>
 </file>
 
-<file path=customXml/itemProps2.xml><?xml version="1.0" encoding="utf-8"?>
+<file path=customXml/itemProps3.xml><?xml version="1.0" encoding="utf-8"?>
 <ds:datastoreItem xmlns:ds="http://schemas.openxmlformats.org/officeDocument/2006/customXml" ds:itemID="{01B4916B-2905-40FE-B973-786E02856A77}">
   <ds:schemaRefs>
     <ds:schemaRef ds:uri="http://schemas.microsoft.com/office/2006/metadata/contentType"/>
@@ -40778,12 +40989,4 @@
     <ds:schemaRef ds:uri="http://schemas.microsoft.com/internal/obd"/>
   </ds:schemaRefs>
 </ds:datastoreItem>
-</file>
-
-<file path=customXml/itemProps3.xml><?xml version="1.0" encoding="utf-8"?>
-<ds:datastoreItem xmlns:ds="http://schemas.openxmlformats.org/officeDocument/2006/customXml" ds:itemID="{E5FD6A2B-9479-4129-9D84-6C858DBE1A90}">
-  <ds:schemaRefs>
-    <ds:schemaRef ds:uri="http://schemas.microsoft.com/sharepoint/v3/contenttype/forms"/>
-  </ds:schemaRefs>
-</ds:datastoreItem>
 </file>
</xml_diff>

<commit_message>
Completar predicción ET0 operativa a siete días
</commit_message>
<xml_diff>
--- a/docs/memoria/TFM_definitivo_2026-10-28.docx
+++ b/docs/memoria/TFM_definitivo_2026-10-28.docx
@@ -381,7 +381,7 @@
       <w:r>
         <w:fldChar w:fldCharType="separate"/>
       </w:r>
-      <w:hyperlink w:anchor="_Toc244100690" w:history="1">
+      <w:hyperlink w:anchor="_Toc244178028" w:history="1">
         <w:r>
           <w:rPr>
             <w:rStyle w:val="Hipervnculo"/>
@@ -408,7 +408,7 @@
             <w:noProof/>
             <w:webHidden/>
           </w:rPr>
-          <w:instrText xml:space="preserve"> PAGEREF _Toc244100690 \h </w:instrText>
+          <w:instrText xml:space="preserve"> PAGEREF _Toc244178028 \h </w:instrText>
         </w:r>
         <w:r>
           <w:rPr>
@@ -455,7 +455,7 @@
           <w14:ligatures w14:val="standardContextual"/>
         </w:rPr>
       </w:pPr>
-      <w:hyperlink w:anchor="_Toc244100691" w:history="1">
+      <w:hyperlink w:anchor="_Toc244178029" w:history="1">
         <w:r>
           <w:rPr>
             <w:rStyle w:val="Hipervnculo"/>
@@ -482,7 +482,7 @@
             <w:noProof/>
             <w:webHidden/>
           </w:rPr>
-          <w:instrText xml:space="preserve"> PAGEREF _Toc244100691 \h </w:instrText>
+          <w:instrText xml:space="preserve"> PAGEREF _Toc244178029 \h </w:instrText>
         </w:r>
         <w:r>
           <w:rPr>
@@ -529,7 +529,7 @@
           <w14:ligatures w14:val="standardContextual"/>
         </w:rPr>
       </w:pPr>
-      <w:hyperlink w:anchor="_Toc244100692" w:history="1">
+      <w:hyperlink w:anchor="_Toc244178030" w:history="1">
         <w:r>
           <w:rPr>
             <w:rStyle w:val="Hipervnculo"/>
@@ -556,7 +556,7 @@
             <w:noProof/>
             <w:webHidden/>
           </w:rPr>
-          <w:instrText xml:space="preserve"> PAGEREF _Toc244100692 \h </w:instrText>
+          <w:instrText xml:space="preserve"> PAGEREF _Toc244178030 \h </w:instrText>
         </w:r>
         <w:r>
           <w:rPr>
@@ -603,7 +603,7 @@
           <w14:ligatures w14:val="standardContextual"/>
         </w:rPr>
       </w:pPr>
-      <w:hyperlink w:anchor="_Toc244100693" w:history="1">
+      <w:hyperlink w:anchor="_Toc244178031" w:history="1">
         <w:r>
           <w:rPr>
             <w:rStyle w:val="Hipervnculo"/>
@@ -630,7 +630,7 @@
             <w:noProof/>
             <w:webHidden/>
           </w:rPr>
-          <w:instrText xml:space="preserve"> PAGEREF _Toc244100693 \h </w:instrText>
+          <w:instrText xml:space="preserve"> PAGEREF _Toc244178031 \h </w:instrText>
         </w:r>
         <w:r>
           <w:rPr>
@@ -677,7 +677,7 @@
           <w14:ligatures w14:val="standardContextual"/>
         </w:rPr>
       </w:pPr>
-      <w:hyperlink w:anchor="_Toc244100694" w:history="1">
+      <w:hyperlink w:anchor="_Toc244178032" w:history="1">
         <w:r>
           <w:rPr>
             <w:rStyle w:val="Hipervnculo"/>
@@ -704,7 +704,7 @@
             <w:noProof/>
             <w:webHidden/>
           </w:rPr>
-          <w:instrText xml:space="preserve"> PAGEREF _Toc244100694 \h </w:instrText>
+          <w:instrText xml:space="preserve"> PAGEREF _Toc244178032 \h </w:instrText>
         </w:r>
         <w:r>
           <w:rPr>
@@ -751,7 +751,7 @@
           <w14:ligatures w14:val="standardContextual"/>
         </w:rPr>
       </w:pPr>
-      <w:hyperlink w:anchor="_Toc244100695" w:history="1">
+      <w:hyperlink w:anchor="_Toc244178033" w:history="1">
         <w:r>
           <w:rPr>
             <w:rStyle w:val="Hipervnculo"/>
@@ -778,7 +778,7 @@
             <w:noProof/>
             <w:webHidden/>
           </w:rPr>
-          <w:instrText xml:space="preserve"> PAGEREF _Toc244100695 \h </w:instrText>
+          <w:instrText xml:space="preserve"> PAGEREF _Toc244178033 \h </w:instrText>
         </w:r>
         <w:r>
           <w:rPr>
@@ -825,7 +825,7 @@
           <w14:ligatures w14:val="standardContextual"/>
         </w:rPr>
       </w:pPr>
-      <w:hyperlink w:anchor="_Toc244100696" w:history="1">
+      <w:hyperlink w:anchor="_Toc244178034" w:history="1">
         <w:r>
           <w:rPr>
             <w:rStyle w:val="Hipervnculo"/>
@@ -852,7 +852,7 @@
             <w:noProof/>
             <w:webHidden/>
           </w:rPr>
-          <w:instrText xml:space="preserve"> PAGEREF _Toc244100696 \h </w:instrText>
+          <w:instrText xml:space="preserve"> PAGEREF _Toc244178034 \h </w:instrText>
         </w:r>
         <w:r>
           <w:rPr>
@@ -899,7 +899,7 @@
           <w14:ligatures w14:val="standardContextual"/>
         </w:rPr>
       </w:pPr>
-      <w:hyperlink w:anchor="_Toc244100697" w:history="1">
+      <w:hyperlink w:anchor="_Toc244178035" w:history="1">
         <w:r>
           <w:rPr>
             <w:rStyle w:val="Hipervnculo"/>
@@ -926,7 +926,7 @@
             <w:noProof/>
             <w:webHidden/>
           </w:rPr>
-          <w:instrText xml:space="preserve"> PAGEREF _Toc244100697 \h </w:instrText>
+          <w:instrText xml:space="preserve"> PAGEREF _Toc244178035 \h </w:instrText>
         </w:r>
         <w:r>
           <w:rPr>
@@ -973,7 +973,7 @@
           <w14:ligatures w14:val="standardContextual"/>
         </w:rPr>
       </w:pPr>
-      <w:hyperlink w:anchor="_Toc244100698" w:history="1">
+      <w:hyperlink w:anchor="_Toc244178036" w:history="1">
         <w:r>
           <w:rPr>
             <w:rStyle w:val="Hipervnculo"/>
@@ -1000,7 +1000,7 @@
             <w:noProof/>
             <w:webHidden/>
           </w:rPr>
-          <w:instrText xml:space="preserve"> PAGEREF _Toc244100698 \h </w:instrText>
+          <w:instrText xml:space="preserve"> PAGEREF _Toc244178036 \h </w:instrText>
         </w:r>
         <w:r>
           <w:rPr>
@@ -1047,7 +1047,7 @@
           <w14:ligatures w14:val="standardContextual"/>
         </w:rPr>
       </w:pPr>
-      <w:hyperlink w:anchor="_Toc244100699" w:history="1">
+      <w:hyperlink w:anchor="_Toc244178037" w:history="1">
         <w:r>
           <w:rPr>
             <w:rStyle w:val="Hipervnculo"/>
@@ -1074,7 +1074,7 @@
             <w:noProof/>
             <w:webHidden/>
           </w:rPr>
-          <w:instrText xml:space="preserve"> PAGEREF _Toc244100699 \h </w:instrText>
+          <w:instrText xml:space="preserve"> PAGEREF _Toc244178037 \h </w:instrText>
         </w:r>
         <w:r>
           <w:rPr>
@@ -1121,7 +1121,7 @@
           <w14:ligatures w14:val="standardContextual"/>
         </w:rPr>
       </w:pPr>
-      <w:hyperlink w:anchor="_Toc244100700" w:history="1">
+      <w:hyperlink w:anchor="_Toc244178038" w:history="1">
         <w:r>
           <w:rPr>
             <w:rStyle w:val="Hipervnculo"/>
@@ -1148,7 +1148,7 @@
             <w:noProof/>
             <w:webHidden/>
           </w:rPr>
-          <w:instrText xml:space="preserve"> PAGEREF _Toc244100700 \h </w:instrText>
+          <w:instrText xml:space="preserve"> PAGEREF _Toc244178038 \h </w:instrText>
         </w:r>
         <w:r>
           <w:rPr>
@@ -1195,7 +1195,7 @@
           <w14:ligatures w14:val="standardContextual"/>
         </w:rPr>
       </w:pPr>
-      <w:hyperlink w:anchor="_Toc244100701" w:history="1">
+      <w:hyperlink w:anchor="_Toc244178039" w:history="1">
         <w:r>
           <w:rPr>
             <w:rStyle w:val="Hipervnculo"/>
@@ -1222,7 +1222,7 @@
             <w:noProof/>
             <w:webHidden/>
           </w:rPr>
-          <w:instrText xml:space="preserve"> PAGEREF _Toc244100701 \h </w:instrText>
+          <w:instrText xml:space="preserve"> PAGEREF _Toc244178039 \h </w:instrText>
         </w:r>
         <w:r>
           <w:rPr>
@@ -1269,7 +1269,7 @@
           <w14:ligatures w14:val="standardContextual"/>
         </w:rPr>
       </w:pPr>
-      <w:hyperlink w:anchor="_Toc244100702" w:history="1">
+      <w:hyperlink w:anchor="_Toc244178040" w:history="1">
         <w:r>
           <w:rPr>
             <w:rStyle w:val="Hipervnculo"/>
@@ -1296,7 +1296,7 @@
             <w:noProof/>
             <w:webHidden/>
           </w:rPr>
-          <w:instrText xml:space="preserve"> PAGEREF _Toc244100702 \h </w:instrText>
+          <w:instrText xml:space="preserve"> PAGEREF _Toc244178040 \h </w:instrText>
         </w:r>
         <w:r>
           <w:rPr>
@@ -1343,7 +1343,7 @@
           <w14:ligatures w14:val="standardContextual"/>
         </w:rPr>
       </w:pPr>
-      <w:hyperlink w:anchor="_Toc244100703" w:history="1">
+      <w:hyperlink w:anchor="_Toc244178041" w:history="1">
         <w:r>
           <w:rPr>
             <w:rStyle w:val="Hipervnculo"/>
@@ -1370,7 +1370,7 @@
             <w:noProof/>
             <w:webHidden/>
           </w:rPr>
-          <w:instrText xml:space="preserve"> PAGEREF _Toc244100703 \h </w:instrText>
+          <w:instrText xml:space="preserve"> PAGEREF _Toc244178041 \h </w:instrText>
         </w:r>
         <w:r>
           <w:rPr>
@@ -1417,7 +1417,7 @@
           <w14:ligatures w14:val="standardContextual"/>
         </w:rPr>
       </w:pPr>
-      <w:hyperlink w:anchor="_Toc244100704" w:history="1">
+      <w:hyperlink w:anchor="_Toc244178042" w:history="1">
         <w:r>
           <w:rPr>
             <w:rStyle w:val="Hipervnculo"/>
@@ -1444,7 +1444,7 @@
             <w:noProof/>
             <w:webHidden/>
           </w:rPr>
-          <w:instrText xml:space="preserve"> PAGEREF _Toc244100704 \h </w:instrText>
+          <w:instrText xml:space="preserve"> PAGEREF _Toc244178042 \h </w:instrText>
         </w:r>
         <w:r>
           <w:rPr>
@@ -1491,7 +1491,7 @@
           <w14:ligatures w14:val="standardContextual"/>
         </w:rPr>
       </w:pPr>
-      <w:hyperlink w:anchor="_Toc244100705" w:history="1">
+      <w:hyperlink w:anchor="_Toc244178043" w:history="1">
         <w:r>
           <w:rPr>
             <w:rStyle w:val="Hipervnculo"/>
@@ -1518,7 +1518,7 @@
             <w:noProof/>
             <w:webHidden/>
           </w:rPr>
-          <w:instrText xml:space="preserve"> PAGEREF _Toc244100705 \h </w:instrText>
+          <w:instrText xml:space="preserve"> PAGEREF _Toc244178043 \h </w:instrText>
         </w:r>
         <w:r>
           <w:rPr>
@@ -1565,7 +1565,7 @@
           <w14:ligatures w14:val="standardContextual"/>
         </w:rPr>
       </w:pPr>
-      <w:hyperlink w:anchor="_Toc244100706" w:history="1">
+      <w:hyperlink w:anchor="_Toc244178044" w:history="1">
         <w:r>
           <w:rPr>
             <w:rStyle w:val="Hipervnculo"/>
@@ -1592,7 +1592,7 @@
             <w:noProof/>
             <w:webHidden/>
           </w:rPr>
-          <w:instrText xml:space="preserve"> PAGEREF _Toc244100706 \h </w:instrText>
+          <w:instrText xml:space="preserve"> PAGEREF _Toc244178044 \h </w:instrText>
         </w:r>
         <w:r>
           <w:rPr>
@@ -1639,7 +1639,7 @@
           <w14:ligatures w14:val="standardContextual"/>
         </w:rPr>
       </w:pPr>
-      <w:hyperlink w:anchor="_Toc244100707" w:history="1">
+      <w:hyperlink w:anchor="_Toc244178045" w:history="1">
         <w:r>
           <w:rPr>
             <w:rStyle w:val="Hipervnculo"/>
@@ -1666,7 +1666,7 @@
             <w:noProof/>
             <w:webHidden/>
           </w:rPr>
-          <w:instrText xml:space="preserve"> PAGEREF _Toc244100707 \h </w:instrText>
+          <w:instrText xml:space="preserve"> PAGEREF _Toc244178045 \h </w:instrText>
         </w:r>
         <w:r>
           <w:rPr>
@@ -1713,7 +1713,7 @@
           <w14:ligatures w14:val="standardContextual"/>
         </w:rPr>
       </w:pPr>
-      <w:hyperlink w:anchor="_Toc244100708" w:history="1">
+      <w:hyperlink w:anchor="_Toc244178046" w:history="1">
         <w:r>
           <w:rPr>
             <w:rStyle w:val="Hipervnculo"/>
@@ -1740,7 +1740,7 @@
             <w:noProof/>
             <w:webHidden/>
           </w:rPr>
-          <w:instrText xml:space="preserve"> PAGEREF _Toc244100708 \h </w:instrText>
+          <w:instrText xml:space="preserve"> PAGEREF _Toc244178046 \h </w:instrText>
         </w:r>
         <w:r>
           <w:rPr>
@@ -1787,7 +1787,7 @@
           <w14:ligatures w14:val="standardContextual"/>
         </w:rPr>
       </w:pPr>
-      <w:hyperlink w:anchor="_Toc244100709" w:history="1">
+      <w:hyperlink w:anchor="_Toc244178047" w:history="1">
         <w:r>
           <w:rPr>
             <w:rStyle w:val="Hipervnculo"/>
@@ -1814,7 +1814,7 @@
             <w:noProof/>
             <w:webHidden/>
           </w:rPr>
-          <w:instrText xml:space="preserve"> PAGEREF _Toc244100709 \h </w:instrText>
+          <w:instrText xml:space="preserve"> PAGEREF _Toc244178047 \h </w:instrText>
         </w:r>
         <w:r>
           <w:rPr>
@@ -1861,7 +1861,7 @@
           <w14:ligatures w14:val="standardContextual"/>
         </w:rPr>
       </w:pPr>
-      <w:hyperlink w:anchor="_Toc244100710" w:history="1">
+      <w:hyperlink w:anchor="_Toc244178048" w:history="1">
         <w:r>
           <w:rPr>
             <w:rStyle w:val="Hipervnculo"/>
@@ -1888,7 +1888,7 @@
             <w:noProof/>
             <w:webHidden/>
           </w:rPr>
-          <w:instrText xml:space="preserve"> PAGEREF _Toc244100710 \h </w:instrText>
+          <w:instrText xml:space="preserve"> PAGEREF _Toc244178048 \h </w:instrText>
         </w:r>
         <w:r>
           <w:rPr>
@@ -1935,7 +1935,7 @@
           <w14:ligatures w14:val="standardContextual"/>
         </w:rPr>
       </w:pPr>
-      <w:hyperlink w:anchor="_Toc244100711" w:history="1">
+      <w:hyperlink w:anchor="_Toc244178049" w:history="1">
         <w:r>
           <w:rPr>
             <w:rStyle w:val="Hipervnculo"/>
@@ -1962,7 +1962,7 @@
             <w:noProof/>
             <w:webHidden/>
           </w:rPr>
-          <w:instrText xml:space="preserve"> PAGEREF _Toc244100711 \h </w:instrText>
+          <w:instrText xml:space="preserve"> PAGEREF _Toc244178049 \h </w:instrText>
         </w:r>
         <w:r>
           <w:rPr>
@@ -2009,7 +2009,7 @@
           <w14:ligatures w14:val="standardContextual"/>
         </w:rPr>
       </w:pPr>
-      <w:hyperlink w:anchor="_Toc244100712" w:history="1">
+      <w:hyperlink w:anchor="_Toc244178050" w:history="1">
         <w:r>
           <w:rPr>
             <w:rStyle w:val="Hipervnculo"/>
@@ -2036,7 +2036,7 @@
             <w:noProof/>
             <w:webHidden/>
           </w:rPr>
-          <w:instrText xml:space="preserve"> PAGEREF _Toc244100712 \h </w:instrText>
+          <w:instrText xml:space="preserve"> PAGEREF _Toc244178050 \h </w:instrText>
         </w:r>
         <w:r>
           <w:rPr>
@@ -2083,7 +2083,7 @@
           <w14:ligatures w14:val="standardContextual"/>
         </w:rPr>
       </w:pPr>
-      <w:hyperlink w:anchor="_Toc244100713" w:history="1">
+      <w:hyperlink w:anchor="_Toc244178051" w:history="1">
         <w:r>
           <w:rPr>
             <w:rStyle w:val="Hipervnculo"/>
@@ -2110,7 +2110,7 @@
             <w:noProof/>
             <w:webHidden/>
           </w:rPr>
-          <w:instrText xml:space="preserve"> PAGEREF _Toc244100713 \h </w:instrText>
+          <w:instrText xml:space="preserve"> PAGEREF _Toc244178051 \h </w:instrText>
         </w:r>
         <w:r>
           <w:rPr>
@@ -2157,7 +2157,7 @@
           <w14:ligatures w14:val="standardContextual"/>
         </w:rPr>
       </w:pPr>
-      <w:hyperlink w:anchor="_Toc244100714" w:history="1">
+      <w:hyperlink w:anchor="_Toc244178052" w:history="1">
         <w:r>
           <w:rPr>
             <w:rStyle w:val="Hipervnculo"/>
@@ -2184,7 +2184,7 @@
             <w:noProof/>
             <w:webHidden/>
           </w:rPr>
-          <w:instrText xml:space="preserve"> PAGEREF _Toc244100714 \h </w:instrText>
+          <w:instrText xml:space="preserve"> PAGEREF _Toc244178052 \h </w:instrText>
         </w:r>
         <w:r>
           <w:rPr>
@@ -2231,7 +2231,7 @@
           <w14:ligatures w14:val="standardContextual"/>
         </w:rPr>
       </w:pPr>
-      <w:hyperlink w:anchor="_Toc244100715" w:history="1">
+      <w:hyperlink w:anchor="_Toc244178053" w:history="1">
         <w:r>
           <w:rPr>
             <w:rStyle w:val="Hipervnculo"/>
@@ -2258,7 +2258,7 @@
             <w:noProof/>
             <w:webHidden/>
           </w:rPr>
-          <w:instrText xml:space="preserve"> PAGEREF _Toc244100715 \h </w:instrText>
+          <w:instrText xml:space="preserve"> PAGEREF _Toc244178053 \h </w:instrText>
         </w:r>
         <w:r>
           <w:rPr>
@@ -2305,7 +2305,7 @@
           <w14:ligatures w14:val="standardContextual"/>
         </w:rPr>
       </w:pPr>
-      <w:hyperlink w:anchor="_Toc244100716" w:history="1">
+      <w:hyperlink w:anchor="_Toc244178054" w:history="1">
         <w:r>
           <w:rPr>
             <w:rStyle w:val="Hipervnculo"/>
@@ -2332,7 +2332,7 @@
             <w:noProof/>
             <w:webHidden/>
           </w:rPr>
-          <w:instrText xml:space="preserve"> PAGEREF _Toc244100716 \h </w:instrText>
+          <w:instrText xml:space="preserve"> PAGEREF _Toc244178054 \h </w:instrText>
         </w:r>
         <w:r>
           <w:rPr>
@@ -2379,7 +2379,7 @@
           <w14:ligatures w14:val="standardContextual"/>
         </w:rPr>
       </w:pPr>
-      <w:hyperlink w:anchor="_Toc244100717" w:history="1">
+      <w:hyperlink w:anchor="_Toc244178055" w:history="1">
         <w:r>
           <w:rPr>
             <w:rStyle w:val="Hipervnculo"/>
@@ -2406,7 +2406,7 @@
             <w:noProof/>
             <w:webHidden/>
           </w:rPr>
-          <w:instrText xml:space="preserve"> PAGEREF _Toc244100717 \h </w:instrText>
+          <w:instrText xml:space="preserve"> PAGEREF _Toc244178055 \h </w:instrText>
         </w:r>
         <w:r>
           <w:rPr>
@@ -2453,7 +2453,7 @@
           <w14:ligatures w14:val="standardContextual"/>
         </w:rPr>
       </w:pPr>
-      <w:hyperlink w:anchor="_Toc244100718" w:history="1">
+      <w:hyperlink w:anchor="_Toc244178056" w:history="1">
         <w:r>
           <w:rPr>
             <w:rStyle w:val="Hipervnculo"/>
@@ -2480,7 +2480,7 @@
             <w:noProof/>
             <w:webHidden/>
           </w:rPr>
-          <w:instrText xml:space="preserve"> PAGEREF _Toc244100718 \h </w:instrText>
+          <w:instrText xml:space="preserve"> PAGEREF _Toc244178056 \h </w:instrText>
         </w:r>
         <w:r>
           <w:rPr>
@@ -2527,7 +2527,7 @@
           <w14:ligatures w14:val="standardContextual"/>
         </w:rPr>
       </w:pPr>
-      <w:hyperlink w:anchor="_Toc244100719" w:history="1">
+      <w:hyperlink w:anchor="_Toc244178057" w:history="1">
         <w:r>
           <w:rPr>
             <w:rStyle w:val="Hipervnculo"/>
@@ -2554,7 +2554,7 @@
             <w:noProof/>
             <w:webHidden/>
           </w:rPr>
-          <w:instrText xml:space="preserve"> PAGEREF _Toc244100719 \h </w:instrText>
+          <w:instrText xml:space="preserve"> PAGEREF _Toc244178057 \h </w:instrText>
         </w:r>
         <w:r>
           <w:rPr>
@@ -2601,7 +2601,7 @@
           <w14:ligatures w14:val="standardContextual"/>
         </w:rPr>
       </w:pPr>
-      <w:hyperlink w:anchor="_Toc244100720" w:history="1">
+      <w:hyperlink w:anchor="_Toc244178058" w:history="1">
         <w:r>
           <w:rPr>
             <w:rStyle w:val="Hipervnculo"/>
@@ -2628,7 +2628,7 @@
             <w:noProof/>
             <w:webHidden/>
           </w:rPr>
-          <w:instrText xml:space="preserve"> PAGEREF _Toc244100720 \h </w:instrText>
+          <w:instrText xml:space="preserve"> PAGEREF _Toc244178058 \h </w:instrText>
         </w:r>
         <w:r>
           <w:rPr>
@@ -2675,7 +2675,7 @@
           <w14:ligatures w14:val="standardContextual"/>
         </w:rPr>
       </w:pPr>
-      <w:hyperlink w:anchor="_Toc244100721" w:history="1">
+      <w:hyperlink w:anchor="_Toc244178059" w:history="1">
         <w:r>
           <w:rPr>
             <w:rStyle w:val="Hipervnculo"/>
@@ -2702,7 +2702,7 @@
             <w:noProof/>
             <w:webHidden/>
           </w:rPr>
-          <w:instrText xml:space="preserve"> PAGEREF _Toc244100721 \h </w:instrText>
+          <w:instrText xml:space="preserve"> PAGEREF _Toc244178059 \h </w:instrText>
         </w:r>
         <w:r>
           <w:rPr>
@@ -2749,7 +2749,7 @@
           <w14:ligatures w14:val="standardContextual"/>
         </w:rPr>
       </w:pPr>
-      <w:hyperlink w:anchor="_Toc244100722" w:history="1">
+      <w:hyperlink w:anchor="_Toc244178060" w:history="1">
         <w:r>
           <w:rPr>
             <w:rStyle w:val="Hipervnculo"/>
@@ -2776,7 +2776,7 @@
             <w:noProof/>
             <w:webHidden/>
           </w:rPr>
-          <w:instrText xml:space="preserve"> PAGEREF _Toc244100722 \h </w:instrText>
+          <w:instrText xml:space="preserve"> PAGEREF _Toc244178060 \h </w:instrText>
         </w:r>
         <w:r>
           <w:rPr>
@@ -2823,7 +2823,7 @@
           <w14:ligatures w14:val="standardContextual"/>
         </w:rPr>
       </w:pPr>
-      <w:hyperlink w:anchor="_Toc244100723" w:history="1">
+      <w:hyperlink w:anchor="_Toc244178061" w:history="1">
         <w:r>
           <w:rPr>
             <w:rStyle w:val="Hipervnculo"/>
@@ -2850,7 +2850,7 @@
             <w:noProof/>
             <w:webHidden/>
           </w:rPr>
-          <w:instrText xml:space="preserve"> PAGEREF _Toc244100723 \h </w:instrText>
+          <w:instrText xml:space="preserve"> PAGEREF _Toc244178061 \h </w:instrText>
         </w:r>
         <w:r>
           <w:rPr>
@@ -2897,7 +2897,7 @@
           <w14:ligatures w14:val="standardContextual"/>
         </w:rPr>
       </w:pPr>
-      <w:hyperlink w:anchor="_Toc244100724" w:history="1">
+      <w:hyperlink w:anchor="_Toc244178062" w:history="1">
         <w:r>
           <w:rPr>
             <w:rStyle w:val="Hipervnculo"/>
@@ -2924,7 +2924,7 @@
             <w:noProof/>
             <w:webHidden/>
           </w:rPr>
-          <w:instrText xml:space="preserve"> PAGEREF _Toc244100724 \h </w:instrText>
+          <w:instrText xml:space="preserve"> PAGEREF _Toc244178062 \h </w:instrText>
         </w:r>
         <w:r>
           <w:rPr>
@@ -2971,7 +2971,7 @@
           <w14:ligatures w14:val="standardContextual"/>
         </w:rPr>
       </w:pPr>
-      <w:hyperlink w:anchor="_Toc244100725" w:history="1">
+      <w:hyperlink w:anchor="_Toc244178063" w:history="1">
         <w:r>
           <w:rPr>
             <w:rStyle w:val="Hipervnculo"/>
@@ -2998,7 +2998,7 @@
             <w:noProof/>
             <w:webHidden/>
           </w:rPr>
-          <w:instrText xml:space="preserve"> PAGEREF _Toc244100725 \h </w:instrText>
+          <w:instrText xml:space="preserve"> PAGEREF _Toc244178063 \h </w:instrText>
         </w:r>
         <w:r>
           <w:rPr>
@@ -3045,7 +3045,7 @@
           <w14:ligatures w14:val="standardContextual"/>
         </w:rPr>
       </w:pPr>
-      <w:hyperlink w:anchor="_Toc244100726" w:history="1">
+      <w:hyperlink w:anchor="_Toc244178064" w:history="1">
         <w:r>
           <w:rPr>
             <w:rStyle w:val="Hipervnculo"/>
@@ -3072,7 +3072,7 @@
             <w:noProof/>
             <w:webHidden/>
           </w:rPr>
-          <w:instrText xml:space="preserve"> PAGEREF _Toc244100726 \h </w:instrText>
+          <w:instrText xml:space="preserve"> PAGEREF _Toc244178064 \h </w:instrText>
         </w:r>
         <w:r>
           <w:rPr>
@@ -3119,7 +3119,7 @@
           <w14:ligatures w14:val="standardContextual"/>
         </w:rPr>
       </w:pPr>
-      <w:hyperlink w:anchor="_Toc244100727" w:history="1">
+      <w:hyperlink w:anchor="_Toc244178065" w:history="1">
         <w:r>
           <w:rPr>
             <w:rStyle w:val="Hipervnculo"/>
@@ -3146,7 +3146,7 @@
             <w:noProof/>
             <w:webHidden/>
           </w:rPr>
-          <w:instrText xml:space="preserve"> PAGEREF _Toc244100727 \h </w:instrText>
+          <w:instrText xml:space="preserve"> PAGEREF _Toc244178065 \h </w:instrText>
         </w:r>
         <w:r>
           <w:rPr>
@@ -3193,7 +3193,7 @@
           <w14:ligatures w14:val="standardContextual"/>
         </w:rPr>
       </w:pPr>
-      <w:hyperlink w:anchor="_Toc244100728" w:history="1">
+      <w:hyperlink w:anchor="_Toc244178066" w:history="1">
         <w:r>
           <w:rPr>
             <w:rStyle w:val="Hipervnculo"/>
@@ -3220,7 +3220,7 @@
             <w:noProof/>
             <w:webHidden/>
           </w:rPr>
-          <w:instrText xml:space="preserve"> PAGEREF _Toc244100728 \h </w:instrText>
+          <w:instrText xml:space="preserve"> PAGEREF _Toc244178066 \h </w:instrText>
         </w:r>
         <w:r>
           <w:rPr>
@@ -3267,7 +3267,7 @@
           <w14:ligatures w14:val="standardContextual"/>
         </w:rPr>
       </w:pPr>
-      <w:hyperlink w:anchor="_Toc244100729" w:history="1">
+      <w:hyperlink w:anchor="_Toc244178067" w:history="1">
         <w:r>
           <w:rPr>
             <w:rStyle w:val="Hipervnculo"/>
@@ -3294,7 +3294,7 @@
             <w:noProof/>
             <w:webHidden/>
           </w:rPr>
-          <w:instrText xml:space="preserve"> PAGEREF _Toc244100729 \h </w:instrText>
+          <w:instrText xml:space="preserve"> PAGEREF _Toc244178067 \h </w:instrText>
         </w:r>
         <w:r>
           <w:rPr>
@@ -3341,7 +3341,7 @@
           <w14:ligatures w14:val="standardContextual"/>
         </w:rPr>
       </w:pPr>
-      <w:hyperlink w:anchor="_Toc244100730" w:history="1">
+      <w:hyperlink w:anchor="_Toc244178068" w:history="1">
         <w:r>
           <w:rPr>
             <w:rStyle w:val="Hipervnculo"/>
@@ -3368,7 +3368,7 @@
             <w:noProof/>
             <w:webHidden/>
           </w:rPr>
-          <w:instrText xml:space="preserve"> PAGEREF _Toc244100730 \h </w:instrText>
+          <w:instrText xml:space="preserve"> PAGEREF _Toc244178068 \h </w:instrText>
         </w:r>
         <w:r>
           <w:rPr>
@@ -3415,7 +3415,7 @@
           <w14:ligatures w14:val="standardContextual"/>
         </w:rPr>
       </w:pPr>
-      <w:hyperlink w:anchor="_Toc244100731" w:history="1">
+      <w:hyperlink w:anchor="_Toc244178069" w:history="1">
         <w:r>
           <w:rPr>
             <w:rStyle w:val="Hipervnculo"/>
@@ -3442,7 +3442,7 @@
             <w:noProof/>
             <w:webHidden/>
           </w:rPr>
-          <w:instrText xml:space="preserve"> PAGEREF _Toc244100731 \h </w:instrText>
+          <w:instrText xml:space="preserve"> PAGEREF _Toc244178069 \h </w:instrText>
         </w:r>
         <w:r>
           <w:rPr>
@@ -3489,7 +3489,7 @@
           <w14:ligatures w14:val="standardContextual"/>
         </w:rPr>
       </w:pPr>
-      <w:hyperlink w:anchor="_Toc244100732" w:history="1">
+      <w:hyperlink w:anchor="_Toc244178070" w:history="1">
         <w:r>
           <w:rPr>
             <w:rStyle w:val="Hipervnculo"/>
@@ -3516,7 +3516,7 @@
             <w:noProof/>
             <w:webHidden/>
           </w:rPr>
-          <w:instrText xml:space="preserve"> PAGEREF _Toc244100732 \h </w:instrText>
+          <w:instrText xml:space="preserve"> PAGEREF _Toc244178070 \h </w:instrText>
         </w:r>
         <w:r>
           <w:rPr>
@@ -3563,7 +3563,7 @@
           <w14:ligatures w14:val="standardContextual"/>
         </w:rPr>
       </w:pPr>
-      <w:hyperlink w:anchor="_Toc244100733" w:history="1">
+      <w:hyperlink w:anchor="_Toc244178071" w:history="1">
         <w:r>
           <w:rPr>
             <w:rStyle w:val="Hipervnculo"/>
@@ -3590,7 +3590,7 @@
             <w:noProof/>
             <w:webHidden/>
           </w:rPr>
-          <w:instrText xml:space="preserve"> PAGEREF _Toc244100733 \h </w:instrText>
+          <w:instrText xml:space="preserve"> PAGEREF _Toc244178071 \h </w:instrText>
         </w:r>
         <w:r>
           <w:rPr>
@@ -3637,7 +3637,7 @@
           <w14:ligatures w14:val="standardContextual"/>
         </w:rPr>
       </w:pPr>
-      <w:hyperlink w:anchor="_Toc244100734" w:history="1">
+      <w:hyperlink w:anchor="_Toc244178072" w:history="1">
         <w:r>
           <w:rPr>
             <w:rStyle w:val="Hipervnculo"/>
@@ -3664,7 +3664,7 @@
             <w:noProof/>
             <w:webHidden/>
           </w:rPr>
-          <w:instrText xml:space="preserve"> PAGEREF _Toc244100734 \h </w:instrText>
+          <w:instrText xml:space="preserve"> PAGEREF _Toc244178072 \h </w:instrText>
         </w:r>
         <w:r>
           <w:rPr>
@@ -3711,7 +3711,7 @@
           <w14:ligatures w14:val="standardContextual"/>
         </w:rPr>
       </w:pPr>
-      <w:hyperlink w:anchor="_Toc244100735" w:history="1">
+      <w:hyperlink w:anchor="_Toc244178073" w:history="1">
         <w:r>
           <w:rPr>
             <w:rStyle w:val="Hipervnculo"/>
@@ -3738,7 +3738,7 @@
             <w:noProof/>
             <w:webHidden/>
           </w:rPr>
-          <w:instrText xml:space="preserve"> PAGEREF _Toc244100735 \h </w:instrText>
+          <w:instrText xml:space="preserve"> PAGEREF _Toc244178073 \h </w:instrText>
         </w:r>
         <w:r>
           <w:rPr>
@@ -3785,7 +3785,7 @@
           <w14:ligatures w14:val="standardContextual"/>
         </w:rPr>
       </w:pPr>
-      <w:hyperlink w:anchor="_Toc244100736" w:history="1">
+      <w:hyperlink w:anchor="_Toc244178074" w:history="1">
         <w:r>
           <w:rPr>
             <w:rStyle w:val="Hipervnculo"/>
@@ -3812,7 +3812,7 @@
             <w:noProof/>
             <w:webHidden/>
           </w:rPr>
-          <w:instrText xml:space="preserve"> PAGEREF _Toc244100736 \h </w:instrText>
+          <w:instrText xml:space="preserve"> PAGEREF _Toc244178074 \h </w:instrText>
         </w:r>
         <w:r>
           <w:rPr>
@@ -3859,7 +3859,7 @@
           <w14:ligatures w14:val="standardContextual"/>
         </w:rPr>
       </w:pPr>
-      <w:hyperlink w:anchor="_Toc244100737" w:history="1">
+      <w:hyperlink w:anchor="_Toc244178075" w:history="1">
         <w:r>
           <w:rPr>
             <w:rStyle w:val="Hipervnculo"/>
@@ -3886,7 +3886,7 @@
             <w:noProof/>
             <w:webHidden/>
           </w:rPr>
-          <w:instrText xml:space="preserve"> PAGEREF _Toc244100737 \h </w:instrText>
+          <w:instrText xml:space="preserve"> PAGEREF _Toc244178075 \h </w:instrText>
         </w:r>
         <w:r>
           <w:rPr>
@@ -3933,7 +3933,7 @@
           <w14:ligatures w14:val="standardContextual"/>
         </w:rPr>
       </w:pPr>
-      <w:hyperlink w:anchor="_Toc244100738" w:history="1">
+      <w:hyperlink w:anchor="_Toc244178076" w:history="1">
         <w:r>
           <w:rPr>
             <w:rStyle w:val="Hipervnculo"/>
@@ -3960,7 +3960,7 @@
             <w:noProof/>
             <w:webHidden/>
           </w:rPr>
-          <w:instrText xml:space="preserve"> PAGEREF _Toc244100738 \h </w:instrText>
+          <w:instrText xml:space="preserve"> PAGEREF _Toc244178076 \h </w:instrText>
         </w:r>
         <w:r>
           <w:rPr>
@@ -4007,7 +4007,7 @@
           <w14:ligatures w14:val="standardContextual"/>
         </w:rPr>
       </w:pPr>
-      <w:hyperlink w:anchor="_Toc244100739" w:history="1">
+      <w:hyperlink w:anchor="_Toc244178077" w:history="1">
         <w:r>
           <w:rPr>
             <w:rStyle w:val="Hipervnculo"/>
@@ -4034,7 +4034,7 @@
             <w:noProof/>
             <w:webHidden/>
           </w:rPr>
-          <w:instrText xml:space="preserve"> PAGEREF _Toc244100739 \h </w:instrText>
+          <w:instrText xml:space="preserve"> PAGEREF _Toc244178077 \h </w:instrText>
         </w:r>
         <w:r>
           <w:rPr>
@@ -4081,7 +4081,7 @@
           <w14:ligatures w14:val="standardContextual"/>
         </w:rPr>
       </w:pPr>
-      <w:hyperlink w:anchor="_Toc244100740" w:history="1">
+      <w:hyperlink w:anchor="_Toc244178078" w:history="1">
         <w:r>
           <w:rPr>
             <w:rStyle w:val="Hipervnculo"/>
@@ -4108,7 +4108,7 @@
             <w:noProof/>
             <w:webHidden/>
           </w:rPr>
-          <w:instrText xml:space="preserve"> PAGEREF _Toc244100740 \h </w:instrText>
+          <w:instrText xml:space="preserve"> PAGEREF _Toc244178078 \h </w:instrText>
         </w:r>
         <w:r>
           <w:rPr>
@@ -4155,7 +4155,7 @@
           <w14:ligatures w14:val="standardContextual"/>
         </w:rPr>
       </w:pPr>
-      <w:hyperlink w:anchor="_Toc244100741" w:history="1">
+      <w:hyperlink w:anchor="_Toc244178079" w:history="1">
         <w:r>
           <w:rPr>
             <w:rStyle w:val="Hipervnculo"/>
@@ -4182,7 +4182,7 @@
             <w:noProof/>
             <w:webHidden/>
           </w:rPr>
-          <w:instrText xml:space="preserve"> PAGEREF _Toc244100741 \h </w:instrText>
+          <w:instrText xml:space="preserve"> PAGEREF _Toc244178079 \h </w:instrText>
         </w:r>
         <w:r>
           <w:rPr>
@@ -4229,7 +4229,7 @@
           <w14:ligatures w14:val="standardContextual"/>
         </w:rPr>
       </w:pPr>
-      <w:hyperlink w:anchor="_Toc244100742" w:history="1">
+      <w:hyperlink w:anchor="_Toc244178080" w:history="1">
         <w:r>
           <w:rPr>
             <w:rStyle w:val="Hipervnculo"/>
@@ -4256,7 +4256,7 @@
             <w:noProof/>
             <w:webHidden/>
           </w:rPr>
-          <w:instrText xml:space="preserve"> PAGEREF _Toc244100742 \h </w:instrText>
+          <w:instrText xml:space="preserve"> PAGEREF _Toc244178080 \h </w:instrText>
         </w:r>
         <w:r>
           <w:rPr>
@@ -4303,7 +4303,7 @@
           <w14:ligatures w14:val="standardContextual"/>
         </w:rPr>
       </w:pPr>
-      <w:hyperlink w:anchor="_Toc244100743" w:history="1">
+      <w:hyperlink w:anchor="_Toc244178081" w:history="1">
         <w:r>
           <w:rPr>
             <w:rStyle w:val="Hipervnculo"/>
@@ -4330,7 +4330,7 @@
             <w:noProof/>
             <w:webHidden/>
           </w:rPr>
-          <w:instrText xml:space="preserve"> PAGEREF _Toc244100743 \h </w:instrText>
+          <w:instrText xml:space="preserve"> PAGEREF _Toc244178081 \h </w:instrText>
         </w:r>
         <w:r>
           <w:rPr>
@@ -4351,6 +4351,80 @@
             <w:webHidden/>
           </w:rPr>
           <w:t>56</w:t>
+        </w:r>
+        <w:r>
+          <w:rPr>
+            <w:noProof/>
+            <w:webHidden/>
+          </w:rPr>
+          <w:fldChar w:fldCharType="end"/>
+        </w:r>
+      </w:hyperlink>
+    </w:p>
+    <w:p>
+      <w:pPr>
+        <w:pStyle w:val="TDC3"/>
+        <w:tabs>
+          <w:tab w:val="right" w:leader="dot" w:pos="9628"/>
+        </w:tabs>
+        <w:rPr>
+          <w:rFonts w:asciiTheme="minorHAnsi" w:eastAsiaTheme="minorEastAsia" w:hAnsiTheme="minorHAnsi" w:cstheme="minorBidi"/>
+          <w:noProof/>
+          <w:color w:val="auto"/>
+          <w:kern w:val="2"/>
+          <w:sz w:val="24"/>
+          <w:szCs w:val="24"/>
+          <w14:ligatures w14:val="standardContextual"/>
+        </w:rPr>
+      </w:pPr>
+      <w:hyperlink w:anchor="_Toc244178082" w:history="1">
+        <w:r>
+          <w:rPr>
+            <w:rStyle w:val="Hipervnculo"/>
+            <w:noProof/>
+          </w:rPr>
+          <w:t>4.3.13. Predicción multianual de ET0 a siete días</w:t>
+        </w:r>
+        <w:r>
+          <w:rPr>
+            <w:noProof/>
+            <w:webHidden/>
+          </w:rPr>
+          <w:tab/>
+        </w:r>
+        <w:r>
+          <w:rPr>
+            <w:noProof/>
+            <w:webHidden/>
+          </w:rPr>
+          <w:fldChar w:fldCharType="begin"/>
+        </w:r>
+        <w:r>
+          <w:rPr>
+            <w:noProof/>
+            <w:webHidden/>
+          </w:rPr>
+          <w:instrText xml:space="preserve"> PAGEREF _Toc244178082 \h </w:instrText>
+        </w:r>
+        <w:r>
+          <w:rPr>
+            <w:noProof/>
+            <w:webHidden/>
+          </w:rPr>
+        </w:r>
+        <w:r>
+          <w:rPr>
+            <w:noProof/>
+            <w:webHidden/>
+          </w:rPr>
+          <w:fldChar w:fldCharType="separate"/>
+        </w:r>
+        <w:r>
+          <w:rPr>
+            <w:noProof/>
+            <w:webHidden/>
+          </w:rPr>
+          <w:t>58</w:t>
         </w:r>
         <w:r>
           <w:rPr>
@@ -4377,7 +4451,7 @@
           <w14:ligatures w14:val="standardContextual"/>
         </w:rPr>
       </w:pPr>
-      <w:hyperlink w:anchor="_Toc244100744" w:history="1">
+      <w:hyperlink w:anchor="_Toc244178083" w:history="1">
         <w:r>
           <w:rPr>
             <w:rStyle w:val="Hipervnculo"/>
@@ -4404,7 +4478,7 @@
             <w:noProof/>
             <w:webHidden/>
           </w:rPr>
-          <w:instrText xml:space="preserve"> PAGEREF _Toc244100744 \h </w:instrText>
+          <w:instrText xml:space="preserve"> PAGEREF _Toc244178083 \h </w:instrText>
         </w:r>
         <w:r>
           <w:rPr>
@@ -4451,7 +4525,7 @@
           <w14:ligatures w14:val="standardContextual"/>
         </w:rPr>
       </w:pPr>
-      <w:hyperlink w:anchor="_Toc244100745" w:history="1">
+      <w:hyperlink w:anchor="_Toc244178084" w:history="1">
         <w:r>
           <w:rPr>
             <w:rStyle w:val="Hipervnculo"/>
@@ -4478,7 +4552,7 @@
             <w:noProof/>
             <w:webHidden/>
           </w:rPr>
-          <w:instrText xml:space="preserve"> PAGEREF _Toc244100745 \h </w:instrText>
+          <w:instrText xml:space="preserve"> PAGEREF _Toc244178084 \h </w:instrText>
         </w:r>
         <w:r>
           <w:rPr>
@@ -4525,7 +4599,7 @@
           <w14:ligatures w14:val="standardContextual"/>
         </w:rPr>
       </w:pPr>
-      <w:hyperlink w:anchor="_Toc244100746" w:history="1">
+      <w:hyperlink w:anchor="_Toc244178085" w:history="1">
         <w:r>
           <w:rPr>
             <w:rStyle w:val="Hipervnculo"/>
@@ -4552,7 +4626,7 @@
             <w:noProof/>
             <w:webHidden/>
           </w:rPr>
-          <w:instrText xml:space="preserve"> PAGEREF _Toc244100746 \h </w:instrText>
+          <w:instrText xml:space="preserve"> PAGEREF _Toc244178085 \h </w:instrText>
         </w:r>
         <w:r>
           <w:rPr>
@@ -4599,7 +4673,7 @@
           <w14:ligatures w14:val="standardContextual"/>
         </w:rPr>
       </w:pPr>
-      <w:hyperlink w:anchor="_Toc244100747" w:history="1">
+      <w:hyperlink w:anchor="_Toc244178086" w:history="1">
         <w:r>
           <w:rPr>
             <w:rStyle w:val="Hipervnculo"/>
@@ -4626,7 +4700,7 @@
             <w:noProof/>
             <w:webHidden/>
           </w:rPr>
-          <w:instrText xml:space="preserve"> PAGEREF _Toc244100747 \h </w:instrText>
+          <w:instrText xml:space="preserve"> PAGEREF _Toc244178086 \h </w:instrText>
         </w:r>
         <w:r>
           <w:rPr>
@@ -4673,7 +4747,7 @@
           <w14:ligatures w14:val="standardContextual"/>
         </w:rPr>
       </w:pPr>
-      <w:hyperlink w:anchor="_Toc244100748" w:history="1">
+      <w:hyperlink w:anchor="_Toc244178087" w:history="1">
         <w:r>
           <w:rPr>
             <w:rStyle w:val="Hipervnculo"/>
@@ -4700,7 +4774,7 @@
             <w:noProof/>
             <w:webHidden/>
           </w:rPr>
-          <w:instrText xml:space="preserve"> PAGEREF _Toc244100748 \h </w:instrText>
+          <w:instrText xml:space="preserve"> PAGEREF _Toc244178087 \h </w:instrText>
         </w:r>
         <w:r>
           <w:rPr>
@@ -4747,7 +4821,7 @@
           <w14:ligatures w14:val="standardContextual"/>
         </w:rPr>
       </w:pPr>
-      <w:hyperlink w:anchor="_Toc244100749" w:history="1">
+      <w:hyperlink w:anchor="_Toc244178088" w:history="1">
         <w:r>
           <w:rPr>
             <w:rStyle w:val="Hipervnculo"/>
@@ -4774,7 +4848,7 @@
             <w:noProof/>
             <w:webHidden/>
           </w:rPr>
-          <w:instrText xml:space="preserve"> PAGEREF _Toc244100749 \h </w:instrText>
+          <w:instrText xml:space="preserve"> PAGEREF _Toc244178088 \h </w:instrText>
         </w:r>
         <w:r>
           <w:rPr>
@@ -4821,7 +4895,7 @@
           <w14:ligatures w14:val="standardContextual"/>
         </w:rPr>
       </w:pPr>
-      <w:hyperlink w:anchor="_Toc244100750" w:history="1">
+      <w:hyperlink w:anchor="_Toc244178089" w:history="1">
         <w:r>
           <w:rPr>
             <w:rStyle w:val="Hipervnculo"/>
@@ -4848,7 +4922,7 @@
             <w:noProof/>
             <w:webHidden/>
           </w:rPr>
-          <w:instrText xml:space="preserve"> PAGEREF _Toc244100750 \h </w:instrText>
+          <w:instrText xml:space="preserve"> PAGEREF _Toc244178089 \h </w:instrText>
         </w:r>
         <w:r>
           <w:rPr>
@@ -4895,7 +4969,7 @@
           <w14:ligatures w14:val="standardContextual"/>
         </w:rPr>
       </w:pPr>
-      <w:hyperlink w:anchor="_Toc244100751" w:history="1">
+      <w:hyperlink w:anchor="_Toc244178090" w:history="1">
         <w:r>
           <w:rPr>
             <w:rStyle w:val="Hipervnculo"/>
@@ -4922,7 +4996,7 @@
             <w:noProof/>
             <w:webHidden/>
           </w:rPr>
-          <w:instrText xml:space="preserve"> PAGEREF _Toc244100751 \h </w:instrText>
+          <w:instrText xml:space="preserve"> PAGEREF _Toc244178090 \h </w:instrText>
         </w:r>
         <w:r>
           <w:rPr>
@@ -4969,7 +5043,7 @@
           <w14:ligatures w14:val="standardContextual"/>
         </w:rPr>
       </w:pPr>
-      <w:hyperlink w:anchor="_Toc244100752" w:history="1">
+      <w:hyperlink w:anchor="_Toc244178091" w:history="1">
         <w:r>
           <w:rPr>
             <w:rStyle w:val="Hipervnculo"/>
@@ -4996,7 +5070,7 @@
             <w:noProof/>
             <w:webHidden/>
           </w:rPr>
-          <w:instrText xml:space="preserve"> PAGEREF _Toc244100752 \h </w:instrText>
+          <w:instrText xml:space="preserve"> PAGEREF _Toc244178091 \h </w:instrText>
         </w:r>
         <w:r>
           <w:rPr>
@@ -5043,7 +5117,7 @@
           <w14:ligatures w14:val="standardContextual"/>
         </w:rPr>
       </w:pPr>
-      <w:hyperlink w:anchor="_Toc244100753" w:history="1">
+      <w:hyperlink w:anchor="_Toc244178092" w:history="1">
         <w:r>
           <w:rPr>
             <w:rStyle w:val="Hipervnculo"/>
@@ -5070,7 +5144,7 @@
             <w:noProof/>
             <w:webHidden/>
           </w:rPr>
-          <w:instrText xml:space="preserve"> PAGEREF _Toc244100753 \h </w:instrText>
+          <w:instrText xml:space="preserve"> PAGEREF _Toc244178092 \h </w:instrText>
         </w:r>
         <w:r>
           <w:rPr>
@@ -5117,7 +5191,7 @@
           <w14:ligatures w14:val="standardContextual"/>
         </w:rPr>
       </w:pPr>
-      <w:hyperlink w:anchor="_Toc244100754" w:history="1">
+      <w:hyperlink w:anchor="_Toc244178093" w:history="1">
         <w:r>
           <w:rPr>
             <w:rStyle w:val="Hipervnculo"/>
@@ -5144,7 +5218,7 @@
             <w:noProof/>
             <w:webHidden/>
           </w:rPr>
-          <w:instrText xml:space="preserve"> PAGEREF _Toc244100754 \h </w:instrText>
+          <w:instrText xml:space="preserve"> PAGEREF _Toc244178093 \h </w:instrText>
         </w:r>
         <w:r>
           <w:rPr>
@@ -5164,7 +5238,7 @@
             <w:noProof/>
             <w:webHidden/>
           </w:rPr>
-          <w:t>65</w:t>
+          <w:t>64</w:t>
         </w:r>
         <w:r>
           <w:rPr>
@@ -5191,7 +5265,7 @@
           <w14:ligatures w14:val="standardContextual"/>
         </w:rPr>
       </w:pPr>
-      <w:hyperlink w:anchor="_Toc244100755" w:history="1">
+      <w:hyperlink w:anchor="_Toc244178094" w:history="1">
         <w:r>
           <w:rPr>
             <w:rStyle w:val="Hipervnculo"/>
@@ -5218,7 +5292,7 @@
             <w:noProof/>
             <w:webHidden/>
           </w:rPr>
-          <w:instrText xml:space="preserve"> PAGEREF _Toc244100755 \h </w:instrText>
+          <w:instrText xml:space="preserve"> PAGEREF _Toc244178094 \h </w:instrText>
         </w:r>
         <w:r>
           <w:rPr>
@@ -5265,7 +5339,7 @@
           <w14:ligatures w14:val="standardContextual"/>
         </w:rPr>
       </w:pPr>
-      <w:hyperlink w:anchor="_Toc244100756" w:history="1">
+      <w:hyperlink w:anchor="_Toc244178095" w:history="1">
         <w:r>
           <w:rPr>
             <w:rStyle w:val="Hipervnculo"/>
@@ -5292,7 +5366,7 @@
             <w:noProof/>
             <w:webHidden/>
           </w:rPr>
-          <w:instrText xml:space="preserve"> PAGEREF _Toc244100756 \h </w:instrText>
+          <w:instrText xml:space="preserve"> PAGEREF _Toc244178095 \h </w:instrText>
         </w:r>
         <w:r>
           <w:rPr>
@@ -5339,7 +5413,7 @@
           <w14:ligatures w14:val="standardContextual"/>
         </w:rPr>
       </w:pPr>
-      <w:hyperlink w:anchor="_Toc244100757" w:history="1">
+      <w:hyperlink w:anchor="_Toc244178096" w:history="1">
         <w:r>
           <w:rPr>
             <w:rStyle w:val="Hipervnculo"/>
@@ -5366,7 +5440,7 @@
             <w:noProof/>
             <w:webHidden/>
           </w:rPr>
-          <w:instrText xml:space="preserve"> PAGEREF _Toc244100757 \h </w:instrText>
+          <w:instrText xml:space="preserve"> PAGEREF _Toc244178096 \h </w:instrText>
         </w:r>
         <w:r>
           <w:rPr>
@@ -5413,7 +5487,7 @@
           <w14:ligatures w14:val="standardContextual"/>
         </w:rPr>
       </w:pPr>
-      <w:hyperlink w:anchor="_Toc244100758" w:history="1">
+      <w:hyperlink w:anchor="_Toc244178097" w:history="1">
         <w:r>
           <w:rPr>
             <w:rStyle w:val="Hipervnculo"/>
@@ -5440,7 +5514,7 @@
             <w:noProof/>
             <w:webHidden/>
           </w:rPr>
-          <w:instrText xml:space="preserve"> PAGEREF _Toc244100758 \h </w:instrText>
+          <w:instrText xml:space="preserve"> PAGEREF _Toc244178097 \h </w:instrText>
         </w:r>
         <w:r>
           <w:rPr>
@@ -5487,7 +5561,7 @@
           <w14:ligatures w14:val="standardContextual"/>
         </w:rPr>
       </w:pPr>
-      <w:hyperlink w:anchor="_Toc244100759" w:history="1">
+      <w:hyperlink w:anchor="_Toc244178098" w:history="1">
         <w:r>
           <w:rPr>
             <w:rStyle w:val="Hipervnculo"/>
@@ -5514,7 +5588,7 @@
             <w:noProof/>
             <w:webHidden/>
           </w:rPr>
-          <w:instrText xml:space="preserve"> PAGEREF _Toc244100759 \h </w:instrText>
+          <w:instrText xml:space="preserve"> PAGEREF _Toc244178098 \h </w:instrText>
         </w:r>
         <w:r>
           <w:rPr>
@@ -5561,7 +5635,7 @@
           <w14:ligatures w14:val="standardContextual"/>
         </w:rPr>
       </w:pPr>
-      <w:hyperlink w:anchor="_Toc244100760" w:history="1">
+      <w:hyperlink w:anchor="_Toc244178099" w:history="1">
         <w:r>
           <w:rPr>
             <w:rStyle w:val="Hipervnculo"/>
@@ -5588,7 +5662,7 @@
             <w:noProof/>
             <w:webHidden/>
           </w:rPr>
-          <w:instrText xml:space="preserve"> PAGEREF _Toc244100760 \h </w:instrText>
+          <w:instrText xml:space="preserve"> PAGEREF _Toc244178099 \h </w:instrText>
         </w:r>
         <w:r>
           <w:rPr>
@@ -5635,7 +5709,7 @@
           <w14:ligatures w14:val="standardContextual"/>
         </w:rPr>
       </w:pPr>
-      <w:hyperlink w:anchor="_Toc244100761" w:history="1">
+      <w:hyperlink w:anchor="_Toc244178100" w:history="1">
         <w:r>
           <w:rPr>
             <w:rStyle w:val="Hipervnculo"/>
@@ -5662,7 +5736,7 @@
             <w:noProof/>
             <w:webHidden/>
           </w:rPr>
-          <w:instrText xml:space="preserve"> PAGEREF _Toc244100761 \h </w:instrText>
+          <w:instrText xml:space="preserve"> PAGEREF _Toc244178100 \h </w:instrText>
         </w:r>
         <w:r>
           <w:rPr>
@@ -5709,7 +5783,7 @@
           <w14:ligatures w14:val="standardContextual"/>
         </w:rPr>
       </w:pPr>
-      <w:hyperlink w:anchor="_Toc244100762" w:history="1">
+      <w:hyperlink w:anchor="_Toc244178101" w:history="1">
         <w:r>
           <w:rPr>
             <w:rStyle w:val="Hipervnculo"/>
@@ -5736,7 +5810,7 @@
             <w:noProof/>
             <w:webHidden/>
           </w:rPr>
-          <w:instrText xml:space="preserve"> PAGEREF _Toc244100762 \h </w:instrText>
+          <w:instrText xml:space="preserve"> PAGEREF _Toc244178101 \h </w:instrText>
         </w:r>
         <w:r>
           <w:rPr>
@@ -5783,7 +5857,7 @@
           <w14:ligatures w14:val="standardContextual"/>
         </w:rPr>
       </w:pPr>
-      <w:hyperlink w:anchor="_Toc244100763" w:history="1">
+      <w:hyperlink w:anchor="_Toc244178102" w:history="1">
         <w:r>
           <w:rPr>
             <w:rStyle w:val="Hipervnculo"/>
@@ -5810,7 +5884,7 @@
             <w:noProof/>
             <w:webHidden/>
           </w:rPr>
-          <w:instrText xml:space="preserve"> PAGEREF _Toc244100763 \h </w:instrText>
+          <w:instrText xml:space="preserve"> PAGEREF _Toc244178102 \h </w:instrText>
         </w:r>
         <w:r>
           <w:rPr>
@@ -5857,7 +5931,7 @@
           <w14:ligatures w14:val="standardContextual"/>
         </w:rPr>
       </w:pPr>
-      <w:hyperlink w:anchor="_Toc244100764" w:history="1">
+      <w:hyperlink w:anchor="_Toc244178103" w:history="1">
         <w:r>
           <w:rPr>
             <w:rStyle w:val="Hipervnculo"/>
@@ -5884,7 +5958,7 @@
             <w:noProof/>
             <w:webHidden/>
           </w:rPr>
-          <w:instrText xml:space="preserve"> PAGEREF _Toc244100764 \h </w:instrText>
+          <w:instrText xml:space="preserve"> PAGEREF _Toc244178103 \h </w:instrText>
         </w:r>
         <w:r>
           <w:rPr>
@@ -5931,7 +6005,7 @@
           <w14:ligatures w14:val="standardContextual"/>
         </w:rPr>
       </w:pPr>
-      <w:hyperlink w:anchor="_Toc244100765" w:history="1">
+      <w:hyperlink w:anchor="_Toc244178104" w:history="1">
         <w:r>
           <w:rPr>
             <w:rStyle w:val="Hipervnculo"/>
@@ -5958,7 +6032,7 @@
             <w:noProof/>
             <w:webHidden/>
           </w:rPr>
-          <w:instrText xml:space="preserve"> PAGEREF _Toc244100765 \h </w:instrText>
+          <w:instrText xml:space="preserve"> PAGEREF _Toc244178104 \h </w:instrText>
         </w:r>
         <w:r>
           <w:rPr>
@@ -6005,7 +6079,7 @@
           <w14:ligatures w14:val="standardContextual"/>
         </w:rPr>
       </w:pPr>
-      <w:hyperlink w:anchor="_Toc244100766" w:history="1">
+      <w:hyperlink w:anchor="_Toc244178105" w:history="1">
         <w:r>
           <w:rPr>
             <w:rStyle w:val="Hipervnculo"/>
@@ -6032,7 +6106,7 @@
             <w:noProof/>
             <w:webHidden/>
           </w:rPr>
-          <w:instrText xml:space="preserve"> PAGEREF _Toc244100766 \h </w:instrText>
+          <w:instrText xml:space="preserve"> PAGEREF _Toc244178105 \h </w:instrText>
         </w:r>
         <w:r>
           <w:rPr>
@@ -6079,7 +6153,7 @@
           <w14:ligatures w14:val="standardContextual"/>
         </w:rPr>
       </w:pPr>
-      <w:hyperlink w:anchor="_Toc244100767" w:history="1">
+      <w:hyperlink w:anchor="_Toc244178106" w:history="1">
         <w:r>
           <w:rPr>
             <w:rStyle w:val="Hipervnculo"/>
@@ -6106,7 +6180,7 @@
             <w:noProof/>
             <w:webHidden/>
           </w:rPr>
-          <w:instrText xml:space="preserve"> PAGEREF _Toc244100767 \h </w:instrText>
+          <w:instrText xml:space="preserve"> PAGEREF _Toc244178106 \h </w:instrText>
         </w:r>
         <w:r>
           <w:rPr>
@@ -6153,7 +6227,7 @@
           <w14:ligatures w14:val="standardContextual"/>
         </w:rPr>
       </w:pPr>
-      <w:hyperlink w:anchor="_Toc244100768" w:history="1">
+      <w:hyperlink w:anchor="_Toc244178107" w:history="1">
         <w:r>
           <w:rPr>
             <w:rStyle w:val="Hipervnculo"/>
@@ -6180,7 +6254,7 @@
             <w:noProof/>
             <w:webHidden/>
           </w:rPr>
-          <w:instrText xml:space="preserve"> PAGEREF _Toc244100768 \h </w:instrText>
+          <w:instrText xml:space="preserve"> PAGEREF _Toc244178107 \h </w:instrText>
         </w:r>
         <w:r>
           <w:rPr>
@@ -6227,7 +6301,7 @@
           <w14:ligatures w14:val="standardContextual"/>
         </w:rPr>
       </w:pPr>
-      <w:hyperlink w:anchor="_Toc244100769" w:history="1">
+      <w:hyperlink w:anchor="_Toc244178108" w:history="1">
         <w:r>
           <w:rPr>
             <w:rStyle w:val="Hipervnculo"/>
@@ -6254,7 +6328,7 @@
             <w:noProof/>
             <w:webHidden/>
           </w:rPr>
-          <w:instrText xml:space="preserve"> PAGEREF _Toc244100769 \h </w:instrText>
+          <w:instrText xml:space="preserve"> PAGEREF _Toc244178108 \h </w:instrText>
         </w:r>
         <w:r>
           <w:rPr>
@@ -6301,7 +6375,7 @@
           <w14:ligatures w14:val="standardContextual"/>
         </w:rPr>
       </w:pPr>
-      <w:hyperlink w:anchor="_Toc244100770" w:history="1">
+      <w:hyperlink w:anchor="_Toc244178109" w:history="1">
         <w:r>
           <w:rPr>
             <w:rStyle w:val="Hipervnculo"/>
@@ -6328,7 +6402,7 @@
             <w:noProof/>
             <w:webHidden/>
           </w:rPr>
-          <w:instrText xml:space="preserve"> PAGEREF _Toc244100770 \h </w:instrText>
+          <w:instrText xml:space="preserve"> PAGEREF _Toc244178109 \h </w:instrText>
         </w:r>
         <w:r>
           <w:rPr>
@@ -6375,7 +6449,7 @@
           <w14:ligatures w14:val="standardContextual"/>
         </w:rPr>
       </w:pPr>
-      <w:hyperlink w:anchor="_Toc244100771" w:history="1">
+      <w:hyperlink w:anchor="_Toc244178110" w:history="1">
         <w:r>
           <w:rPr>
             <w:rStyle w:val="Hipervnculo"/>
@@ -6402,7 +6476,7 @@
             <w:noProof/>
             <w:webHidden/>
           </w:rPr>
-          <w:instrText xml:space="preserve"> PAGEREF _Toc244100771 \h </w:instrText>
+          <w:instrText xml:space="preserve"> PAGEREF _Toc244178110 \h </w:instrText>
         </w:r>
         <w:r>
           <w:rPr>
@@ -6449,7 +6523,7 @@
           <w14:ligatures w14:val="standardContextual"/>
         </w:rPr>
       </w:pPr>
-      <w:hyperlink w:anchor="_Toc244100772" w:history="1">
+      <w:hyperlink w:anchor="_Toc244178111" w:history="1">
         <w:r>
           <w:rPr>
             <w:rStyle w:val="Hipervnculo"/>
@@ -6476,7 +6550,7 @@
             <w:noProof/>
             <w:webHidden/>
           </w:rPr>
-          <w:instrText xml:space="preserve"> PAGEREF _Toc244100772 \h </w:instrText>
+          <w:instrText xml:space="preserve"> PAGEREF _Toc244178111 \h </w:instrText>
         </w:r>
         <w:r>
           <w:rPr>
@@ -6523,7 +6597,7 @@
           <w14:ligatures w14:val="standardContextual"/>
         </w:rPr>
       </w:pPr>
-      <w:hyperlink w:anchor="_Toc244100773" w:history="1">
+      <w:hyperlink w:anchor="_Toc244178112" w:history="1">
         <w:r>
           <w:rPr>
             <w:rStyle w:val="Hipervnculo"/>
@@ -6550,7 +6624,7 @@
             <w:noProof/>
             <w:webHidden/>
           </w:rPr>
-          <w:instrText xml:space="preserve"> PAGEREF _Toc244100773 \h </w:instrText>
+          <w:instrText xml:space="preserve"> PAGEREF _Toc244178112 \h </w:instrText>
         </w:r>
         <w:r>
           <w:rPr>
@@ -6597,7 +6671,7 @@
           <w14:ligatures w14:val="standardContextual"/>
         </w:rPr>
       </w:pPr>
-      <w:hyperlink w:anchor="_Toc244100774" w:history="1">
+      <w:hyperlink w:anchor="_Toc244178113" w:history="1">
         <w:r>
           <w:rPr>
             <w:rStyle w:val="Hipervnculo"/>
@@ -6624,7 +6698,7 @@
             <w:noProof/>
             <w:webHidden/>
           </w:rPr>
-          <w:instrText xml:space="preserve"> PAGEREF _Toc244100774 \h </w:instrText>
+          <w:instrText xml:space="preserve"> PAGEREF _Toc244178113 \h </w:instrText>
         </w:r>
         <w:r>
           <w:rPr>
@@ -6671,7 +6745,7 @@
           <w14:ligatures w14:val="standardContextual"/>
         </w:rPr>
       </w:pPr>
-      <w:hyperlink w:anchor="_Toc244100775" w:history="1">
+      <w:hyperlink w:anchor="_Toc244178114" w:history="1">
         <w:r>
           <w:rPr>
             <w:rStyle w:val="Hipervnculo"/>
@@ -6698,7 +6772,7 @@
             <w:noProof/>
             <w:webHidden/>
           </w:rPr>
-          <w:instrText xml:space="preserve"> PAGEREF _Toc244100775 \h </w:instrText>
+          <w:instrText xml:space="preserve"> PAGEREF _Toc244178114 \h </w:instrText>
         </w:r>
         <w:r>
           <w:rPr>
@@ -6745,7 +6819,7 @@
           <w14:ligatures w14:val="standardContextual"/>
         </w:rPr>
       </w:pPr>
-      <w:hyperlink w:anchor="_Toc244100776" w:history="1">
+      <w:hyperlink w:anchor="_Toc244178115" w:history="1">
         <w:r>
           <w:rPr>
             <w:rStyle w:val="Hipervnculo"/>
@@ -6772,7 +6846,7 @@
             <w:noProof/>
             <w:webHidden/>
           </w:rPr>
-          <w:instrText xml:space="preserve"> PAGEREF _Toc244100776 \h </w:instrText>
+          <w:instrText xml:space="preserve"> PAGEREF _Toc244178115 \h </w:instrText>
         </w:r>
         <w:r>
           <w:rPr>
@@ -6819,7 +6893,7 @@
           <w14:ligatures w14:val="standardContextual"/>
         </w:rPr>
       </w:pPr>
-      <w:hyperlink w:anchor="_Toc244100777" w:history="1">
+      <w:hyperlink w:anchor="_Toc244178116" w:history="1">
         <w:r>
           <w:rPr>
             <w:rStyle w:val="Hipervnculo"/>
@@ -6846,7 +6920,7 @@
             <w:noProof/>
             <w:webHidden/>
           </w:rPr>
-          <w:instrText xml:space="preserve"> PAGEREF _Toc244100777 \h </w:instrText>
+          <w:instrText xml:space="preserve"> PAGEREF _Toc244178116 \h </w:instrText>
         </w:r>
         <w:r>
           <w:rPr>
@@ -6893,7 +6967,7 @@
           <w14:ligatures w14:val="standardContextual"/>
         </w:rPr>
       </w:pPr>
-      <w:hyperlink w:anchor="_Toc244100778" w:history="1">
+      <w:hyperlink w:anchor="_Toc244178117" w:history="1">
         <w:r>
           <w:rPr>
             <w:rStyle w:val="Hipervnculo"/>
@@ -6920,7 +6994,7 @@
             <w:noProof/>
             <w:webHidden/>
           </w:rPr>
-          <w:instrText xml:space="preserve"> PAGEREF _Toc244100778 \h </w:instrText>
+          <w:instrText xml:space="preserve"> PAGEREF _Toc244178117 \h </w:instrText>
         </w:r>
         <w:r>
           <w:rPr>
@@ -6967,7 +7041,7 @@
           <w14:ligatures w14:val="standardContextual"/>
         </w:rPr>
       </w:pPr>
-      <w:hyperlink w:anchor="_Toc244100779" w:history="1">
+      <w:hyperlink w:anchor="_Toc244178118" w:history="1">
         <w:r>
           <w:rPr>
             <w:rStyle w:val="Hipervnculo"/>
@@ -6994,7 +7068,7 @@
             <w:noProof/>
             <w:webHidden/>
           </w:rPr>
-          <w:instrText xml:space="preserve"> PAGEREF _Toc244100779 \h </w:instrText>
+          <w:instrText xml:space="preserve"> PAGEREF _Toc244178118 \h </w:instrText>
         </w:r>
         <w:r>
           <w:rPr>
@@ -7041,7 +7115,7 @@
           <w14:ligatures w14:val="standardContextual"/>
         </w:rPr>
       </w:pPr>
-      <w:hyperlink w:anchor="_Toc244100780" w:history="1">
+      <w:hyperlink w:anchor="_Toc244178119" w:history="1">
         <w:r>
           <w:rPr>
             <w:rStyle w:val="Hipervnculo"/>
@@ -7068,7 +7142,7 @@
             <w:noProof/>
             <w:webHidden/>
           </w:rPr>
-          <w:instrText xml:space="preserve"> PAGEREF _Toc244100780 \h </w:instrText>
+          <w:instrText xml:space="preserve"> PAGEREF _Toc244178119 \h </w:instrText>
         </w:r>
         <w:r>
           <w:rPr>
@@ -7115,7 +7189,7 @@
           <w14:ligatures w14:val="standardContextual"/>
         </w:rPr>
       </w:pPr>
-      <w:hyperlink w:anchor="_Toc244100781" w:history="1">
+      <w:hyperlink w:anchor="_Toc244178120" w:history="1">
         <w:r>
           <w:rPr>
             <w:rStyle w:val="Hipervnculo"/>
@@ -7142,7 +7216,7 @@
             <w:noProof/>
             <w:webHidden/>
           </w:rPr>
-          <w:instrText xml:space="preserve"> PAGEREF _Toc244100781 \h </w:instrText>
+          <w:instrText xml:space="preserve"> PAGEREF _Toc244178120 \h </w:instrText>
         </w:r>
         <w:r>
           <w:rPr>
@@ -7189,7 +7263,7 @@
           <w14:ligatures w14:val="standardContextual"/>
         </w:rPr>
       </w:pPr>
-      <w:hyperlink w:anchor="_Toc244100782" w:history="1">
+      <w:hyperlink w:anchor="_Toc244178121" w:history="1">
         <w:r>
           <w:rPr>
             <w:rStyle w:val="Hipervnculo"/>
@@ -7216,7 +7290,7 @@
             <w:noProof/>
             <w:webHidden/>
           </w:rPr>
-          <w:instrText xml:space="preserve"> PAGEREF _Toc244100782 \h </w:instrText>
+          <w:instrText xml:space="preserve"> PAGEREF _Toc244178121 \h </w:instrText>
         </w:r>
         <w:r>
           <w:rPr>
@@ -7263,7 +7337,7 @@
           <w14:ligatures w14:val="standardContextual"/>
         </w:rPr>
       </w:pPr>
-      <w:hyperlink w:anchor="_Toc244100783" w:history="1">
+      <w:hyperlink w:anchor="_Toc244178122" w:history="1">
         <w:r>
           <w:rPr>
             <w:rStyle w:val="Hipervnculo"/>
@@ -7290,7 +7364,7 @@
             <w:noProof/>
             <w:webHidden/>
           </w:rPr>
-          <w:instrText xml:space="preserve"> PAGEREF _Toc244100783 \h </w:instrText>
+          <w:instrText xml:space="preserve"> PAGEREF _Toc244178122 \h </w:instrText>
         </w:r>
         <w:r>
           <w:rPr>
@@ -7337,7 +7411,7 @@
           <w14:ligatures w14:val="standardContextual"/>
         </w:rPr>
       </w:pPr>
-      <w:hyperlink w:anchor="_Toc244100784" w:history="1">
+      <w:hyperlink w:anchor="_Toc244178123" w:history="1">
         <w:r>
           <w:rPr>
             <w:rStyle w:val="Hipervnculo"/>
@@ -7364,7 +7438,7 @@
             <w:noProof/>
             <w:webHidden/>
           </w:rPr>
-          <w:instrText xml:space="preserve"> PAGEREF _Toc244100784 \h </w:instrText>
+          <w:instrText xml:space="preserve"> PAGEREF _Toc244178123 \h </w:instrText>
         </w:r>
         <w:r>
           <w:rPr>
@@ -7411,7 +7485,7 @@
           <w14:ligatures w14:val="standardContextual"/>
         </w:rPr>
       </w:pPr>
-      <w:hyperlink w:anchor="_Toc244100785" w:history="1">
+      <w:hyperlink w:anchor="_Toc244178124" w:history="1">
         <w:r>
           <w:rPr>
             <w:rStyle w:val="Hipervnculo"/>
@@ -7438,7 +7512,7 @@
             <w:noProof/>
             <w:webHidden/>
           </w:rPr>
-          <w:instrText xml:space="preserve"> PAGEREF _Toc244100785 \h </w:instrText>
+          <w:instrText xml:space="preserve"> PAGEREF _Toc244178124 \h </w:instrText>
         </w:r>
         <w:r>
           <w:rPr>
@@ -7485,7 +7559,7 @@
           <w14:ligatures w14:val="standardContextual"/>
         </w:rPr>
       </w:pPr>
-      <w:hyperlink w:anchor="_Toc244100786" w:history="1">
+      <w:hyperlink w:anchor="_Toc244178125" w:history="1">
         <w:r>
           <w:rPr>
             <w:rStyle w:val="Hipervnculo"/>
@@ -7512,7 +7586,7 @@
             <w:noProof/>
             <w:webHidden/>
           </w:rPr>
-          <w:instrText xml:space="preserve"> PAGEREF _Toc244100786 \h </w:instrText>
+          <w:instrText xml:space="preserve"> PAGEREF _Toc244178125 \h </w:instrText>
         </w:r>
         <w:r>
           <w:rPr>
@@ -7559,7 +7633,7 @@
           <w14:ligatures w14:val="standardContextual"/>
         </w:rPr>
       </w:pPr>
-      <w:hyperlink w:anchor="_Toc244100787" w:history="1">
+      <w:hyperlink w:anchor="_Toc244178126" w:history="1">
         <w:r>
           <w:rPr>
             <w:rStyle w:val="Hipervnculo"/>
@@ -7586,7 +7660,7 @@
             <w:noProof/>
             <w:webHidden/>
           </w:rPr>
-          <w:instrText xml:space="preserve"> PAGEREF _Toc244100787 \h </w:instrText>
+          <w:instrText xml:space="preserve"> PAGEREF _Toc244178126 \h </w:instrText>
         </w:r>
         <w:r>
           <w:rPr>
@@ -7633,7 +7707,7 @@
           <w14:ligatures w14:val="standardContextual"/>
         </w:rPr>
       </w:pPr>
-      <w:hyperlink w:anchor="_Toc244100788" w:history="1">
+      <w:hyperlink w:anchor="_Toc244178127" w:history="1">
         <w:r>
           <w:rPr>
             <w:rStyle w:val="Hipervnculo"/>
@@ -7660,7 +7734,7 @@
             <w:noProof/>
             <w:webHidden/>
           </w:rPr>
-          <w:instrText xml:space="preserve"> PAGEREF _Toc244100788 \h </w:instrText>
+          <w:instrText xml:space="preserve"> PAGEREF _Toc244178127 \h </w:instrText>
         </w:r>
         <w:r>
           <w:rPr>
@@ -7707,7 +7781,7 @@
           <w14:ligatures w14:val="standardContextual"/>
         </w:rPr>
       </w:pPr>
-      <w:hyperlink w:anchor="_Toc244100789" w:history="1">
+      <w:hyperlink w:anchor="_Toc244178128" w:history="1">
         <w:r>
           <w:rPr>
             <w:rStyle w:val="Hipervnculo"/>
@@ -7734,7 +7808,7 @@
             <w:noProof/>
             <w:webHidden/>
           </w:rPr>
-          <w:instrText xml:space="preserve"> PAGEREF _Toc244100789 \h </w:instrText>
+          <w:instrText xml:space="preserve"> PAGEREF _Toc244178128 \h </w:instrText>
         </w:r>
         <w:r>
           <w:rPr>
@@ -7781,7 +7855,7 @@
           <w14:ligatures w14:val="standardContextual"/>
         </w:rPr>
       </w:pPr>
-      <w:hyperlink w:anchor="_Toc244100790" w:history="1">
+      <w:hyperlink w:anchor="_Toc244178129" w:history="1">
         <w:r>
           <w:rPr>
             <w:rStyle w:val="Hipervnculo"/>
@@ -7808,7 +7882,7 @@
             <w:noProof/>
             <w:webHidden/>
           </w:rPr>
-          <w:instrText xml:space="preserve"> PAGEREF _Toc244100790 \h </w:instrText>
+          <w:instrText xml:space="preserve"> PAGEREF _Toc244178129 \h </w:instrText>
         </w:r>
         <w:r>
           <w:rPr>
@@ -8523,7 +8597,7 @@
       <w:r>
         <w:br w:type="page"/>
       </w:r>
-      <w:bookmarkStart w:id="1" w:name="_Toc244100690"/>
+      <w:bookmarkStart w:id="1" w:name="_Toc244178028"/>
       <w:r>
         <w:lastRenderedPageBreak/>
         <w:t>1. Introducción y objetivos</w:t>
@@ -8534,7 +8608,7 @@
       <w:pPr>
         <w:pStyle w:val="Ttulo2"/>
       </w:pPr>
-      <w:bookmarkStart w:id="2" w:name="_Toc244100691"/>
+      <w:bookmarkStart w:id="2" w:name="_Toc244178029"/>
       <w:r>
         <w:t>1.1. Contexto, motivación y justificación</w:t>
       </w:r>
@@ -8597,7 +8671,7 @@
       <w:pPr>
         <w:pStyle w:val="Ttulo2"/>
       </w:pPr>
-      <w:bookmarkStart w:id="3" w:name="_Toc244100692"/>
+      <w:bookmarkStart w:id="3" w:name="_Toc244178030"/>
       <w:r>
         <w:t>1.2. Objetivos generales y específicos</w:t>
       </w:r>
@@ -8656,7 +8730,7 @@
       <w:pPr>
         <w:pStyle w:val="Ttulo2"/>
       </w:pPr>
-      <w:bookmarkStart w:id="4" w:name="_Toc244100693"/>
+      <w:bookmarkStart w:id="4" w:name="_Toc244178031"/>
       <w:r>
         <w:t>1.3. Alcance, usuarios y limitaciones</w:t>
       </w:r>
@@ -8766,7 +8840,7 @@
         <w:pStyle w:val="Ttulo1"/>
         <w:pageBreakBefore/>
       </w:pPr>
-      <w:bookmarkStart w:id="5" w:name="_Toc244100694"/>
+      <w:bookmarkStart w:id="5" w:name="_Toc244178032"/>
       <w:r>
         <w:lastRenderedPageBreak/>
         <w:t>2. Marco teórico y estado del arte</w:t>
@@ -8777,7 +8851,7 @@
       <w:pPr>
         <w:pStyle w:val="Ttulo2"/>
       </w:pPr>
-      <w:bookmarkStart w:id="6" w:name="_Toc244100695"/>
+      <w:bookmarkStart w:id="6" w:name="_Toc244178033"/>
       <w:r>
         <w:t>2.1. Necesidades hídricas y gestión eficiente del riego</w:t>
       </w:r>
@@ -8845,7 +8919,7 @@
       <w:pPr>
         <w:pStyle w:val="Ttulo2"/>
       </w:pPr>
-      <w:bookmarkStart w:id="7" w:name="_Toc244100696"/>
+      <w:bookmarkStart w:id="7" w:name="_Toc244178034"/>
       <w:r>
         <w:t>2.2. Agricultura de precisión y aprendizaje automático</w:t>
       </w:r>
@@ -8918,7 +8992,7 @@
       <w:pPr>
         <w:pStyle w:val="Ttulo2"/>
       </w:pPr>
-      <w:bookmarkStart w:id="8" w:name="_Toc244100697"/>
+      <w:bookmarkStart w:id="8" w:name="_Toc244178035"/>
       <w:r>
         <w:t>2.3. Sistemas inteligentes de apoyo a la decisión</w:t>
       </w:r>
@@ -8984,7 +9058,7 @@
         <w:pStyle w:val="Ttulo1"/>
         <w:pageBreakBefore/>
       </w:pPr>
-      <w:bookmarkStart w:id="9" w:name="_Toc244100698"/>
+      <w:bookmarkStart w:id="9" w:name="_Toc244178036"/>
       <w:r>
         <w:lastRenderedPageBreak/>
         <w:t>3. Metodología y arquitectura del sistema</w:t>
@@ -8995,7 +9069,7 @@
       <w:pPr>
         <w:pStyle w:val="Ttulo2"/>
       </w:pPr>
-      <w:bookmarkStart w:id="10" w:name="_Toc244100699"/>
+      <w:bookmarkStart w:id="10" w:name="_Toc244178037"/>
       <w:r>
         <w:t>3.1. Fuentes, variables y calidad de los datos</w:t>
       </w:r>
@@ -9015,7 +9089,7 @@
       <w:pPr>
         <w:pStyle w:val="Ttulo3"/>
       </w:pPr>
-      <w:bookmarkStart w:id="11" w:name="_Toc244100700"/>
+      <w:bookmarkStart w:id="11" w:name="_Toc244178038"/>
       <w:r>
         <w:rPr>
           <w:sz w:val="24"/>
@@ -9687,7 +9761,7 @@
       <w:pPr>
         <w:pStyle w:val="Ttulo3"/>
       </w:pPr>
-      <w:bookmarkStart w:id="13" w:name="_Toc244100701"/>
+      <w:bookmarkStart w:id="13" w:name="_Toc244178039"/>
       <w:r>
         <w:rPr>
           <w:sz w:val="24"/>
@@ -10430,7 +10504,7 @@
       <w:pPr>
         <w:pStyle w:val="Ttulo3"/>
       </w:pPr>
-      <w:bookmarkStart w:id="15" w:name="_Toc244100702"/>
+      <w:bookmarkStart w:id="15" w:name="_Toc244178040"/>
       <w:r>
         <w:rPr>
           <w:sz w:val="24"/>
@@ -10539,7 +10613,7 @@
       <w:pPr>
         <w:pStyle w:val="Ttulo3"/>
       </w:pPr>
-      <w:bookmarkStart w:id="16" w:name="_Toc244100703"/>
+      <w:bookmarkStart w:id="16" w:name="_Toc244178041"/>
       <w:r>
         <w:rPr>
           <w:sz w:val="24"/>
@@ -10563,7 +10637,7 @@
       <w:pPr>
         <w:pStyle w:val="Ttulo2"/>
       </w:pPr>
-      <w:bookmarkStart w:id="17" w:name="_Toc244100704"/>
+      <w:bookmarkStart w:id="17" w:name="_Toc244178042"/>
       <w:r>
         <w:t>3.2. Arquitectura, tecnologías y flujo de información</w:t>
       </w:r>
@@ -10638,7 +10712,7 @@
       <w:pPr>
         <w:pStyle w:val="Ttulo3"/>
       </w:pPr>
-      <w:bookmarkStart w:id="19" w:name="_Toc244100705"/>
+      <w:bookmarkStart w:id="19" w:name="_Toc244178043"/>
       <w:r>
         <w:rPr>
           <w:sz w:val="24"/>
@@ -10775,7 +10849,7 @@
       <w:pPr>
         <w:pStyle w:val="Ttulo3"/>
       </w:pPr>
-      <w:bookmarkStart w:id="20" w:name="_Toc244100706"/>
+      <w:bookmarkStart w:id="20" w:name="_Toc244178044"/>
       <w:r>
         <w:rPr>
           <w:sz w:val="24"/>
@@ -11785,7 +11859,7 @@
       <w:pPr>
         <w:pStyle w:val="Ttulo3"/>
       </w:pPr>
-      <w:bookmarkStart w:id="22" w:name="_Toc244100707"/>
+      <w:bookmarkStart w:id="22" w:name="_Toc244178045"/>
       <w:r>
         <w:rPr>
           <w:sz w:val="24"/>
@@ -11812,7 +11886,7 @@
       <w:pPr>
         <w:pStyle w:val="Ttulo3"/>
       </w:pPr>
-      <w:bookmarkStart w:id="23" w:name="_Toc244100708"/>
+      <w:bookmarkStart w:id="23" w:name="_Toc244178046"/>
       <w:r>
         <w:rPr>
           <w:sz w:val="24"/>
@@ -11823,7 +11897,7 @@
     </w:p>
     <w:p>
       <w:r>
-        <w:t>Los módulos generan salidas reproducibles a partir de datos y parámetros conocidos. La suite reúne 108 pruebas definidas para extracción, protección de credenciales, escritura raw, normalización, calidad, variables, selección temporal, modelos de ETc, explicabilidad XAI y reglas del motor. Incluye controles para impedir el uso de información posterior a la consulta. Las figuras y resúmenes se regeneran desde los archivos del proyecto.</w:t>
+        <w:t>Los módulos generan salidas reproducibles a partir de datos y parámetros conocidos. La suite reúne 150 pruebas definidas para extracción, protección de credenciales, escritura raw, normalización, calidad, variables, selección temporal, modelos de ETc, explicabilidad XAI y reglas del motor. Incluye controles para impedir el uso de información posterior a la consulta. Las figuras y resúmenes se regeneran desde los archivos del proyecto.</w:t>
       </w:r>
     </w:p>
     <w:p>
@@ -11835,7 +11909,7 @@
       <w:pPr>
         <w:pStyle w:val="Ttulo2"/>
       </w:pPr>
-      <w:bookmarkStart w:id="24" w:name="_Toc244100709"/>
+      <w:bookmarkStart w:id="24" w:name="_Toc244178047"/>
       <w:r>
         <w:t>3.3. Planificación y organización del proyecto</w:t>
       </w:r>
@@ -12481,7 +12555,7 @@
         <w:pStyle w:val="Ttulo1"/>
         <w:pageBreakBefore/>
       </w:pPr>
-      <w:bookmarkStart w:id="26" w:name="_Toc244100710"/>
+      <w:bookmarkStart w:id="26" w:name="_Toc244178048"/>
       <w:r>
         <w:lastRenderedPageBreak/>
         <w:t>4. Procesamiento de datos y aprendizaje automático</w:t>
@@ -12492,7 +12566,7 @@
       <w:pPr>
         <w:pStyle w:val="Ttulo2"/>
       </w:pPr>
-      <w:bookmarkStart w:id="27" w:name="_Toc244100711"/>
+      <w:bookmarkStart w:id="27" w:name="_Toc244178049"/>
       <w:r>
         <w:t>4.1. Extracción, transformación y almacenamiento de datos</w:t>
       </w:r>
@@ -12575,7 +12649,7 @@
       <w:pPr>
         <w:pStyle w:val="Ttulo3"/>
       </w:pPr>
-      <w:bookmarkStart w:id="29" w:name="_Toc244100712"/>
+      <w:bookmarkStart w:id="29" w:name="_Toc244178050"/>
       <w:r>
         <w:rPr>
           <w:sz w:val="24"/>
@@ -13164,7 +13238,7 @@
       <w:pPr>
         <w:pStyle w:val="Ttulo3"/>
       </w:pPr>
-      <w:bookmarkStart w:id="31" w:name="_Toc244100713"/>
+      <w:bookmarkStart w:id="31" w:name="_Toc244178051"/>
       <w:r>
         <w:rPr>
           <w:sz w:val="24"/>
@@ -13634,7 +13708,7 @@
       <w:pPr>
         <w:pStyle w:val="Ttulo3"/>
       </w:pPr>
-      <w:bookmarkStart w:id="33" w:name="_Toc244100714"/>
+      <w:bookmarkStart w:id="33" w:name="_Toc244178052"/>
       <w:r>
         <w:rPr>
           <w:sz w:val="24"/>
@@ -14420,7 +14494,7 @@
       <w:pPr>
         <w:pStyle w:val="Ttulo3"/>
       </w:pPr>
-      <w:bookmarkStart w:id="35" w:name="_Toc244100715"/>
+      <w:bookmarkStart w:id="35" w:name="_Toc244178053"/>
       <w:r>
         <w:rPr>
           <w:sz w:val="24"/>
@@ -14496,7 +14570,7 @@
       <w:pPr>
         <w:pStyle w:val="Ttulo3"/>
       </w:pPr>
-      <w:bookmarkStart w:id="36" w:name="_Toc244100716"/>
+      <w:bookmarkStart w:id="36" w:name="_Toc244178054"/>
       <w:r>
         <w:rPr>
           <w:sz w:val="24"/>
@@ -14645,7 +14719,7 @@
       <w:pPr>
         <w:pStyle w:val="Ttulo3"/>
       </w:pPr>
-      <w:bookmarkStart w:id="37" w:name="_Toc244100717"/>
+      <w:bookmarkStart w:id="37" w:name="_Toc244178055"/>
       <w:r>
         <w:rPr>
           <w:sz w:val="24"/>
@@ -17264,7 +17338,7 @@
       <w:pPr>
         <w:pStyle w:val="Ttulo3"/>
       </w:pPr>
-      <w:bookmarkStart w:id="42" w:name="_Toc244100718"/>
+      <w:bookmarkStart w:id="42" w:name="_Toc244178056"/>
       <w:r>
         <w:rPr>
           <w:sz w:val="24"/>
@@ -19255,7 +19329,7 @@
       <w:pPr>
         <w:pStyle w:val="Ttulo3"/>
       </w:pPr>
-      <w:bookmarkStart w:id="44" w:name="_Toc244100719"/>
+      <w:bookmarkStart w:id="44" w:name="_Toc244178057"/>
       <w:r>
         <w:rPr>
           <w:sz w:val="24"/>
@@ -20009,7 +20083,7 @@
       <w:pPr>
         <w:pStyle w:val="Ttulo3"/>
       </w:pPr>
-      <w:bookmarkStart w:id="46" w:name="_Toc244100720"/>
+      <w:bookmarkStart w:id="46" w:name="_Toc244178058"/>
       <w:r>
         <w:rPr>
           <w:sz w:val="24"/>
@@ -20036,7 +20110,7 @@
       <w:pPr>
         <w:pStyle w:val="Ttulo3"/>
       </w:pPr>
-      <w:bookmarkStart w:id="47" w:name="_Toc244100721"/>
+      <w:bookmarkStart w:id="47" w:name="_Toc244178059"/>
       <w:r>
         <w:rPr>
           <w:sz w:val="24"/>
@@ -20064,7 +20138,7 @@
       <w:pPr>
         <w:pStyle w:val="Ttulo3"/>
       </w:pPr>
-      <w:bookmarkStart w:id="48" w:name="_Toc244100722"/>
+      <w:bookmarkStart w:id="48" w:name="_Toc244178060"/>
       <w:r>
         <w:rPr>
           <w:sz w:val="24"/>
@@ -20082,7 +20156,7 @@
       <w:pPr>
         <w:pStyle w:val="Ttulo2"/>
       </w:pPr>
-      <w:bookmarkStart w:id="49" w:name="_Toc244100723"/>
+      <w:bookmarkStart w:id="49" w:name="_Toc244178061"/>
       <w:r>
         <w:t>4.2. Análisis exploratorio y preparación de variables</w:t>
       </w:r>
@@ -20097,7 +20171,7 @@
       <w:pPr>
         <w:pStyle w:val="Ttulo3"/>
       </w:pPr>
-      <w:bookmarkStart w:id="50" w:name="_Toc244100724"/>
+      <w:bookmarkStart w:id="50" w:name="_Toc244178062"/>
       <w:r>
         <w:rPr>
           <w:sz w:val="24"/>
@@ -20631,7 +20705,7 @@
       <w:pPr>
         <w:pStyle w:val="Ttulo3"/>
       </w:pPr>
-      <w:bookmarkStart w:id="53" w:name="_Toc244100725"/>
+      <w:bookmarkStart w:id="53" w:name="_Toc244178063"/>
       <w:r>
         <w:rPr>
           <w:sz w:val="24"/>
@@ -21702,7 +21776,7 @@
       <w:pPr>
         <w:pStyle w:val="Ttulo3"/>
       </w:pPr>
-      <w:bookmarkStart w:id="57" w:name="_Toc244100726"/>
+      <w:bookmarkStart w:id="57" w:name="_Toc244178064"/>
       <w:r>
         <w:rPr>
           <w:sz w:val="24"/>
@@ -21791,7 +21865,7 @@
       <w:pPr>
         <w:pStyle w:val="Ttulo3"/>
       </w:pPr>
-      <w:bookmarkStart w:id="59" w:name="_Toc244100727"/>
+      <w:bookmarkStart w:id="59" w:name="_Toc244178065"/>
       <w:r>
         <w:rPr>
           <w:sz w:val="24"/>
@@ -21874,7 +21948,7 @@
       <w:pPr>
         <w:pStyle w:val="Ttulo3"/>
       </w:pPr>
-      <w:bookmarkStart w:id="60" w:name="_Toc244100728"/>
+      <w:bookmarkStart w:id="60" w:name="_Toc244178066"/>
       <w:r>
         <w:rPr>
           <w:sz w:val="24"/>
@@ -22414,7 +22488,7 @@
       <w:pPr>
         <w:pStyle w:val="Ttulo3"/>
       </w:pPr>
-      <w:bookmarkStart w:id="62" w:name="_Toc244100729"/>
+      <w:bookmarkStart w:id="62" w:name="_Toc244178067"/>
       <w:r>
         <w:rPr>
           <w:sz w:val="24"/>
@@ -22442,7 +22516,7 @@
       <w:pPr>
         <w:pStyle w:val="Ttulo3"/>
       </w:pPr>
-      <w:bookmarkStart w:id="63" w:name="_Toc244100730"/>
+      <w:bookmarkStart w:id="63" w:name="_Toc244178068"/>
       <w:r>
         <w:rPr>
           <w:sz w:val="24"/>
@@ -22558,7 +22632,7 @@
       <w:pPr>
         <w:pStyle w:val="Ttulo2"/>
       </w:pPr>
-      <w:bookmarkStart w:id="64" w:name="_Toc244100731"/>
+      <w:bookmarkStart w:id="64" w:name="_Toc244178069"/>
       <w:r>
         <w:lastRenderedPageBreak/>
         <w:t>4.3. Desarrollo y evaluación del modelo predictivo</w:t>
@@ -22574,7 +22648,7 @@
       <w:pPr>
         <w:pStyle w:val="Ttulo3"/>
       </w:pPr>
-      <w:bookmarkStart w:id="65" w:name="_Toc244100732"/>
+      <w:bookmarkStart w:id="65" w:name="_Toc244178070"/>
       <w:r>
         <w:rPr>
           <w:sz w:val="24"/>
@@ -22602,7 +22676,7 @@
       <w:pPr>
         <w:pStyle w:val="Ttulo3"/>
       </w:pPr>
-      <w:bookmarkStart w:id="66" w:name="_Toc244100733"/>
+      <w:bookmarkStart w:id="66" w:name="_Toc244178071"/>
       <w:r>
         <w:rPr>
           <w:sz w:val="24"/>
@@ -22628,7 +22702,7 @@
       <w:pPr>
         <w:pStyle w:val="Ttulo3"/>
       </w:pPr>
-      <w:bookmarkStart w:id="67" w:name="_Toc244100734"/>
+      <w:bookmarkStart w:id="67" w:name="_Toc244178072"/>
       <w:r>
         <w:rPr>
           <w:sz w:val="24"/>
@@ -22769,7 +22843,7 @@
       <w:pPr>
         <w:pStyle w:val="Ttulo3"/>
       </w:pPr>
-      <w:bookmarkStart w:id="68" w:name="_Toc244100735"/>
+      <w:bookmarkStart w:id="68" w:name="_Toc244178073"/>
       <w:r>
         <w:rPr>
           <w:sz w:val="24"/>
@@ -22787,7 +22861,7 @@
       <w:pPr>
         <w:pStyle w:val="Ttulo3"/>
       </w:pPr>
-      <w:bookmarkStart w:id="69" w:name="_Toc244100736"/>
+      <w:bookmarkStart w:id="69" w:name="_Toc244178074"/>
       <w:r>
         <w:rPr>
           <w:sz w:val="24"/>
@@ -23562,7 +23636,7 @@
       <w:pPr>
         <w:pStyle w:val="Ttulo3"/>
       </w:pPr>
-      <w:bookmarkStart w:id="72" w:name="_Toc244100737"/>
+      <w:bookmarkStart w:id="72" w:name="_Toc244178075"/>
       <w:r>
         <w:rPr>
           <w:sz w:val="24"/>
@@ -24465,7 +24539,7 @@
       <w:pPr>
         <w:pStyle w:val="Ttulo3"/>
       </w:pPr>
-      <w:bookmarkStart w:id="75" w:name="_Toc244100738"/>
+      <w:bookmarkStart w:id="75" w:name="_Toc244178076"/>
       <w:r>
         <w:rPr>
           <w:sz w:val="24"/>
@@ -24499,7 +24573,7 @@
       <w:pPr>
         <w:pStyle w:val="Ttulo3"/>
       </w:pPr>
-      <w:bookmarkStart w:id="76" w:name="_Toc244100739"/>
+      <w:bookmarkStart w:id="76" w:name="_Toc244178077"/>
       <w:r>
         <w:rPr>
           <w:sz w:val="24"/>
@@ -24522,7 +24596,7 @@
       <w:pPr>
         <w:pStyle w:val="Ttulo3"/>
       </w:pPr>
-      <w:bookmarkStart w:id="77" w:name="_Toc244100740"/>
+      <w:bookmarkStart w:id="77" w:name="_Toc244178078"/>
       <w:r>
         <w:rPr>
           <w:sz w:val="24"/>
@@ -24545,7 +24619,7 @@
       <w:pPr>
         <w:pStyle w:val="Ttulo3"/>
       </w:pPr>
-      <w:bookmarkStart w:id="78" w:name="_Toc244100741"/>
+      <w:bookmarkStart w:id="78" w:name="_Toc244178079"/>
       <w:r>
         <w:lastRenderedPageBreak/>
         <w:t>4.3.10. Reentrenamiento con datos de 2026</w:t>
@@ -25275,7 +25349,7 @@
       <w:pPr>
         <w:pStyle w:val="Ttulo3"/>
       </w:pPr>
-      <w:bookmarkStart w:id="81" w:name="_Toc244100742"/>
+      <w:bookmarkStart w:id="81" w:name="_Toc244178080"/>
       <w:r>
         <w:t>4.3.11. Modelo de ETc para la aplicación</w:t>
       </w:r>
@@ -25888,7 +25962,7 @@
       <w:pPr>
         <w:pStyle w:val="Ttulo3"/>
       </w:pPr>
-      <w:bookmarkStart w:id="83" w:name="_Toc244100743"/>
+      <w:bookmarkStart w:id="83" w:name="_Toc244178081"/>
       <w:r>
         <w:t>4.3.12. Explicabilidad de los modelos de árboles</w:t>
       </w:r>
@@ -26591,17 +26665,47 @@
     </w:p>
     <w:p>
       <w:pPr>
+        <w:pStyle w:val="Ttulo3"/>
+      </w:pPr>
+      <w:bookmarkStart w:id="86" w:name="_Toc244178082"/>
+      <w:r>
+        <w:t>4.3.13. Predicción multianual de ET0 a siete días</w:t>
+      </w:r>
+      <w:bookmarkEnd w:id="86"/>
+    </w:p>
+    <w:p>
+      <w:r>
+        <w:t>Para superar la limitación de una única campaña por cultivo se planteó un experimento independiente sobre ET0 diaria de estación entre 2021 y 2025. Se entrenó Ridge para h=1…9: aunque la interfaz muestra siete fechas, con dos días de retraso SiAR hoy requiere h=2 y el séptimo día h=8; si se empieza mañana se requieren h=3…9. Cada horizonte dispone de un artefacto por AL01, Z06 y BA08. Las medias de 3, 7 y 14 días exigen ventanas completas y todas las entradas pertenecen a t o antes.</w:t>
+      </w:r>
+    </w:p>
+    <w:p>
+      <w:r>
+        <w:t>La validación con origen rodante prueba 2023, 2024 y 2025 entrenando solo con años anteriores. Ridge completo obtuvo menor MAE puntual que la media de siete días en las 81 combinaciones estación-año-horizonte. El bootstrap por bloques produjo 63 intervalos que excluyeron cero a favor de Ridge y 18 no concluyentes. En la ablación frente a Ridge reducido, 74 de 81 intervalos cruzaron cero y cinco favorecieron al reducido; por tanto, no se atribuye una ganancia estable a las variables meteorológicas auxiliares.</w:t>
+      </w:r>
+    </w:p>
+    <w:p>
+      <w:r>
+        <w:t>La cobertura retrospectiva de 2026 fue aproximadamente del 97 % con Ridge en AL01 y BA08. En Z06, SiAR solo devolvió 13 jornadas para enero-octubre y Ridge tuvo 0 % de cobertura tras exigir 14 observaciones completas. El sistema no fabrica esa serie: usa media de siete días durante un máximo de siete días y después declara la recomendación no disponible.</w:t>
+      </w:r>
+    </w:p>
+    <w:p>
+      <w:r>
+        <w:t>Streamlit genera una ET0 distinta para cada fecha, aplica ET0 × Kc, descuenta la lluvia AEMET utilizable y muestra el método y un intervalo residual central del 80 %. Una tarea diaria emite h=1…9 sin depender de aperturas de la aplicación, conserva el primer valor SiAR provisional, detecta revisiones y consolida tras siete días. Con 30 casos consolidados, Ridge se mantiene solo si su MAE prospectivo es menor que el de media de siete días; en caso contrario se activa automáticamente el respaldo físico. El reentrenamiento es anual y está sujeto al mismo control temporal.</w:t>
+      </w:r>
+    </w:p>
+    <w:p>
+      <w:pPr>
         <w:pStyle w:val="Ttulo1"/>
         <w:pageBreakBefore/>
       </w:pPr>
-      <w:bookmarkStart w:id="86" w:name="_Toc243495226"/>
-      <w:bookmarkStart w:id="87" w:name="_Toc244100744"/>
+      <w:bookmarkStart w:id="87" w:name="_Toc243495226"/>
+      <w:bookmarkStart w:id="88" w:name="_Toc244178083"/>
       <w:r>
         <w:lastRenderedPageBreak/>
         <w:t>5. Sistema de recomendación y resultados</w:t>
       </w:r>
-      <w:bookmarkEnd w:id="86"/>
       <w:bookmarkEnd w:id="87"/>
+      <w:bookmarkEnd w:id="88"/>
     </w:p>
     <w:p>
       <w:r>
@@ -26612,11 +26716,11 @@
       <w:pPr>
         <w:pStyle w:val="Ttulo2"/>
       </w:pPr>
-      <w:bookmarkStart w:id="88" w:name="_Toc244100745"/>
+      <w:bookmarkStart w:id="89" w:name="_Toc244178084"/>
       <w:r>
         <w:t>5.1. Diseño del sistema de recomendación de riego</w:t>
       </w:r>
-      <w:bookmarkEnd w:id="88"/>
+      <w:bookmarkEnd w:id="89"/>
     </w:p>
     <w:p>
       <w:r>
@@ -26632,14 +26736,14 @@
       <w:pPr>
         <w:pStyle w:val="Ttulo3"/>
       </w:pPr>
-      <w:bookmarkStart w:id="89" w:name="_Toc244100746"/>
+      <w:bookmarkStart w:id="90" w:name="_Toc244178085"/>
       <w:r>
         <w:rPr>
           <w:sz w:val="24"/>
         </w:rPr>
         <w:t>5.1.1. Requisitos de partida</w:t>
       </w:r>
-      <w:bookmarkEnd w:id="89"/>
+      <w:bookmarkEnd w:id="90"/>
     </w:p>
     <w:p>
       <w:r>
@@ -26659,14 +26763,14 @@
       <w:pPr>
         <w:pStyle w:val="Ttulo3"/>
       </w:pPr>
-      <w:bookmarkStart w:id="90" w:name="_Toc244100747"/>
+      <w:bookmarkStart w:id="91" w:name="_Toc244178086"/>
       <w:r>
         <w:rPr>
           <w:sz w:val="24"/>
         </w:rPr>
         <w:t>5.1.2. Arquitectura del motor</w:t>
       </w:r>
-      <w:bookmarkEnd w:id="90"/>
+      <w:bookmarkEnd w:id="91"/>
     </w:p>
     <w:p>
       <w:r>
@@ -26725,7 +26829,7 @@
         <w:keepLines/>
         <w:jc w:val="center"/>
       </w:pPr>
-      <w:bookmarkStart w:id="91" w:name="idx_fig_5_1"/>
+      <w:bookmarkStart w:id="92" w:name="idx_fig_5_1"/>
       <w:r>
         <w:rPr>
           <w:i/>
@@ -26733,7 +26837,7 @@
         </w:rPr>
         <w:t>Figura 5.1. Flujo simplificado del motor retrospectivo de 2025.</w:t>
       </w:r>
-      <w:bookmarkEnd w:id="91"/>
+      <w:bookmarkEnd w:id="92"/>
     </w:p>
     <w:p>
       <w:r>
@@ -26744,7 +26848,7 @@
       <w:pPr>
         <w:pStyle w:val="Ttulo3"/>
       </w:pPr>
-      <w:bookmarkStart w:id="92" w:name="_Toc244100748"/>
+      <w:bookmarkStart w:id="93" w:name="_Toc244178087"/>
       <w:r>
         <w:rPr>
           <w:sz w:val="24"/>
@@ -26752,7 +26856,7 @@
         <w:lastRenderedPageBreak/>
         <w:t>5.1.3. Estimación de la necesidad neta</w:t>
       </w:r>
-      <w:bookmarkEnd w:id="92"/>
+      <w:bookmarkEnd w:id="93"/>
     </w:p>
     <w:p>
       <w:r>
@@ -26776,7 +26880,7 @@
     </w:p>
     <w:p>
       <w:r>
-        <w:t>La vía preferente utiliza una ET0 prevista solo cuando se proporciona como entrada explícita. El prototipo no descarga ni calcula automáticamente ese pronóstico; los productos de SiAR y una estimación derivada de AEMET son posibilidades futuras pendientes de evaluación. La necesidad se obtiene multiplicando esa ET0 por el Kc del día. La segunda vía, que es la que se emplea por defecto en el piloto porque no se dispone de un histórico de predicciones alineado con la campaña, sustituye la ET0 futura por la media de la ET0 observada en los siete días anteriores y la combina con el Kc del día objetivo. La tercera vía es la persistencia del apartado 4.3: se repite la última necesidad neta conocida. Solo se recurre a ella cuando no hay ninguna ET0 reciente, y en todos los casos su valor se guarda junto a la recomendación como referencia de comparación.</w:t>
+        <w:t>La vía preferente utiliza la ET0 prevista por el modelo Ridge multianual del apartado 4.3.13. La aplicación calcula una predicción específica para cada uno de los siete días y la multiplica por el Kc de la fecha. Si faltan las ventanas completas o el control prospectivo desactiva Ridge, la segunda vía usa la media de la ET0 observada en los siete días anteriores. No se prolonga indefinidamente: con una observación de más de siete días se declara la salida no disponible. La tercera vía es la persistencia del apartado 4.3; solo se recurre a ella cuando no hay ET0 reciente suficiente y se conserva como referencia trazable.</w:t>
       </w:r>
     </w:p>
     <w:p>
@@ -26793,7 +26897,7 @@
       <w:pPr>
         <w:pStyle w:val="Ttulo3"/>
       </w:pPr>
-      <w:bookmarkStart w:id="93" w:name="_Toc244100749"/>
+      <w:bookmarkStart w:id="94" w:name="_Toc244178088"/>
       <w:r>
         <w:rPr>
           <w:sz w:val="24"/>
@@ -26801,7 +26905,7 @@
         <w:lastRenderedPageBreak/>
         <w:t>5.1.4. Reglas de decisión</w:t>
       </w:r>
-      <w:bookmarkEnd w:id="93"/>
+      <w:bookmarkEnd w:id="94"/>
     </w:p>
     <w:p>
       <w:r>
@@ -26813,14 +26917,14 @@
         <w:pStyle w:val="ndicetablaTFM"/>
         <w:spacing w:after="120"/>
       </w:pPr>
-      <w:bookmarkStart w:id="94" w:name="idx_tbl_5_1"/>
+      <w:bookmarkStart w:id="95" w:name="idx_tbl_5_1"/>
       <w:r>
         <w:rPr>
           <w:b/>
         </w:rPr>
         <w:t>Tabla 5.1. Reglas aplicadas por el motor de recomendación.</w:t>
       </w:r>
-      <w:bookmarkEnd w:id="94"/>
+      <w:bookmarkEnd w:id="95"/>
     </w:p>
     <w:tbl>
       <w:tblPr>
@@ -27677,14 +27781,14 @@
       <w:pPr>
         <w:pStyle w:val="Ttulo3"/>
       </w:pPr>
-      <w:bookmarkStart w:id="95" w:name="_Toc244100750"/>
+      <w:bookmarkStart w:id="96" w:name="_Toc244178089"/>
       <w:r>
         <w:rPr>
           <w:sz w:val="24"/>
         </w:rPr>
         <w:t>5.1.5. Estructura de la salida</w:t>
       </w:r>
-      <w:bookmarkEnd w:id="95"/>
+      <w:bookmarkEnd w:id="96"/>
     </w:p>
     <w:p>
       <w:r>
@@ -27700,7 +27804,7 @@
       <w:pPr>
         <w:pStyle w:val="Ttulo3"/>
       </w:pPr>
-      <w:bookmarkStart w:id="96" w:name="_Toc244100751"/>
+      <w:bookmarkStart w:id="97" w:name="_Toc244178090"/>
       <w:r>
         <w:rPr>
           <w:sz w:val="24"/>
@@ -27708,31 +27812,31 @@
         <w:lastRenderedPageBreak/>
         <w:t>5.1.6. Decisiones descartadas</w:t>
       </w:r>
-      <w:bookmarkEnd w:id="96"/>
-    </w:p>
-    <w:p>
-      <w:r>
-        <w:t>Durante el diseño original se valoró el modelo Ridge de necesidad neta del apartado 4.3 como motor principal. Se descartó porque no superó de forma estable a la persistencia y porque ante cambios de fase es menos transparente que la vía ET0 por Kc. Ese experimento es distinto del modelo Ridge de ETc para coliflor, que la aplicación actual muestra solo como contraste. También se descartó calcular ET0 futura con Hargreaves a partir de temperatura AEMET por falta de predicciones históricas para calibrarla (Allen et al., 1998). El motor admite una ET0 prevista explícita para una integración posterior. Un balance hídrico del suelo permitiría decidir cuándo regar, pero requiere capacidad de retención, profundidad radicular y riegos previos no disponibles en el piloto.</w:t>
+      <w:bookmarkEnd w:id="97"/>
+    </w:p>
+    <w:p>
+      <w:r>
+        <w:t>Durante el diseño se descartó como motor principal el Ridge de necesidad neta del apartado 4.3 porque no superó de forma estable a la persistencia y mezclaría demanda y lluvia en una sola etiqueta. Esto no debe confundirse con el Ridge multianual de ET0 del apartado 4.3.13, que predice una variable meteorológica anterior a Kc y a la precipitación. También se descartó calcular ET0 futura mediante Hargreaves con temperaturas AEMET por falta de emisiones históricas calibrables. El balance hídrico del suelo permitiría decidir cuándo regar, pero requiere capacidad de retención, profundidad radicular y riegos previos no disponibles en el piloto.</w:t>
       </w:r>
     </w:p>
     <w:p>
       <w:pPr>
         <w:pStyle w:val="Ttulo3"/>
       </w:pPr>
-      <w:bookmarkStart w:id="97" w:name="_Toc244100752"/>
+      <w:bookmarkStart w:id="98" w:name="_Toc244178091"/>
       <w:r>
         <w:t>5.1.7. Integración operativa de ETc y AEMET</w:t>
       </w:r>
-      <w:bookmarkEnd w:id="97"/>
-    </w:p>
-    <w:p>
-      <w:r>
-        <w:t>La versión 1.1 del motor distingue la ETc estimada antes de lluvia, la precipitación AEMET disponible, la fracción efectiva supuesta, la necesidad neta y la dosis bruta. La predicción del modelo y el cálculo físico se comparan en la interfaz junto con sus MAE de prueba. El modelo solo interviene en el primer día si la observación SiAR del día anterior existe y su error histórico fue menor. Los días 2 a 7 mantienen la estimación física provisional. El CSV registra el método aplicado y, cuando procede, el modelo y la última fecha utilizada en su entrenamiento.</w:t>
-      </w:r>
-    </w:p>
-    <w:p>
-      <w:r>
-        <w:t>En la versión evaluada, el cálculo físico supera al modelo de ETc en cinco de los seis casos. El único caso habilitado para determinar la dosis mediante el modelo es algodón BA08, que estaba fuera de ciclo durante la demostración de octubre de 2026. Por ello, en los cultivos activos de la aplicación la dosis principal procede del cálculo ET0 reciente × Kc; el modelo de ETc se conserva como resultado comparativo y trazable, no como motor operativo general.</w:t>
+      <w:bookmarkEnd w:id="98"/>
+    </w:p>
+    <w:p>
+      <w:r>
+        <w:t>Para cada fecha del horizonte, el sistema calcula la ET0 con el Ridge de la estación y horizonte correspondientes, la transforma en ETc mediante Kc y la entrega al motor como demanda anterior a la lluvia. La previsión AEMET, si aporta milímetros horarios completos, se descuenta una sola vez usando la fracción aprovechable indicada por el usuario. Con dos días de retraso SiAR, hoy usa h=2 y el séptimo día h=8; si la consulta comienza mañana utiliza h=3…9. Si faltan datos o cobertura, se aplica el respaldo físico o se declara ausencia de recomendación.</w:t>
+      </w:r>
+    </w:p>
+    <w:p>
+      <w:r>
+        <w:t>El modelo directo de ETc se conserva únicamente como comparación: el cálculo físico lo supera en cinco de los seis casos. La vía operativa es el Ridge de ET0 multianual cuando supera los controles de cobertura y monitorización; en caso contrario se aplica la media reciente o se declara ausencia de cobertura.</w:t>
       </w:r>
     </w:p>
     <w:p>
@@ -27744,11 +27848,11 @@
       <w:pPr>
         <w:pStyle w:val="Ttulo2"/>
       </w:pPr>
-      <w:bookmarkStart w:id="98" w:name="_Toc244100753"/>
+      <w:bookmarkStart w:id="99" w:name="_Toc244178092"/>
       <w:r>
         <w:t>5.2. Aplicación y visualización de resultados</w:t>
       </w:r>
-      <w:bookmarkEnd w:id="98"/>
+      <w:bookmarkEnd w:id="99"/>
     </w:p>
     <w:p>
       <w:r>
@@ -27759,19 +27863,22 @@
       <w:pPr>
         <w:pStyle w:val="Ttulo3"/>
       </w:pPr>
-      <w:bookmarkStart w:id="99" w:name="_Toc244100754"/>
+      <w:bookmarkStart w:id="100" w:name="_Toc244178093"/>
       <w:r>
         <w:rPr>
           <w:sz w:val="24"/>
         </w:rPr>
+        <w:t>5.2.1. Elección de la tecnología de presentación</w:t>
+      </w:r>
+      <w:bookmarkEnd w:id="100"/>
+    </w:p>
+    <w:p>
+      <w:r>
+        <w:t xml:space="preserve">El anteproyecto contemplaba un cuadro de mando en Power BI o Tableau. Se mantuvo esa opción hasta disponer de un motor funcional, y en ese momento se comprobó que la herramienta </w:t>
+      </w:r>
+      <w:r>
         <w:lastRenderedPageBreak/>
-        <w:t>5.2.1. Elección de la tecnología de presentación</w:t>
-      </w:r>
-      <w:bookmarkEnd w:id="99"/>
-    </w:p>
-    <w:p>
-      <w:r>
-        <w:t>El anteproyecto contemplaba un cuadro de mando en Power BI o Tableau. Se mantuvo esa opción hasta disponer de un motor funcional, y en ese momento se comprobó que la herramienta debía cumplir dos condiciones que un cuadro de mando convencional resuelve con dificultad. La primera es interactiva: cambiar la fecha de emisión, el horizonte o la eficiencia tiene que volver a ejecutar el motor, no solo filtrar una tabla ya calculada. La segunda es de reproducibilidad: cualquier evaluador o miembro del equipo debería poder lanzar la aplicación desde el repositorio con las mismas dependencias que el resto del proyecto.</w:t>
+        <w:t>debía cumplir dos condiciones que un cuadro de mando convencional resuelve con dificultad. La primera es interactiva: cambiar la fecha de emisión, el horizonte o la eficiencia tiene que volver a ejecutar el motor, no solo filtrar una tabla ya calculada. La segunda es de reproducibilidad: cualquier evaluador o miembro del equipo debería poder lanzar la aplicación desde el repositorio con las mismas dependencias que el resto del proyecto.</w:t>
       </w:r>
     </w:p>
     <w:p>
@@ -27783,14 +27890,14 @@
       <w:pPr>
         <w:pStyle w:val="Ttulo3"/>
       </w:pPr>
-      <w:bookmarkStart w:id="100" w:name="_Toc244100755"/>
+      <w:bookmarkStart w:id="101" w:name="_Toc244178094"/>
       <w:r>
         <w:rPr>
           <w:sz w:val="24"/>
         </w:rPr>
         <w:t>5.2.2. Organización de la interfaz</w:t>
       </w:r>
-      <w:bookmarkEnd w:id="100"/>
+      <w:bookmarkEnd w:id="101"/>
     </w:p>
     <w:p>
       <w:r>
@@ -27811,22 +27918,18 @@
       <w:pPr>
         <w:pStyle w:val="Ttulo3"/>
       </w:pPr>
-      <w:bookmarkStart w:id="101" w:name="_Toc244100756"/>
+      <w:bookmarkStart w:id="102" w:name="_Toc244178095"/>
       <w:r>
         <w:rPr>
           <w:sz w:val="24"/>
         </w:rPr>
         <w:t>5.2.3. Ejemplo de uso en un cambio de fase del cultivo</w:t>
       </w:r>
-      <w:bookmarkEnd w:id="101"/>
-    </w:p>
-    <w:p>
-      <w:r>
-        <w:t xml:space="preserve">El ejemplo histórico analiza una planificación emitida el 28 de junio de 2025 con siete días de horizonte; cruza el cambio de Kc de 0,70 a 0,90 el 1 de julio. Supone goteo con eficiencia del 90 % </w:t>
-      </w:r>
-      <w:r>
-        <w:lastRenderedPageBreak/>
-        <w:t>y una parcela de 1,5 ha. La Figura 5.2 conserva una captura de la versión anterior de la interfaz con la referencia SiAR superpuesta. La interfaz pública actual se organiza como describe 5.2.2.</w:t>
+      <w:bookmarkEnd w:id="102"/>
+    </w:p>
+    <w:p>
+      <w:r>
+        <w:t>El ejemplo histórico analiza una planificación emitida el 28 de junio de 2025 con siete días de horizonte; cruza el cambio de Kc de 0,70 a 0,90 el 1 de julio. Supone goteo con eficiencia del 90 % y una parcela de 1,5 ha. La Figura 5.2 conserva una captura de la versión anterior de la interfaz con la referencia SiAR superpuesta. La interfaz pública actual se organiza como describe 5.2.2.</w:t>
       </w:r>
     </w:p>
     <w:p>
@@ -27838,6 +27941,7 @@
         <w:rPr>
           <w:noProof/>
         </w:rPr>
+        <w:lastRenderedPageBreak/>
         <w:drawing>
           <wp:inline distT="0" distB="0" distL="0" distR="0" wp14:anchorId="3E2F1CF6" wp14:editId="3076D4AC">
             <wp:extent cx="5577840" cy="4648200"/>
@@ -27881,7 +27985,7 @@
         <w:keepLines/>
         <w:jc w:val="center"/>
       </w:pPr>
-      <w:bookmarkStart w:id="102" w:name="idx_fig_5_2"/>
+      <w:bookmarkStart w:id="103" w:name="idx_fig_5_2"/>
       <w:r>
         <w:rPr>
           <w:i/>
@@ -27889,7 +27993,7 @@
         </w:rPr>
         <w:t>Figura 5.2. Captura de la interfaz anterior para la planificación histórica emitida el 28 de junio de 2025, con referencia SiAR superpuesta.</w:t>
       </w:r>
-      <w:bookmarkEnd w:id="102"/>
+      <w:bookmarkEnd w:id="103"/>
     </w:p>
     <w:p>
       <w:r>
@@ -27901,7 +28005,7 @@
         <w:pStyle w:val="ndicetablaTFM"/>
         <w:spacing w:after="120"/>
       </w:pPr>
-      <w:bookmarkStart w:id="103" w:name="idx_tbl_5_2"/>
+      <w:bookmarkStart w:id="104" w:name="idx_tbl_5_2"/>
       <w:r>
         <w:rPr>
           <w:b/>
@@ -27909,7 +28013,7 @@
         <w:lastRenderedPageBreak/>
         <w:t>Tabla 5.2. Planificación emitida el 28 de junio de 2025 frente a la referencia SiAR.</w:t>
       </w:r>
-      <w:bookmarkEnd w:id="103"/>
+      <w:bookmarkEnd w:id="104"/>
     </w:p>
     <w:tbl>
       <w:tblPr>
@@ -29761,14 +29865,14 @@
       <w:pPr>
         <w:pStyle w:val="Ttulo3"/>
       </w:pPr>
-      <w:bookmarkStart w:id="104" w:name="_Toc244100757"/>
+      <w:bookmarkStart w:id="105" w:name="_Toc244178096"/>
       <w:r>
         <w:rPr>
           <w:sz w:val="24"/>
         </w:rPr>
         <w:t>5.2.4. Uso desde la línea de comandos</w:t>
       </w:r>
-      <w:bookmarkEnd w:id="104"/>
+      <w:bookmarkEnd w:id="105"/>
     </w:p>
     <w:p>
       <w:r>
@@ -29788,14 +29892,14 @@
       <w:pPr>
         <w:pStyle w:val="Ttulo3"/>
       </w:pPr>
-      <w:bookmarkStart w:id="105" w:name="_Toc244100758"/>
+      <w:bookmarkStart w:id="106" w:name="_Toc244178097"/>
       <w:r>
         <w:rPr>
           <w:sz w:val="24"/>
         </w:rPr>
         <w:t>5.2.5. Visualización de la campaña</w:t>
       </w:r>
-      <w:bookmarkEnd w:id="105"/>
+      <w:bookmarkEnd w:id="106"/>
     </w:p>
     <w:p>
       <w:r>
@@ -29806,29 +29910,29 @@
       <w:pPr>
         <w:pStyle w:val="Ttulo3"/>
       </w:pPr>
-      <w:bookmarkStart w:id="106" w:name="_Toc244100759"/>
+      <w:bookmarkStart w:id="107" w:name="_Toc244178098"/>
       <w:r>
         <w:rPr>
           <w:sz w:val="24"/>
         </w:rPr>
         <w:t>5.2.6. Limitaciones de la aplicación</w:t>
       </w:r>
-      <w:bookmarkEnd w:id="106"/>
-    </w:p>
-    <w:p>
-      <w:r>
-        <w:t>La aplicación es una demostración pública sin cuentas de usuario ni histórico de riego por parcela. Lee CSV verificados y puede actualizar en memoria el caso vigente desde SiAR. Para hoy suma solo las horas futuras de lluvia AEMET que tienen cantidad numérica utilizable; para mañana exige cobertura horaria completa. Una emisión antigua o sin milímetros útiles deja la dosis base sin descuento. La dosis de hoy representa el día completo: la aplicación desconoce el riego y la lluvia ya ocurridos, por lo que el usuario debe ajustarla antes de aplicarla. No calcula ET0 futura a partir de la temperatura ni dispone de emisiones pasadas para evaluar AEMET. Los días posteriores al primero son orientativos y deben recalcularse. Tampoco se ha probado la interfaz con agricultores o técnicos (Rose et al., 2016).</w:t>
+      <w:bookmarkEnd w:id="107"/>
+    </w:p>
+    <w:p>
+      <w:r>
+        <w:t>La aplicación es una demostración pública sin cuentas de usuario ni histórico de riego por parcela. La ET0 prevista se calcula con el modelo multianual de la estación; AEMET aporta la lluvia prevista, no la ET0. Para hoy solo se descuentan horas futuras con cantidad numérica utilizable y para mañana se exige cobertura horaria completa. La dosis de hoy representa el día completo y debe ajustarse si ya se ha regado. Faltan datos de suelo, riego aplicado y validación agronómica en campo; tampoco se ha probado la interfaz con agricultores o técnicos.</w:t>
       </w:r>
     </w:p>
     <w:p>
       <w:pPr>
         <w:pStyle w:val="Ttulo2"/>
       </w:pPr>
-      <w:bookmarkStart w:id="107" w:name="_Toc244100760"/>
+      <w:bookmarkStart w:id="108" w:name="_Toc244178099"/>
       <w:r>
         <w:t>5.3. Validación, resultados y análisis crítico</w:t>
       </w:r>
-      <w:bookmarkEnd w:id="107"/>
+      <w:bookmarkEnd w:id="108"/>
     </w:p>
     <w:p>
       <w:r>
@@ -29844,7 +29948,7 @@
       <w:pPr>
         <w:pStyle w:val="Ttulo3"/>
       </w:pPr>
-      <w:bookmarkStart w:id="108" w:name="_Toc244100761"/>
+      <w:bookmarkStart w:id="109" w:name="_Toc244178100"/>
       <w:r>
         <w:rPr>
           <w:sz w:val="24"/>
@@ -29852,7 +29956,7 @@
         <w:lastRenderedPageBreak/>
         <w:t>5.3.1. Fidelidad de la vía agronómica</w:t>
       </w:r>
-      <w:bookmarkEnd w:id="108"/>
+      <w:bookmarkEnd w:id="109"/>
     </w:p>
     <w:p>
       <w:r>
@@ -29868,14 +29972,14 @@
       <w:pPr>
         <w:pStyle w:val="Ttulo3"/>
       </w:pPr>
-      <w:bookmarkStart w:id="109" w:name="_Toc244100762"/>
+      <w:bookmarkStart w:id="110" w:name="_Toc244178101"/>
       <w:r>
         <w:rPr>
           <w:sz w:val="24"/>
         </w:rPr>
         <w:t>5.3.2. Selección de la ventana de ET0</w:t>
       </w:r>
-      <w:bookmarkEnd w:id="109"/>
+      <w:bookmarkEnd w:id="110"/>
     </w:p>
     <w:p>
       <w:r>
@@ -29887,14 +29991,14 @@
         <w:pStyle w:val="ndicetablaTFM"/>
         <w:spacing w:after="120"/>
       </w:pPr>
-      <w:bookmarkStart w:id="110" w:name="idx_tbl_5_3"/>
+      <w:bookmarkStart w:id="111" w:name="idx_tbl_5_3"/>
       <w:r>
         <w:rPr>
           <w:b/>
         </w:rPr>
         <w:t>Tabla 5.3. MAE medio de los horizontes 1 a 7 según la ventana de ET0 (mm/día).</w:t>
       </w:r>
-      <w:bookmarkEnd w:id="110"/>
+      <w:bookmarkEnd w:id="111"/>
     </w:p>
     <w:tbl>
       <w:tblPr>
@@ -30376,14 +30480,14 @@
       <w:pPr>
         <w:pStyle w:val="Ttulo3"/>
       </w:pPr>
-      <w:bookmarkStart w:id="111" w:name="_Toc244100763"/>
+      <w:bookmarkStart w:id="112" w:name="_Toc244178102"/>
       <w:r>
         <w:rPr>
           <w:sz w:val="24"/>
         </w:rPr>
         <w:t>5.3.3. Error de la recomendación a un día</w:t>
       </w:r>
-      <w:bookmarkEnd w:id="111"/>
+      <w:bookmarkEnd w:id="112"/>
     </w:p>
     <w:p>
       <w:r>
@@ -30395,14 +30499,14 @@
         <w:pStyle w:val="ndicetablaTFM"/>
         <w:spacing w:after="120"/>
       </w:pPr>
-      <w:bookmarkStart w:id="112" w:name="idx_tbl_5_4"/>
+      <w:bookmarkStart w:id="113" w:name="idx_tbl_5_4"/>
       <w:r>
         <w:rPr>
           <w:b/>
         </w:rPr>
         <w:t>Tabla 5.4. Error de la recomendación a un día frente a la referencia SiAR.</w:t>
       </w:r>
-      <w:bookmarkEnd w:id="112"/>
+      <w:bookmarkEnd w:id="113"/>
     </w:p>
     <w:tbl>
       <w:tblPr>
@@ -31231,7 +31335,7 @@
         <w:keepLines/>
         <w:jc w:val="center"/>
       </w:pPr>
-      <w:bookmarkStart w:id="113" w:name="idx_fig_5_3"/>
+      <w:bookmarkStart w:id="114" w:name="idx_fig_5_3"/>
       <w:r>
         <w:rPr>
           <w:i/>
@@ -31239,7 +31343,7 @@
         </w:rPr>
         <w:t>Figura 5.3. Recomendaciones emitidas cada día con la información del día anterior y error frente a la referencia SiAR.</w:t>
       </w:r>
-      <w:bookmarkEnd w:id="113"/>
+      <w:bookmarkEnd w:id="114"/>
     </w:p>
     <w:p>
       <w:r>
@@ -31255,7 +31359,7 @@
       <w:pPr>
         <w:pStyle w:val="Ttulo3"/>
       </w:pPr>
-      <w:bookmarkStart w:id="114" w:name="_Toc244100764"/>
+      <w:bookmarkStart w:id="115" w:name="_Toc244178103"/>
       <w:r>
         <w:rPr>
           <w:sz w:val="24"/>
@@ -31263,7 +31367,7 @@
         <w:lastRenderedPageBreak/>
         <w:t>5.3.4. Error según el horizonte de planificación</w:t>
       </w:r>
-      <w:bookmarkEnd w:id="114"/>
+      <w:bookmarkEnd w:id="115"/>
     </w:p>
     <w:p>
       <w:r>
@@ -31322,7 +31426,7 @@
         <w:keepLines/>
         <w:jc w:val="center"/>
       </w:pPr>
-      <w:bookmarkStart w:id="115" w:name="idx_fig_5_4"/>
+      <w:bookmarkStart w:id="116" w:name="idx_fig_5_4"/>
       <w:r>
         <w:rPr>
           <w:i/>
@@ -31330,21 +31434,21 @@
         </w:rPr>
         <w:t>Figura 5.4. MAE diario según el día del horizonte en los periodos de desarrollo y prueba.</w:t>
       </w:r>
-      <w:bookmarkEnd w:id="115"/>
+      <w:bookmarkEnd w:id="116"/>
     </w:p>
     <w:p>
       <w:pPr>
         <w:pStyle w:val="ndicetablaTFM"/>
         <w:spacing w:after="120"/>
       </w:pPr>
-      <w:bookmarkStart w:id="116" w:name="idx_tbl_5_5"/>
+      <w:bookmarkStart w:id="117" w:name="idx_tbl_5_5"/>
       <w:r>
         <w:rPr>
           <w:b/>
         </w:rPr>
         <w:t>Tabla 5.5. MAE diario según el día del horizonte (mm/día).</w:t>
       </w:r>
-      <w:bookmarkEnd w:id="116"/>
+      <w:bookmarkEnd w:id="117"/>
     </w:p>
     <w:tbl>
       <w:tblPr>
@@ -32364,14 +32468,14 @@
       <w:pPr>
         <w:pStyle w:val="Ttulo3"/>
       </w:pPr>
-      <w:bookmarkStart w:id="117" w:name="_Toc244100765"/>
+      <w:bookmarkStart w:id="118" w:name="_Toc244178104"/>
       <w:r>
         <w:rPr>
           <w:sz w:val="24"/>
         </w:rPr>
         <w:t>5.3.5. Coherencia semanal</w:t>
       </w:r>
-      <w:bookmarkEnd w:id="117"/>
+      <w:bookmarkEnd w:id="118"/>
     </w:p>
     <w:p>
       <w:r>
@@ -32431,7 +32535,7 @@
         <w:keepLines/>
         <w:jc w:val="center"/>
       </w:pPr>
-      <w:bookmarkStart w:id="118" w:name="idx_fig_5_5"/>
+      <w:bookmarkStart w:id="119" w:name="idx_fig_5_5"/>
       <w:r>
         <w:rPr>
           <w:i/>
@@ -32439,7 +32543,7 @@
         </w:rPr>
         <w:t>Figura 5.5. Necesidad neta semanal planificada por el DSS frente a la referencia SiAR y dosis bruta para riego por goteo.</w:t>
       </w:r>
-      <w:bookmarkEnd w:id="118"/>
+      <w:bookmarkEnd w:id="119"/>
     </w:p>
     <w:p>
       <w:r>
@@ -32455,14 +32559,14 @@
       <w:pPr>
         <w:pStyle w:val="Ttulo3"/>
       </w:pPr>
-      <w:bookmarkStart w:id="119" w:name="_Toc244100766"/>
+      <w:bookmarkStart w:id="120" w:name="_Toc244178105"/>
       <w:r>
         <w:rPr>
           <w:sz w:val="24"/>
         </w:rPr>
         <w:t>5.3.6. Sensibilidad a la eficiencia del riego</w:t>
       </w:r>
-      <w:bookmarkEnd w:id="119"/>
+      <w:bookmarkEnd w:id="120"/>
     </w:p>
     <w:p>
       <w:r>
@@ -32474,14 +32578,14 @@
         <w:pStyle w:val="ndicetablaTFM"/>
         <w:spacing w:after="120"/>
       </w:pPr>
-      <w:bookmarkStart w:id="120" w:name="idx_tbl_5_6"/>
+      <w:bookmarkStart w:id="121" w:name="idx_tbl_5_6"/>
       <w:r>
         <w:rPr>
           <w:b/>
         </w:rPr>
         <w:t>Tabla 5.6. Dosis bruta de los 148 días con referencia válida según el sistema de riego.</w:t>
       </w:r>
-      <w:bookmarkEnd w:id="120"/>
+      <w:bookmarkEnd w:id="121"/>
     </w:p>
     <w:tbl>
       <w:tblPr>
@@ -32916,14 +33020,14 @@
       <w:pPr>
         <w:pStyle w:val="Ttulo3"/>
       </w:pPr>
-      <w:bookmarkStart w:id="121" w:name="_Toc244100767"/>
+      <w:bookmarkStart w:id="122" w:name="_Toc244178106"/>
       <w:r>
         <w:rPr>
           <w:sz w:val="24"/>
         </w:rPr>
         <w:t>5.3.7. Escenarios de robustez y trazabilidad</w:t>
       </w:r>
-      <w:bookmarkEnd w:id="121"/>
+      <w:bookmarkEnd w:id="122"/>
     </w:p>
     <w:p>
       <w:r>
@@ -32935,14 +33039,14 @@
         <w:pStyle w:val="ndicetablaTFM"/>
         <w:spacing w:after="120"/>
       </w:pPr>
-      <w:bookmarkStart w:id="122" w:name="idx_tbl_5_7"/>
+      <w:bookmarkStart w:id="123" w:name="idx_tbl_5_7"/>
       <w:r>
         <w:rPr>
           <w:b/>
         </w:rPr>
         <w:t>Tabla 5.7. Escenarios de validación del comportamiento del sistema.</w:t>
       </w:r>
-      <w:bookmarkEnd w:id="122"/>
+      <w:bookmarkEnd w:id="123"/>
     </w:p>
     <w:tbl>
       <w:tblPr>
@@ -34007,14 +34111,14 @@
       <w:pPr>
         <w:pStyle w:val="Ttulo3"/>
       </w:pPr>
-      <w:bookmarkStart w:id="123" w:name="_Toc244100768"/>
+      <w:bookmarkStart w:id="124" w:name="_Toc244178107"/>
       <w:r>
         <w:rPr>
           <w:sz w:val="24"/>
         </w:rPr>
         <w:t>5.3.8. Rendimiento operativo</w:t>
       </w:r>
-      <w:bookmarkEnd w:id="123"/>
+      <w:bookmarkEnd w:id="124"/>
     </w:p>
     <w:p>
       <w:r>
@@ -34025,14 +34129,14 @@
       <w:pPr>
         <w:pStyle w:val="Ttulo3"/>
       </w:pPr>
-      <w:bookmarkStart w:id="124" w:name="_Toc244100769"/>
+      <w:bookmarkStart w:id="125" w:name="_Toc244178108"/>
       <w:r>
         <w:rPr>
           <w:sz w:val="24"/>
         </w:rPr>
         <w:t>5.3.9. Análisis crítico</w:t>
       </w:r>
-      <w:bookmarkEnd w:id="124"/>
+      <w:bookmarkEnd w:id="125"/>
     </w:p>
     <w:p>
       <w:r>
@@ -34058,11 +34162,11 @@
         <w:pStyle w:val="Ttulo3"/>
         <w:keepNext w:val="0"/>
       </w:pPr>
-      <w:bookmarkStart w:id="125" w:name="_Toc244100770"/>
+      <w:bookmarkStart w:id="126" w:name="_Toc244178109"/>
       <w:r>
         <w:t>5.3.10. Comprobación cronológica en otros cultivos y regiones</w:t>
       </w:r>
-      <w:bookmarkEnd w:id="125"/>
+      <w:bookmarkEnd w:id="126"/>
     </w:p>
     <w:p>
       <w:r>
@@ -34506,11 +34610,11 @@
       <w:pPr>
         <w:pStyle w:val="Ttulo3"/>
       </w:pPr>
-      <w:bookmarkStart w:id="126" w:name="_Toc244100771"/>
+      <w:bookmarkStart w:id="127" w:name="_Toc244178110"/>
       <w:r>
         <w:t>5.3.11. Reproducibilidad y evidencias</w:t>
       </w:r>
-      <w:bookmarkEnd w:id="126"/>
+      <w:bookmarkEnd w:id="127"/>
     </w:p>
     <w:p>
       <w:r>
@@ -34522,35 +34626,35 @@
         <w:pStyle w:val="Ttulo1"/>
         <w:pageBreakBefore/>
       </w:pPr>
-      <w:bookmarkStart w:id="127" w:name="_Toc244100772"/>
+      <w:bookmarkStart w:id="128" w:name="_Toc244178111"/>
       <w:r>
         <w:lastRenderedPageBreak/>
         <w:t>6. Conclusiones</w:t>
       </w:r>
-      <w:bookmarkEnd w:id="127"/>
+      <w:bookmarkEnd w:id="128"/>
     </w:p>
     <w:p>
       <w:pPr>
         <w:pStyle w:val="Ttulo2"/>
       </w:pPr>
-      <w:bookmarkStart w:id="128" w:name="_Toc244100773"/>
+      <w:bookmarkStart w:id="129" w:name="_Toc244178112"/>
       <w:r>
         <w:t>6.1. Cumplimiento de objetivos y aportaciones</w:t>
       </w:r>
-      <w:bookmarkEnd w:id="128"/>
+      <w:bookmarkEnd w:id="129"/>
     </w:p>
     <w:p>
       <w:pPr>
         <w:pStyle w:val="Ttulo3"/>
       </w:pPr>
-      <w:bookmarkStart w:id="129" w:name="_Toc244100774"/>
+      <w:bookmarkStart w:id="130" w:name="_Toc244178113"/>
       <w:r>
         <w:rPr>
           <w:sz w:val="24"/>
         </w:rPr>
         <w:t>6.1.1. Valoración de los objetivos</w:t>
       </w:r>
-      <w:bookmarkEnd w:id="129"/>
+      <w:bookmarkEnd w:id="130"/>
     </w:p>
     <w:p>
       <w:r>
@@ -34567,14 +34671,14 @@
         <w:pStyle w:val="ndicetablaTFM"/>
         <w:spacing w:after="120"/>
       </w:pPr>
-      <w:bookmarkStart w:id="130" w:name="idx_tbl_6_1"/>
+      <w:bookmarkStart w:id="131" w:name="idx_tbl_6_1"/>
       <w:r>
         <w:rPr>
           <w:b/>
         </w:rPr>
         <w:t>Tabla 6.1. Grado de cumplimiento de los objetivos específicos.</w:t>
       </w:r>
-      <w:bookmarkEnd w:id="130"/>
+      <w:bookmarkEnd w:id="131"/>
     </w:p>
     <w:tbl>
       <w:tblPr>
@@ -35161,7 +35265,7 @@
           </w:tcPr>
           <w:p>
             <w:r>
-              <w:t>Apartado 5.3; validación, 13 escenarios y 108 pruebas</w:t>
+              <w:t>Apartado 5.3; validación, 13 escenarios y 150 pruebas</w:t>
             </w:r>
           </w:p>
         </w:tc>
@@ -35215,14 +35319,14 @@
       <w:pPr>
         <w:pStyle w:val="Ttulo3"/>
       </w:pPr>
-      <w:bookmarkStart w:id="131" w:name="_Toc244100775"/>
+      <w:bookmarkStart w:id="132" w:name="_Toc244178114"/>
       <w:r>
         <w:rPr>
           <w:sz w:val="24"/>
         </w:rPr>
         <w:t>6.1.2. Aportaciones del trabajo</w:t>
       </w:r>
-      <w:bookmarkEnd w:id="131"/>
+      <w:bookmarkEnd w:id="132"/>
     </w:p>
     <w:p>
       <w:r>
@@ -35252,24 +35356,24 @@
       <w:pPr>
         <w:pStyle w:val="Ttulo2"/>
       </w:pPr>
-      <w:bookmarkStart w:id="132" w:name="_Toc244100776"/>
+      <w:bookmarkStart w:id="133" w:name="_Toc244178115"/>
       <w:r>
         <w:t>6.2. Limitaciones e impacto del proyecto</w:t>
       </w:r>
-      <w:bookmarkEnd w:id="132"/>
+      <w:bookmarkEnd w:id="133"/>
     </w:p>
     <w:p>
       <w:pPr>
         <w:pStyle w:val="Ttulo3"/>
       </w:pPr>
-      <w:bookmarkStart w:id="133" w:name="_Toc244100777"/>
+      <w:bookmarkStart w:id="134" w:name="_Toc244178116"/>
       <w:r>
         <w:rPr>
           <w:sz w:val="24"/>
         </w:rPr>
         <w:t>6.2.1. Limitaciones y alcance de las conclusiones</w:t>
       </w:r>
-      <w:bookmarkEnd w:id="133"/>
+      <w:bookmarkEnd w:id="134"/>
     </w:p>
     <w:p>
       <w:r>
@@ -35294,7 +35398,7 @@
     </w:p>
     <w:p>
       <w:r>
-        <w:t>La tercera limitación afecta a la predicción meteorológica. No existe una ET0 futura contrastada ni un archivo histórico de emisiones AEMET anteriores a cada fecha objetivo. Los resultados retrospectivos de 2025 no miden la integración actual. La aplicación descuenta una fracción supuesta de la lluvia prevista cuando existen milímetros horarios utilizables: las horas restantes de hoy o las 24 horas de mañana. Esa fracción no está calibrada para la parcela y falta el balance de agua del suelo. Los días posteriores al primero usan una estimación provisional de ET0 y Kc. En la prueba original, el séptimo día perdió frente a la persistencia.</w:t>
+        <w:t>La tercera afecta a la cobertura predictiva. El sistema dispone de ET0 Ridge multianual por horizonte y descuenta la lluvia AEMET disponible, pero su validación prospectiva acaba de comenzar y aún no contiene 30 casos consolidados. La cobertura retrospectiva de 2026 es cercana al 97 % en AL01 y BA08, pero nula para Ridge en Z06 porque la fuente solo devolvió 13 días continuos. Los intervalos mostrados son cuantiles empíricos de residuo, no una garantía probabilística calibrada para una parcela concreta.</w:t>
       </w:r>
     </w:p>
     <w:p>
@@ -35312,14 +35416,14 @@
         <w:pStyle w:val="ndicetablaTFM"/>
         <w:spacing w:after="120"/>
       </w:pPr>
-      <w:bookmarkStart w:id="134" w:name="idx_tbl_6_2"/>
+      <w:bookmarkStart w:id="135" w:name="idx_tbl_6_2"/>
       <w:r>
         <w:rPr>
           <w:b/>
         </w:rPr>
         <w:t>Tabla 6.2. Limitaciones del piloto, alcance de las conclusiones y línea de mejora asociada.</w:t>
       </w:r>
-      <w:bookmarkEnd w:id="134"/>
+      <w:bookmarkEnd w:id="135"/>
     </w:p>
     <w:tbl>
       <w:tblPr>
@@ -35592,7 +35696,7 @@
           </w:tcPr>
           <w:p>
             <w:r>
-              <w:t>Sin ET0 prevista ni histórico de pronósticos</w:t>
+              <w:t>ET0 prevista sin evidencia prospectiva suficiente y cobertura nula de Ridge en Z06</w:t>
             </w:r>
           </w:p>
         </w:tc>
@@ -35610,7 +35714,10 @@
           </w:tcPr>
           <w:p>
             <w:r>
-              <w:t>Que se anticipen cambios meteorológicos a largo horizonte</w:t>
+              <w:t xml:space="preserve">Que la mejora retrospectiva se mantenga operativamente en todas las </w:t>
+            </w:r>
+            <w:r>
+              <w:t>estaciones</w:t>
             </w:r>
           </w:p>
         </w:tc>
@@ -35628,7 +35735,7 @@
           </w:tcPr>
           <w:p>
             <w:r>
-              <w:t>ET0 prevista (6.3.2)</w:t>
+              <w:t>Monitorización diaria, consolidación y ampliación de cobertura (6.3.2)</w:t>
             </w:r>
           </w:p>
         </w:tc>
@@ -35846,14 +35953,14 @@
       <w:pPr>
         <w:pStyle w:val="Ttulo3"/>
       </w:pPr>
-      <w:bookmarkStart w:id="135" w:name="_Toc244100778"/>
+      <w:bookmarkStart w:id="136" w:name="_Toc244178117"/>
       <w:r>
         <w:rPr>
           <w:sz w:val="24"/>
         </w:rPr>
         <w:t>6.2.2. Impacto del proyecto</w:t>
       </w:r>
-      <w:bookmarkEnd w:id="135"/>
+      <w:bookmarkEnd w:id="136"/>
     </w:p>
     <w:p>
       <w:r>
@@ -35862,11 +35969,11 @@
     </w:p>
     <w:p>
       <w:r>
-        <w:t xml:space="preserve">El primero es una capacidad funcional comprobada. El sistema transforma datos públicos y gratuitos en una dosis diaria y semanal expresada en milímetros y en metros cúbicos por parcela, acompañada de su explicación y sin necesidad de sensores. Su valor práctico se concentra en los cambios de fase. En la semana analizada en el apartado 5.2.3, la persistencia habría planificado 6,77 mm menos de los que necesitó el cultivo, un 18 % de la referencia, justo al entrar en una fase de mayor demanda; el sistema se desvió un 4,9 %. Es el tipo de error que un calendario fijo o la </w:t>
+        <w:t xml:space="preserve">El primero es una capacidad funcional comprobada. El sistema transforma datos públicos y gratuitos en una dosis diaria y semanal expresada en milímetros y en metros cúbicos por parcela, acompañada de su explicación y sin necesidad de sensores. Su valor práctico se concentra en los cambios de fase. En la semana analizada en el apartado 5.2.3, la persistencia habría planificado </w:t>
       </w:r>
       <w:r>
         <w:lastRenderedPageBreak/>
-        <w:t>repetición de la última dosis no ponen de manifiesto y que podría producir un déficit si se aplicara sin otros controles; el ejemplo retrospectivo no demuestra que ocurriera en una parcela.</w:t>
+        <w:t>6,77 mm menos de los que necesitó el cultivo, un 18 % de la referencia, justo al entrar en una fase de mayor demanda; el sistema se desvió un 4,9 %. Es el tipo de error que un calendario fijo o la repetición de la última dosis no ponen de manifiesto y que podría producir un déficit si se aplicara sin otros controles; el ejemplo retrospectivo no demuestra que ocurriera en una parcela.</w:t>
       </w:r>
     </w:p>
     <w:p>
@@ -35888,11 +35995,11 @@
       <w:pPr>
         <w:pStyle w:val="Ttulo2"/>
       </w:pPr>
-      <w:bookmarkStart w:id="136" w:name="_Toc244100779"/>
+      <w:bookmarkStart w:id="137" w:name="_Toc244178118"/>
       <w:r>
         <w:t>6.3. Mejoras y líneas futuras</w:t>
       </w:r>
-      <w:bookmarkEnd w:id="136"/>
+      <w:bookmarkEnd w:id="137"/>
     </w:p>
     <w:p>
       <w:r>
@@ -35903,70 +36010,73 @@
       <w:pPr>
         <w:pStyle w:val="Ttulo3"/>
       </w:pPr>
-      <w:bookmarkStart w:id="137" w:name="_Toc244100780"/>
+      <w:bookmarkStart w:id="138" w:name="_Toc244178119"/>
       <w:r>
         <w:rPr>
           <w:sz w:val="24"/>
         </w:rPr>
         <w:t>6.3.1. Ampliación de la evidencia</w:t>
       </w:r>
-      <w:bookmarkEnd w:id="137"/>
-    </w:p>
-    <w:p>
-      <w:r>
-        <w:t>La primera mejora consiste en ampliar campañas, estaciones y cultivos. El prototipo ya ofrece seis combinaciones en tres estaciones, pero solo entre casos descargados y verificados. La extracción meteorológica admite estación y periodo; las necesidades se aportan con CSV SiAR y metadatos. Falta automatizar un catálogo amplio y contrastar la aplicabilidad agronómica de cada calendario. Con campañas adicionales podrán reservarse bloques completos para medir transferencia temporal y espacial (Roberts et al., 2017).</w:t>
+      <w:bookmarkEnd w:id="138"/>
+    </w:p>
+    <w:p>
+      <w:r>
+        <w:t xml:space="preserve">La primera mejora consiste en ampliar campañas, estaciones y cultivos. El prototipo ya ofrece seis combinaciones en tres estaciones, pero solo entre casos descargados y verificados. La extracción meteorológica admite estación y periodo; las necesidades se aportan con CSV SiAR y metadatos. Falta automatizar un catálogo amplio y contrastar la aplicabilidad agronómica de cada calendario. </w:t>
+      </w:r>
+      <w:r>
+        <w:lastRenderedPageBreak/>
+        <w:t>Con campañas adicionales podrán reservarse bloques completos para medir transferencia temporal y espacial (Roberts et al., 2017).</w:t>
       </w:r>
     </w:p>
     <w:p>
       <w:pPr>
         <w:pStyle w:val="Ttulo3"/>
       </w:pPr>
-      <w:bookmarkStart w:id="138" w:name="_Toc244100781"/>
+      <w:bookmarkStart w:id="139" w:name="_Toc244178120"/>
       <w:r>
         <w:rPr>
           <w:sz w:val="24"/>
         </w:rPr>
+        <w:t>6.3.2. Mejora del motor de recomendación</w:t>
+      </w:r>
+      <w:bookmarkEnd w:id="139"/>
+    </w:p>
+    <w:p>
+      <w:r>
+        <w:t>La prioridad principal para la siguiente iteración es incorporar un balance hídrico real de la parcela. La instrumentación podría combinar sondas capacitivas FDR o TDR para contenido volumétrico y tensiómetros para potencial matricial, instalados a varias profundidades representativas de la zona radicular. Como configuración inicial se propone un registro frecuente y una agregación horaria; Sui (2017) documenta un caso con lectura cada minuto, promedio horario y sensores a tres profundidades. La frecuencia definitiva deberá ajustarse al suelo, cultivo y sistema de riego. La tubería de datos controlaría rango físico, valores ausentes, deriva, conectividad y calibración específica del suelo antes de alimentar el DSS. Junto con capacidad de retención, profundidad radicular, precipitación efectiva y riego realmente aplicado, estas entradas permitirían estimar el agotamiento admisible de FAO-56, decidir no solo cuánto sino cuándo regar y aprovechar la lluvia almacenada (Allen et al., 1998). La telemetría no sustituye la caracterización agronómica ni prueba que una dosis recomendada se haya ejecutado. Cualquier mejora deberá validarse en campo; después podría estudiarse un riego deficitario que concentre el déficit en fases menos sensibles (Fereres &amp; Soriano, 2007).</w:t>
+      </w:r>
+    </w:p>
+    <w:p>
+      <w:r>
+        <w:t>Como complemento espacial, podría evaluarse la teledetección de Copernicus Sentinel-2 para estimar índices de vegetación como NDVI y observar diferencias de vigor dentro de la parcela (Drusch et al., 2012). Estos índices no sustituirían automáticamente el Kc de calendario. Servirían para investigar un Kc dinámico por cultivo y parcela, calibrado frente a sensores, observaciones de campo y ETc de referencia. La nubosidad, la frecuencia de adquisición y la resolución disponible deberían tratarse como fuentes de ausencia e incertidumbre, de modo que el sistema mantuviera la vía agronómica cuando la imagen no fuese representativa.</w:t>
+      </w:r>
+    </w:p>
+    <w:p>
+      <w:r>
+        <w:t>La segunda prioridad ya no es construir una primera ET0 prevista, sino validar prospectivamente la predicción Ridge h=1…9, ampliar la cobertura de Z06 y vigilar la deriva. Una tarea diaria archiva cada emisión y la contrasta con el primer valor SiAR disponible y con sus revisiones. El umbral exige al menos 30 casos consolidados y un MAE inferior al respaldo de media de siete días; si deja de cumplirse, el sistema vuelve automáticamente a ese respaldo. El reentrenamiento es anual y solo sustituye el artefacto vigente si supera el mismo control temporal. Como evolución adicional, el archivo de emisiones AEMET permitirá evaluar y corregir el error local de la lluvia prevista.</w:t>
+      </w:r>
+    </w:p>
+    <w:p>
+      <w:r>
+        <w:t xml:space="preserve">La tercera prioridad es reevaluar el componente predictivo cuando existan más campañas, telemetría y previsiones archivadas. Los seis modelos de ETc actuales se utilizan como contraste de la vía física y solo pueden determinar la dosis cuando mejoran su MAE de prueba y existe una observación del día anterior. Con más información convendrá ensayar una corrección de la </w:t>
+      </w:r>
+      <w:r>
         <w:lastRenderedPageBreak/>
-        <w:t>6.3.2. Mejora del motor de recomendación</w:t>
-      </w:r>
-      <w:bookmarkEnd w:id="138"/>
-    </w:p>
-    <w:p>
-      <w:r>
-        <w:t>La prioridad principal para la siguiente iteración es incorporar un balance hídrico real de la parcela. La instrumentación podría combinar sondas capacitivas FDR o TDR para contenido volumétrico y tensiómetros para potencial matricial, instalados a varias profundidades representativas de la zona radicular. Como configuración inicial se propone un registro frecuente y una agregación horaria; Sui (2017) documenta un caso con lectura cada minuto, promedio horario y sensores a tres profundidades. La frecuencia definitiva deberá ajustarse al suelo, cultivo y sistema de riego. La tubería de datos controlaría rango físico, valores ausentes, deriva, conectividad y calibración específica del suelo antes de alimentar el DSS. Junto con capacidad de retención, profundidad radicular, precipitación efectiva y riego realmente aplicado, estas entradas permitirían estimar el agotamiento admisible de FAO-56, decidir no solo cuánto sino cuándo regar y aprovechar la lluvia almacenada (Allen et al., 1998). La telemetría no sustituye la caracterización agronómica ni prueba que una dosis recomendada se haya ejecutado. Cualquier mejora deberá validarse en campo; después podría estudiarse un riego deficitario que concentre el déficit en fases menos sensibles (Fereres &amp; Soriano, 2007).</w:t>
-      </w:r>
-    </w:p>
-    <w:p>
-      <w:r>
-        <w:t>Como complemento espacial, podría evaluarse la teledetección de Copernicus Sentinel-2 para estimar índices de vegetación como NDVI y observar diferencias de vigor dentro de la parcela (Drusch et al., 2012). Estos índices no sustituirían automáticamente el Kc de calendario. Servirían para investigar un Kc dinámico por cultivo y parcela, calibrado frente a sensores, observaciones de campo y ETc de referencia. La nubosidad, la frecuencia de adquisición y la resolución disponible deberían tratarse como fuentes de ausencia e incertidumbre, de modo que el sistema mantuviera la vía agronómica cuando la imagen no fuese representativa.</w:t>
-      </w:r>
-    </w:p>
-    <w:p>
-      <w:r>
-        <w:t>La segunda prioridad es anticipar los cambios meteorológicos mediante una ET0 futura validada, especialmente para los días 4 a 7. El motor admite esa entrada, pero la aplicación usa de momento ET0 observada reciente. AEMET aporta lluvia prevista al cálculo actual; no hay emisiones históricas archivadas que permitan evaluar su aportación frente a la lluvia finalmente efectiva. Ese archivo deberá registrar emisión, periodo de validez y observación posterior. Con él se podría evaluar una ET0 derivada de variables pronosticadas o el producto de necesidades previstas de SiAR (Sistema de Información Agroclimática para el Regadío, s. f.), sin confundir productos relacionados con una validación independiente. La sustitución de la vía actual exigiría mejorar el error por horizonte en bloques temporales nuevos. El mismo archivo permitiría modelizar el error local de AEMET mediante dos tareas separadas: clasificación de la ocurrencia de lluvia y regresión de la cantidad observada frente a la prevista. Este posprocesado corregiría sesgos locales y cuantificaría la incertidumbre; no sustituiría la predicción oficial. El entrenamiento respetaría la hora de emisión y reservaría bloques temporales posteriores para prueba.</w:t>
-      </w:r>
-    </w:p>
-    <w:p>
-      <w:r>
-        <w:t xml:space="preserve">La tercera prioridad es reevaluar el componente predictivo cuando existan más campañas, telemetría y previsiones archivadas. Los seis modelos de ETc actuales se utilizan como contraste </w:t>
-      </w:r>
-      <w:r>
-        <w:lastRenderedPageBreak/>
-        <w:t>de la vía física y solo pueden determinar la dosis cuando mejoran su MAE de prueba y existe una observación del día anterior. Con más información convendrá ensayar una corrección de la estimación física mediante el residuo entre ET0 × Kc y la referencia, usando únicamente datos disponibles al emitir. La mejora deberá evaluarse en bloques temporales nuevos, sin reutilizar para selección la misma prueba final. Los niveles de confianza actuales, definidos por reglas, podrían reemplazarse por intervalos calibrados (Hyndman &amp; Athanasopoulos, 2021).</w:t>
+        <w:t>estimación física mediante el residuo entre ET0 × Kc y la referencia, usando únicamente datos disponibles al emitir. La mejora deberá evaluarse en bloques temporales nuevos, sin reutilizar para selección la misma prueba final. Los niveles de confianza actuales, definidos por reglas, podrían reemplazarse por intervalos calibrados (Hyndman &amp; Athanasopoulos, 2021).</w:t>
       </w:r>
     </w:p>
     <w:p>
       <w:pPr>
         <w:pStyle w:val="Ttulo3"/>
       </w:pPr>
-      <w:bookmarkStart w:id="139" w:name="_Toc244100782"/>
+      <w:bookmarkStart w:id="140" w:name="_Toc244178121"/>
       <w:r>
         <w:rPr>
           <w:sz w:val="24"/>
         </w:rPr>
         <w:t>6.3.3. Validación en condiciones de uso</w:t>
       </w:r>
-      <w:bookmarkEnd w:id="139"/>
+      <w:bookmarkEnd w:id="140"/>
     </w:p>
     <w:p>
       <w:r>
@@ -35987,22 +36097,22 @@
       <w:pPr>
         <w:pStyle w:val="Ttulo3"/>
       </w:pPr>
-      <w:bookmarkStart w:id="140" w:name="_Toc244100783"/>
+      <w:bookmarkStart w:id="141" w:name="_Toc244178122"/>
       <w:r>
         <w:rPr>
           <w:sz w:val="24"/>
         </w:rPr>
         <w:t>6.3.4. Evolución de la plataforma</w:t>
       </w:r>
-      <w:bookmarkEnd w:id="140"/>
-    </w:p>
-    <w:p>
-      <w:r>
-        <w:t xml:space="preserve">La industrialización debería ser gradual y proporcional al volumen real. Una primera etapa programaría procesos ligeros en Python o funciones gestionadas que conservaran cada respuesta JSON, su hora de emisión y su procedencia en una capa raw inmutable de almacenamiento de objetos. Una segunda capa normalizaría y particionaría los datos en Parquet por fuente, estación y fecha, con catálogo, controles de calidad y trazabilidad. Una base relacional quedaría reservada para usuarios, parcelas y recomendaciones; el histórico analítico se consultaría con DuckDB o Polars mientras el volumen sea moderado. Si una ampliación nacional y multianual exigiera consultas concurrentes, podría incorporarse un motor SQL distribuido como Trino, capaz de consultar formatos de tabla y archivos Parquet sobre almacenamiento de objetos (Trino, s. f.). Esta evolución sigue los principios de un lakehouse sin presentar Apache Hop, Impala, Hue o </w:t>
+      <w:bookmarkEnd w:id="141"/>
+    </w:p>
+    <w:p>
+      <w:r>
+        <w:t xml:space="preserve">La industrialización debería ser gradual y proporcional al volumen real. Una primera etapa programaría procesos ligeros en Python o funciones gestionadas que conservaran cada respuesta JSON, su hora de emisión y su procedencia en una capa raw inmutable de almacenamiento de objetos. Una segunda capa normalizaría y particionaría los datos en Parquet por fuente, estación y fecha, con catálogo, controles de calidad y trazabilidad. Una base relacional quedaría reservada para usuarios, parcelas y recomendaciones; el histórico analítico se consultaría con DuckDB o Polars mientras el volumen sea moderado. Si una ampliación nacional y multianual exigiera consultas concurrentes, podría incorporarse un motor SQL distribuido como Trino, capaz de consultar formatos de tabla y archivos Parquet sobre almacenamiento de objetos (Trino, s. f.). Esta evolución sigue los principios de un lakehouse sin presentar Apache Hop, Impala, Hue o PySpark como requisitos. El procesamiento distribuido solo se justificaría mediante mediciones de volumen, latencia y coste que demostrasen una limitación del enfoque ligero. La aplicación </w:t>
       </w:r>
       <w:r>
         <w:lastRenderedPageBreak/>
-        <w:t>PySpark como requisitos. El procesamiento distribuido solo se justificaría mediante mediciones de volumen, latencia y coste que demostrasen una limitación del enfoque ligero. La aplicación seguiría necesitando un catálogo agronómico dinámico, operación, control de acceso y persistencia de consultas.</w:t>
+        <w:t>seguiría necesitando un catálogo agronómico dinámico, operación, control de acceso y persistencia de consultas.</w:t>
       </w:r>
     </w:p>
     <w:p>
@@ -36014,11 +36124,11 @@
       <w:pPr>
         <w:pStyle w:val="Ttulo3"/>
       </w:pPr>
-      <w:bookmarkStart w:id="141" w:name="_Toc244100784"/>
+      <w:bookmarkStart w:id="142" w:name="_Toc244178123"/>
       <w:r>
         <w:t>6.3.5. Operación, MLOps y control de deriva</w:t>
       </w:r>
-      <w:bookmarkEnd w:id="141"/>
+      <w:bookmarkEnd w:id="142"/>
     </w:p>
     <w:p>
       <w:r>
@@ -36034,11 +36144,11 @@
       <w:pPr>
         <w:pStyle w:val="Ttulo3"/>
       </w:pPr>
-      <w:bookmarkStart w:id="142" w:name="_Toc244100785"/>
+      <w:bookmarkStart w:id="143" w:name="_Toc244178124"/>
       <w:r>
         <w:t>6.3.6. Ciencia abierta y principios FAIR</w:t>
       </w:r>
-      <w:bookmarkEnd w:id="142"/>
+      <w:bookmarkEnd w:id="143"/>
     </w:p>
     <w:p>
       <w:r>
@@ -36047,26 +36157,26 @@
     </w:p>
     <w:p>
       <w:r>
-        <w:t xml:space="preserve">Una versión posterior podría depositarse en Zenodo para obtener un DOI, pero solo después de etiquetar una revisión inmutable y comprobar las condiciones de redistribución de SiAR y AEMET. </w:t>
+        <w:t xml:space="preserve">Una versión posterior podría depositarse en Zenodo para obtener un DOI, pero solo después de etiquetar una revisión inmutable y comprobar las condiciones de redistribución de SiAR y AEMET. La licencia del código no relicencia los datos de terceros. El depósito debería incluir la memoria, el </w:t>
       </w:r>
       <w:r>
         <w:lastRenderedPageBreak/>
-        <w:t>La licencia del código no relicencia los datos de terceros. El depósito debería incluir la memoria, el código, los requisitos, las pruebas, la ficha del conjunto y los metadatos, sin tokens ni respuestas raw cuya redistribución no esté autorizada.</w:t>
+        <w:t>código, los requisitos, las pruebas, la ficha del conjunto y los metadatos, sin tokens ni respuestas raw cuya redistribución no esté autorizada.</w:t>
       </w:r>
     </w:p>
     <w:p>
       <w:pPr>
         <w:pStyle w:val="Ttulo3"/>
       </w:pPr>
-      <w:bookmarkStart w:id="143" w:name="_Toc244100786"/>
+      <w:bookmarkStart w:id="144" w:name="_Toc244178125"/>
       <w:r>
         <w:t>6.3.7. Consideración final</w:t>
       </w:r>
-      <w:bookmarkEnd w:id="143"/>
-    </w:p>
-    <w:p>
-      <w:r>
-        <w:t>El trabajo muestra el valor de separar la demanda del cultivo, la lluvia prevista y las reglas de aplicación de la dosis. En la evaluación original del pimiento, la vía física anticipó mejor la referencia SiAR que la persistencia en los tramos estudiados. En la ampliación, cinco de los seis casos de ETc conservaron la vía física tras comparar errores de prueba; el único modelo favorecido corresponde a algodón, fuera de ciclo en octubre. La integración de AEMET es funcional, pero faltan previsiones archivadas y mediciones de parcela para conocer su efecto real. La siguiente mejora depende sobre todo de datos y validación externa, no de aumentar sin más la complejidad del algoritmo.</w:t>
+      <w:bookmarkEnd w:id="144"/>
+    </w:p>
+    <w:p>
+      <w:r>
+        <w:t>El trabajo muestra el valor de separar la demanda del cultivo, la ET0 prevista, la lluvia AEMET y las reglas de aplicación de la dosis. La evaluación original acreditó el valor de la base física; el experimento multianual añadió una predicción Ridge específica para cada horizonte, con respaldo explícito y monitorización prospectiva. La siguiente mejora depende de ampliar cobertura y validar en campo, no de aumentar la complejidad del algoritmo.</w:t>
       </w:r>
     </w:p>
     <w:p>
@@ -36074,12 +36184,12 @@
         <w:pStyle w:val="Ttulo1"/>
         <w:pageBreakBefore/>
       </w:pPr>
-      <w:bookmarkStart w:id="144" w:name="_Toc244100787"/>
+      <w:bookmarkStart w:id="145" w:name="_Toc244178126"/>
       <w:r>
         <w:lastRenderedPageBreak/>
         <w:t>Referencias bibliográficas</w:t>
       </w:r>
-      <w:bookmarkEnd w:id="144"/>
+      <w:bookmarkEnd w:id="145"/>
     </w:p>
     <w:p>
       <w:pPr>
@@ -37017,12 +37127,12 @@
       <w:pPr>
         <w:pStyle w:val="Ttulo1"/>
       </w:pPr>
-      <w:bookmarkStart w:id="145" w:name="_Toc244100788"/>
+      <w:bookmarkStart w:id="146" w:name="_Toc244178127"/>
       <w:r>
         <w:lastRenderedPageBreak/>
         <w:t>Anexo A. Reproducción y localización de las evidencias</w:t>
       </w:r>
-      <w:bookmarkEnd w:id="145"/>
+      <w:bookmarkEnd w:id="146"/>
     </w:p>
     <w:p>
       <w:r>
@@ -37069,21 +37179,21 @@
       <w:pPr>
         <w:pStyle w:val="Ttulo2"/>
       </w:pPr>
-      <w:bookmarkStart w:id="146" w:name="_Toc244100789"/>
+      <w:bookmarkStart w:id="147" w:name="_Toc244178128"/>
       <w:r>
         <w:t>A.1. Archivos principales</w:t>
       </w:r>
-      <w:bookmarkEnd w:id="146"/>
+      <w:bookmarkEnd w:id="147"/>
     </w:p>
     <w:p>
       <w:pPr>
         <w:pStyle w:val="ndicetablaTFM"/>
       </w:pPr>
-      <w:bookmarkStart w:id="147" w:name="idx_tbl_A_1"/>
+      <w:bookmarkStart w:id="148" w:name="idx_tbl_A_1"/>
       <w:r>
         <w:t>Tabla A.1. Rutas del repositorio para reproducir y contrastar los resultados.</w:t>
       </w:r>
-      <w:bookmarkEnd w:id="147"/>
+      <w:bookmarkEnd w:id="148"/>
     </w:p>
     <w:tbl>
       <w:tblPr>
@@ -37534,11 +37644,11 @@
       <w:pPr>
         <w:pStyle w:val="Ttulo2"/>
       </w:pPr>
-      <w:bookmarkStart w:id="148" w:name="_Toc244100790"/>
+      <w:bookmarkStart w:id="149" w:name="_Toc244178129"/>
       <w:r>
         <w:t>A.2. Secuencia mínima de reproducción</w:t>
       </w:r>
-      <w:bookmarkEnd w:id="148"/>
+      <w:bookmarkEnd w:id="149"/>
     </w:p>
     <w:p>
       <w:r>
@@ -40724,21 +40834,12 @@
 </file>
 
 <file path=customXml/item1.xml><?xml version="1.0" encoding="utf-8"?>
-<?mso-contentType ?>
-<FormTemplates xmlns="http://schemas.microsoft.com/sharepoint/v3/contenttype/forms">
-  <Display>DocumentLibraryForm</Display>
-  <Edit>DocumentLibraryForm</Edit>
-  <New>DocumentLibraryForm</New>
-</FormTemplates>
-</file>
-
-<file path=customXml/item2.xml><?xml version="1.0" encoding="utf-8"?>
 <p:properties xmlns:p="http://schemas.microsoft.com/office/2006/metadata/properties" xmlns:xsi="http://www.w3.org/2001/XMLSchema-instance" xmlns:pc="http://schemas.microsoft.com/office/infopath/2007/PartnerControls">
   <documentManagement/>
 </p:properties>
 </file>
 
-<file path=customXml/item3.xml><?xml version="1.0" encoding="utf-8"?>
+<file path=customXml/item2.xml><?xml version="1.0" encoding="utf-8"?>
 <ct:contentTypeSchema xmlns:ct="http://schemas.microsoft.com/office/2006/metadata/contentType" xmlns:ma="http://schemas.microsoft.com/office/2006/metadata/properties/metaAttributes" ct:_="" ma:_="" ma:contentTypeName="Documento" ma:contentTypeID="0x01010019FAAD7208B57F46B26AFFED99BCE0D3" ma:contentTypeVersion="12" ma:contentTypeDescription="Crear nuevo documento." ma:contentTypeScope="" ma:versionID="1ef574cbf204855aeab3c40b347ffcdd">
   <xsd:schema xmlns:xsd="http://www.w3.org/2001/XMLSchema" xmlns:xs="http://www.w3.org/2001/XMLSchema" xmlns:p="http://schemas.microsoft.com/office/2006/metadata/properties" xmlns:ns2="9d7b9a5c-6b4f-4ca1-bb03-c38cacb734bc" xmlns:ns3="7d80c08f-e909-465c-8aa4-0e649fbe85d0" targetNamespace="http://schemas.microsoft.com/office/2006/metadata/properties" ma:root="true" ma:fieldsID="d90f8574e5bf50e8ad773515e43a9e2d" ns2:_="" ns3:_="">
     <xsd:import namespace="9d7b9a5c-6b4f-4ca1-bb03-c38cacb734bc"/>
@@ -40955,15 +41056,16 @@
 </ct:contentTypeSchema>
 </file>
 
-<file path=customXml/itemProps1.xml><?xml version="1.0" encoding="utf-8"?>
-<ds:datastoreItem xmlns:ds="http://schemas.openxmlformats.org/officeDocument/2006/customXml" ds:itemID="{E5FD6A2B-9479-4129-9D84-6C858DBE1A90}">
-  <ds:schemaRefs>
-    <ds:schemaRef ds:uri="http://schemas.microsoft.com/sharepoint/v3/contenttype/forms"/>
-  </ds:schemaRefs>
-</ds:datastoreItem>
+<file path=customXml/item3.xml><?xml version="1.0" encoding="utf-8"?>
+<?mso-contentType ?>
+<FormTemplates xmlns="http://schemas.microsoft.com/sharepoint/v3/contenttype/forms">
+  <Display>DocumentLibraryForm</Display>
+  <Edit>DocumentLibraryForm</Edit>
+  <New>DocumentLibraryForm</New>
+</FormTemplates>
 </file>
 
-<file path=customXml/itemProps2.xml><?xml version="1.0" encoding="utf-8"?>
+<file path=customXml/itemProps1.xml><?xml version="1.0" encoding="utf-8"?>
 <ds:datastoreItem xmlns:ds="http://schemas.openxmlformats.org/officeDocument/2006/customXml" ds:itemID="{261B0A37-6C6C-45CF-A5C4-83D994BC3980}">
   <ds:schemaRefs>
     <ds:schemaRef ds:uri="http://schemas.microsoft.com/office/2006/metadata/properties"/>
@@ -40972,7 +41074,7 @@
 </ds:datastoreItem>
 </file>
 
-<file path=customXml/itemProps3.xml><?xml version="1.0" encoding="utf-8"?>
+<file path=customXml/itemProps2.xml><?xml version="1.0" encoding="utf-8"?>
 <ds:datastoreItem xmlns:ds="http://schemas.openxmlformats.org/officeDocument/2006/customXml" ds:itemID="{01B4916B-2905-40FE-B973-786E02856A77}">
   <ds:schemaRefs>
     <ds:schemaRef ds:uri="http://schemas.microsoft.com/office/2006/metadata/contentType"/>
@@ -40989,4 +41091,12 @@
     <ds:schemaRef ds:uri="http://schemas.microsoft.com/internal/obd"/>
   </ds:schemaRefs>
 </ds:datastoreItem>
+</file>
+
+<file path=customXml/itemProps3.xml><?xml version="1.0" encoding="utf-8"?>
+<ds:datastoreItem xmlns:ds="http://schemas.openxmlformats.org/officeDocument/2006/customXml" ds:itemID="{E5FD6A2B-9479-4129-9D84-6C858DBE1A90}">
+  <ds:schemaRefs>
+    <ds:schemaRef ds:uri="http://schemas.microsoft.com/sharepoint/v3/contenttype/forms"/>
+  </ds:schemaRefs>
+</ds:datastoreItem>
 </file>
</xml_diff>